<commit_message>
discipline place output ready
</commit_message>
<xml_diff>
--- a/templates/docxRPD/rpd.docx
+++ b/templates/docxRPD/rpd.docx
@@ -640,7 +640,7 @@
         <w:gridCol w:w="500"/>
         <w:gridCol w:w="230"/>
         <w:gridCol w:w="1150"/>
-        <w:gridCol w:w="1727"/>
+        <w:gridCol w:w="2010"/>
       </w:tblGrid>
       <w:tr>
         <w:trPr>
@@ -813,7 +813,7 @@
         </w:tc>
         <w:tc>
           <w:tcPr>
-            <w:tcW w:w="1727" w:type="dxa"/>
+            <w:tcW w:w="2010" w:type="dxa"/>
             <w:vAlign w:val="bottom"/>
           </w:tcPr>
           <w:p>
@@ -884,7 +884,7 @@
         <w:gridCol w:w="500"/>
         <w:gridCol w:w="230"/>
         <w:gridCol w:w="1150"/>
-        <w:gridCol w:w="1727"/>
+        <w:gridCol w:w="2010"/>
       </w:tblGrid>
       <w:tr>
         <w:trPr>
@@ -1047,7 +1047,7 @@
         </w:tc>
         <w:tc>
           <w:tcPr>
-            <w:tcW w:w="1727" w:type="dxa"/>
+            <w:tcW w:w="2010" w:type="dxa"/>
             <w:vAlign w:val="bottom"/>
           </w:tcPr>
           <w:p>
@@ -1713,6 +1713,7 @@
           </w:tcPr>
           <w:p>
             <w:pPr>
+              <w:jc w:val="center"/>
               <w:rPr>
                 <w:rFonts w:ascii="Times New Roman" w:hAnsi="Times New Roman" w:cs="Times New Roman"/>
                 <w:color w:val="000000" w:themeColor="text1"/>
@@ -1996,6 +1997,7 @@
           </w:tcPr>
           <w:p>
             <w:pPr>
+              <w:jc w:val="center"/>
               <w:rPr>
                 <w:rFonts w:ascii="Times New Roman" w:hAnsi="Times New Roman" w:cs="Times New Roman"/>
                 <w:color w:val="000000" w:themeColor="text1"/>
@@ -2044,21 +2046,190 @@
         <w:jc w:val="both"/>
         <w:rPr>
           <w:rFonts w:ascii="Times New Roman" w:hAnsi="Times New Roman" w:cs="Times New Roman"/>
+          <w:b/>
+          <w:bCs/>
+          <w:sz w:val="24"/>
+          <w:szCs w:val="24"/>
+        </w:rPr>
+      </w:pPr>
+      <w:r>
+        <w:rPr>
+          <w:rFonts w:ascii="Times New Roman" w:hAnsi="Times New Roman" w:cs="Times New Roman"/>
+          <w:b/>
+          <w:bCs/>
+          <w:sz w:val="24"/>
+          <w:szCs w:val="24"/>
+        </w:rPr>
+        <w:t>2</w:t>
+      </w:r>
+      <w:r>
+        <w:rPr>
+          <w:rFonts w:ascii="Times New Roman" w:hAnsi="Times New Roman" w:cs="Times New Roman"/>
+          <w:b/>
+          <w:bCs/>
+          <w:sz w:val="24"/>
+          <w:szCs w:val="24"/>
+        </w:rPr>
+        <w:t xml:space="preserve"> </w:t>
+      </w:r>
+      <w:r>
+        <w:rPr>
+          <w:rFonts w:ascii="Times New Roman" w:hAnsi="Times New Roman" w:cs="Times New Roman"/>
+          <w:b/>
+          <w:bCs/>
+          <w:sz w:val="24"/>
+          <w:szCs w:val="24"/>
+        </w:rPr>
+        <w:t>Место дисциплины в структуре ООП</w:t>
+      </w:r>
+    </w:p>
+    <w:p>
+      <w:pPr>
+        <w:spacing w:before="200" w:after="200" w:line="240" w:lineRule="auto"/>
+        <w:ind w:firstLine="708"/>
+        <w:jc w:val="both"/>
+        <w:rPr>
+          <w:rFonts w:ascii="Times New Roman" w:hAnsi="Times New Roman" w:cs="Times New Roman"/>
+          <w:sz w:val="24"/>
+          <w:szCs w:val="24"/>
+        </w:rPr>
+      </w:pPr>
+      <w:r>
+        <w:rPr>
+          <w:rFonts w:ascii="Times New Roman" w:hAnsi="Times New Roman" w:cs="Times New Roman"/>
+          <w:sz w:val="24"/>
+          <w:szCs w:val="24"/>
+        </w:rPr>
+        <w:t>Изучение дисциплины «{{</w:t>
+      </w:r>
+      <w:r>
+        <w:rPr>
+          <w:rFonts w:ascii="Times New Roman" w:hAnsi="Times New Roman" w:cs="Times New Roman"/>
+          <w:sz w:val="24"/>
+          <w:szCs w:val="24"/>
+          <w:lang w:val="en-US"/>
+        </w:rPr>
+        <w:t>discipline</w:t>
+      </w:r>
+      <w:r>
+        <w:rPr>
+          <w:rFonts w:ascii="Times New Roman" w:hAnsi="Times New Roman" w:cs="Times New Roman"/>
+          <w:sz w:val="24"/>
+          <w:szCs w:val="24"/>
+        </w:rPr>
+        <w:t xml:space="preserve">}}» базируется на результатах освоения следующих дисциплин: </w:t>
+      </w:r>
+      <w:r>
+        <w:rPr>
+          <w:rFonts w:ascii="Times New Roman" w:hAnsi="Times New Roman" w:cs="Times New Roman"/>
+          <w:sz w:val="24"/>
+          <w:szCs w:val="24"/>
+        </w:rPr>
+        <w:t>{{</w:t>
+      </w:r>
+      <w:r>
+        <w:t xml:space="preserve"> </w:t>
+      </w:r>
+      <w:r>
+        <w:rPr>
+          <w:rFonts w:ascii="Times New Roman" w:hAnsi="Times New Roman" w:cs="Times New Roman"/>
+          <w:sz w:val="24"/>
+          <w:szCs w:val="24"/>
+        </w:rPr>
+        <w:t>subsequent }}</w:t>
+      </w:r>
+    </w:p>
+    <w:p>
+      <w:pPr>
+        <w:spacing w:before="200" w:after="200" w:line="240" w:lineRule="auto"/>
+        <w:jc w:val="both"/>
+        <w:rPr>
+          <w:rFonts w:ascii="Times New Roman" w:hAnsi="Times New Roman" w:cs="Times New Roman"/>
+          <w:sz w:val="24"/>
+          <w:szCs w:val="24"/>
+        </w:rPr>
+      </w:pPr>
+      <w:r>
+        <w:rPr>
+          <w:rFonts w:ascii="Times New Roman" w:hAnsi="Times New Roman" w:cs="Times New Roman"/>
+          <w:sz w:val="24"/>
+          <w:szCs w:val="24"/>
+        </w:rPr>
+        <w:tab/>
+        <w:t xml:space="preserve">Дисциплина является предшествующей для дисциплин: </w:t>
+      </w:r>
+      <w:r>
+        <w:rPr>
+          <w:rFonts w:ascii="Times New Roman" w:hAnsi="Times New Roman" w:cs="Times New Roman"/>
+          <w:sz w:val="24"/>
+          <w:szCs w:val="24"/>
+        </w:rPr>
+        <w:t>{{ precedence }}</w:t>
+      </w:r>
+    </w:p>
+    <w:p>
+      <w:pPr>
+        <w:spacing w:before="200" w:after="200" w:line="240" w:lineRule="auto"/>
+        <w:jc w:val="both"/>
+        <w:rPr>
+          <w:rFonts w:ascii="Times New Roman" w:hAnsi="Times New Roman" w:cs="Times New Roman"/>
+          <w:b/>
+          <w:bCs/>
+          <w:sz w:val="24"/>
+          <w:szCs w:val="24"/>
+        </w:rPr>
+      </w:pPr>
+      <w:r>
+        <w:rPr>
+          <w:rFonts w:ascii="Times New Roman" w:hAnsi="Times New Roman" w:cs="Times New Roman"/>
+          <w:b/>
+          <w:bCs/>
+          <w:sz w:val="24"/>
+          <w:szCs w:val="24"/>
+        </w:rPr>
+        <w:t>3</w:t>
+      </w:r>
+      <w:r>
+        <w:rPr>
+          <w:rFonts w:ascii="Times New Roman" w:hAnsi="Times New Roman" w:cs="Times New Roman"/>
+          <w:b/>
+          <w:bCs/>
+          <w:sz w:val="24"/>
+          <w:szCs w:val="24"/>
+        </w:rPr>
+        <w:t xml:space="preserve"> </w:t>
+      </w:r>
+      <w:r>
+        <w:rPr>
+          <w:rFonts w:ascii="Times New Roman" w:hAnsi="Times New Roman" w:cs="Times New Roman"/>
+          <w:b/>
+          <w:bCs/>
+          <w:sz w:val="24"/>
+          <w:szCs w:val="24"/>
+        </w:rPr>
+        <w:t>О</w:t>
+      </w:r>
+      <w:r>
+        <w:rPr>
+          <w:rFonts w:ascii="Times New Roman" w:hAnsi="Times New Roman" w:cs="Times New Roman"/>
+          <w:b/>
+          <w:bCs/>
+          <w:sz w:val="24"/>
+          <w:szCs w:val="24"/>
+        </w:rPr>
+        <w:t>бъем дисциплины</w:t>
+      </w:r>
+    </w:p>
+    <w:p>
+      <w:pPr>
+        <w:rPr>
+          <w:rFonts w:ascii="Times New Roman" w:hAnsi="Times New Roman" w:cs="Times New Roman"/>
           <w:sz w:val="24"/>
           <w:szCs w:val="24"/>
         </w:rPr>
       </w:pPr>
       <w:bookmarkStart w:id="0" w:name="_GoBack"/>
       <w:bookmarkEnd w:id="0"/>
-    </w:p>
-    <w:p>
-      <w:pPr>
-        <w:rPr>
-          <w:rFonts w:ascii="Times New Roman" w:hAnsi="Times New Roman" w:cs="Times New Roman"/>
-          <w:sz w:val="24"/>
-          <w:szCs w:val="24"/>
-        </w:rPr>
-      </w:pPr>
     </w:p>
     <w:sectPr>
       <w:footerReference w:type="default" r:id="rId7"/>
@@ -2694,6 +2865,7 @@
   <w:style w:type="paragraph" w:default="1" w:styleId="a">
     <w:name w:val="Normal"/>
     <w:qFormat/>
+    <w:rsid w:val="00082B42"/>
   </w:style>
   <w:style w:type="character" w:default="1" w:styleId="a0">
     <w:name w:val="Default Paragraph Font"/>
@@ -3105,7 +3277,7 @@
 </file>
 
 <file path=customXml/itemProps1.xml><?xml version="1.0" encoding="utf-8"?>
-<ds:datastoreItem xmlns:ds="http://schemas.openxmlformats.org/officeDocument/2006/customXml" ds:itemID="{7E1F07F9-AFB1-45C9-8E2C-D66260D9CFBA}">
+<ds:datastoreItem xmlns:ds="http://schemas.openxmlformats.org/officeDocument/2006/customXml" ds:itemID="{FCFEC6E7-8754-49B0-910D-6E927C837CDB}">
   <ds:schemaRefs>
     <ds:schemaRef ds:uri="http://schemas.openxmlformats.org/officeDocument/2006/bibliography"/>
   </ds:schemaRefs>

</xml_diff>

<commit_message>
tic all output complete
</commit_message>
<xml_diff>
--- a/templates/docxRPD/rpd.docx
+++ b/templates/docxRPD/rpd.docx
@@ -2317,17 +2317,20 @@
       <w:tblPr>
         <w:tblStyle w:val="ab"/>
         <w:tblW w:w="0" w:type="auto"/>
+        <w:tblLayout w:type="fixed"/>
         <w:tblLook w:val="04A0" w:firstRow="1" w:lastRow="0" w:firstColumn="1" w:lastColumn="0" w:noHBand="0" w:noVBand="1"/>
       </w:tblPr>
       <w:tblGrid>
-        <w:gridCol w:w="4503"/>
-        <w:gridCol w:w="2384"/>
-        <w:gridCol w:w="2458"/>
+        <w:gridCol w:w="3681"/>
+        <w:gridCol w:w="1843"/>
+        <w:gridCol w:w="814"/>
+        <w:gridCol w:w="2164"/>
+        <w:gridCol w:w="843"/>
       </w:tblGrid>
       <w:tr>
         <w:tc>
           <w:tcPr>
-            <w:tcW w:w="4503" w:type="dxa"/>
+            <w:tcW w:w="3681" w:type="dxa"/>
             <w:vAlign w:val="center"/>
           </w:tcPr>
           <w:p>
@@ -2353,12 +2356,13 @@
         </w:tc>
         <w:tc>
           <w:tcPr>
-            <w:tcW w:w="4842" w:type="dxa"/>
-            <w:gridSpan w:val="2"/>
-            <w:vAlign w:val="center"/>
-          </w:tcPr>
-          <w:p>
-            <w:pPr>
+            <w:tcW w:w="5664" w:type="dxa"/>
+            <w:gridSpan w:val="4"/>
+            <w:vAlign w:val="center"/>
+          </w:tcPr>
+          <w:p>
+            <w:pPr>
+              <w:jc w:val="center"/>
               <w:rPr>
                 <w:rFonts w:ascii="Times New Roman" w:hAnsi="Times New Roman" w:cs="Times New Roman"/>
                 <w:sz w:val="24"/>
@@ -2395,8 +2399,9 @@
                 <w:rFonts w:ascii="Times New Roman" w:hAnsi="Times New Roman" w:cs="Times New Roman"/>
                 <w:sz w:val="24"/>
                 <w:szCs w:val="24"/>
-              </w:rPr>
-              <w:t>semester_hours</w:t>
+                <w:lang w:val="en-US"/>
+              </w:rPr>
+              <w:t>sh</w:t>
             </w:r>
             <w:r>
               <w:rPr>
@@ -2414,6 +2419,22 @@
                 <w:lang w:val="en-US"/>
               </w:rPr>
               <w:t>count</w:t>
+            </w:r>
+            <w:r>
+              <w:rPr>
+                <w:rFonts w:ascii="Times New Roman" w:hAnsi="Times New Roman" w:cs="Times New Roman"/>
+                <w:sz w:val="24"/>
+                <w:szCs w:val="24"/>
+              </w:rPr>
+              <w:t>+1</w:t>
+            </w:r>
+            <w:r>
+              <w:rPr>
+                <w:rFonts w:ascii="Times New Roman" w:hAnsi="Times New Roman" w:cs="Times New Roman"/>
+                <w:sz w:val="24"/>
+                <w:szCs w:val="24"/>
+              </w:rPr>
+              <w:t xml:space="preserve"> </w:t>
             </w:r>
             <w:r>
               <w:rPr>
@@ -2429,7 +2450,7 @@
       <w:tr>
         <w:tc>
           <w:tcPr>
-            <w:tcW w:w="4503" w:type="dxa"/>
+            <w:tcW w:w="3681" w:type="dxa"/>
           </w:tcPr>
           <w:p>
             <w:pPr>
@@ -2451,7 +2472,7 @@
         </w:tc>
         <w:tc>
           <w:tcPr>
-            <w:tcW w:w="2384" w:type="dxa"/>
+            <w:tcW w:w="1843" w:type="dxa"/>
             <w:vAlign w:val="center"/>
           </w:tcPr>
           <w:p>
@@ -2475,25 +2496,122 @@
         </w:tc>
         <w:tc>
           <w:tcPr>
-            <w:tcW w:w="2458" w:type="dxa"/>
-            <w:vAlign w:val="center"/>
-          </w:tcPr>
-          <w:p>
-            <w:pPr>
-              <w:jc w:val="center"/>
-              <w:rPr>
-                <w:rFonts w:ascii="Times New Roman" w:hAnsi="Times New Roman" w:cs="Times New Roman"/>
-                <w:sz w:val="24"/>
-                <w:szCs w:val="24"/>
-              </w:rPr>
-            </w:pPr>
+            <w:tcW w:w="814" w:type="dxa"/>
+            <w:vAlign w:val="center"/>
+          </w:tcPr>
+          <w:p>
+            <w:pPr>
+              <w:jc w:val="center"/>
+              <w:rPr>
+                <w:rFonts w:ascii="Times New Roman" w:hAnsi="Times New Roman" w:cs="Times New Roman"/>
+                <w:sz w:val="24"/>
+                <w:szCs w:val="24"/>
+                <w:lang w:val="en-US"/>
+              </w:rPr>
+            </w:pPr>
+            <w:r>
+              <w:rPr>
+                <w:rFonts w:ascii="Times New Roman" w:hAnsi="Times New Roman" w:cs="Times New Roman"/>
+                <w:sz w:val="24"/>
+                <w:szCs w:val="24"/>
+                <w:lang w:val="en-US"/>
+              </w:rPr>
+              <w:t>{%tc for item in sh %}</w:t>
+            </w:r>
+          </w:p>
+        </w:tc>
+        <w:tc>
+          <w:tcPr>
+            <w:tcW w:w="2164" w:type="dxa"/>
+            <w:vAlign w:val="center"/>
+          </w:tcPr>
+          <w:p>
+            <w:pPr>
+              <w:jc w:val="center"/>
+              <w:rPr>
+                <w:rFonts w:ascii="Times New Roman" w:hAnsi="Times New Roman" w:cs="Times New Roman"/>
+                <w:sz w:val="24"/>
+                <w:szCs w:val="24"/>
+                <w:lang w:val="en-US"/>
+              </w:rPr>
+            </w:pPr>
+            <w:r>
+              <w:rPr>
+                <w:rFonts w:ascii="Times New Roman" w:hAnsi="Times New Roman" w:cs="Times New Roman"/>
+                <w:sz w:val="24"/>
+                <w:szCs w:val="24"/>
+              </w:rPr>
+              <w:t>Семестр</w:t>
+            </w:r>
+            <w:r>
+              <w:rPr>
+                <w:rFonts w:ascii="Times New Roman" w:hAnsi="Times New Roman" w:cs="Times New Roman"/>
+                <w:sz w:val="24"/>
+                <w:szCs w:val="24"/>
+                <w:lang w:val="en-US"/>
+              </w:rPr>
+              <w:t xml:space="preserve"> № </w:t>
+            </w:r>
+            <w:r>
+              <w:rPr>
+                <w:rFonts w:ascii="Times New Roman" w:hAnsi="Times New Roman" w:cs="Times New Roman"/>
+                <w:sz w:val="24"/>
+                <w:szCs w:val="24"/>
+                <w:lang w:val="en-US"/>
+              </w:rPr>
+              <w:t>{{item.num</w:t>
+            </w:r>
+            <w:r>
+              <w:rPr>
+                <w:rFonts w:ascii="Times New Roman" w:hAnsi="Times New Roman" w:cs="Times New Roman"/>
+                <w:sz w:val="24"/>
+                <w:szCs w:val="24"/>
+                <w:lang w:val="en-US"/>
+              </w:rPr>
+              <w:t>}</w:t>
+            </w:r>
+            <w:r>
+              <w:rPr>
+                <w:rFonts w:ascii="Times New Roman" w:hAnsi="Times New Roman" w:cs="Times New Roman"/>
+                <w:sz w:val="24"/>
+                <w:szCs w:val="24"/>
+                <w:lang w:val="en-US"/>
+              </w:rPr>
+              <w:t>}</w:t>
+            </w:r>
+          </w:p>
+        </w:tc>
+        <w:tc>
+          <w:tcPr>
+            <w:tcW w:w="843" w:type="dxa"/>
+            <w:vAlign w:val="center"/>
+          </w:tcPr>
+          <w:p>
+            <w:pPr>
+              <w:jc w:val="center"/>
+              <w:rPr>
+                <w:rFonts w:ascii="Times New Roman" w:hAnsi="Times New Roman" w:cs="Times New Roman"/>
+                <w:sz w:val="24"/>
+                <w:szCs w:val="24"/>
+                <w:lang w:val="en-US"/>
+              </w:rPr>
+            </w:pPr>
+            <w:r>
+              <w:rPr>
+                <w:rFonts w:ascii="Times New Roman" w:hAnsi="Times New Roman" w:cs="Times New Roman"/>
+                <w:sz w:val="24"/>
+                <w:szCs w:val="24"/>
+                <w:lang w:val="en-US"/>
+              </w:rPr>
+              <w:t>{%tc endfor %}</w:t>
+            </w:r>
           </w:p>
         </w:tc>
       </w:tr>
       <w:tr>
         <w:tc>
           <w:tcPr>
-            <w:tcW w:w="4503" w:type="dxa"/>
+            <w:tcW w:w="3681" w:type="dxa"/>
           </w:tcPr>
           <w:p>
             <w:pPr>
@@ -2515,7 +2633,7 @@
         </w:tc>
         <w:tc>
           <w:tcPr>
-            <w:tcW w:w="2384" w:type="dxa"/>
+            <w:tcW w:w="1843" w:type="dxa"/>
             <w:vAlign w:val="center"/>
           </w:tcPr>
           <w:p>
@@ -2565,44 +2683,95 @@
                 <w:szCs w:val="24"/>
                 <w:lang w:val="en-US"/>
               </w:rPr>
-              <w:t>hours_all</w:t>
+              <w:t>aud_</w:t>
+            </w:r>
+            <w:r>
+              <w:rPr>
+                <w:rFonts w:ascii="Times New Roman" w:hAnsi="Times New Roman" w:cs="Times New Roman"/>
+                <w:sz w:val="24"/>
+                <w:szCs w:val="24"/>
+                <w:lang w:val="en-US"/>
+              </w:rPr>
+              <w:t>hours_all}}</w:t>
+            </w:r>
+          </w:p>
+        </w:tc>
+        <w:tc>
+          <w:tcPr>
+            <w:tcW w:w="814" w:type="dxa"/>
+            <w:vAlign w:val="center"/>
+          </w:tcPr>
+          <w:p>
+            <w:pPr>
+              <w:jc w:val="center"/>
+              <w:rPr>
+                <w:rFonts w:ascii="Times New Roman" w:hAnsi="Times New Roman" w:cs="Times New Roman"/>
+                <w:sz w:val="24"/>
+                <w:szCs w:val="24"/>
+                <w:lang w:val="en-US"/>
+              </w:rPr>
+            </w:pPr>
+            <w:r>
+              <w:rPr>
+                <w:rFonts w:ascii="Times New Roman" w:hAnsi="Times New Roman" w:cs="Times New Roman"/>
+                <w:sz w:val="24"/>
+                <w:szCs w:val="24"/>
+                <w:lang w:val="en-US"/>
+              </w:rPr>
+              <w:t>{%tc for item in sh %}</w:t>
+            </w:r>
+          </w:p>
+        </w:tc>
+        <w:tc>
+          <w:tcPr>
+            <w:tcW w:w="2164" w:type="dxa"/>
+            <w:vAlign w:val="center"/>
+          </w:tcPr>
+          <w:p>
+            <w:pPr>
+              <w:jc w:val="center"/>
+              <w:rPr>
+                <w:rFonts w:ascii="Times New Roman" w:hAnsi="Times New Roman" w:cs="Times New Roman"/>
+                <w:sz w:val="24"/>
+                <w:szCs w:val="24"/>
+                <w:lang w:val="en-US"/>
+              </w:rPr>
+            </w:pPr>
+            <w:r>
+              <w:rPr>
+                <w:rFonts w:ascii="Times New Roman" w:hAnsi="Times New Roman" w:cs="Times New Roman"/>
+                <w:sz w:val="24"/>
+                <w:szCs w:val="24"/>
+                <w:lang w:val="en-US"/>
+              </w:rPr>
+              <w:t>{{item.aud_hours}}</w:t>
             </w:r>
             <w:bookmarkStart w:id="0" w:name="_GoBack"/>
             <w:bookmarkEnd w:id="0"/>
-            <w:r>
-              <w:rPr>
-                <w:rFonts w:ascii="Times New Roman" w:hAnsi="Times New Roman" w:cs="Times New Roman"/>
-                <w:sz w:val="24"/>
-                <w:szCs w:val="24"/>
-                <w:lang w:val="en-US"/>
-              </w:rPr>
-              <w:t>}}</w:t>
-            </w:r>
-          </w:p>
-        </w:tc>
-        <w:tc>
-          <w:tcPr>
-            <w:tcW w:w="2458" w:type="dxa"/>
-            <w:vAlign w:val="center"/>
-          </w:tcPr>
-          <w:p>
-            <w:pPr>
-              <w:jc w:val="center"/>
-              <w:rPr>
-                <w:rFonts w:ascii="Times New Roman" w:hAnsi="Times New Roman" w:cs="Times New Roman"/>
-                <w:sz w:val="24"/>
-                <w:szCs w:val="24"/>
-                <w:lang w:val="en-US"/>
-              </w:rPr>
-            </w:pPr>
-            <w:r>
-              <w:rPr>
-                <w:rFonts w:ascii="Times New Roman" w:hAnsi="Times New Roman" w:cs="Times New Roman"/>
-                <w:sz w:val="24"/>
-                <w:szCs w:val="24"/>
-                <w:lang w:val="en-US"/>
-              </w:rPr>
-              <w:t>{{ hours }}</w:t>
+          </w:p>
+        </w:tc>
+        <w:tc>
+          <w:tcPr>
+            <w:tcW w:w="843" w:type="dxa"/>
+          </w:tcPr>
+          <w:p>
+            <w:pPr>
+              <w:jc w:val="center"/>
+              <w:rPr>
+                <w:rFonts w:ascii="Times New Roman" w:hAnsi="Times New Roman" w:cs="Times New Roman"/>
+                <w:sz w:val="24"/>
+                <w:szCs w:val="24"/>
+                <w:lang w:val="en-US"/>
+              </w:rPr>
+            </w:pPr>
+            <w:r>
+              <w:rPr>
+                <w:rFonts w:ascii="Times New Roman" w:hAnsi="Times New Roman" w:cs="Times New Roman"/>
+                <w:sz w:val="24"/>
+                <w:szCs w:val="24"/>
+                <w:lang w:val="en-US"/>
+              </w:rPr>
+              <w:t>{%tc endfor %}</w:t>
             </w:r>
           </w:p>
         </w:tc>
@@ -2610,7 +2779,7 @@
       <w:tr>
         <w:tc>
           <w:tcPr>
-            <w:tcW w:w="4503" w:type="dxa"/>
+            <w:tcW w:w="3681" w:type="dxa"/>
           </w:tcPr>
           <w:p>
             <w:pPr>
@@ -2632,25 +2801,224 @@
         </w:tc>
         <w:tc>
           <w:tcPr>
-            <w:tcW w:w="2384" w:type="dxa"/>
-            <w:vAlign w:val="center"/>
-          </w:tcPr>
-          <w:p>
-            <w:pPr>
-              <w:jc w:val="center"/>
-              <w:rPr>
-                <w:rFonts w:ascii="Times New Roman" w:hAnsi="Times New Roman" w:cs="Times New Roman"/>
-                <w:sz w:val="24"/>
-                <w:szCs w:val="24"/>
-                <w:lang w:val="en-US"/>
-              </w:rPr>
-            </w:pPr>
-            <w:r>
-              <w:rPr>
-                <w:rFonts w:ascii="Times New Roman" w:hAnsi="Times New Roman" w:cs="Times New Roman"/>
-                <w:sz w:val="24"/>
-                <w:szCs w:val="24"/>
-                <w:lang w:val="en-US"/>
+            <w:tcW w:w="1843" w:type="dxa"/>
+            <w:vAlign w:val="center"/>
+          </w:tcPr>
+          <w:p>
+            <w:pPr>
+              <w:jc w:val="center"/>
+              <w:rPr>
+                <w:rFonts w:ascii="Times New Roman" w:hAnsi="Times New Roman" w:cs="Times New Roman"/>
+                <w:sz w:val="24"/>
+                <w:szCs w:val="24"/>
+              </w:rPr>
+            </w:pPr>
+            <w:r>
+              <w:rPr>
+                <w:rFonts w:ascii="Times New Roman" w:hAnsi="Times New Roman" w:cs="Times New Roman"/>
+                <w:sz w:val="24"/>
+                <w:szCs w:val="24"/>
+              </w:rPr>
+              <w:t xml:space="preserve">{{ </w:t>
+            </w:r>
+            <w:r>
+              <w:rPr>
+                <w:rFonts w:ascii="Times New Roman" w:hAnsi="Times New Roman" w:cs="Times New Roman"/>
+                <w:sz w:val="24"/>
+                <w:szCs w:val="24"/>
+                <w:lang w:val="en-US"/>
+              </w:rPr>
+              <w:t>sha</w:t>
+            </w:r>
+            <w:r>
+              <w:rPr>
+                <w:rFonts w:ascii="Times New Roman" w:hAnsi="Times New Roman" w:cs="Times New Roman"/>
+                <w:sz w:val="24"/>
+                <w:szCs w:val="24"/>
+              </w:rPr>
+              <w:t>.</w:t>
+            </w:r>
+            <w:r>
+              <w:rPr>
+                <w:rFonts w:ascii="Times New Roman" w:hAnsi="Times New Roman" w:cs="Times New Roman"/>
+                <w:sz w:val="24"/>
+                <w:szCs w:val="24"/>
+                <w:lang w:val="en-US"/>
+              </w:rPr>
+              <w:t>lekc</w:t>
+            </w:r>
+            <w:r>
+              <w:rPr>
+                <w:rFonts w:ascii="Times New Roman" w:hAnsi="Times New Roman" w:cs="Times New Roman"/>
+                <w:sz w:val="24"/>
+                <w:szCs w:val="24"/>
+              </w:rPr>
+              <w:t>_</w:t>
+            </w:r>
+            <w:r>
+              <w:rPr>
+                <w:rFonts w:ascii="Times New Roman" w:hAnsi="Times New Roman" w:cs="Times New Roman"/>
+                <w:sz w:val="24"/>
+                <w:szCs w:val="24"/>
+                <w:lang w:val="en-US"/>
+              </w:rPr>
+              <w:t>hours</w:t>
+            </w:r>
+            <w:r>
+              <w:rPr>
+                <w:rFonts w:ascii="Times New Roman" w:hAnsi="Times New Roman" w:cs="Times New Roman"/>
+                <w:sz w:val="24"/>
+                <w:szCs w:val="24"/>
+              </w:rPr>
+              <w:t>_</w:t>
+            </w:r>
+            <w:r>
+              <w:rPr>
+                <w:rFonts w:ascii="Times New Roman" w:hAnsi="Times New Roman" w:cs="Times New Roman"/>
+                <w:sz w:val="24"/>
+                <w:szCs w:val="24"/>
+                <w:lang w:val="en-US"/>
+              </w:rPr>
+              <w:t>all</w:t>
+            </w:r>
+            <w:r>
+              <w:rPr>
+                <w:rFonts w:ascii="Times New Roman" w:hAnsi="Times New Roman" w:cs="Times New Roman"/>
+                <w:sz w:val="24"/>
+                <w:szCs w:val="24"/>
+              </w:rPr>
+              <w:t xml:space="preserve"> }}</w:t>
+            </w:r>
+          </w:p>
+        </w:tc>
+        <w:tc>
+          <w:tcPr>
+            <w:tcW w:w="814" w:type="dxa"/>
+            <w:vAlign w:val="center"/>
+          </w:tcPr>
+          <w:p>
+            <w:pPr>
+              <w:jc w:val="center"/>
+              <w:rPr>
+                <w:rFonts w:ascii="Times New Roman" w:hAnsi="Times New Roman" w:cs="Times New Roman"/>
+                <w:sz w:val="24"/>
+                <w:szCs w:val="24"/>
+              </w:rPr>
+            </w:pPr>
+            <w:r>
+              <w:rPr>
+                <w:rFonts w:ascii="Times New Roman" w:hAnsi="Times New Roman" w:cs="Times New Roman"/>
+                <w:sz w:val="24"/>
+                <w:szCs w:val="24"/>
+              </w:rPr>
+              <w:t>{%</w:t>
+            </w:r>
+            <w:r>
+              <w:rPr>
+                <w:rFonts w:ascii="Times New Roman" w:hAnsi="Times New Roman" w:cs="Times New Roman"/>
+                <w:sz w:val="24"/>
+                <w:szCs w:val="24"/>
+                <w:lang w:val="en-US"/>
+              </w:rPr>
+              <w:t>tc</w:t>
+            </w:r>
+            <w:r>
+              <w:rPr>
+                <w:rFonts w:ascii="Times New Roman" w:hAnsi="Times New Roman" w:cs="Times New Roman"/>
+                <w:sz w:val="24"/>
+                <w:szCs w:val="24"/>
+              </w:rPr>
+              <w:t xml:space="preserve"> </w:t>
+            </w:r>
+            <w:r>
+              <w:rPr>
+                <w:rFonts w:ascii="Times New Roman" w:hAnsi="Times New Roman" w:cs="Times New Roman"/>
+                <w:sz w:val="24"/>
+                <w:szCs w:val="24"/>
+                <w:lang w:val="en-US"/>
+              </w:rPr>
+              <w:t>for</w:t>
+            </w:r>
+            <w:r>
+              <w:rPr>
+                <w:rFonts w:ascii="Times New Roman" w:hAnsi="Times New Roman" w:cs="Times New Roman"/>
+                <w:sz w:val="24"/>
+                <w:szCs w:val="24"/>
+              </w:rPr>
+              <w:t xml:space="preserve"> </w:t>
+            </w:r>
+            <w:r>
+              <w:rPr>
+                <w:rFonts w:ascii="Times New Roman" w:hAnsi="Times New Roman" w:cs="Times New Roman"/>
+                <w:sz w:val="24"/>
+                <w:szCs w:val="24"/>
+                <w:lang w:val="en-US"/>
+              </w:rPr>
+              <w:t>item</w:t>
+            </w:r>
+            <w:r>
+              <w:rPr>
+                <w:rFonts w:ascii="Times New Roman" w:hAnsi="Times New Roman" w:cs="Times New Roman"/>
+                <w:sz w:val="24"/>
+                <w:szCs w:val="24"/>
+              </w:rPr>
+              <w:t xml:space="preserve"> </w:t>
+            </w:r>
+            <w:r>
+              <w:rPr>
+                <w:rFonts w:ascii="Times New Roman" w:hAnsi="Times New Roman" w:cs="Times New Roman"/>
+                <w:sz w:val="24"/>
+                <w:szCs w:val="24"/>
+                <w:lang w:val="en-US"/>
+              </w:rPr>
+              <w:t>in</w:t>
+            </w:r>
+            <w:r>
+              <w:rPr>
+                <w:rFonts w:ascii="Times New Roman" w:hAnsi="Times New Roman" w:cs="Times New Roman"/>
+                <w:sz w:val="24"/>
+                <w:szCs w:val="24"/>
+              </w:rPr>
+              <w:t xml:space="preserve"> </w:t>
+            </w:r>
+            <w:r>
+              <w:rPr>
+                <w:rFonts w:ascii="Times New Roman" w:hAnsi="Times New Roman" w:cs="Times New Roman"/>
+                <w:sz w:val="24"/>
+                <w:szCs w:val="24"/>
+                <w:lang w:val="en-US"/>
+              </w:rPr>
+              <w:t>sh</w:t>
+            </w:r>
+            <w:r>
+              <w:rPr>
+                <w:rFonts w:ascii="Times New Roman" w:hAnsi="Times New Roman" w:cs="Times New Roman"/>
+                <w:sz w:val="24"/>
+                <w:szCs w:val="24"/>
+              </w:rPr>
+              <w:t xml:space="preserve"> %}</w:t>
+            </w:r>
+          </w:p>
+        </w:tc>
+        <w:tc>
+          <w:tcPr>
+            <w:tcW w:w="2164" w:type="dxa"/>
+            <w:vAlign w:val="center"/>
+          </w:tcPr>
+          <w:p>
+            <w:pPr>
+              <w:jc w:val="center"/>
+              <w:rPr>
+                <w:rFonts w:ascii="Times New Roman" w:hAnsi="Times New Roman" w:cs="Times New Roman"/>
+                <w:sz w:val="24"/>
+                <w:szCs w:val="24"/>
+              </w:rPr>
+            </w:pPr>
+            <w:r>
+              <w:rPr>
+                <w:rFonts w:ascii="Times New Roman" w:hAnsi="Times New Roman" w:cs="Times New Roman"/>
+                <w:sz w:val="24"/>
+                <w:szCs w:val="24"/>
               </w:rPr>
               <w:t>{{</w:t>
             </w:r>
@@ -2661,6 +3029,97 @@
                 <w:szCs w:val="24"/>
                 <w:lang w:val="en-US"/>
               </w:rPr>
+              <w:t>item</w:t>
+            </w:r>
+            <w:r>
+              <w:rPr>
+                <w:rFonts w:ascii="Times New Roman" w:hAnsi="Times New Roman" w:cs="Times New Roman"/>
+                <w:sz w:val="24"/>
+                <w:szCs w:val="24"/>
+              </w:rPr>
+              <w:t>.</w:t>
+            </w:r>
+            <w:r>
+              <w:rPr>
+                <w:rFonts w:ascii="Times New Roman" w:hAnsi="Times New Roman" w:cs="Times New Roman"/>
+                <w:sz w:val="24"/>
+                <w:szCs w:val="24"/>
+                <w:lang w:val="en-US"/>
+              </w:rPr>
+              <w:t>lekc</w:t>
+            </w:r>
+            <w:r>
+              <w:rPr>
+                <w:rFonts w:ascii="Times New Roman" w:hAnsi="Times New Roman" w:cs="Times New Roman"/>
+                <w:sz w:val="24"/>
+                <w:szCs w:val="24"/>
+              </w:rPr>
+              <w:t>_</w:t>
+            </w:r>
+            <w:r>
+              <w:rPr>
+                <w:rFonts w:ascii="Times New Roman" w:hAnsi="Times New Roman" w:cs="Times New Roman"/>
+                <w:sz w:val="24"/>
+                <w:szCs w:val="24"/>
+                <w:lang w:val="en-US"/>
+              </w:rPr>
+              <w:t>hour</w:t>
+            </w:r>
+            <w:r>
+              <w:rPr>
+                <w:rFonts w:ascii="Times New Roman" w:hAnsi="Times New Roman" w:cs="Times New Roman"/>
+                <w:sz w:val="24"/>
+                <w:szCs w:val="24"/>
+                <w:lang w:val="en-US"/>
+              </w:rPr>
+              <w:t>s</w:t>
+            </w:r>
+            <w:r>
+              <w:rPr>
+                <w:rFonts w:ascii="Times New Roman" w:hAnsi="Times New Roman" w:cs="Times New Roman"/>
+                <w:sz w:val="24"/>
+                <w:szCs w:val="24"/>
+              </w:rPr>
+              <w:t>}}</w:t>
+            </w:r>
+          </w:p>
+        </w:tc>
+        <w:tc>
+          <w:tcPr>
+            <w:tcW w:w="843" w:type="dxa"/>
+          </w:tcPr>
+          <w:p>
+            <w:pPr>
+              <w:jc w:val="center"/>
+              <w:rPr>
+                <w:rFonts w:ascii="Times New Roman" w:hAnsi="Times New Roman" w:cs="Times New Roman"/>
+                <w:sz w:val="24"/>
+                <w:szCs w:val="24"/>
+              </w:rPr>
+            </w:pPr>
+            <w:r>
+              <w:rPr>
+                <w:rFonts w:ascii="Times New Roman" w:hAnsi="Times New Roman" w:cs="Times New Roman"/>
+                <w:sz w:val="24"/>
+                <w:szCs w:val="24"/>
+              </w:rPr>
+              <w:t>{%</w:t>
+            </w:r>
+            <w:r>
+              <w:rPr>
+                <w:rFonts w:ascii="Times New Roman" w:hAnsi="Times New Roman" w:cs="Times New Roman"/>
+                <w:sz w:val="24"/>
+                <w:szCs w:val="24"/>
+                <w:lang w:val="en-US"/>
+              </w:rPr>
+              <w:t>tc</w:t>
+            </w:r>
+            <w:r>
+              <w:rPr>
+                <w:rFonts w:ascii="Times New Roman" w:hAnsi="Times New Roman" w:cs="Times New Roman"/>
+                <w:sz w:val="24"/>
+                <w:szCs w:val="24"/>
+              </w:rPr>
               <w:t xml:space="preserve"> </w:t>
             </w:r>
             <w:r>
@@ -2670,51 +3129,15 @@
                 <w:szCs w:val="24"/>
                 <w:lang w:val="en-US"/>
               </w:rPr>
-              <w:t>sha</w:t>
-            </w:r>
-            <w:r>
-              <w:rPr>
-                <w:rFonts w:ascii="Times New Roman" w:hAnsi="Times New Roman" w:cs="Times New Roman"/>
-                <w:sz w:val="24"/>
-                <w:szCs w:val="24"/>
-                <w:lang w:val="en-US"/>
-              </w:rPr>
-              <w:t>.</w:t>
-            </w:r>
-            <w:r>
-              <w:rPr>
-                <w:rFonts w:ascii="Times New Roman" w:hAnsi="Times New Roman" w:cs="Times New Roman"/>
-                <w:sz w:val="24"/>
-                <w:szCs w:val="24"/>
-                <w:lang w:val="en-US"/>
-              </w:rPr>
-              <w:t>aud_hours_all }}</w:t>
-            </w:r>
-          </w:p>
-        </w:tc>
-        <w:tc>
-          <w:tcPr>
-            <w:tcW w:w="2458" w:type="dxa"/>
-            <w:vAlign w:val="center"/>
-          </w:tcPr>
-          <w:p>
-            <w:pPr>
-              <w:jc w:val="center"/>
-              <w:rPr>
-                <w:rFonts w:ascii="Times New Roman" w:hAnsi="Times New Roman" w:cs="Times New Roman"/>
-                <w:sz w:val="24"/>
-                <w:szCs w:val="24"/>
-                <w:lang w:val="en-US"/>
-              </w:rPr>
-            </w:pPr>
-            <w:r>
-              <w:rPr>
-                <w:rFonts w:ascii="Times New Roman" w:hAnsi="Times New Roman" w:cs="Times New Roman"/>
-                <w:sz w:val="24"/>
-                <w:szCs w:val="24"/>
-                <w:lang w:val="en-US"/>
-              </w:rPr>
-              <w:t>{{ aud_hours }}</w:t>
+              <w:t>endfor</w:t>
+            </w:r>
+            <w:r>
+              <w:rPr>
+                <w:rFonts w:ascii="Times New Roman" w:hAnsi="Times New Roman" w:cs="Times New Roman"/>
+                <w:sz w:val="24"/>
+                <w:szCs w:val="24"/>
+              </w:rPr>
+              <w:t xml:space="preserve"> %}</w:t>
             </w:r>
           </w:p>
         </w:tc>
@@ -2722,47 +3145,70 @@
       <w:tr>
         <w:tc>
           <w:tcPr>
-            <w:tcW w:w="4503" w:type="dxa"/>
-          </w:tcPr>
-          <w:p>
-            <w:pPr>
-              <w:rPr>
-                <w:rFonts w:ascii="Times New Roman" w:hAnsi="Times New Roman" w:cs="Times New Roman"/>
-                <w:sz w:val="24"/>
-                <w:szCs w:val="24"/>
-              </w:rPr>
-            </w:pPr>
-            <w:r>
-              <w:rPr>
-                <w:rFonts w:ascii="Times New Roman" w:hAnsi="Times New Roman" w:cs="Times New Roman"/>
-                <w:sz w:val="24"/>
-                <w:szCs w:val="24"/>
-              </w:rPr>
-              <w:t xml:space="preserve">    лабораторные работы</w:t>
-            </w:r>
-          </w:p>
-        </w:tc>
-        <w:tc>
-          <w:tcPr>
-            <w:tcW w:w="2384" w:type="dxa"/>
-            <w:vAlign w:val="center"/>
-          </w:tcPr>
-          <w:p>
-            <w:pPr>
-              <w:jc w:val="center"/>
-              <w:rPr>
-                <w:rFonts w:ascii="Times New Roman" w:hAnsi="Times New Roman" w:cs="Times New Roman"/>
-                <w:sz w:val="24"/>
-                <w:szCs w:val="24"/>
-                <w:lang w:val="en-US"/>
-              </w:rPr>
-            </w:pPr>
-            <w:r>
-              <w:rPr>
-                <w:rFonts w:ascii="Times New Roman" w:hAnsi="Times New Roman" w:cs="Times New Roman"/>
-                <w:sz w:val="24"/>
-                <w:szCs w:val="24"/>
-                <w:lang w:val="en-US"/>
+            <w:tcW w:w="3681" w:type="dxa"/>
+          </w:tcPr>
+          <w:p>
+            <w:pPr>
+              <w:rPr>
+                <w:rFonts w:ascii="Times New Roman" w:hAnsi="Times New Roman" w:cs="Times New Roman"/>
+                <w:sz w:val="24"/>
+                <w:szCs w:val="24"/>
+              </w:rPr>
+            </w:pPr>
+            <w:r>
+              <w:rPr>
+                <w:rFonts w:ascii="Times New Roman" w:hAnsi="Times New Roman" w:cs="Times New Roman"/>
+                <w:sz w:val="24"/>
+                <w:szCs w:val="24"/>
+              </w:rPr>
+              <w:lastRenderedPageBreak/>
+              <w:t xml:space="preserve">    </w:t>
+            </w:r>
+            <w:r>
+              <w:rPr>
+                <w:rFonts w:ascii="Times New Roman" w:hAnsi="Times New Roman" w:cs="Times New Roman"/>
+                <w:sz w:val="24"/>
+                <w:szCs w:val="24"/>
+              </w:rPr>
+              <w:t>лабораторные</w:t>
+            </w:r>
+            <w:r>
+              <w:rPr>
+                <w:rFonts w:ascii="Times New Roman" w:hAnsi="Times New Roman" w:cs="Times New Roman"/>
+                <w:sz w:val="24"/>
+                <w:szCs w:val="24"/>
+              </w:rPr>
+              <w:t xml:space="preserve"> </w:t>
+            </w:r>
+            <w:r>
+              <w:rPr>
+                <w:rFonts w:ascii="Times New Roman" w:hAnsi="Times New Roman" w:cs="Times New Roman"/>
+                <w:sz w:val="24"/>
+                <w:szCs w:val="24"/>
+              </w:rPr>
+              <w:t>работы</w:t>
+            </w:r>
+          </w:p>
+        </w:tc>
+        <w:tc>
+          <w:tcPr>
+            <w:tcW w:w="1843" w:type="dxa"/>
+            <w:vAlign w:val="center"/>
+          </w:tcPr>
+          <w:p>
+            <w:pPr>
+              <w:jc w:val="center"/>
+              <w:rPr>
+                <w:rFonts w:ascii="Times New Roman" w:hAnsi="Times New Roman" w:cs="Times New Roman"/>
+                <w:sz w:val="24"/>
+                <w:szCs w:val="24"/>
+              </w:rPr>
+            </w:pPr>
+            <w:r>
+              <w:rPr>
+                <w:rFonts w:ascii="Times New Roman" w:hAnsi="Times New Roman" w:cs="Times New Roman"/>
+                <w:sz w:val="24"/>
+                <w:szCs w:val="24"/>
               </w:rPr>
               <w:t xml:space="preserve">{{ </w:t>
             </w:r>
@@ -2780,7 +3226,6 @@
                 <w:rFonts w:ascii="Times New Roman" w:hAnsi="Times New Roman" w:cs="Times New Roman"/>
                 <w:sz w:val="24"/>
                 <w:szCs w:val="24"/>
-                <w:lang w:val="en-US"/>
               </w:rPr>
               <w:t>.</w:t>
             </w:r>
@@ -2791,33 +3236,237 @@
                 <w:szCs w:val="24"/>
                 <w:lang w:val="en-US"/>
               </w:rPr>
-              <w:t>lab_hours_all }}</w:t>
-            </w:r>
-          </w:p>
-        </w:tc>
-        <w:tc>
-          <w:tcPr>
-            <w:tcW w:w="2458" w:type="dxa"/>
-            <w:vAlign w:val="center"/>
-          </w:tcPr>
-          <w:p>
-            <w:pPr>
-              <w:jc w:val="center"/>
-              <w:rPr>
-                <w:rFonts w:ascii="Times New Roman" w:hAnsi="Times New Roman" w:cs="Times New Roman"/>
-                <w:sz w:val="24"/>
-                <w:szCs w:val="24"/>
-                <w:lang w:val="en-US"/>
-              </w:rPr>
-            </w:pPr>
-            <w:r>
-              <w:rPr>
-                <w:rFonts w:ascii="Times New Roman" w:hAnsi="Times New Roman" w:cs="Times New Roman"/>
-                <w:sz w:val="24"/>
-                <w:szCs w:val="24"/>
-                <w:lang w:val="en-US"/>
-              </w:rPr>
-              <w:t>{{ lab_hours }}</w:t>
+              <w:t>lab</w:t>
+            </w:r>
+            <w:r>
+              <w:rPr>
+                <w:rFonts w:ascii="Times New Roman" w:hAnsi="Times New Roman" w:cs="Times New Roman"/>
+                <w:sz w:val="24"/>
+                <w:szCs w:val="24"/>
+              </w:rPr>
+              <w:t>_</w:t>
+            </w:r>
+            <w:r>
+              <w:rPr>
+                <w:rFonts w:ascii="Times New Roman" w:hAnsi="Times New Roman" w:cs="Times New Roman"/>
+                <w:sz w:val="24"/>
+                <w:szCs w:val="24"/>
+                <w:lang w:val="en-US"/>
+              </w:rPr>
+              <w:t>hours</w:t>
+            </w:r>
+            <w:r>
+              <w:rPr>
+                <w:rFonts w:ascii="Times New Roman" w:hAnsi="Times New Roman" w:cs="Times New Roman"/>
+                <w:sz w:val="24"/>
+                <w:szCs w:val="24"/>
+              </w:rPr>
+              <w:t>_</w:t>
+            </w:r>
+            <w:r>
+              <w:rPr>
+                <w:rFonts w:ascii="Times New Roman" w:hAnsi="Times New Roman" w:cs="Times New Roman"/>
+                <w:sz w:val="24"/>
+                <w:szCs w:val="24"/>
+                <w:lang w:val="en-US"/>
+              </w:rPr>
+              <w:t>all</w:t>
+            </w:r>
+            <w:r>
+              <w:rPr>
+                <w:rFonts w:ascii="Times New Roman" w:hAnsi="Times New Roman" w:cs="Times New Roman"/>
+                <w:sz w:val="24"/>
+                <w:szCs w:val="24"/>
+              </w:rPr>
+              <w:t xml:space="preserve"> }}</w:t>
+            </w:r>
+          </w:p>
+        </w:tc>
+        <w:tc>
+          <w:tcPr>
+            <w:tcW w:w="814" w:type="dxa"/>
+            <w:vAlign w:val="center"/>
+          </w:tcPr>
+          <w:p>
+            <w:pPr>
+              <w:jc w:val="center"/>
+              <w:rPr>
+                <w:rFonts w:ascii="Times New Roman" w:hAnsi="Times New Roman" w:cs="Times New Roman"/>
+                <w:sz w:val="24"/>
+                <w:szCs w:val="24"/>
+                <w:lang w:val="en-US"/>
+              </w:rPr>
+            </w:pPr>
+            <w:r>
+              <w:rPr>
+                <w:rFonts w:ascii="Times New Roman" w:hAnsi="Times New Roman" w:cs="Times New Roman"/>
+                <w:sz w:val="24"/>
+                <w:szCs w:val="24"/>
+              </w:rPr>
+              <w:t>{%</w:t>
+            </w:r>
+            <w:r>
+              <w:rPr>
+                <w:rFonts w:ascii="Times New Roman" w:hAnsi="Times New Roman" w:cs="Times New Roman"/>
+                <w:sz w:val="24"/>
+                <w:szCs w:val="24"/>
+                <w:lang w:val="en-US"/>
+              </w:rPr>
+              <w:t>tc</w:t>
+            </w:r>
+            <w:r>
+              <w:rPr>
+                <w:rFonts w:ascii="Times New Roman" w:hAnsi="Times New Roman" w:cs="Times New Roman"/>
+                <w:sz w:val="24"/>
+                <w:szCs w:val="24"/>
+              </w:rPr>
+              <w:t xml:space="preserve"> </w:t>
+            </w:r>
+            <w:r>
+              <w:rPr>
+                <w:rFonts w:ascii="Times New Roman" w:hAnsi="Times New Roman" w:cs="Times New Roman"/>
+                <w:sz w:val="24"/>
+                <w:szCs w:val="24"/>
+                <w:lang w:val="en-US"/>
+              </w:rPr>
+              <w:t>for</w:t>
+            </w:r>
+            <w:r>
+              <w:rPr>
+                <w:rFonts w:ascii="Times New Roman" w:hAnsi="Times New Roman" w:cs="Times New Roman"/>
+                <w:sz w:val="24"/>
+                <w:szCs w:val="24"/>
+              </w:rPr>
+              <w:t xml:space="preserve"> </w:t>
+            </w:r>
+            <w:r>
+              <w:rPr>
+                <w:rFonts w:ascii="Times New Roman" w:hAnsi="Times New Roman" w:cs="Times New Roman"/>
+                <w:sz w:val="24"/>
+                <w:szCs w:val="24"/>
+                <w:lang w:val="en-US"/>
+              </w:rPr>
+              <w:t>item</w:t>
+            </w:r>
+            <w:r>
+              <w:rPr>
+                <w:rFonts w:ascii="Times New Roman" w:hAnsi="Times New Roman" w:cs="Times New Roman"/>
+                <w:sz w:val="24"/>
+                <w:szCs w:val="24"/>
+              </w:rPr>
+              <w:t xml:space="preserve"> </w:t>
+            </w:r>
+            <w:r>
+              <w:rPr>
+                <w:rFonts w:ascii="Times New Roman" w:hAnsi="Times New Roman" w:cs="Times New Roman"/>
+                <w:sz w:val="24"/>
+                <w:szCs w:val="24"/>
+                <w:lang w:val="en-US"/>
+              </w:rPr>
+              <w:t>in</w:t>
+            </w:r>
+            <w:r>
+              <w:rPr>
+                <w:rFonts w:ascii="Times New Roman" w:hAnsi="Times New Roman" w:cs="Times New Roman"/>
+                <w:sz w:val="24"/>
+                <w:szCs w:val="24"/>
+              </w:rPr>
+              <w:t xml:space="preserve"> </w:t>
+            </w:r>
+            <w:r>
+              <w:rPr>
+                <w:rFonts w:ascii="Times New Roman" w:hAnsi="Times New Roman" w:cs="Times New Roman"/>
+                <w:sz w:val="24"/>
+                <w:szCs w:val="24"/>
+                <w:lang w:val="en-US"/>
+              </w:rPr>
+              <w:t>sh</w:t>
+            </w:r>
+            <w:r>
+              <w:rPr>
+                <w:rFonts w:ascii="Times New Roman" w:hAnsi="Times New Roman" w:cs="Times New Roman"/>
+                <w:sz w:val="24"/>
+                <w:szCs w:val="24"/>
+              </w:rPr>
+              <w:t xml:space="preserve"> %</w:t>
+            </w:r>
+            <w:r>
+              <w:rPr>
+                <w:rFonts w:ascii="Times New Roman" w:hAnsi="Times New Roman" w:cs="Times New Roman"/>
+                <w:sz w:val="24"/>
+                <w:szCs w:val="24"/>
+                <w:lang w:val="en-US"/>
+              </w:rPr>
+              <w:t>}</w:t>
+            </w:r>
+          </w:p>
+        </w:tc>
+        <w:tc>
+          <w:tcPr>
+            <w:tcW w:w="2164" w:type="dxa"/>
+            <w:vAlign w:val="center"/>
+          </w:tcPr>
+          <w:p>
+            <w:pPr>
+              <w:jc w:val="center"/>
+              <w:rPr>
+                <w:rFonts w:ascii="Times New Roman" w:hAnsi="Times New Roman" w:cs="Times New Roman"/>
+                <w:sz w:val="24"/>
+                <w:szCs w:val="24"/>
+                <w:lang w:val="en-US"/>
+              </w:rPr>
+            </w:pPr>
+            <w:r>
+              <w:rPr>
+                <w:rFonts w:ascii="Times New Roman" w:hAnsi="Times New Roman" w:cs="Times New Roman"/>
+                <w:sz w:val="24"/>
+                <w:szCs w:val="24"/>
+                <w:lang w:val="en-US"/>
+              </w:rPr>
+              <w:t>{{item.lab_hour</w:t>
+            </w:r>
+            <w:r>
+              <w:rPr>
+                <w:rFonts w:ascii="Times New Roman" w:hAnsi="Times New Roman" w:cs="Times New Roman"/>
+                <w:sz w:val="24"/>
+                <w:szCs w:val="24"/>
+                <w:lang w:val="en-US"/>
+              </w:rPr>
+              <w:t>s</w:t>
+            </w:r>
+            <w:r>
+              <w:rPr>
+                <w:rFonts w:ascii="Times New Roman" w:hAnsi="Times New Roman" w:cs="Times New Roman"/>
+                <w:sz w:val="24"/>
+                <w:szCs w:val="24"/>
+                <w:lang w:val="en-US"/>
+              </w:rPr>
+              <w:t>}}</w:t>
+            </w:r>
+          </w:p>
+        </w:tc>
+        <w:tc>
+          <w:tcPr>
+            <w:tcW w:w="843" w:type="dxa"/>
+          </w:tcPr>
+          <w:p>
+            <w:pPr>
+              <w:jc w:val="center"/>
+              <w:rPr>
+                <w:rFonts w:ascii="Times New Roman" w:hAnsi="Times New Roman" w:cs="Times New Roman"/>
+                <w:sz w:val="24"/>
+                <w:szCs w:val="24"/>
+                <w:lang w:val="en-US"/>
+              </w:rPr>
+            </w:pPr>
+            <w:r>
+              <w:rPr>
+                <w:rFonts w:ascii="Times New Roman" w:hAnsi="Times New Roman" w:cs="Times New Roman"/>
+                <w:sz w:val="24"/>
+                <w:szCs w:val="24"/>
+                <w:lang w:val="en-US"/>
+              </w:rPr>
+              <w:t>{%tc endfor %}</w:t>
             </w:r>
           </w:p>
         </w:tc>
@@ -2825,29 +3474,38 @@
       <w:tr>
         <w:tc>
           <w:tcPr>
-            <w:tcW w:w="4503" w:type="dxa"/>
-          </w:tcPr>
-          <w:p>
-            <w:pPr>
-              <w:rPr>
-                <w:rFonts w:ascii="Times New Roman" w:hAnsi="Times New Roman" w:cs="Times New Roman"/>
-                <w:sz w:val="24"/>
-                <w:szCs w:val="24"/>
-              </w:rPr>
-            </w:pPr>
-            <w:r>
-              <w:rPr>
-                <w:rFonts w:ascii="Times New Roman" w:hAnsi="Times New Roman" w:cs="Times New Roman"/>
-                <w:sz w:val="24"/>
-                <w:szCs w:val="24"/>
-              </w:rPr>
-              <w:t xml:space="preserve">    практические/семинарские занятия</w:t>
-            </w:r>
-          </w:p>
-        </w:tc>
-        <w:tc>
-          <w:tcPr>
-            <w:tcW w:w="2384" w:type="dxa"/>
+            <w:tcW w:w="3681" w:type="dxa"/>
+          </w:tcPr>
+          <w:p>
+            <w:pPr>
+              <w:rPr>
+                <w:rFonts w:ascii="Times New Roman" w:hAnsi="Times New Roman" w:cs="Times New Roman"/>
+                <w:sz w:val="24"/>
+                <w:szCs w:val="24"/>
+              </w:rPr>
+            </w:pPr>
+            <w:r>
+              <w:rPr>
+                <w:rFonts w:ascii="Times New Roman" w:hAnsi="Times New Roman" w:cs="Times New Roman"/>
+                <w:sz w:val="24"/>
+                <w:szCs w:val="24"/>
+                <w:lang w:val="en-US"/>
+              </w:rPr>
+              <w:t xml:space="preserve">    </w:t>
+            </w:r>
+            <w:r>
+              <w:rPr>
+                <w:rFonts w:ascii="Times New Roman" w:hAnsi="Times New Roman" w:cs="Times New Roman"/>
+                <w:sz w:val="24"/>
+                <w:szCs w:val="24"/>
+              </w:rPr>
+              <w:t>практические/семинарские занятия</w:t>
+            </w:r>
+          </w:p>
+        </w:tc>
+        <w:tc>
+          <w:tcPr>
+            <w:tcW w:w="1843" w:type="dxa"/>
             <w:vAlign w:val="center"/>
           </w:tcPr>
           <w:p>
@@ -2900,27 +3558,96 @@
         </w:tc>
         <w:tc>
           <w:tcPr>
-            <w:tcW w:w="2458" w:type="dxa"/>
-            <w:vAlign w:val="center"/>
-          </w:tcPr>
-          <w:p>
-            <w:pPr>
-              <w:jc w:val="center"/>
-              <w:rPr>
-                <w:rFonts w:ascii="Times New Roman" w:hAnsi="Times New Roman" w:cs="Times New Roman"/>
-                <w:sz w:val="24"/>
-                <w:szCs w:val="24"/>
-                <w:lang w:val="en-US"/>
-              </w:rPr>
-            </w:pPr>
-            <w:r>
-              <w:rPr>
-                <w:rFonts w:ascii="Times New Roman" w:hAnsi="Times New Roman" w:cs="Times New Roman"/>
-                <w:sz w:val="24"/>
-                <w:szCs w:val="24"/>
-                <w:lang w:val="en-US"/>
-              </w:rPr>
-              <w:t>{{ pr_hours }}</w:t>
+            <w:tcW w:w="814" w:type="dxa"/>
+            <w:vAlign w:val="center"/>
+          </w:tcPr>
+          <w:p>
+            <w:pPr>
+              <w:jc w:val="center"/>
+              <w:rPr>
+                <w:rFonts w:ascii="Times New Roman" w:hAnsi="Times New Roman" w:cs="Times New Roman"/>
+                <w:sz w:val="24"/>
+                <w:szCs w:val="24"/>
+                <w:lang w:val="en-US"/>
+              </w:rPr>
+            </w:pPr>
+            <w:r>
+              <w:rPr>
+                <w:rFonts w:ascii="Times New Roman" w:hAnsi="Times New Roman" w:cs="Times New Roman"/>
+                <w:sz w:val="24"/>
+                <w:szCs w:val="24"/>
+                <w:lang w:val="en-US"/>
+              </w:rPr>
+              <w:t>{%tc for item in sh %}</w:t>
+            </w:r>
+          </w:p>
+        </w:tc>
+        <w:tc>
+          <w:tcPr>
+            <w:tcW w:w="2164" w:type="dxa"/>
+            <w:vAlign w:val="center"/>
+          </w:tcPr>
+          <w:p>
+            <w:pPr>
+              <w:jc w:val="center"/>
+              <w:rPr>
+                <w:rFonts w:ascii="Times New Roman" w:hAnsi="Times New Roman" w:cs="Times New Roman"/>
+                <w:sz w:val="24"/>
+                <w:szCs w:val="24"/>
+                <w:lang w:val="en-US"/>
+              </w:rPr>
+            </w:pPr>
+            <w:r>
+              <w:rPr>
+                <w:rFonts w:ascii="Times New Roman" w:hAnsi="Times New Roman" w:cs="Times New Roman"/>
+                <w:sz w:val="24"/>
+                <w:szCs w:val="24"/>
+                <w:lang w:val="en-US"/>
+              </w:rPr>
+              <w:t>{{item.pr_hour</w:t>
+            </w:r>
+            <w:r>
+              <w:rPr>
+                <w:rFonts w:ascii="Times New Roman" w:hAnsi="Times New Roman" w:cs="Times New Roman"/>
+                <w:sz w:val="24"/>
+                <w:szCs w:val="24"/>
+                <w:lang w:val="en-US"/>
+              </w:rPr>
+              <w:t>s</w:t>
+            </w:r>
+            <w:r>
+              <w:rPr>
+                <w:rFonts w:ascii="Times New Roman" w:hAnsi="Times New Roman" w:cs="Times New Roman"/>
+                <w:sz w:val="24"/>
+                <w:szCs w:val="24"/>
+                <w:lang w:val="en-US"/>
+              </w:rPr>
+              <w:t>}}</w:t>
+            </w:r>
+          </w:p>
+        </w:tc>
+        <w:tc>
+          <w:tcPr>
+            <w:tcW w:w="843" w:type="dxa"/>
+          </w:tcPr>
+          <w:p>
+            <w:pPr>
+              <w:jc w:val="center"/>
+              <w:rPr>
+                <w:rFonts w:ascii="Times New Roman" w:hAnsi="Times New Roman" w:cs="Times New Roman"/>
+                <w:sz w:val="24"/>
+                <w:szCs w:val="24"/>
+                <w:lang w:val="en-US"/>
+              </w:rPr>
+            </w:pPr>
+            <w:r>
+              <w:rPr>
+                <w:rFonts w:ascii="Times New Roman" w:hAnsi="Times New Roman" w:cs="Times New Roman"/>
+                <w:sz w:val="24"/>
+                <w:szCs w:val="24"/>
+                <w:lang w:val="en-US"/>
+              </w:rPr>
+              <w:t>{%tc endfor %}</w:t>
             </w:r>
           </w:p>
         </w:tc>
@@ -2928,7 +3655,7 @@
       <w:tr>
         <w:tc>
           <w:tcPr>
-            <w:tcW w:w="4503" w:type="dxa"/>
+            <w:tcW w:w="3681" w:type="dxa"/>
           </w:tcPr>
           <w:p>
             <w:pPr>
@@ -2950,7 +3677,7 @@
         </w:tc>
         <w:tc>
           <w:tcPr>
-            <w:tcW w:w="2384" w:type="dxa"/>
+            <w:tcW w:w="1843" w:type="dxa"/>
             <w:vAlign w:val="center"/>
           </w:tcPr>
           <w:p>
@@ -3003,27 +3730,96 @@
         </w:tc>
         <w:tc>
           <w:tcPr>
-            <w:tcW w:w="2458" w:type="dxa"/>
-            <w:vAlign w:val="center"/>
-          </w:tcPr>
-          <w:p>
-            <w:pPr>
-              <w:jc w:val="center"/>
-              <w:rPr>
-                <w:rFonts w:ascii="Times New Roman" w:hAnsi="Times New Roman" w:cs="Times New Roman"/>
-                <w:sz w:val="24"/>
-                <w:szCs w:val="24"/>
-                <w:lang w:val="en-US"/>
-              </w:rPr>
-            </w:pPr>
-            <w:r>
-              <w:rPr>
-                <w:rFonts w:ascii="Times New Roman" w:hAnsi="Times New Roman" w:cs="Times New Roman"/>
-                <w:sz w:val="24"/>
-                <w:szCs w:val="24"/>
-                <w:lang w:val="en-US"/>
-              </w:rPr>
-              <w:t>{{ srs_hours }}</w:t>
+            <w:tcW w:w="814" w:type="dxa"/>
+            <w:vAlign w:val="center"/>
+          </w:tcPr>
+          <w:p>
+            <w:pPr>
+              <w:jc w:val="center"/>
+              <w:rPr>
+                <w:rFonts w:ascii="Times New Roman" w:hAnsi="Times New Roman" w:cs="Times New Roman"/>
+                <w:sz w:val="24"/>
+                <w:szCs w:val="24"/>
+                <w:lang w:val="en-US"/>
+              </w:rPr>
+            </w:pPr>
+            <w:r>
+              <w:rPr>
+                <w:rFonts w:ascii="Times New Roman" w:hAnsi="Times New Roman" w:cs="Times New Roman"/>
+                <w:sz w:val="24"/>
+                <w:szCs w:val="24"/>
+                <w:lang w:val="en-US"/>
+              </w:rPr>
+              <w:t>{%tc for item in sh %}</w:t>
+            </w:r>
+          </w:p>
+        </w:tc>
+        <w:tc>
+          <w:tcPr>
+            <w:tcW w:w="2164" w:type="dxa"/>
+            <w:vAlign w:val="center"/>
+          </w:tcPr>
+          <w:p>
+            <w:pPr>
+              <w:jc w:val="center"/>
+              <w:rPr>
+                <w:rFonts w:ascii="Times New Roman" w:hAnsi="Times New Roman" w:cs="Times New Roman"/>
+                <w:sz w:val="24"/>
+                <w:szCs w:val="24"/>
+                <w:lang w:val="en-US"/>
+              </w:rPr>
+            </w:pPr>
+            <w:r>
+              <w:rPr>
+                <w:rFonts w:ascii="Times New Roman" w:hAnsi="Times New Roman" w:cs="Times New Roman"/>
+                <w:sz w:val="24"/>
+                <w:szCs w:val="24"/>
+                <w:lang w:val="en-US"/>
+              </w:rPr>
+              <w:t>{{item.srs_hour</w:t>
+            </w:r>
+            <w:r>
+              <w:rPr>
+                <w:rFonts w:ascii="Times New Roman" w:hAnsi="Times New Roman" w:cs="Times New Roman"/>
+                <w:sz w:val="24"/>
+                <w:szCs w:val="24"/>
+                <w:lang w:val="en-US"/>
+              </w:rPr>
+              <w:t>s</w:t>
+            </w:r>
+            <w:r>
+              <w:rPr>
+                <w:rFonts w:ascii="Times New Roman" w:hAnsi="Times New Roman" w:cs="Times New Roman"/>
+                <w:sz w:val="24"/>
+                <w:szCs w:val="24"/>
+                <w:lang w:val="en-US"/>
+              </w:rPr>
+              <w:t>}}</w:t>
+            </w:r>
+          </w:p>
+        </w:tc>
+        <w:tc>
+          <w:tcPr>
+            <w:tcW w:w="843" w:type="dxa"/>
+          </w:tcPr>
+          <w:p>
+            <w:pPr>
+              <w:jc w:val="center"/>
+              <w:rPr>
+                <w:rFonts w:ascii="Times New Roman" w:hAnsi="Times New Roman" w:cs="Times New Roman"/>
+                <w:sz w:val="24"/>
+                <w:szCs w:val="24"/>
+                <w:lang w:val="en-US"/>
+              </w:rPr>
+            </w:pPr>
+            <w:r>
+              <w:rPr>
+                <w:rFonts w:ascii="Times New Roman" w:hAnsi="Times New Roman" w:cs="Times New Roman"/>
+                <w:sz w:val="24"/>
+                <w:szCs w:val="24"/>
+                <w:lang w:val="en-US"/>
+              </w:rPr>
+              <w:t>{%tc endfor %}</w:t>
             </w:r>
           </w:p>
         </w:tc>
@@ -3031,7 +3827,7 @@
       <w:tr>
         <w:tc>
           <w:tcPr>
-            <w:tcW w:w="4503" w:type="dxa"/>
+            <w:tcW w:w="3681" w:type="dxa"/>
           </w:tcPr>
           <w:p>
             <w:pPr>
@@ -3053,43 +3849,112 @@
         </w:tc>
         <w:tc>
           <w:tcPr>
-            <w:tcW w:w="2384" w:type="dxa"/>
-            <w:vAlign w:val="center"/>
-          </w:tcPr>
-          <w:p>
-            <w:pPr>
-              <w:jc w:val="center"/>
-              <w:rPr>
-                <w:rFonts w:ascii="Times New Roman" w:hAnsi="Times New Roman" w:cs="Times New Roman"/>
-                <w:sz w:val="24"/>
-                <w:szCs w:val="24"/>
-                <w:lang w:val="en-US"/>
-              </w:rPr>
-            </w:pPr>
-          </w:p>
-        </w:tc>
-        <w:tc>
-          <w:tcPr>
-            <w:tcW w:w="2458" w:type="dxa"/>
-            <w:vAlign w:val="center"/>
-          </w:tcPr>
-          <w:p>
-            <w:pPr>
-              <w:jc w:val="center"/>
-              <w:rPr>
-                <w:rFonts w:ascii="Times New Roman" w:hAnsi="Times New Roman" w:cs="Times New Roman"/>
-                <w:sz w:val="24"/>
-                <w:szCs w:val="24"/>
-                <w:lang w:val="en-US"/>
-              </w:rPr>
-            </w:pPr>
+            <w:tcW w:w="1843" w:type="dxa"/>
+            <w:vAlign w:val="center"/>
+          </w:tcPr>
+          <w:p>
+            <w:pPr>
+              <w:jc w:val="center"/>
+              <w:rPr>
+                <w:rFonts w:ascii="Times New Roman" w:hAnsi="Times New Roman" w:cs="Times New Roman"/>
+                <w:sz w:val="24"/>
+                <w:szCs w:val="24"/>
+                <w:lang w:val="en-US"/>
+              </w:rPr>
+            </w:pPr>
+            <w:r>
+              <w:rPr>
+                <w:rFonts w:ascii="Times New Roman" w:hAnsi="Times New Roman" w:cs="Times New Roman"/>
+                <w:sz w:val="24"/>
+                <w:szCs w:val="24"/>
+                <w:lang w:val="en-US"/>
+              </w:rPr>
+              <w:t>{{ sha.ekz_hours_all}}</w:t>
+            </w:r>
+          </w:p>
+        </w:tc>
+        <w:tc>
+          <w:tcPr>
+            <w:tcW w:w="814" w:type="dxa"/>
+            <w:vAlign w:val="center"/>
+          </w:tcPr>
+          <w:p>
+            <w:pPr>
+              <w:jc w:val="center"/>
+              <w:rPr>
+                <w:rFonts w:ascii="Times New Roman" w:hAnsi="Times New Roman" w:cs="Times New Roman"/>
+                <w:sz w:val="24"/>
+                <w:szCs w:val="24"/>
+                <w:lang w:val="en-US"/>
+              </w:rPr>
+            </w:pPr>
+            <w:r>
+              <w:rPr>
+                <w:rFonts w:ascii="Times New Roman" w:hAnsi="Times New Roman" w:cs="Times New Roman"/>
+                <w:sz w:val="24"/>
+                <w:szCs w:val="24"/>
+                <w:lang w:val="en-US"/>
+              </w:rPr>
+              <w:t>{%tc for item in sh %}</w:t>
+            </w:r>
+          </w:p>
+        </w:tc>
+        <w:tc>
+          <w:tcPr>
+            <w:tcW w:w="2164" w:type="dxa"/>
+            <w:vAlign w:val="center"/>
+          </w:tcPr>
+          <w:p>
+            <w:pPr>
+              <w:jc w:val="center"/>
+              <w:rPr>
+                <w:rFonts w:ascii="Times New Roman" w:hAnsi="Times New Roman" w:cs="Times New Roman"/>
+                <w:sz w:val="24"/>
+                <w:szCs w:val="24"/>
+                <w:lang w:val="en-US"/>
+              </w:rPr>
+            </w:pPr>
+            <w:r>
+              <w:rPr>
+                <w:rFonts w:ascii="Times New Roman" w:hAnsi="Times New Roman" w:cs="Times New Roman"/>
+                <w:sz w:val="24"/>
+                <w:szCs w:val="24"/>
+                <w:lang w:val="en-US"/>
+              </w:rPr>
+              <w:t>{{item.ekz_hours}}</w:t>
+            </w:r>
+          </w:p>
+        </w:tc>
+        <w:tc>
+          <w:tcPr>
+            <w:tcW w:w="843" w:type="dxa"/>
+          </w:tcPr>
+          <w:p>
+            <w:pPr>
+              <w:jc w:val="center"/>
+              <w:rPr>
+                <w:rFonts w:ascii="Times New Roman" w:hAnsi="Times New Roman" w:cs="Times New Roman"/>
+                <w:sz w:val="24"/>
+                <w:szCs w:val="24"/>
+                <w:lang w:val="en-US"/>
+              </w:rPr>
+            </w:pPr>
+            <w:r>
+              <w:rPr>
+                <w:rFonts w:ascii="Times New Roman" w:hAnsi="Times New Roman" w:cs="Times New Roman"/>
+                <w:sz w:val="24"/>
+                <w:szCs w:val="24"/>
+                <w:lang w:val="en-US"/>
+              </w:rPr>
+              <w:t>{%tc endfor %}</w:t>
+            </w:r>
           </w:p>
         </w:tc>
       </w:tr>
       <w:tr>
         <w:tc>
           <w:tcPr>
-            <w:tcW w:w="4503" w:type="dxa"/>
+            <w:tcW w:w="3681" w:type="dxa"/>
           </w:tcPr>
           <w:p>
             <w:pPr>
@@ -3111,7 +3976,7 @@
         </w:tc>
         <w:tc>
           <w:tcPr>
-            <w:tcW w:w="2384" w:type="dxa"/>
+            <w:tcW w:w="1843" w:type="dxa"/>
             <w:vAlign w:val="center"/>
           </w:tcPr>
           <w:p>
@@ -3164,27 +4029,78 @@
         </w:tc>
         <w:tc>
           <w:tcPr>
-            <w:tcW w:w="2458" w:type="dxa"/>
-            <w:vAlign w:val="center"/>
-          </w:tcPr>
-          <w:p>
-            <w:pPr>
-              <w:jc w:val="center"/>
-              <w:rPr>
-                <w:rFonts w:ascii="Times New Roman" w:hAnsi="Times New Roman" w:cs="Times New Roman"/>
-                <w:sz w:val="24"/>
-                <w:szCs w:val="24"/>
-                <w:lang w:val="en-US"/>
-              </w:rPr>
-            </w:pPr>
-            <w:r>
-              <w:rPr>
-                <w:rFonts w:ascii="Times New Roman" w:hAnsi="Times New Roman" w:cs="Times New Roman"/>
-                <w:sz w:val="24"/>
-                <w:szCs w:val="24"/>
-                <w:lang w:val="en-US"/>
-              </w:rPr>
-              <w:t>{{ tic }}</w:t>
+            <w:tcW w:w="814" w:type="dxa"/>
+            <w:vAlign w:val="center"/>
+          </w:tcPr>
+          <w:p>
+            <w:pPr>
+              <w:jc w:val="center"/>
+              <w:rPr>
+                <w:rFonts w:ascii="Times New Roman" w:hAnsi="Times New Roman" w:cs="Times New Roman"/>
+                <w:sz w:val="24"/>
+                <w:szCs w:val="24"/>
+                <w:lang w:val="en-US"/>
+              </w:rPr>
+            </w:pPr>
+            <w:r>
+              <w:rPr>
+                <w:rFonts w:ascii="Times New Roman" w:hAnsi="Times New Roman" w:cs="Times New Roman"/>
+                <w:sz w:val="24"/>
+                <w:szCs w:val="24"/>
+                <w:lang w:val="en-US"/>
+              </w:rPr>
+              <w:t>{%tc for item in sh %}</w:t>
+            </w:r>
+          </w:p>
+        </w:tc>
+        <w:tc>
+          <w:tcPr>
+            <w:tcW w:w="2164" w:type="dxa"/>
+            <w:vAlign w:val="center"/>
+          </w:tcPr>
+          <w:p>
+            <w:pPr>
+              <w:jc w:val="center"/>
+              <w:rPr>
+                <w:rFonts w:ascii="Times New Roman" w:hAnsi="Times New Roman" w:cs="Times New Roman"/>
+                <w:sz w:val="24"/>
+                <w:szCs w:val="24"/>
+                <w:lang w:val="en-US"/>
+              </w:rPr>
+            </w:pPr>
+            <w:r>
+              <w:rPr>
+                <w:rFonts w:ascii="Times New Roman" w:hAnsi="Times New Roman" w:cs="Times New Roman"/>
+                <w:sz w:val="24"/>
+                <w:szCs w:val="24"/>
+                <w:lang w:val="en-US"/>
+              </w:rPr>
+              <w:t>{{item.tic}}</w:t>
+            </w:r>
+          </w:p>
+        </w:tc>
+        <w:tc>
+          <w:tcPr>
+            <w:tcW w:w="843" w:type="dxa"/>
+          </w:tcPr>
+          <w:p>
+            <w:pPr>
+              <w:jc w:val="center"/>
+              <w:rPr>
+                <w:rFonts w:ascii="Times New Roman" w:hAnsi="Times New Roman" w:cs="Times New Roman"/>
+                <w:sz w:val="24"/>
+                <w:szCs w:val="24"/>
+                <w:lang w:val="en-US"/>
+              </w:rPr>
+            </w:pPr>
+            <w:r>
+              <w:rPr>
+                <w:rFonts w:ascii="Times New Roman" w:hAnsi="Times New Roman" w:cs="Times New Roman"/>
+                <w:sz w:val="24"/>
+                <w:szCs w:val="24"/>
+                <w:lang w:val="en-US"/>
+              </w:rPr>
+              <w:t>{%tc endfor %}</w:t>
             </w:r>
           </w:p>
         </w:tc>
@@ -3280,7 +4196,7 @@
             <w:noProof/>
             <w:sz w:val="24"/>
           </w:rPr>
-          <w:t>2</w:t>
+          <w:t>3</w:t>
         </w:r>
         <w:r>
           <w:rPr>
@@ -4245,7 +5161,7 @@
 </file>
 
 <file path=customXml/itemProps1.xml><?xml version="1.0" encoding="utf-8"?>
-<ds:datastoreItem xmlns:ds="http://schemas.openxmlformats.org/officeDocument/2006/customXml" ds:itemID="{CA6FFDDE-D925-445D-8172-2324116DAE8D}">
+<ds:datastoreItem xmlns:ds="http://schemas.openxmlformats.org/officeDocument/2006/customXml" ds:itemID="{C8CAB185-8F2E-477B-8624-AD60FB7A0F20}">
   <ds:schemaRefs>
     <ds:schemaRef ds:uri="http://schemas.openxmlformats.org/officeDocument/2006/bibliography"/>
   </ds:schemaRefs>

</xml_diff>

<commit_message>
back to work version
</commit_message>
<xml_diff>
--- a/templates/docxRPD/rpd.docx
+++ b/templates/docxRPD/rpd.docx
@@ -5281,7 +5281,6 @@
           <w:bCs/>
           <w:sz w:val="24"/>
           <w:szCs w:val="24"/>
-          <w:lang w:val="en-US"/>
         </w:rPr>
       </w:pPr>
       <w:r>
@@ -5304,9 +5303,8 @@
           <w:szCs w:val="24"/>
           <w:lang w:val="en-US"/>
         </w:rPr>
-        <w:t xml:space="preserve">for item in </w:t>
-      </w:r>
-      <w:proofErr w:type="spellStart"/>
+        <w:t>for</w:t>
+      </w:r>
       <w:r>
         <w:rPr>
           <w:rFonts w:ascii="Times New Roman" w:hAnsi="Times New Roman" w:cs="Times New Roman"/>
@@ -5316,9 +5314,8 @@
           <w:szCs w:val="24"/>
           <w:lang w:val="en-US"/>
         </w:rPr>
-        <w:t>wk</w:t>
-      </w:r>
-      <w:proofErr w:type="spellEnd"/>
+        <w:t xml:space="preserve"> </w:t>
+      </w:r>
       <w:r>
         <w:rPr>
           <w:rFonts w:ascii="Times New Roman" w:hAnsi="Times New Roman" w:cs="Times New Roman"/>
@@ -5328,13 +5325,9 @@
           <w:szCs w:val="24"/>
           <w:lang w:val="en-US"/>
         </w:rPr>
-        <w:t xml:space="preserve"> %}</w:t>
-      </w:r>
-    </w:p>
-    <w:p>
-      <w:pPr>
-        <w:spacing w:before="200" w:after="0" w:line="240" w:lineRule="auto"/>
-        <w:jc w:val="both"/>
+        <w:t>key</w:t>
+      </w:r>
+      <w:r>
         <w:rPr>
           <w:rFonts w:ascii="Times New Roman" w:hAnsi="Times New Roman" w:cs="Times New Roman"/>
           <w:b/>
@@ -5343,7 +5336,8 @@
           <w:szCs w:val="24"/>
           <w:lang w:val="en-US"/>
         </w:rPr>
-      </w:pPr>
+        <w:t xml:space="preserve">, </w:t>
+      </w:r>
       <w:r>
         <w:rPr>
           <w:rFonts w:ascii="Times New Roman" w:hAnsi="Times New Roman" w:cs="Times New Roman"/>
@@ -5351,8 +5345,9 @@
           <w:bCs/>
           <w:sz w:val="24"/>
           <w:szCs w:val="24"/>
-        </w:rPr>
-        <w:t>Семестр</w:t>
+          <w:lang w:val="en-US"/>
+        </w:rPr>
+        <w:t>item</w:t>
       </w:r>
       <w:r>
         <w:rPr>
@@ -5363,9 +5358,8 @@
           <w:szCs w:val="24"/>
           <w:lang w:val="en-US"/>
         </w:rPr>
-        <w:t xml:space="preserve"> № </w:t>
-      </w:r>
-      <w:proofErr w:type="gramStart"/>
+        <w:t xml:space="preserve"> </w:t>
+      </w:r>
       <w:r>
         <w:rPr>
           <w:rFonts w:ascii="Times New Roman" w:hAnsi="Times New Roman" w:cs="Times New Roman"/>
@@ -5375,9 +5369,8 @@
           <w:szCs w:val="24"/>
           <w:lang w:val="en-US"/>
         </w:rPr>
-        <w:t xml:space="preserve">{{ </w:t>
-      </w:r>
-      <w:proofErr w:type="spellStart"/>
+        <w:t>in</w:t>
+      </w:r>
       <w:r>
         <w:rPr>
           <w:rFonts w:ascii="Times New Roman" w:hAnsi="Times New Roman" w:cs="Times New Roman"/>
@@ -5387,8 +5380,9 @@
           <w:szCs w:val="24"/>
           <w:lang w:val="en-US"/>
         </w:rPr>
-        <w:t>item</w:t>
-      </w:r>
+        <w:t xml:space="preserve"> </w:t>
+      </w:r>
+      <w:proofErr w:type="spellStart"/>
       <w:r>
         <w:rPr>
           <w:rFonts w:ascii="Times New Roman" w:hAnsi="Times New Roman" w:cs="Times New Roman"/>
@@ -5398,7 +5392,7 @@
           <w:szCs w:val="24"/>
           <w:lang w:val="en-US"/>
         </w:rPr>
-        <w:t>.</w:t>
+        <w:t>wk</w:t>
       </w:r>
       <w:r>
         <w:rPr>
@@ -5409,10 +5403,8 @@
           <w:szCs w:val="24"/>
           <w:lang w:val="en-US"/>
         </w:rPr>
-        <w:t>num</w:t>
-      </w:r>
-      <w:proofErr w:type="spellEnd"/>
-      <w:proofErr w:type="gramEnd"/>
+        <w:t>.</w:t>
+      </w:r>
       <w:r>
         <w:rPr>
           <w:rFonts w:ascii="Times New Roman" w:hAnsi="Times New Roman" w:cs="Times New Roman"/>
@@ -5421,6 +5413,82 @@
           <w:sz w:val="24"/>
           <w:szCs w:val="24"/>
           <w:lang w:val="en-US"/>
+        </w:rPr>
+        <w:t>items</w:t>
+      </w:r>
+      <w:proofErr w:type="spellEnd"/>
+      <w:r>
+        <w:rPr>
+          <w:rFonts w:ascii="Times New Roman" w:hAnsi="Times New Roman" w:cs="Times New Roman"/>
+          <w:b/>
+          <w:bCs/>
+          <w:sz w:val="24"/>
+          <w:szCs w:val="24"/>
+          <w:lang w:val="en-US"/>
+        </w:rPr>
+        <w:t>()</w:t>
+      </w:r>
+      <w:r>
+        <w:rPr>
+          <w:rFonts w:ascii="Times New Roman" w:hAnsi="Times New Roman" w:cs="Times New Roman"/>
+          <w:b/>
+          <w:bCs/>
+          <w:sz w:val="24"/>
+          <w:szCs w:val="24"/>
+          <w:lang w:val="en-US"/>
+        </w:rPr>
+        <w:t xml:space="preserve"> %}</w:t>
+      </w:r>
+      <w:bookmarkStart w:id="0" w:name="_GoBack"/>
+      <w:bookmarkEnd w:id="0"/>
+      <w:r>
+        <w:rPr>
+          <w:rFonts w:ascii="Times New Roman" w:hAnsi="Times New Roman" w:cs="Times New Roman"/>
+          <w:b/>
+          <w:bCs/>
+          <w:sz w:val="24"/>
+          <w:szCs w:val="24"/>
+        </w:rPr>
+        <w:t>Семестр</w:t>
+      </w:r>
+      <w:r>
+        <w:rPr>
+          <w:rFonts w:ascii="Times New Roman" w:hAnsi="Times New Roman" w:cs="Times New Roman"/>
+          <w:b/>
+          <w:bCs/>
+          <w:sz w:val="24"/>
+          <w:szCs w:val="24"/>
+        </w:rPr>
+        <w:t xml:space="preserve"> № </w:t>
+      </w:r>
+      <w:r>
+        <w:rPr>
+          <w:rFonts w:ascii="Times New Roman" w:hAnsi="Times New Roman" w:cs="Times New Roman"/>
+          <w:b/>
+          <w:bCs/>
+          <w:sz w:val="24"/>
+          <w:szCs w:val="24"/>
+        </w:rPr>
+        <w:t>{{</w:t>
+      </w:r>
+      <w:r>
+        <w:rPr>
+          <w:rFonts w:ascii="Times New Roman" w:hAnsi="Times New Roman" w:cs="Times New Roman"/>
+          <w:b/>
+          <w:bCs/>
+          <w:sz w:val="24"/>
+          <w:szCs w:val="24"/>
+          <w:lang w:val="en-US"/>
+        </w:rPr>
+        <w:t xml:space="preserve"> key</w:t>
+      </w:r>
+      <w:r>
+        <w:rPr>
+          <w:rFonts w:ascii="Times New Roman" w:hAnsi="Times New Roman" w:cs="Times New Roman"/>
+          <w:b/>
+          <w:bCs/>
+          <w:sz w:val="24"/>
+          <w:szCs w:val="24"/>
         </w:rPr>
         <w:t xml:space="preserve"> }}</w:t>
       </w:r>
@@ -5429,25 +5497,26 @@
       <w:tblPr>
         <w:tblStyle w:val="ab"/>
         <w:tblW w:w="0" w:type="auto"/>
+        <w:tblLayout w:type="fixed"/>
         <w:tblLook w:val="04A0" w:firstRow="1" w:lastRow="0" w:firstColumn="1" w:lastColumn="0" w:noHBand="0" w:noVBand="1"/>
       </w:tblPr>
       <w:tblGrid>
-        <w:gridCol w:w="955"/>
-        <w:gridCol w:w="1703"/>
-        <w:gridCol w:w="680"/>
-        <w:gridCol w:w="699"/>
-        <w:gridCol w:w="680"/>
-        <w:gridCol w:w="700"/>
-        <w:gridCol w:w="682"/>
-        <w:gridCol w:w="700"/>
-        <w:gridCol w:w="681"/>
-        <w:gridCol w:w="700"/>
-        <w:gridCol w:w="1165"/>
+        <w:gridCol w:w="704"/>
+        <w:gridCol w:w="1791"/>
+        <w:gridCol w:w="708"/>
+        <w:gridCol w:w="709"/>
+        <w:gridCol w:w="709"/>
+        <w:gridCol w:w="710"/>
+        <w:gridCol w:w="710"/>
+        <w:gridCol w:w="710"/>
+        <w:gridCol w:w="710"/>
+        <w:gridCol w:w="710"/>
+        <w:gridCol w:w="1174"/>
       </w:tblGrid>
       <w:tr>
         <w:tc>
           <w:tcPr>
-            <w:tcW w:w="780" w:type="dxa"/>
+            <w:tcW w:w="704" w:type="dxa"/>
             <w:vMerge w:val="restart"/>
             <w:vAlign w:val="center"/>
           </w:tcPr>
@@ -5494,7 +5563,7 @@
         </w:tc>
         <w:tc>
           <w:tcPr>
-            <w:tcW w:w="1715" w:type="dxa"/>
+            <w:tcW w:w="1791" w:type="dxa"/>
             <w:vMerge w:val="restart"/>
             <w:vAlign w:val="center"/>
           </w:tcPr>
@@ -5577,7 +5646,7 @@
       <w:tr>
         <w:tc>
           <w:tcPr>
-            <w:tcW w:w="780" w:type="dxa"/>
+            <w:tcW w:w="704" w:type="dxa"/>
             <w:vMerge/>
             <w:vAlign w:val="center"/>
           </w:tcPr>
@@ -5594,7 +5663,7 @@
         </w:tc>
         <w:tc>
           <w:tcPr>
-            <w:tcW w:w="1715" w:type="dxa"/>
+            <w:tcW w:w="1791" w:type="dxa"/>
             <w:vMerge/>
             <w:vAlign w:val="center"/>
           </w:tcPr>
@@ -5730,7 +5799,7 @@
       <w:tr>
         <w:tc>
           <w:tcPr>
-            <w:tcW w:w="780" w:type="dxa"/>
+            <w:tcW w:w="704" w:type="dxa"/>
             <w:vMerge/>
             <w:vAlign w:val="center"/>
           </w:tcPr>
@@ -5747,7 +5816,7 @@
         </w:tc>
         <w:tc>
           <w:tcPr>
-            <w:tcW w:w="1715" w:type="dxa"/>
+            <w:tcW w:w="1791" w:type="dxa"/>
             <w:vMerge/>
             <w:vAlign w:val="center"/>
           </w:tcPr>
@@ -5975,7 +6044,7 @@
       <w:tr>
         <w:tc>
           <w:tcPr>
-            <w:tcW w:w="780" w:type="dxa"/>
+            <w:tcW w:w="704" w:type="dxa"/>
             <w:vAlign w:val="center"/>
           </w:tcPr>
           <w:p>
@@ -5999,7 +6068,7 @@
         </w:tc>
         <w:tc>
           <w:tcPr>
-            <w:tcW w:w="1715" w:type="dxa"/>
+            <w:tcW w:w="1791" w:type="dxa"/>
             <w:vAlign w:val="center"/>
           </w:tcPr>
           <w:p>
@@ -6241,298 +6310,72 @@
       <w:tr>
         <w:tc>
           <w:tcPr>
-            <w:tcW w:w="9345" w:type="dxa"/>
-            <w:gridSpan w:val="11"/>
-            <w:vAlign w:val="center"/>
-          </w:tcPr>
-          <w:p>
-            <w:pPr>
-              <w:jc w:val="center"/>
-              <w:rPr>
-                <w:rFonts w:ascii="Times New Roman" w:hAnsi="Times New Roman" w:cs="Times New Roman"/>
-                <w:sz w:val="20"/>
-                <w:szCs w:val="20"/>
-                <w:lang w:val="en-US"/>
-              </w:rPr>
-            </w:pPr>
-            <w:r>
-              <w:rPr>
-                <w:rFonts w:ascii="Times New Roman" w:hAnsi="Times New Roman" w:cs="Times New Roman"/>
-                <w:sz w:val="20"/>
-                <w:szCs w:val="20"/>
-                <w:lang w:val="en-US"/>
-              </w:rPr>
-              <w:t>{%</w:t>
-            </w:r>
-            <w:proofErr w:type="spellStart"/>
-            <w:r>
-              <w:rPr>
-                <w:rFonts w:ascii="Times New Roman" w:hAnsi="Times New Roman" w:cs="Times New Roman"/>
-                <w:sz w:val="20"/>
-                <w:szCs w:val="20"/>
-                <w:lang w:val="en-US"/>
-              </w:rPr>
-              <w:t>tr</w:t>
-            </w:r>
-            <w:proofErr w:type="spellEnd"/>
-            <w:r>
-              <w:rPr>
-                <w:rFonts w:ascii="Times New Roman" w:hAnsi="Times New Roman" w:cs="Times New Roman"/>
-                <w:sz w:val="20"/>
-                <w:szCs w:val="20"/>
-                <w:lang w:val="en-US"/>
-              </w:rPr>
-              <w:t xml:space="preserve"> </w:t>
-            </w:r>
-            <w:r>
-              <w:rPr>
-                <w:rFonts w:ascii="Times New Roman" w:hAnsi="Times New Roman" w:cs="Times New Roman"/>
-                <w:sz w:val="20"/>
-                <w:szCs w:val="20"/>
-                <w:lang w:val="en-US"/>
-              </w:rPr>
-              <w:t>for</w:t>
-            </w:r>
-            <w:r>
-              <w:rPr>
-                <w:rFonts w:ascii="Times New Roman" w:hAnsi="Times New Roman" w:cs="Times New Roman"/>
-                <w:sz w:val="20"/>
-                <w:szCs w:val="20"/>
-                <w:lang w:val="en-US"/>
-              </w:rPr>
-              <w:t xml:space="preserve"> </w:t>
-            </w:r>
-            <w:r>
-              <w:rPr>
-                <w:rFonts w:ascii="Times New Roman" w:hAnsi="Times New Roman" w:cs="Times New Roman"/>
-                <w:sz w:val="20"/>
-                <w:szCs w:val="20"/>
-                <w:lang w:val="en-US"/>
-              </w:rPr>
-              <w:t>k</w:t>
-            </w:r>
-            <w:r>
-              <w:rPr>
-                <w:rFonts w:ascii="Times New Roman" w:hAnsi="Times New Roman" w:cs="Times New Roman"/>
-                <w:sz w:val="20"/>
-                <w:szCs w:val="20"/>
-                <w:lang w:val="en-US"/>
-              </w:rPr>
-              <w:t xml:space="preserve">, </w:t>
-            </w:r>
-            <w:r>
-              <w:rPr>
-                <w:rFonts w:ascii="Times New Roman" w:hAnsi="Times New Roman" w:cs="Times New Roman"/>
-                <w:sz w:val="20"/>
-                <w:szCs w:val="20"/>
-                <w:lang w:val="en-US"/>
-              </w:rPr>
-              <w:t>v</w:t>
-            </w:r>
-            <w:r>
-              <w:rPr>
-                <w:rFonts w:ascii="Times New Roman" w:hAnsi="Times New Roman" w:cs="Times New Roman"/>
-                <w:sz w:val="20"/>
-                <w:szCs w:val="20"/>
-                <w:lang w:val="en-US"/>
-              </w:rPr>
-              <w:t xml:space="preserve"> </w:t>
-            </w:r>
-            <w:r>
-              <w:rPr>
-                <w:rFonts w:ascii="Times New Roman" w:hAnsi="Times New Roman" w:cs="Times New Roman"/>
-                <w:sz w:val="20"/>
-                <w:szCs w:val="20"/>
-                <w:lang w:val="en-US"/>
-              </w:rPr>
-              <w:t>in</w:t>
-            </w:r>
-            <w:r>
-              <w:rPr>
-                <w:rFonts w:ascii="Times New Roman" w:hAnsi="Times New Roman" w:cs="Times New Roman"/>
-                <w:sz w:val="20"/>
-                <w:szCs w:val="20"/>
-                <w:lang w:val="en-US"/>
-              </w:rPr>
-              <w:t xml:space="preserve"> </w:t>
-            </w:r>
-            <w:proofErr w:type="spellStart"/>
-            <w:r>
-              <w:rPr>
-                <w:rFonts w:ascii="Times New Roman" w:hAnsi="Times New Roman" w:cs="Times New Roman"/>
-                <w:sz w:val="20"/>
-                <w:szCs w:val="20"/>
-                <w:lang w:val="en-US"/>
-              </w:rPr>
-              <w:t>item</w:t>
-            </w:r>
-            <w:proofErr w:type="spellEnd"/>
-            <w:r>
-              <w:rPr>
-                <w:rFonts w:ascii="Times New Roman" w:hAnsi="Times New Roman" w:cs="Times New Roman"/>
-                <w:sz w:val="20"/>
-                <w:szCs w:val="20"/>
-                <w:lang w:val="en-US"/>
-              </w:rPr>
-              <w:t>.</w:t>
-            </w:r>
-            <w:proofErr w:type="spellStart"/>
-            <w:r>
-              <w:rPr>
-                <w:rFonts w:ascii="Times New Roman" w:hAnsi="Times New Roman" w:cs="Times New Roman"/>
-                <w:sz w:val="20"/>
-                <w:szCs w:val="20"/>
-                <w:lang w:val="en-US"/>
-              </w:rPr>
-              <w:t>it</w:t>
-            </w:r>
-            <w:proofErr w:type="spellEnd"/>
-            <w:r>
-              <w:rPr>
-                <w:rFonts w:ascii="Times New Roman" w:hAnsi="Times New Roman" w:cs="Times New Roman"/>
-                <w:sz w:val="20"/>
-                <w:szCs w:val="20"/>
-                <w:lang w:val="en-US"/>
-              </w:rPr>
-              <w:t>.</w:t>
-            </w:r>
-            <w:r>
-              <w:rPr>
-                <w:rFonts w:ascii="Times New Roman" w:hAnsi="Times New Roman" w:cs="Times New Roman"/>
-                <w:sz w:val="20"/>
-                <w:szCs w:val="20"/>
-                <w:lang w:val="en-US"/>
-              </w:rPr>
-              <w:t>items()</w:t>
-            </w:r>
-            <w:r>
-              <w:rPr>
-                <w:rFonts w:ascii="Times New Roman" w:hAnsi="Times New Roman" w:cs="Times New Roman"/>
-                <w:sz w:val="20"/>
-                <w:szCs w:val="20"/>
-                <w:lang w:val="en-US"/>
-              </w:rPr>
-              <w:t xml:space="preserve"> </w:t>
-            </w:r>
-            <w:r>
-              <w:rPr>
-                <w:rFonts w:ascii="Times New Roman" w:hAnsi="Times New Roman" w:cs="Times New Roman"/>
-                <w:sz w:val="20"/>
-                <w:szCs w:val="20"/>
-                <w:lang w:val="en-US"/>
-              </w:rPr>
-              <w:t>%}</w:t>
-            </w:r>
+            <w:tcW w:w="704" w:type="dxa"/>
+            <w:vAlign w:val="center"/>
+          </w:tcPr>
+          <w:p>
+            <w:pPr>
+              <w:jc w:val="center"/>
+              <w:rPr>
+                <w:rFonts w:ascii="Times New Roman" w:hAnsi="Times New Roman" w:cs="Times New Roman"/>
+                <w:sz w:val="20"/>
+                <w:szCs w:val="20"/>
+                <w:lang w:val="en-US"/>
+              </w:rPr>
+            </w:pPr>
+          </w:p>
+        </w:tc>
+        <w:tc>
+          <w:tcPr>
+            <w:tcW w:w="8641" w:type="dxa"/>
+            <w:gridSpan w:val="10"/>
+            <w:vAlign w:val="center"/>
+          </w:tcPr>
+          <w:p>
+            <w:pPr>
+              <w:jc w:val="center"/>
+              <w:rPr>
+                <w:rFonts w:ascii="Times New Roman" w:hAnsi="Times New Roman" w:cs="Times New Roman"/>
+                <w:sz w:val="20"/>
+                <w:szCs w:val="20"/>
+                <w:lang w:val="en-US"/>
+              </w:rPr>
+            </w:pPr>
           </w:p>
         </w:tc>
       </w:tr>
       <w:tr>
         <w:tc>
           <w:tcPr>
-            <w:tcW w:w="780" w:type="dxa"/>
-            <w:vAlign w:val="center"/>
-          </w:tcPr>
-          <w:p>
-            <w:pPr>
-              <w:jc w:val="center"/>
-              <w:rPr>
-                <w:rFonts w:ascii="Times New Roman" w:hAnsi="Times New Roman" w:cs="Times New Roman"/>
-                <w:sz w:val="20"/>
-                <w:szCs w:val="20"/>
-                <w:lang w:val="en-US"/>
-              </w:rPr>
-            </w:pPr>
-            <w:r>
-              <w:rPr>
-                <w:rFonts w:ascii="Times New Roman" w:hAnsi="Times New Roman" w:cs="Times New Roman"/>
-                <w:sz w:val="20"/>
-                <w:szCs w:val="20"/>
-                <w:lang w:val="en-US"/>
-              </w:rPr>
-              <w:t xml:space="preserve">{{ </w:t>
-            </w:r>
-            <w:r>
-              <w:rPr>
-                <w:rFonts w:ascii="Times New Roman" w:hAnsi="Times New Roman" w:cs="Times New Roman"/>
-                <w:sz w:val="20"/>
-                <w:szCs w:val="20"/>
-                <w:lang w:val="en-US"/>
-              </w:rPr>
-              <w:t>v</w:t>
-            </w:r>
-            <w:r>
-              <w:rPr>
-                <w:rFonts w:ascii="Times New Roman" w:hAnsi="Times New Roman" w:cs="Times New Roman"/>
-                <w:sz w:val="20"/>
-                <w:szCs w:val="20"/>
-                <w:lang w:val="en-US"/>
-              </w:rPr>
-              <w:t>[0]</w:t>
-            </w:r>
-            <w:bookmarkStart w:id="0" w:name="_GoBack"/>
-            <w:bookmarkEnd w:id="0"/>
-            <w:r>
-              <w:rPr>
-                <w:rFonts w:ascii="Times New Roman" w:hAnsi="Times New Roman" w:cs="Times New Roman"/>
-                <w:sz w:val="20"/>
-                <w:szCs w:val="20"/>
-                <w:lang w:val="en-US"/>
-              </w:rPr>
-              <w:t>.num</w:t>
-            </w:r>
-            <w:r>
-              <w:rPr>
-                <w:rFonts w:ascii="Times New Roman" w:hAnsi="Times New Roman" w:cs="Times New Roman"/>
-                <w:sz w:val="20"/>
-                <w:szCs w:val="20"/>
-                <w:lang w:val="en-US"/>
-              </w:rPr>
-              <w:t xml:space="preserve"> }}</w:t>
-            </w:r>
-          </w:p>
-        </w:tc>
-        <w:tc>
-          <w:tcPr>
-            <w:tcW w:w="1715" w:type="dxa"/>
-            <w:vAlign w:val="center"/>
-          </w:tcPr>
-          <w:p>
-            <w:pPr>
-              <w:jc w:val="center"/>
-              <w:rPr>
-                <w:rFonts w:ascii="Times New Roman" w:hAnsi="Times New Roman" w:cs="Times New Roman"/>
-                <w:sz w:val="20"/>
-                <w:szCs w:val="20"/>
-                <w:lang w:val="en-US"/>
-              </w:rPr>
-            </w:pPr>
-            <w:r>
-              <w:rPr>
-                <w:rFonts w:ascii="Times New Roman" w:hAnsi="Times New Roman" w:cs="Times New Roman"/>
-                <w:sz w:val="20"/>
-                <w:szCs w:val="20"/>
-                <w:lang w:val="en-US"/>
-              </w:rPr>
-              <w:t xml:space="preserve">{{ </w:t>
-            </w:r>
-            <w:r>
-              <w:rPr>
-                <w:rFonts w:ascii="Times New Roman" w:hAnsi="Times New Roman" w:cs="Times New Roman"/>
-                <w:sz w:val="20"/>
-                <w:szCs w:val="20"/>
-                <w:lang w:val="en-US"/>
-              </w:rPr>
-              <w:t>k</w:t>
-            </w:r>
-            <w:r>
-              <w:rPr>
-                <w:rFonts w:ascii="Times New Roman" w:hAnsi="Times New Roman" w:cs="Times New Roman"/>
-                <w:sz w:val="20"/>
-                <w:szCs w:val="20"/>
-                <w:lang w:val="en-US"/>
-              </w:rPr>
-              <w:t xml:space="preserve"> }}</w:t>
-            </w:r>
+            <w:tcW w:w="704" w:type="dxa"/>
+            <w:vAlign w:val="center"/>
+          </w:tcPr>
+          <w:p>
+            <w:pPr>
+              <w:rPr>
+                <w:rFonts w:ascii="Times New Roman" w:hAnsi="Times New Roman" w:cs="Times New Roman"/>
+                <w:sz w:val="20"/>
+                <w:szCs w:val="20"/>
+                <w:lang w:val="en-US"/>
+              </w:rPr>
+            </w:pPr>
+          </w:p>
+        </w:tc>
+        <w:tc>
+          <w:tcPr>
+            <w:tcW w:w="1791" w:type="dxa"/>
+            <w:vAlign w:val="center"/>
+          </w:tcPr>
+          <w:p>
+            <w:pPr>
+              <w:jc w:val="center"/>
+              <w:rPr>
+                <w:rFonts w:ascii="Times New Roman" w:hAnsi="Times New Roman" w:cs="Times New Roman"/>
+                <w:sz w:val="20"/>
+                <w:szCs w:val="20"/>
+                <w:lang w:val="en-US"/>
+              </w:rPr>
+            </w:pPr>
           </w:p>
         </w:tc>
         <w:tc>
@@ -6692,93 +6535,61 @@
       <w:tr>
         <w:tc>
           <w:tcPr>
-            <w:tcW w:w="9345" w:type="dxa"/>
-            <w:gridSpan w:val="11"/>
-            <w:vAlign w:val="center"/>
-          </w:tcPr>
-          <w:p>
-            <w:pPr>
-              <w:jc w:val="center"/>
-              <w:rPr>
-                <w:rFonts w:ascii="Times New Roman" w:hAnsi="Times New Roman" w:cs="Times New Roman"/>
-                <w:sz w:val="20"/>
-                <w:szCs w:val="20"/>
-                <w:lang w:val="en-US"/>
-              </w:rPr>
-            </w:pPr>
-            <w:r>
-              <w:rPr>
-                <w:rFonts w:ascii="Times New Roman" w:hAnsi="Times New Roman" w:cs="Times New Roman"/>
-                <w:sz w:val="20"/>
-                <w:szCs w:val="20"/>
-                <w:lang w:val="en-US"/>
-              </w:rPr>
-              <w:t>{%</w:t>
-            </w:r>
-            <w:proofErr w:type="spellStart"/>
-            <w:r>
-              <w:rPr>
-                <w:rFonts w:ascii="Times New Roman" w:hAnsi="Times New Roman" w:cs="Times New Roman"/>
-                <w:sz w:val="20"/>
-                <w:szCs w:val="20"/>
-                <w:lang w:val="en-US"/>
-              </w:rPr>
-              <w:t>tr</w:t>
-            </w:r>
-            <w:proofErr w:type="spellEnd"/>
-            <w:r>
-              <w:rPr>
-                <w:rFonts w:ascii="Times New Roman" w:hAnsi="Times New Roman" w:cs="Times New Roman"/>
-                <w:sz w:val="20"/>
-                <w:szCs w:val="20"/>
-                <w:lang w:val="en-US"/>
-              </w:rPr>
-              <w:t xml:space="preserve"> </w:t>
-            </w:r>
-            <w:proofErr w:type="spellStart"/>
-            <w:r>
-              <w:rPr>
-                <w:rFonts w:ascii="Times New Roman" w:hAnsi="Times New Roman" w:cs="Times New Roman"/>
-                <w:sz w:val="20"/>
-                <w:szCs w:val="20"/>
-                <w:lang w:val="en-US"/>
-              </w:rPr>
-              <w:t>endfor</w:t>
-            </w:r>
-            <w:proofErr w:type="spellEnd"/>
-            <w:r>
-              <w:rPr>
-                <w:rFonts w:ascii="Times New Roman" w:hAnsi="Times New Roman" w:cs="Times New Roman"/>
-                <w:sz w:val="20"/>
-                <w:szCs w:val="20"/>
-                <w:lang w:val="en-US"/>
-              </w:rPr>
-              <w:t xml:space="preserve"> %}</w:t>
-            </w:r>
+            <w:tcW w:w="704" w:type="dxa"/>
+            <w:vAlign w:val="center"/>
+          </w:tcPr>
+          <w:p>
+            <w:pPr>
+              <w:jc w:val="center"/>
+              <w:rPr>
+                <w:rFonts w:ascii="Times New Roman" w:hAnsi="Times New Roman" w:cs="Times New Roman"/>
+                <w:sz w:val="20"/>
+                <w:szCs w:val="20"/>
+                <w:lang w:val="en-US"/>
+              </w:rPr>
+            </w:pPr>
+          </w:p>
+        </w:tc>
+        <w:tc>
+          <w:tcPr>
+            <w:tcW w:w="8641" w:type="dxa"/>
+            <w:gridSpan w:val="10"/>
+            <w:vAlign w:val="center"/>
+          </w:tcPr>
+          <w:p>
+            <w:pPr>
+              <w:jc w:val="center"/>
+              <w:rPr>
+                <w:rFonts w:ascii="Times New Roman" w:hAnsi="Times New Roman" w:cs="Times New Roman"/>
+                <w:sz w:val="20"/>
+                <w:szCs w:val="20"/>
+                <w:lang w:val="en-US"/>
+              </w:rPr>
+            </w:pPr>
           </w:p>
         </w:tc>
       </w:tr>
       <w:tr>
         <w:tc>
           <w:tcPr>
-            <w:tcW w:w="780" w:type="dxa"/>
-            <w:vAlign w:val="center"/>
-          </w:tcPr>
-          <w:p>
-            <w:pPr>
-              <w:jc w:val="center"/>
-              <w:rPr>
-                <w:rFonts w:ascii="Times New Roman" w:hAnsi="Times New Roman" w:cs="Times New Roman"/>
-                <w:sz w:val="20"/>
-                <w:szCs w:val="20"/>
-                <w:lang w:val="en-US"/>
-              </w:rPr>
-            </w:pPr>
-          </w:p>
-        </w:tc>
-        <w:tc>
-          <w:tcPr>
-            <w:tcW w:w="1715" w:type="dxa"/>
+            <w:tcW w:w="704" w:type="dxa"/>
+            <w:vAlign w:val="center"/>
+          </w:tcPr>
+          <w:p>
+            <w:pPr>
+              <w:jc w:val="center"/>
+              <w:rPr>
+                <w:rFonts w:ascii="Times New Roman" w:hAnsi="Times New Roman" w:cs="Times New Roman"/>
+                <w:sz w:val="20"/>
+                <w:szCs w:val="20"/>
+                <w:lang w:val="en-US"/>
+              </w:rPr>
+            </w:pPr>
+          </w:p>
+        </w:tc>
+        <w:tc>
+          <w:tcPr>
+            <w:tcW w:w="1791" w:type="dxa"/>
           </w:tcPr>
           <w:p>
             <w:pPr>
@@ -6971,24 +6782,24 @@
       <w:tr>
         <w:tc>
           <w:tcPr>
-            <w:tcW w:w="780" w:type="dxa"/>
-            <w:vAlign w:val="center"/>
-          </w:tcPr>
-          <w:p>
-            <w:pPr>
-              <w:jc w:val="center"/>
-              <w:rPr>
-                <w:rFonts w:ascii="Times New Roman" w:hAnsi="Times New Roman" w:cs="Times New Roman"/>
-                <w:sz w:val="20"/>
-                <w:szCs w:val="20"/>
-                <w:lang w:val="en-US"/>
-              </w:rPr>
-            </w:pPr>
-          </w:p>
-        </w:tc>
-        <w:tc>
-          <w:tcPr>
-            <w:tcW w:w="1715" w:type="dxa"/>
+            <w:tcW w:w="704" w:type="dxa"/>
+            <w:vAlign w:val="center"/>
+          </w:tcPr>
+          <w:p>
+            <w:pPr>
+              <w:jc w:val="center"/>
+              <w:rPr>
+                <w:rFonts w:ascii="Times New Roman" w:hAnsi="Times New Roman" w:cs="Times New Roman"/>
+                <w:sz w:val="20"/>
+                <w:szCs w:val="20"/>
+                <w:lang w:val="en-US"/>
+              </w:rPr>
+            </w:pPr>
+          </w:p>
+        </w:tc>
+        <w:tc>
+          <w:tcPr>
+            <w:tcW w:w="1791" w:type="dxa"/>
           </w:tcPr>
           <w:p>
             <w:pPr>
@@ -7170,7 +6981,6 @@
           <w:rFonts w:ascii="Times New Roman" w:hAnsi="Times New Roman" w:cs="Times New Roman"/>
           <w:sz w:val="24"/>
           <w:szCs w:val="24"/>
-          <w:lang w:val="en-US"/>
         </w:rPr>
       </w:pPr>
       <w:r>
@@ -7285,7 +7095,7 @@
             <w:noProof/>
             <w:sz w:val="24"/>
           </w:rPr>
-          <w:t>3</w:t>
+          <w:t>2</w:t>
         </w:r>
         <w:r>
           <w:rPr>
@@ -8300,7 +8110,7 @@
 </file>
 
 <file path=customXml/itemProps1.xml><?xml version="1.0" encoding="utf-8"?>
-<ds:datastoreItem xmlns:ds="http://schemas.openxmlformats.org/officeDocument/2006/customXml" ds:itemID="{C03C744B-96F4-4EE9-BEC3-58BD0D0D9E7B}">
+<ds:datastoreItem xmlns:ds="http://schemas.openxmlformats.org/officeDocument/2006/customXml" ds:itemID="{4F29CD64-3F22-4BC3-8FBE-0BBA10EF8855}">
   <ds:schemaRefs>
     <ds:schemaRef ds:uri="http://schemas.openxmlformats.org/officeDocument/2006/bibliography"/>
   </ds:schemaRefs>

</xml_diff>

<commit_message>
sign in report added
</commit_message>
<xml_diff>
--- a/templates/docxRPD/rpd.docx
+++ b/templates/docxRPD/rpd.docx
@@ -976,267 +976,15 @@
     </w:tbl>
     <w:p>
       <w:pPr>
-        <w:spacing w:before="350" w:after="150" w:line="300" w:lineRule="auto"/>
+        <w:jc w:val="center"/>
         <w:rPr>
           <w:rFonts w:ascii="Times New Roman" w:hAnsi="Times New Roman" w:cs="Times New Roman"/>
           <w:sz w:val="24"/>
           <w:szCs w:val="24"/>
         </w:rPr>
       </w:pPr>
-      <w:r>
-        <w:rPr>
-          <w:rFonts w:ascii="Times New Roman" w:hAnsi="Times New Roman" w:cs="Times New Roman"/>
-          <w:b/>
-          <w:bCs/>
-          <w:sz w:val="24"/>
-          <w:szCs w:val="24"/>
-        </w:rPr>
-        <w:t xml:space="preserve">Руководитель ООП: </w:t>
-      </w:r>
-    </w:p>
-    <w:tbl>
-      <w:tblPr>
-        <w:tblW w:w="0" w:type="auto"/>
-        <w:tblInd w:w="10" w:type="dxa"/>
-        <w:tblCellMar>
-          <w:left w:w="10" w:type="dxa"/>
-          <w:right w:w="10" w:type="dxa"/>
-        </w:tblCellMar>
-        <w:tblLook w:val="0000" w:firstRow="0" w:lastRow="0" w:firstColumn="0" w:lastColumn="0" w:noHBand="0" w:noVBand="0"/>
-      </w:tblPr>
-      <w:tblGrid>
-        <w:gridCol w:w="2650"/>
-        <w:gridCol w:w="230"/>
-        <w:gridCol w:w="1150"/>
-        <w:gridCol w:w="575"/>
-        <w:gridCol w:w="500"/>
-        <w:gridCol w:w="230"/>
-        <w:gridCol w:w="1150"/>
-        <w:gridCol w:w="2010"/>
-      </w:tblGrid>
-      <w:tr>
-        <w:trPr>
-          <w:trHeight w:val="80"/>
-        </w:trPr>
-        <w:tc>
-          <w:tcPr>
-            <w:tcW w:w="2650" w:type="dxa"/>
-            <w:tcBorders>
-              <w:bottom w:val="single" w:sz="6" w:space="0" w:color="000000"/>
-            </w:tcBorders>
-            <w:vAlign w:val="center"/>
-          </w:tcPr>
-          <w:p>
-            <w:pPr>
-              <w:spacing w:after="0" w:line="240" w:lineRule="auto"/>
-              <w:jc w:val="center"/>
-              <w:rPr>
-                <w:rFonts w:ascii="Times New Roman" w:hAnsi="Times New Roman" w:cs="Times New Roman"/>
-                <w:sz w:val="24"/>
-                <w:szCs w:val="24"/>
-              </w:rPr>
-            </w:pPr>
-          </w:p>
-        </w:tc>
-        <w:tc>
-          <w:tcPr>
-            <w:tcW w:w="230" w:type="dxa"/>
-            <w:vAlign w:val="center"/>
-          </w:tcPr>
-          <w:p>
-            <w:pPr>
-              <w:spacing w:after="0" w:line="240" w:lineRule="auto"/>
-              <w:jc w:val="center"/>
-              <w:rPr>
-                <w:rFonts w:ascii="Times New Roman" w:hAnsi="Times New Roman" w:cs="Times New Roman"/>
-                <w:sz w:val="24"/>
-                <w:szCs w:val="24"/>
-              </w:rPr>
-            </w:pPr>
-            <w:r>
-              <w:rPr>
-                <w:rFonts w:ascii="Times New Roman" w:hAnsi="Times New Roman" w:cs="Times New Roman"/>
-                <w:sz w:val="24"/>
-                <w:szCs w:val="24"/>
-              </w:rPr>
-              <w:t>/</w:t>
-            </w:r>
-          </w:p>
-        </w:tc>
-        <w:tc>
-          <w:tcPr>
-            <w:tcW w:w="1150" w:type="dxa"/>
-            <w:tcBorders>
-              <w:bottom w:val="single" w:sz="6" w:space="0" w:color="000000"/>
-            </w:tcBorders>
-            <w:vAlign w:val="center"/>
-          </w:tcPr>
-          <w:p>
-            <w:pPr>
-              <w:spacing w:after="0" w:line="240" w:lineRule="auto"/>
-              <w:jc w:val="center"/>
-              <w:rPr>
-                <w:rFonts w:ascii="Times New Roman" w:hAnsi="Times New Roman" w:cs="Times New Roman"/>
-                <w:sz w:val="24"/>
-                <w:szCs w:val="24"/>
-              </w:rPr>
-            </w:pPr>
-          </w:p>
-        </w:tc>
-        <w:tc>
-          <w:tcPr>
-            <w:tcW w:w="575" w:type="dxa"/>
-            <w:vAlign w:val="center"/>
-          </w:tcPr>
-          <w:p>
-            <w:pPr>
-              <w:spacing w:after="0" w:line="240" w:lineRule="auto"/>
-              <w:jc w:val="center"/>
-              <w:rPr>
-                <w:rFonts w:ascii="Times New Roman" w:hAnsi="Times New Roman" w:cs="Times New Roman"/>
-                <w:sz w:val="24"/>
-                <w:szCs w:val="24"/>
-              </w:rPr>
-            </w:pPr>
-            <w:r>
-              <w:rPr>
-                <w:rFonts w:ascii="Times New Roman" w:hAnsi="Times New Roman" w:cs="Times New Roman"/>
-                <w:sz w:val="24"/>
-                <w:szCs w:val="24"/>
-              </w:rPr>
-              <w:t>/   “</w:t>
-            </w:r>
-          </w:p>
-        </w:tc>
-        <w:tc>
-          <w:tcPr>
-            <w:tcW w:w="500" w:type="dxa"/>
-            <w:tcBorders>
-              <w:bottom w:val="single" w:sz="6" w:space="0" w:color="000000"/>
-            </w:tcBorders>
-            <w:vAlign w:val="center"/>
-          </w:tcPr>
-          <w:p>
-            <w:pPr>
-              <w:spacing w:after="0" w:line="240" w:lineRule="auto"/>
-              <w:jc w:val="center"/>
-              <w:rPr>
-                <w:rFonts w:ascii="Times New Roman" w:hAnsi="Times New Roman" w:cs="Times New Roman"/>
-                <w:sz w:val="24"/>
-                <w:szCs w:val="24"/>
-              </w:rPr>
-            </w:pPr>
-          </w:p>
-        </w:tc>
-        <w:tc>
-          <w:tcPr>
-            <w:tcW w:w="230" w:type="dxa"/>
-            <w:vAlign w:val="center"/>
-          </w:tcPr>
-          <w:p>
-            <w:pPr>
-              <w:spacing w:after="0" w:line="240" w:lineRule="auto"/>
-              <w:jc w:val="center"/>
-              <w:rPr>
-                <w:rFonts w:ascii="Times New Roman" w:hAnsi="Times New Roman" w:cs="Times New Roman"/>
-                <w:sz w:val="24"/>
-                <w:szCs w:val="24"/>
-              </w:rPr>
-            </w:pPr>
-            <w:r>
-              <w:rPr>
-                <w:rFonts w:ascii="Times New Roman" w:hAnsi="Times New Roman" w:cs="Times New Roman"/>
-                <w:sz w:val="24"/>
-                <w:szCs w:val="24"/>
-              </w:rPr>
-              <w:t>”</w:t>
-            </w:r>
-          </w:p>
-        </w:tc>
-        <w:tc>
-          <w:tcPr>
-            <w:tcW w:w="1150" w:type="dxa"/>
-            <w:tcBorders>
-              <w:bottom w:val="single" w:sz="6" w:space="0" w:color="000000"/>
-            </w:tcBorders>
-            <w:vAlign w:val="center"/>
-          </w:tcPr>
-          <w:p>
-            <w:pPr>
-              <w:spacing w:after="0" w:line="240" w:lineRule="auto"/>
-              <w:jc w:val="center"/>
-              <w:rPr>
-                <w:rFonts w:ascii="Times New Roman" w:hAnsi="Times New Roman" w:cs="Times New Roman"/>
-                <w:sz w:val="24"/>
-                <w:szCs w:val="24"/>
-              </w:rPr>
-            </w:pPr>
-          </w:p>
-        </w:tc>
-        <w:tc>
-          <w:tcPr>
-            <w:tcW w:w="2010" w:type="dxa"/>
-            <w:vAlign w:val="bottom"/>
-          </w:tcPr>
-          <w:p>
-            <w:pPr>
-              <w:spacing w:after="0" w:line="240" w:lineRule="auto"/>
-              <w:rPr>
-                <w:rFonts w:ascii="Times New Roman" w:hAnsi="Times New Roman" w:cs="Times New Roman"/>
-                <w:sz w:val="24"/>
-                <w:szCs w:val="24"/>
-              </w:rPr>
-            </w:pPr>
-            <w:r>
-              <w:rPr>
-                <w:rFonts w:ascii="Times New Roman" w:hAnsi="Times New Roman" w:cs="Times New Roman"/>
-                <w:sz w:val="24"/>
-                <w:szCs w:val="24"/>
-                <w:lang w:val="en-US"/>
-              </w:rPr>
-              <w:t>{{</w:t>
-            </w:r>
-            <w:proofErr w:type="spellStart"/>
-            <w:r>
-              <w:rPr>
-                <w:rFonts w:ascii="Times New Roman" w:hAnsi="Times New Roman" w:cs="Times New Roman"/>
-                <w:sz w:val="24"/>
-                <w:szCs w:val="24"/>
-                <w:lang w:val="en-US"/>
-              </w:rPr>
-              <w:t>current_year</w:t>
-            </w:r>
-            <w:proofErr w:type="spellEnd"/>
-            <w:r>
-              <w:rPr>
-                <w:rFonts w:ascii="Times New Roman" w:hAnsi="Times New Roman" w:cs="Times New Roman"/>
-                <w:sz w:val="24"/>
-                <w:szCs w:val="24"/>
-                <w:lang w:val="en-US"/>
-              </w:rPr>
-              <w:t xml:space="preserve">}} </w:t>
-            </w:r>
-            <w:r>
-              <w:rPr>
-                <w:rFonts w:ascii="Times New Roman" w:hAnsi="Times New Roman" w:cs="Times New Roman"/>
-                <w:sz w:val="24"/>
-                <w:szCs w:val="24"/>
-              </w:rPr>
-              <w:t>г.</w:t>
-            </w:r>
-          </w:p>
-        </w:tc>
-      </w:tr>
-    </w:tbl>
-    <w:p>
-      <w:pPr>
-        <w:jc w:val="center"/>
-        <w:rPr>
-          <w:rFonts w:ascii="Times New Roman" w:hAnsi="Times New Roman" w:cs="Times New Roman"/>
-          <w:sz w:val="24"/>
-          <w:szCs w:val="24"/>
-        </w:rPr>
-      </w:pPr>
+      <w:bookmarkStart w:id="0" w:name="_GoBack"/>
+      <w:bookmarkEnd w:id="0"/>
     </w:p>
     <w:p>
       <w:pPr>
@@ -8229,8 +7977,6 @@
               </w:rPr>
               <w:t>tic</w:t>
             </w:r>
-            <w:bookmarkStart w:id="0" w:name="_GoBack"/>
-            <w:bookmarkEnd w:id="0"/>
             <w:r>
               <w:rPr>
                 <w:rFonts w:ascii="Times New Roman" w:hAnsi="Times New Roman" w:cs="Times New Roman"/>
@@ -8406,7 +8152,6 @@
           <w:rFonts w:ascii="Times New Roman" w:hAnsi="Times New Roman" w:cs="Times New Roman"/>
           <w:sz w:val="24"/>
           <w:szCs w:val="24"/>
-          <w:lang w:val="en-US"/>
         </w:rPr>
       </w:pPr>
       <w:r>
@@ -8416,7 +8161,6 @@
           <w:bCs/>
           <w:sz w:val="24"/>
           <w:szCs w:val="24"/>
-          <w:lang w:val="en-US"/>
         </w:rPr>
         <w:t xml:space="preserve">4.2 </w:t>
       </w:r>
@@ -8437,7 +8181,6 @@
           <w:bCs/>
           <w:sz w:val="24"/>
           <w:szCs w:val="24"/>
-          <w:lang w:val="en-US"/>
         </w:rPr>
         <w:t xml:space="preserve"> </w:t>
       </w:r>
@@ -8458,7 +8201,6 @@
           <w:bCs/>
           <w:sz w:val="24"/>
           <w:szCs w:val="24"/>
-          <w:lang w:val="en-US"/>
         </w:rPr>
         <w:t xml:space="preserve"> </w:t>
       </w:r>
@@ -8479,7 +8221,6 @@
           <w:bCs/>
           <w:sz w:val="24"/>
           <w:szCs w:val="24"/>
-          <w:lang w:val="en-US"/>
         </w:rPr>
         <w:t xml:space="preserve"> </w:t>
       </w:r>
@@ -8500,7 +8241,6 @@
           <w:bCs/>
           <w:sz w:val="24"/>
           <w:szCs w:val="24"/>
-          <w:lang w:val="en-US"/>
         </w:rPr>
         <w:t xml:space="preserve"> </w:t>
       </w:r>
@@ -8521,7 +8261,6 @@
           <w:bCs/>
           <w:sz w:val="24"/>
           <w:szCs w:val="24"/>
-          <w:lang w:val="en-US"/>
         </w:rPr>
         <w:t xml:space="preserve"> </w:t>
       </w:r>
@@ -17124,7 +16863,7 @@
             <w:noProof/>
             <w:sz w:val="24"/>
           </w:rPr>
-          <w:t>6</w:t>
+          <w:t>2</w:t>
         </w:r>
         <w:r>
           <w:rPr>
@@ -18111,7 +17850,7 @@
 </file>
 
 <file path=customXml/itemProps1.xml><?xml version="1.0" encoding="utf-8"?>
-<ds:datastoreItem xmlns:ds="http://schemas.openxmlformats.org/officeDocument/2006/customXml" ds:itemID="{89D48347-7D65-4557-8093-44154B66767C}">
+<ds:datastoreItem xmlns:ds="http://schemas.openxmlformats.org/officeDocument/2006/customXml" ds:itemID="{1F3B7D93-4E62-4626-B2DF-400BAB4443B1}">
   <ds:schemaRefs>
     <ds:schemaRef ds:uri="http://schemas.openxmlformats.org/officeDocument/2006/bibliography"/>
   </ds:schemaRefs>

</xml_diff>

<commit_message>
rpd report change add asp report
</commit_message>
<xml_diff>
--- a/templates/docxRPD/rpd.docx
+++ b/templates/docxRPD/rpd.docx
@@ -156,6 +156,7 @@
           <w:rFonts w:ascii="Times New Roman" w:hAnsi="Times New Roman" w:cs="Times New Roman"/>
           <w:sz w:val="24"/>
           <w:szCs w:val="24"/>
+          <w:u w:val="single"/>
         </w:rPr>
       </w:pPr>
       <w:r>
@@ -164,7 +165,32 @@
           <w:sz w:val="24"/>
           <w:szCs w:val="24"/>
         </w:rPr>
-        <w:t>на заседании __________________</w:t>
+        <w:t xml:space="preserve">на </w:t>
+      </w:r>
+      <w:r>
+        <w:rPr>
+          <w:rFonts w:ascii="Times New Roman" w:hAnsi="Times New Roman" w:cs="Times New Roman"/>
+          <w:sz w:val="24"/>
+          <w:szCs w:val="24"/>
+        </w:rPr>
+        <w:t xml:space="preserve">{{ </w:t>
+      </w:r>
+      <w:r>
+        <w:rPr>
+          <w:rFonts w:ascii="Times New Roman" w:hAnsi="Times New Roman" w:cs="Times New Roman"/>
+          <w:sz w:val="24"/>
+          <w:szCs w:val="24"/>
+          <w:lang w:val="en-US"/>
+        </w:rPr>
+        <w:t>meeting</w:t>
+      </w:r>
+      <w:r>
+        <w:rPr>
+          <w:rFonts w:ascii="Times New Roman" w:hAnsi="Times New Roman" w:cs="Times New Roman"/>
+          <w:sz w:val="24"/>
+          <w:szCs w:val="24"/>
+        </w:rPr>
+        <w:t xml:space="preserve"> }}</w:t>
       </w:r>
     </w:p>
     <w:p>
@@ -183,7 +209,61 @@
           <w:sz w:val="24"/>
           <w:szCs w:val="24"/>
         </w:rPr>
-        <w:t>Протокол №___ от «____»</w:t>
+        <w:t>Протокол</w:t>
+      </w:r>
+      <w:r>
+        <w:rPr>
+          <w:rFonts w:ascii="Times New Roman" w:hAnsi="Times New Roman" w:cs="Times New Roman"/>
+          <w:sz w:val="24"/>
+          <w:szCs w:val="24"/>
+        </w:rPr>
+        <w:t xml:space="preserve"> №</w:t>
+      </w:r>
+      <w:r>
+        <w:rPr>
+          <w:rFonts w:ascii="Times New Roman" w:hAnsi="Times New Roman" w:cs="Times New Roman"/>
+          <w:sz w:val="24"/>
+          <w:szCs w:val="24"/>
+          <w:u w:val="single"/>
+        </w:rPr>
+        <w:t xml:space="preserve">{{ </w:t>
+      </w:r>
+      <w:r>
+        <w:rPr>
+          <w:rFonts w:ascii="Times New Roman" w:hAnsi="Times New Roman" w:cs="Times New Roman"/>
+          <w:sz w:val="24"/>
+          <w:szCs w:val="24"/>
+          <w:u w:val="single"/>
+          <w:lang w:val="en-US"/>
+        </w:rPr>
+        <w:t>protocol</w:t>
+      </w:r>
+      <w:r>
+        <w:rPr>
+          <w:rFonts w:ascii="Times New Roman" w:hAnsi="Times New Roman" w:cs="Times New Roman"/>
+          <w:sz w:val="24"/>
+          <w:szCs w:val="24"/>
+          <w:u w:val="single"/>
+        </w:rPr>
+        <w:t>_</w:t>
+      </w:r>
+      <w:r>
+        <w:rPr>
+          <w:rFonts w:ascii="Times New Roman" w:hAnsi="Times New Roman" w:cs="Times New Roman"/>
+          <w:sz w:val="24"/>
+          <w:szCs w:val="24"/>
+          <w:u w:val="single"/>
+        </w:rPr>
+        <w:t>number</w:t>
+      </w:r>
+      <w:r>
+        <w:rPr>
+          <w:rFonts w:ascii="Times New Roman" w:hAnsi="Times New Roman" w:cs="Times New Roman"/>
+          <w:sz w:val="24"/>
+          <w:szCs w:val="24"/>
+          <w:u w:val="single"/>
+        </w:rPr>
+        <w:t xml:space="preserve"> }}</w:t>
       </w:r>
       <w:r>
         <w:rPr>
@@ -199,7 +279,7 @@
           <w:sz w:val="24"/>
           <w:szCs w:val="24"/>
         </w:rPr>
-        <w:t>________</w:t>
+        <w:t>от</w:t>
       </w:r>
       <w:r>
         <w:rPr>
@@ -214,8 +294,71 @@
           <w:rFonts w:ascii="Times New Roman" w:hAnsi="Times New Roman" w:cs="Times New Roman"/>
           <w:sz w:val="24"/>
           <w:szCs w:val="24"/>
-        </w:rPr>
-        <w:t>г.</w:t>
+          <w:u w:val="single"/>
+        </w:rPr>
+        <w:t xml:space="preserve">{{ </w:t>
+      </w:r>
+      <w:r>
+        <w:rPr>
+          <w:rFonts w:ascii="Times New Roman" w:hAnsi="Times New Roman" w:cs="Times New Roman"/>
+          <w:sz w:val="24"/>
+          <w:szCs w:val="24"/>
+          <w:u w:val="single"/>
+          <w:lang w:val="en-US"/>
+        </w:rPr>
+        <w:t>protocol</w:t>
+      </w:r>
+      <w:r>
+        <w:rPr>
+          <w:rFonts w:ascii="Times New Roman" w:hAnsi="Times New Roman" w:cs="Times New Roman"/>
+          <w:sz w:val="24"/>
+          <w:szCs w:val="24"/>
+          <w:u w:val="single"/>
+        </w:rPr>
+        <w:t>_</w:t>
+      </w:r>
+      <w:r>
+        <w:rPr>
+          <w:rFonts w:ascii="Times New Roman" w:hAnsi="Times New Roman" w:cs="Times New Roman"/>
+          <w:sz w:val="24"/>
+          <w:szCs w:val="24"/>
+          <w:u w:val="single"/>
+          <w:lang w:val="en-US"/>
+        </w:rPr>
+        <w:t>date</w:t>
+      </w:r>
+      <w:r>
+        <w:rPr>
+          <w:rFonts w:ascii="Times New Roman" w:hAnsi="Times New Roman" w:cs="Times New Roman"/>
+          <w:sz w:val="24"/>
+          <w:szCs w:val="24"/>
+          <w:u w:val="single"/>
+        </w:rPr>
+        <w:t xml:space="preserve"> }}</w:t>
+      </w:r>
+      <w:r>
+        <w:rPr>
+          <w:rFonts w:ascii="Times New Roman" w:hAnsi="Times New Roman" w:cs="Times New Roman"/>
+          <w:sz w:val="24"/>
+          <w:szCs w:val="24"/>
+        </w:rPr>
+        <w:t xml:space="preserve"> </w:t>
+      </w:r>
+      <w:r>
+        <w:rPr>
+          <w:rFonts w:ascii="Times New Roman" w:hAnsi="Times New Roman" w:cs="Times New Roman"/>
+          <w:sz w:val="24"/>
+          <w:szCs w:val="24"/>
+        </w:rPr>
+        <w:t>г</w:t>
+      </w:r>
+      <w:r>
+        <w:rPr>
+          <w:rFonts w:ascii="Times New Roman" w:hAnsi="Times New Roman" w:cs="Times New Roman"/>
+          <w:sz w:val="24"/>
+          <w:szCs w:val="24"/>
+        </w:rPr>
+        <w:t>.</w:t>
       </w:r>
     </w:p>
     <w:p>
@@ -604,250 +747,6 @@
     </w:tbl>
     <w:p>
       <w:pPr>
-        <w:spacing w:before="850" w:after="150" w:line="300" w:lineRule="auto"/>
-        <w:rPr>
-          <w:rFonts w:ascii="Times New Roman" w:hAnsi="Times New Roman" w:cs="Times New Roman"/>
-          <w:sz w:val="24"/>
-          <w:szCs w:val="24"/>
-        </w:rPr>
-      </w:pPr>
-      <w:r>
-        <w:rPr>
-          <w:rFonts w:ascii="Times New Roman" w:hAnsi="Times New Roman" w:cs="Times New Roman"/>
-          <w:b/>
-          <w:bCs/>
-          <w:sz w:val="24"/>
-          <w:szCs w:val="24"/>
-        </w:rPr>
-        <w:t>Составитель программы:</w:t>
-      </w:r>
-    </w:p>
-    <w:tbl>
-      <w:tblPr>
-        <w:tblW w:w="0" w:type="auto"/>
-        <w:tblInd w:w="10" w:type="dxa"/>
-        <w:tblCellMar>
-          <w:left w:w="10" w:type="dxa"/>
-          <w:right w:w="10" w:type="dxa"/>
-        </w:tblCellMar>
-        <w:tblLook w:val="0000" w:firstRow="0" w:lastRow="0" w:firstColumn="0" w:lastColumn="0" w:noHBand="0" w:noVBand="0"/>
-      </w:tblPr>
-      <w:tblGrid>
-        <w:gridCol w:w="2650"/>
-        <w:gridCol w:w="230"/>
-        <w:gridCol w:w="1150"/>
-        <w:gridCol w:w="575"/>
-        <w:gridCol w:w="500"/>
-        <w:gridCol w:w="230"/>
-        <w:gridCol w:w="1150"/>
-        <w:gridCol w:w="2010"/>
-      </w:tblGrid>
-      <w:tr>
-        <w:trPr>
-          <w:trHeight w:val="80"/>
-        </w:trPr>
-        <w:tc>
-          <w:tcPr>
-            <w:tcW w:w="2650" w:type="dxa"/>
-            <w:tcBorders>
-              <w:bottom w:val="single" w:sz="6" w:space="0" w:color="000000"/>
-            </w:tcBorders>
-            <w:vAlign w:val="center"/>
-          </w:tcPr>
-          <w:p>
-            <w:pPr>
-              <w:spacing w:after="0" w:line="240" w:lineRule="auto"/>
-              <w:jc w:val="center"/>
-              <w:rPr>
-                <w:rFonts w:ascii="Times New Roman" w:hAnsi="Times New Roman" w:cs="Times New Roman"/>
-                <w:sz w:val="24"/>
-                <w:szCs w:val="24"/>
-                <w:lang w:val="en-US"/>
-              </w:rPr>
-            </w:pPr>
-            <w:r>
-              <w:rPr>
-                <w:rFonts w:ascii="Times New Roman" w:hAnsi="Times New Roman" w:cs="Times New Roman"/>
-                <w:sz w:val="24"/>
-                <w:szCs w:val="24"/>
-                <w:lang w:val="en-US"/>
-              </w:rPr>
-              <w:t>{{ person_name }}</w:t>
-            </w:r>
-          </w:p>
-        </w:tc>
-        <w:tc>
-          <w:tcPr>
-            <w:tcW w:w="230" w:type="dxa"/>
-            <w:vAlign w:val="center"/>
-          </w:tcPr>
-          <w:p>
-            <w:pPr>
-              <w:spacing w:after="0" w:line="240" w:lineRule="auto"/>
-              <w:jc w:val="center"/>
-              <w:rPr>
-                <w:rFonts w:ascii="Times New Roman" w:hAnsi="Times New Roman" w:cs="Times New Roman"/>
-                <w:sz w:val="24"/>
-                <w:szCs w:val="24"/>
-              </w:rPr>
-            </w:pPr>
-            <w:r>
-              <w:rPr>
-                <w:rFonts w:ascii="Times New Roman" w:hAnsi="Times New Roman" w:cs="Times New Roman"/>
-                <w:sz w:val="24"/>
-                <w:szCs w:val="24"/>
-              </w:rPr>
-              <w:t>/</w:t>
-            </w:r>
-          </w:p>
-        </w:tc>
-        <w:tc>
-          <w:tcPr>
-            <w:tcW w:w="1150" w:type="dxa"/>
-            <w:tcBorders>
-              <w:bottom w:val="single" w:sz="6" w:space="0" w:color="000000"/>
-            </w:tcBorders>
-            <w:vAlign w:val="center"/>
-          </w:tcPr>
-          <w:p>
-            <w:pPr>
-              <w:spacing w:after="0" w:line="240" w:lineRule="auto"/>
-              <w:jc w:val="center"/>
-              <w:rPr>
-                <w:rFonts w:ascii="Times New Roman" w:hAnsi="Times New Roman" w:cs="Times New Roman"/>
-                <w:sz w:val="24"/>
-                <w:szCs w:val="24"/>
-              </w:rPr>
-            </w:pPr>
-          </w:p>
-        </w:tc>
-        <w:tc>
-          <w:tcPr>
-            <w:tcW w:w="575" w:type="dxa"/>
-            <w:vAlign w:val="center"/>
-          </w:tcPr>
-          <w:p>
-            <w:pPr>
-              <w:spacing w:after="0" w:line="240" w:lineRule="auto"/>
-              <w:jc w:val="center"/>
-              <w:rPr>
-                <w:rFonts w:ascii="Times New Roman" w:hAnsi="Times New Roman" w:cs="Times New Roman"/>
-                <w:sz w:val="24"/>
-                <w:szCs w:val="24"/>
-              </w:rPr>
-            </w:pPr>
-            <w:r>
-              <w:rPr>
-                <w:rFonts w:ascii="Times New Roman" w:hAnsi="Times New Roman" w:cs="Times New Roman"/>
-                <w:sz w:val="24"/>
-                <w:szCs w:val="24"/>
-              </w:rPr>
-              <w:t>/   “</w:t>
-            </w:r>
-          </w:p>
-        </w:tc>
-        <w:tc>
-          <w:tcPr>
-            <w:tcW w:w="500" w:type="dxa"/>
-            <w:tcBorders>
-              <w:bottom w:val="single" w:sz="6" w:space="0" w:color="000000"/>
-            </w:tcBorders>
-            <w:vAlign w:val="center"/>
-          </w:tcPr>
-          <w:p>
-            <w:pPr>
-              <w:spacing w:after="0" w:line="240" w:lineRule="auto"/>
-              <w:jc w:val="center"/>
-              <w:rPr>
-                <w:rFonts w:ascii="Times New Roman" w:hAnsi="Times New Roman" w:cs="Times New Roman"/>
-                <w:sz w:val="24"/>
-                <w:szCs w:val="24"/>
-              </w:rPr>
-            </w:pPr>
-          </w:p>
-        </w:tc>
-        <w:tc>
-          <w:tcPr>
-            <w:tcW w:w="230" w:type="dxa"/>
-            <w:vAlign w:val="center"/>
-          </w:tcPr>
-          <w:p>
-            <w:pPr>
-              <w:spacing w:after="0" w:line="240" w:lineRule="auto"/>
-              <w:jc w:val="center"/>
-              <w:rPr>
-                <w:rFonts w:ascii="Times New Roman" w:hAnsi="Times New Roman" w:cs="Times New Roman"/>
-                <w:sz w:val="24"/>
-                <w:szCs w:val="24"/>
-              </w:rPr>
-            </w:pPr>
-            <w:r>
-              <w:rPr>
-                <w:rFonts w:ascii="Times New Roman" w:hAnsi="Times New Roman" w:cs="Times New Roman"/>
-                <w:sz w:val="24"/>
-                <w:szCs w:val="24"/>
-              </w:rPr>
-              <w:t>”</w:t>
-            </w:r>
-          </w:p>
-        </w:tc>
-        <w:tc>
-          <w:tcPr>
-            <w:tcW w:w="1150" w:type="dxa"/>
-            <w:tcBorders>
-              <w:bottom w:val="single" w:sz="6" w:space="0" w:color="000000"/>
-            </w:tcBorders>
-            <w:vAlign w:val="center"/>
-          </w:tcPr>
-          <w:p>
-            <w:pPr>
-              <w:spacing w:after="0" w:line="240" w:lineRule="auto"/>
-              <w:jc w:val="center"/>
-              <w:rPr>
-                <w:rFonts w:ascii="Times New Roman" w:hAnsi="Times New Roman" w:cs="Times New Roman"/>
-                <w:sz w:val="24"/>
-                <w:szCs w:val="24"/>
-              </w:rPr>
-            </w:pPr>
-          </w:p>
-        </w:tc>
-        <w:tc>
-          <w:tcPr>
-            <w:tcW w:w="2010" w:type="dxa"/>
-            <w:vAlign w:val="bottom"/>
-          </w:tcPr>
-          <w:p>
-            <w:pPr>
-              <w:spacing w:after="0" w:line="240" w:lineRule="auto"/>
-              <w:rPr>
-                <w:rFonts w:ascii="Times New Roman" w:hAnsi="Times New Roman" w:cs="Times New Roman"/>
-                <w:sz w:val="24"/>
-                <w:szCs w:val="24"/>
-              </w:rPr>
-            </w:pPr>
-            <w:r>
-              <w:rPr>
-                <w:rFonts w:ascii="Times New Roman" w:hAnsi="Times New Roman" w:cs="Times New Roman"/>
-                <w:sz w:val="24"/>
-                <w:szCs w:val="24"/>
-                <w:lang w:val="en-US"/>
-              </w:rPr>
-              <w:t xml:space="preserve">{{current_year}} </w:t>
-            </w:r>
-            <w:r>
-              <w:rPr>
-                <w:rFonts w:ascii="Times New Roman" w:hAnsi="Times New Roman" w:cs="Times New Roman"/>
-                <w:sz w:val="24"/>
-                <w:szCs w:val="24"/>
-              </w:rPr>
-              <w:t>г.</w:t>
-            </w:r>
-          </w:p>
-        </w:tc>
-      </w:tr>
-    </w:tbl>
-    <w:p>
-      <w:pPr>
         <w:jc w:val="center"/>
         <w:rPr>
           <w:rFonts w:ascii="Times New Roman" w:hAnsi="Times New Roman" w:cs="Times New Roman"/>
@@ -858,117 +757,72 @@
     </w:p>
     <w:p>
       <w:pPr>
+        <w:jc w:val="center"/>
         <w:rPr>
           <w:rFonts w:ascii="Times New Roman" w:hAnsi="Times New Roman" w:cs="Times New Roman"/>
           <w:sz w:val="24"/>
           <w:szCs w:val="24"/>
         </w:rPr>
       </w:pPr>
-      <w:r>
-        <w:rPr>
-          <w:rFonts w:ascii="Times New Roman" w:hAnsi="Times New Roman" w:cs="Times New Roman"/>
-          <w:sz w:val="24"/>
-          <w:szCs w:val="24"/>
-        </w:rPr>
-        <w:br w:type="page"/>
-      </w:r>
     </w:p>
     <w:p>
       <w:pPr>
-        <w:spacing w:before="200" w:after="200" w:line="240" w:lineRule="auto"/>
-        <w:jc w:val="both"/>
-        <w:rPr>
-          <w:rFonts w:ascii="Times New Roman" w:hAnsi="Times New Roman" w:cs="Times New Roman"/>
-          <w:b/>
-          <w:bCs/>
+        <w:jc w:val="center"/>
+        <w:rPr>
+          <w:rFonts w:ascii="Times New Roman" w:hAnsi="Times New Roman" w:cs="Times New Roman"/>
           <w:sz w:val="24"/>
           <w:szCs w:val="24"/>
         </w:rPr>
       </w:pPr>
-      <w:r>
-        <w:rPr>
-          <w:rFonts w:ascii="Times New Roman" w:hAnsi="Times New Roman" w:cs="Times New Roman"/>
-          <w:b/>
-          <w:bCs/>
-          <w:sz w:val="24"/>
-          <w:szCs w:val="24"/>
-        </w:rPr>
-        <w:lastRenderedPageBreak/>
-        <w:t>1</w:t>
-      </w:r>
-      <w:r>
-        <w:rPr>
-          <w:rFonts w:ascii="Times New Roman" w:hAnsi="Times New Roman" w:cs="Times New Roman"/>
-          <w:b/>
-          <w:bCs/>
-          <w:sz w:val="24"/>
-          <w:szCs w:val="24"/>
-        </w:rPr>
-        <w:t xml:space="preserve"> Перечень планируемых результатов обучения по дисциплине, соотнесённых с планируемыми результатами освоения образовательной программы</w:t>
-      </w:r>
     </w:p>
     <w:p>
       <w:pPr>
-        <w:spacing w:before="200" w:after="200" w:line="240" w:lineRule="auto"/>
-        <w:jc w:val="both"/>
-        <w:rPr>
-          <w:rFonts w:ascii="Times New Roman" w:hAnsi="Times New Roman" w:cs="Times New Roman"/>
-          <w:b/>
-          <w:bCs/>
+        <w:jc w:val="center"/>
+        <w:rPr>
+          <w:rFonts w:ascii="Times New Roman" w:hAnsi="Times New Roman" w:cs="Times New Roman"/>
           <w:sz w:val="24"/>
           <w:szCs w:val="24"/>
         </w:rPr>
       </w:pPr>
-      <w:r>
-        <w:rPr>
-          <w:rFonts w:ascii="Times New Roman" w:hAnsi="Times New Roman" w:cs="Times New Roman"/>
-          <w:b/>
-          <w:bCs/>
-          <w:sz w:val="24"/>
-          <w:szCs w:val="24"/>
-        </w:rPr>
-        <w:t>1.1 Дисциплина «</w:t>
-      </w:r>
-      <w:r>
-        <w:rPr>
-          <w:rFonts w:ascii="Times New Roman" w:hAnsi="Times New Roman" w:cs="Times New Roman"/>
-          <w:b/>
-          <w:bCs/>
-          <w:sz w:val="24"/>
-          <w:szCs w:val="24"/>
-        </w:rPr>
-        <w:t>{{</w:t>
-      </w:r>
-      <w:r>
-        <w:rPr>
-          <w:rFonts w:ascii="Times New Roman" w:hAnsi="Times New Roman" w:cs="Times New Roman"/>
-          <w:b/>
-          <w:bCs/>
-          <w:sz w:val="24"/>
-          <w:szCs w:val="24"/>
-          <w:lang w:val="en-US"/>
-        </w:rPr>
-        <w:t>discipline</w:t>
-      </w:r>
-      <w:r>
-        <w:rPr>
-          <w:rFonts w:ascii="Times New Roman" w:hAnsi="Times New Roman" w:cs="Times New Roman"/>
-          <w:b/>
-          <w:bCs/>
-          <w:sz w:val="24"/>
-          <w:szCs w:val="24"/>
-        </w:rPr>
-        <w:t>}}</w:t>
-      </w:r>
-      <w:r>
-        <w:rPr>
-          <w:rFonts w:ascii="Times New Roman" w:hAnsi="Times New Roman" w:cs="Times New Roman"/>
-          <w:b/>
-          <w:bCs/>
-          <w:sz w:val="24"/>
-          <w:szCs w:val="24"/>
-        </w:rPr>
-        <w:t>» обеспечивает формирование следующих компетенций с учётом индикаторов их достижения</w:t>
+    </w:p>
+    <w:p>
+      <w:pPr>
+        <w:jc w:val="center"/>
+        <w:rPr>
+          <w:rFonts w:ascii="Times New Roman" w:hAnsi="Times New Roman" w:cs="Times New Roman"/>
+          <w:sz w:val="24"/>
+          <w:szCs w:val="24"/>
+        </w:rPr>
+      </w:pPr>
+    </w:p>
+    <w:p>
+      <w:pPr>
+        <w:jc w:val="center"/>
+        <w:rPr>
+          <w:rFonts w:ascii="Times New Roman" w:hAnsi="Times New Roman" w:cs="Times New Roman"/>
+          <w:sz w:val="24"/>
+          <w:szCs w:val="24"/>
+        </w:rPr>
+      </w:pPr>
+    </w:p>
+    <w:p>
+      <w:pPr>
+        <w:jc w:val="center"/>
+        <w:rPr>
+          <w:rFonts w:ascii="Times New Roman" w:hAnsi="Times New Roman" w:cs="Times New Roman"/>
+          <w:sz w:val="24"/>
+          <w:szCs w:val="24"/>
+          <w:lang w:val="en-US"/>
+        </w:rPr>
+      </w:pPr>
+      <w:r>
+        <w:rPr>
+          <w:rFonts w:ascii="Times New Roman" w:hAnsi="Times New Roman" w:cs="Times New Roman"/>
+          <w:sz w:val="24"/>
+          <w:szCs w:val="24"/>
+          <w:lang w:val="en-US"/>
+        </w:rPr>
+        <w:t>{% if status == 3 %}</w:t>
       </w:r>
     </w:p>
     <w:tbl>
@@ -978,8 +832,515 @@
         <w:tblLook w:val="04A0" w:firstRow="1" w:lastRow="0" w:firstColumn="1" w:lastColumn="0" w:noHBand="0" w:noVBand="1"/>
       </w:tblPr>
       <w:tblGrid>
-        <w:gridCol w:w="4672"/>
-        <w:gridCol w:w="4673"/>
+        <w:gridCol w:w="4106"/>
+        <w:gridCol w:w="851"/>
+        <w:gridCol w:w="4388"/>
+      </w:tblGrid>
+      <w:tr>
+        <w:tc>
+          <w:tcPr>
+            <w:tcW w:w="4106" w:type="dxa"/>
+            <w:tcBorders>
+              <w:right w:val="single" w:sz="4" w:space="0" w:color="auto"/>
+            </w:tcBorders>
+          </w:tcPr>
+          <w:p>
+            <w:pPr>
+              <w:rPr>
+                <w:rFonts w:ascii="Times New Roman" w:hAnsi="Times New Roman" w:cs="Times New Roman"/>
+                <w:sz w:val="20"/>
+                <w:szCs w:val="24"/>
+              </w:rPr>
+            </w:pPr>
+            <w:r>
+              <w:rPr>
+                <w:rFonts w:ascii="Times New Roman" w:hAnsi="Times New Roman" w:cs="Times New Roman"/>
+                <w:sz w:val="20"/>
+                <w:szCs w:val="24"/>
+              </w:rPr>
+              <w:t>Документ подписан простой электронной подписью</w:t>
+            </w:r>
+          </w:p>
+          <w:p>
+            <w:pPr>
+              <w:rPr>
+                <w:rFonts w:ascii="Times New Roman" w:hAnsi="Times New Roman" w:cs="Times New Roman"/>
+                <w:sz w:val="20"/>
+                <w:szCs w:val="24"/>
+              </w:rPr>
+            </w:pPr>
+            <w:r>
+              <w:rPr>
+                <w:rFonts w:ascii="Times New Roman" w:hAnsi="Times New Roman" w:cs="Times New Roman"/>
+                <w:sz w:val="20"/>
+                <w:szCs w:val="24"/>
+              </w:rPr>
+              <w:t xml:space="preserve">Составитель программы: {{ </w:t>
+            </w:r>
+            <w:r>
+              <w:rPr>
+                <w:rFonts w:ascii="Times New Roman" w:hAnsi="Times New Roman" w:cs="Times New Roman"/>
+                <w:sz w:val="20"/>
+                <w:szCs w:val="24"/>
+                <w:lang w:val="en-US"/>
+              </w:rPr>
+              <w:t>person</w:t>
+            </w:r>
+            <w:r>
+              <w:rPr>
+                <w:rFonts w:ascii="Times New Roman" w:hAnsi="Times New Roman" w:cs="Times New Roman"/>
+                <w:sz w:val="20"/>
+                <w:szCs w:val="24"/>
+              </w:rPr>
+              <w:t>_</w:t>
+            </w:r>
+            <w:r>
+              <w:rPr>
+                <w:rFonts w:ascii="Times New Roman" w:hAnsi="Times New Roman" w:cs="Times New Roman"/>
+                <w:sz w:val="20"/>
+                <w:szCs w:val="24"/>
+                <w:lang w:val="en-US"/>
+              </w:rPr>
+              <w:t>name</w:t>
+            </w:r>
+            <w:r>
+              <w:rPr>
+                <w:rFonts w:ascii="Times New Roman" w:hAnsi="Times New Roman" w:cs="Times New Roman"/>
+                <w:sz w:val="20"/>
+                <w:szCs w:val="24"/>
+              </w:rPr>
+              <w:t xml:space="preserve"> }}</w:t>
+            </w:r>
+          </w:p>
+          <w:p>
+            <w:pPr>
+              <w:rPr>
+                <w:rFonts w:ascii="Times New Roman" w:hAnsi="Times New Roman" w:cs="Times New Roman"/>
+                <w:sz w:val="20"/>
+                <w:szCs w:val="24"/>
+              </w:rPr>
+            </w:pPr>
+            <w:r>
+              <w:rPr>
+                <w:rFonts w:ascii="Times New Roman" w:hAnsi="Times New Roman" w:cs="Times New Roman"/>
+                <w:sz w:val="20"/>
+                <w:szCs w:val="24"/>
+              </w:rPr>
+              <w:t xml:space="preserve">Дата подписания: </w:t>
+            </w:r>
+            <w:r>
+              <w:rPr>
+                <w:rFonts w:ascii="Times New Roman" w:hAnsi="Times New Roman" w:cs="Times New Roman"/>
+                <w:sz w:val="20"/>
+                <w:szCs w:val="24"/>
+              </w:rPr>
+              <w:t xml:space="preserve">{{ </w:t>
+            </w:r>
+            <w:r>
+              <w:rPr>
+                <w:rFonts w:ascii="Times New Roman" w:hAnsi="Times New Roman" w:cs="Times New Roman"/>
+                <w:sz w:val="20"/>
+                <w:szCs w:val="24"/>
+                <w:lang w:val="en-US"/>
+              </w:rPr>
+              <w:t>review</w:t>
+            </w:r>
+            <w:r>
+              <w:rPr>
+                <w:rFonts w:ascii="Times New Roman" w:hAnsi="Times New Roman" w:cs="Times New Roman"/>
+                <w:sz w:val="20"/>
+                <w:szCs w:val="24"/>
+              </w:rPr>
+              <w:t>_</w:t>
+            </w:r>
+            <w:r>
+              <w:rPr>
+                <w:rFonts w:ascii="Times New Roman" w:hAnsi="Times New Roman" w:cs="Times New Roman"/>
+                <w:sz w:val="20"/>
+                <w:szCs w:val="24"/>
+                <w:lang w:val="en-US"/>
+              </w:rPr>
+              <w:t>date</w:t>
+            </w:r>
+            <w:r>
+              <w:rPr>
+                <w:rFonts w:ascii="Times New Roman" w:hAnsi="Times New Roman" w:cs="Times New Roman"/>
+                <w:sz w:val="20"/>
+                <w:szCs w:val="24"/>
+              </w:rPr>
+              <w:t xml:space="preserve"> }}</w:t>
+            </w:r>
+          </w:p>
+        </w:tc>
+        <w:tc>
+          <w:tcPr>
+            <w:tcW w:w="851" w:type="dxa"/>
+            <w:tcBorders>
+              <w:top w:val="nil"/>
+              <w:left w:val="single" w:sz="4" w:space="0" w:color="auto"/>
+              <w:bottom w:val="nil"/>
+            </w:tcBorders>
+          </w:tcPr>
+          <w:p>
+            <w:pPr>
+              <w:rPr>
+                <w:rFonts w:ascii="Times New Roman" w:hAnsi="Times New Roman" w:cs="Times New Roman"/>
+                <w:sz w:val="20"/>
+                <w:szCs w:val="24"/>
+              </w:rPr>
+            </w:pPr>
+          </w:p>
+        </w:tc>
+        <w:tc>
+          <w:tcPr>
+            <w:tcW w:w="4388" w:type="dxa"/>
+          </w:tcPr>
+          <w:p>
+            <w:pPr>
+              <w:rPr>
+                <w:rFonts w:ascii="Times New Roman" w:hAnsi="Times New Roman" w:cs="Times New Roman"/>
+                <w:sz w:val="20"/>
+                <w:szCs w:val="24"/>
+              </w:rPr>
+            </w:pPr>
+            <w:r>
+              <w:rPr>
+                <w:rFonts w:ascii="Times New Roman" w:hAnsi="Times New Roman" w:cs="Times New Roman"/>
+                <w:sz w:val="20"/>
+                <w:szCs w:val="24"/>
+              </w:rPr>
+              <w:t>Документ подписан простой электронной подписью</w:t>
+            </w:r>
+          </w:p>
+          <w:p>
+            <w:pPr>
+              <w:rPr>
+                <w:rFonts w:ascii="Times New Roman" w:hAnsi="Times New Roman" w:cs="Times New Roman"/>
+                <w:sz w:val="20"/>
+                <w:szCs w:val="24"/>
+                <w:lang w:val="en-US"/>
+              </w:rPr>
+            </w:pPr>
+            <w:r>
+              <w:rPr>
+                <w:rFonts w:ascii="Times New Roman" w:hAnsi="Times New Roman" w:cs="Times New Roman"/>
+                <w:sz w:val="20"/>
+                <w:szCs w:val="24"/>
+                <w:lang w:val="en-US"/>
+              </w:rPr>
+              <w:t xml:space="preserve">{{ </w:t>
+            </w:r>
+            <w:r>
+              <w:rPr>
+                <w:rFonts w:ascii="Times New Roman" w:hAnsi="Times New Roman" w:cs="Times New Roman"/>
+                <w:sz w:val="20"/>
+                <w:szCs w:val="24"/>
+                <w:lang w:val="en-US"/>
+              </w:rPr>
+              <w:t>user</w:t>
+            </w:r>
+            <w:r>
+              <w:rPr>
+                <w:rFonts w:ascii="Times New Roman" w:hAnsi="Times New Roman" w:cs="Times New Roman"/>
+                <w:sz w:val="20"/>
+                <w:szCs w:val="24"/>
+                <w:lang w:val="en-US"/>
+              </w:rPr>
+              <w:t>_</w:t>
+            </w:r>
+            <w:r>
+              <w:rPr>
+                <w:rFonts w:ascii="Times New Roman" w:hAnsi="Times New Roman" w:cs="Times New Roman"/>
+                <w:sz w:val="20"/>
+                <w:szCs w:val="24"/>
+                <w:lang w:val="en-US"/>
+              </w:rPr>
+              <w:t>type</w:t>
+            </w:r>
+            <w:r>
+              <w:rPr>
+                <w:rFonts w:ascii="Times New Roman" w:hAnsi="Times New Roman" w:cs="Times New Roman"/>
+                <w:sz w:val="20"/>
+                <w:szCs w:val="24"/>
+                <w:lang w:val="en-US"/>
+              </w:rPr>
+              <w:t xml:space="preserve"> }}: </w:t>
+            </w:r>
+            <w:r>
+              <w:rPr>
+                <w:rFonts w:ascii="Times New Roman" w:hAnsi="Times New Roman" w:cs="Times New Roman"/>
+                <w:sz w:val="20"/>
+                <w:szCs w:val="24"/>
+                <w:lang w:val="en-US"/>
+              </w:rPr>
+              <w:t xml:space="preserve">{{ </w:t>
+            </w:r>
+            <w:r>
+              <w:rPr>
+                <w:rFonts w:ascii="Times New Roman" w:hAnsi="Times New Roman" w:cs="Times New Roman"/>
+                <w:sz w:val="20"/>
+                <w:szCs w:val="24"/>
+                <w:lang w:val="en-US"/>
+              </w:rPr>
+              <w:t>user</w:t>
+            </w:r>
+            <w:r>
+              <w:rPr>
+                <w:rFonts w:ascii="Times New Roman" w:hAnsi="Times New Roman" w:cs="Times New Roman"/>
+                <w:sz w:val="20"/>
+                <w:szCs w:val="24"/>
+                <w:lang w:val="en-US"/>
+              </w:rPr>
+              <w:t>_</w:t>
+            </w:r>
+            <w:r>
+              <w:rPr>
+                <w:rFonts w:ascii="Times New Roman" w:hAnsi="Times New Roman" w:cs="Times New Roman"/>
+                <w:sz w:val="20"/>
+                <w:szCs w:val="24"/>
+                <w:lang w:val="en-US"/>
+              </w:rPr>
+              <w:t>accepted</w:t>
+            </w:r>
+            <w:r>
+              <w:rPr>
+                <w:rFonts w:ascii="Times New Roman" w:hAnsi="Times New Roman" w:cs="Times New Roman"/>
+                <w:sz w:val="20"/>
+                <w:szCs w:val="24"/>
+                <w:lang w:val="en-US"/>
+              </w:rPr>
+              <w:t xml:space="preserve"> }}</w:t>
+            </w:r>
+          </w:p>
+          <w:p>
+            <w:pPr>
+              <w:rPr>
+                <w:rFonts w:ascii="Times New Roman" w:hAnsi="Times New Roman" w:cs="Times New Roman"/>
+                <w:sz w:val="20"/>
+                <w:szCs w:val="24"/>
+                <w:lang w:val="en-US"/>
+              </w:rPr>
+            </w:pPr>
+            <w:r>
+              <w:rPr>
+                <w:rFonts w:ascii="Times New Roman" w:hAnsi="Times New Roman" w:cs="Times New Roman"/>
+                <w:sz w:val="20"/>
+                <w:szCs w:val="24"/>
+              </w:rPr>
+              <w:t>Дата</w:t>
+            </w:r>
+            <w:r>
+              <w:rPr>
+                <w:rFonts w:ascii="Times New Roman" w:hAnsi="Times New Roman" w:cs="Times New Roman"/>
+                <w:sz w:val="20"/>
+                <w:szCs w:val="24"/>
+                <w:lang w:val="en-US"/>
+              </w:rPr>
+              <w:t xml:space="preserve"> </w:t>
+            </w:r>
+            <w:r>
+              <w:rPr>
+                <w:rFonts w:ascii="Times New Roman" w:hAnsi="Times New Roman" w:cs="Times New Roman"/>
+                <w:sz w:val="20"/>
+                <w:szCs w:val="24"/>
+              </w:rPr>
+              <w:t>подписания</w:t>
+            </w:r>
+            <w:r>
+              <w:rPr>
+                <w:rFonts w:ascii="Times New Roman" w:hAnsi="Times New Roman" w:cs="Times New Roman"/>
+                <w:sz w:val="20"/>
+                <w:szCs w:val="24"/>
+                <w:lang w:val="en-US"/>
+              </w:rPr>
+              <w:t>:</w:t>
+            </w:r>
+            <w:r>
+              <w:rPr>
+                <w:rFonts w:ascii="Times New Roman" w:hAnsi="Times New Roman" w:cs="Times New Roman"/>
+                <w:sz w:val="20"/>
+                <w:szCs w:val="24"/>
+                <w:lang w:val="en-US"/>
+              </w:rPr>
+              <w:t xml:space="preserve"> {{ </w:t>
+            </w:r>
+            <w:r>
+              <w:rPr>
+                <w:rFonts w:ascii="Times New Roman" w:hAnsi="Times New Roman" w:cs="Times New Roman"/>
+                <w:sz w:val="20"/>
+                <w:szCs w:val="24"/>
+                <w:lang w:val="en-US"/>
+              </w:rPr>
+              <w:t>accept_date</w:t>
+            </w:r>
+            <w:r>
+              <w:rPr>
+                <w:rFonts w:ascii="Times New Roman" w:hAnsi="Times New Roman" w:cs="Times New Roman"/>
+                <w:sz w:val="20"/>
+                <w:szCs w:val="24"/>
+                <w:lang w:val="en-US"/>
+              </w:rPr>
+              <w:t xml:space="preserve"> </w:t>
+            </w:r>
+            <w:r>
+              <w:rPr>
+                <w:rFonts w:ascii="Times New Roman" w:hAnsi="Times New Roman" w:cs="Times New Roman"/>
+                <w:sz w:val="20"/>
+                <w:szCs w:val="24"/>
+                <w:lang w:val="en-US"/>
+              </w:rPr>
+              <w:t>}}</w:t>
+            </w:r>
+          </w:p>
+        </w:tc>
+      </w:tr>
+    </w:tbl>
+    <w:p>
+      <w:pPr>
+        <w:jc w:val="center"/>
+        <w:rPr>
+          <w:rFonts w:ascii="Times New Roman" w:hAnsi="Times New Roman" w:cs="Times New Roman"/>
+          <w:sz w:val="24"/>
+          <w:szCs w:val="24"/>
+          <w:lang w:val="en-US"/>
+        </w:rPr>
+      </w:pPr>
+      <w:r>
+        <w:rPr>
+          <w:rFonts w:ascii="Times New Roman" w:hAnsi="Times New Roman" w:cs="Times New Roman"/>
+          <w:sz w:val="24"/>
+          <w:szCs w:val="24"/>
+          <w:lang w:val="en-US"/>
+        </w:rPr>
+        <w:t>{% endif %}</w:t>
+      </w:r>
+    </w:p>
+    <w:p>
+      <w:pPr>
+        <w:rPr>
+          <w:rFonts w:ascii="Times New Roman" w:hAnsi="Times New Roman" w:cs="Times New Roman"/>
+          <w:sz w:val="24"/>
+          <w:szCs w:val="24"/>
+          <w:lang w:val="en-US"/>
+        </w:rPr>
+      </w:pPr>
+      <w:r>
+        <w:rPr>
+          <w:rFonts w:ascii="Times New Roman" w:hAnsi="Times New Roman" w:cs="Times New Roman"/>
+          <w:sz w:val="24"/>
+          <w:szCs w:val="24"/>
+          <w:lang w:val="en-US"/>
+        </w:rPr>
+        <w:br w:type="page"/>
+      </w:r>
+    </w:p>
+    <w:p>
+      <w:pPr>
+        <w:spacing w:before="200" w:after="200" w:line="240" w:lineRule="auto"/>
+        <w:jc w:val="both"/>
+        <w:rPr>
+          <w:rFonts w:ascii="Times New Roman" w:hAnsi="Times New Roman" w:cs="Times New Roman"/>
+          <w:b/>
+          <w:bCs/>
+          <w:sz w:val="24"/>
+          <w:szCs w:val="24"/>
+        </w:rPr>
+      </w:pPr>
+      <w:r>
+        <w:rPr>
+          <w:rFonts w:ascii="Times New Roman" w:hAnsi="Times New Roman" w:cs="Times New Roman"/>
+          <w:b/>
+          <w:bCs/>
+          <w:sz w:val="24"/>
+          <w:szCs w:val="24"/>
+        </w:rPr>
+        <w:lastRenderedPageBreak/>
+        <w:t>1</w:t>
+      </w:r>
+      <w:r>
+        <w:rPr>
+          <w:rFonts w:ascii="Times New Roman" w:hAnsi="Times New Roman" w:cs="Times New Roman"/>
+          <w:b/>
+          <w:bCs/>
+          <w:sz w:val="24"/>
+          <w:szCs w:val="24"/>
+        </w:rPr>
+        <w:t xml:space="preserve"> Перечень планируемых результатов обучения по дисциплине, соотнесённых с планируемыми результатами освоения образовательной программы</w:t>
+      </w:r>
+    </w:p>
+    <w:p>
+      <w:pPr>
+        <w:spacing w:before="200" w:after="200" w:line="240" w:lineRule="auto"/>
+        <w:jc w:val="both"/>
+        <w:rPr>
+          <w:rFonts w:ascii="Times New Roman" w:hAnsi="Times New Roman" w:cs="Times New Roman"/>
+          <w:b/>
+          <w:bCs/>
+          <w:sz w:val="24"/>
+          <w:szCs w:val="24"/>
+        </w:rPr>
+      </w:pPr>
+      <w:r>
+        <w:rPr>
+          <w:rFonts w:ascii="Times New Roman" w:hAnsi="Times New Roman" w:cs="Times New Roman"/>
+          <w:b/>
+          <w:bCs/>
+          <w:sz w:val="24"/>
+          <w:szCs w:val="24"/>
+        </w:rPr>
+        <w:t>1.1 Дисциплина «</w:t>
+      </w:r>
+      <w:r>
+        <w:rPr>
+          <w:rFonts w:ascii="Times New Roman" w:hAnsi="Times New Roman" w:cs="Times New Roman"/>
+          <w:b/>
+          <w:bCs/>
+          <w:sz w:val="24"/>
+          <w:szCs w:val="24"/>
+        </w:rPr>
+        <w:t>{{</w:t>
+      </w:r>
+      <w:r>
+        <w:rPr>
+          <w:rFonts w:ascii="Times New Roman" w:hAnsi="Times New Roman" w:cs="Times New Roman"/>
+          <w:b/>
+          <w:bCs/>
+          <w:sz w:val="24"/>
+          <w:szCs w:val="24"/>
+          <w:lang w:val="en-US"/>
+        </w:rPr>
+        <w:t>discipline</w:t>
+      </w:r>
+      <w:r>
+        <w:rPr>
+          <w:rFonts w:ascii="Times New Roman" w:hAnsi="Times New Roman" w:cs="Times New Roman"/>
+          <w:b/>
+          <w:bCs/>
+          <w:sz w:val="24"/>
+          <w:szCs w:val="24"/>
+        </w:rPr>
+        <w:t>}}</w:t>
+      </w:r>
+      <w:r>
+        <w:rPr>
+          <w:rFonts w:ascii="Times New Roman" w:hAnsi="Times New Roman" w:cs="Times New Roman"/>
+          <w:b/>
+          <w:bCs/>
+          <w:sz w:val="24"/>
+          <w:szCs w:val="24"/>
+        </w:rPr>
+        <w:t>» обеспечивает формирование следующих компетенций с учётом индикаторов их достижения</w:t>
+      </w:r>
+    </w:p>
+    <w:tbl>
+      <w:tblPr>
+        <w:tblStyle w:val="ab"/>
+        <w:tblW w:w="0" w:type="auto"/>
+        <w:tblLook w:val="04A0" w:firstRow="1" w:lastRow="0" w:firstColumn="1" w:lastColumn="0" w:noHBand="0" w:noVBand="1"/>
+      </w:tblPr>
+      <w:tblGrid>
+        <w:gridCol w:w="5807"/>
+        <w:gridCol w:w="3538"/>
       </w:tblGrid>
       <w:tr>
         <w:trPr>
@@ -987,7 +1348,7 @@
         </w:trPr>
         <w:tc>
           <w:tcPr>
-            <w:tcW w:w="4672" w:type="dxa"/>
+            <w:tcW w:w="5807" w:type="dxa"/>
             <w:tcBorders>
               <w:top w:val="single" w:sz="4" w:space="0" w:color="auto"/>
               <w:left w:val="single" w:sz="4" w:space="0" w:color="auto"/>
@@ -1022,13 +1383,13 @@
                 <w:sz w:val="24"/>
                 <w:szCs w:val="24"/>
               </w:rPr>
-              <w:t>наименования компетенции</w:t>
-            </w:r>
-          </w:p>
-        </w:tc>
-        <w:tc>
-          <w:tcPr>
-            <w:tcW w:w="4673" w:type="dxa"/>
+              <w:t>наименование компетенции</w:t>
+            </w:r>
+          </w:p>
+        </w:tc>
+        <w:tc>
+          <w:tcPr>
+            <w:tcW w:w="3538" w:type="dxa"/>
             <w:tcBorders>
               <w:top w:val="single" w:sz="4" w:space="0" w:color="auto"/>
               <w:left w:val="single" w:sz="4" w:space="0" w:color="auto"/>
@@ -1103,7 +1464,7 @@
       <w:tr>
         <w:tc>
           <w:tcPr>
-            <w:tcW w:w="4672" w:type="dxa"/>
+            <w:tcW w:w="5807" w:type="dxa"/>
             <w:tcBorders>
               <w:top w:val="single" w:sz="4" w:space="0" w:color="auto"/>
               <w:left w:val="single" w:sz="4" w:space="0" w:color="auto"/>
@@ -1178,7 +1539,7 @@
         </w:tc>
         <w:tc>
           <w:tcPr>
-            <w:tcW w:w="4673" w:type="dxa"/>
+            <w:tcW w:w="3538" w:type="dxa"/>
             <w:tcBorders>
               <w:top w:val="single" w:sz="4" w:space="0" w:color="auto"/>
               <w:left w:val="single" w:sz="4" w:space="0" w:color="auto"/>
@@ -2126,33 +2487,7 @@
                 <w:sz w:val="24"/>
                 <w:szCs w:val="24"/>
               </w:rPr>
-              <w:t>Трудоемкость в академических</w:t>
-            </w:r>
-            <w:r>
-              <w:rPr>
-                <w:rFonts w:ascii="Times New Roman" w:hAnsi="Times New Roman" w:cs="Times New Roman"/>
-                <w:sz w:val="24"/>
-                <w:szCs w:val="24"/>
-              </w:rPr>
-              <w:t xml:space="preserve"> </w:t>
-            </w:r>
-            <w:r>
-              <w:rPr>
-                <w:rFonts w:ascii="Times New Roman" w:hAnsi="Times New Roman" w:cs="Times New Roman"/>
-                <w:b/>
-                <w:bCs/>
-                <w:sz w:val="24"/>
-                <w:szCs w:val="24"/>
-              </w:rPr>
-              <w:t>часах</w:t>
-            </w:r>
-            <w:r>
-              <w:rPr>
-                <w:rFonts w:ascii="Times New Roman" w:hAnsi="Times New Roman" w:cs="Times New Roman"/>
-                <w:sz w:val="24"/>
-                <w:szCs w:val="24"/>
-              </w:rPr>
-              <w:t xml:space="preserve"> </w:t>
+              <w:t>Трудоемкость в академических часах</w:t>
             </w:r>
           </w:p>
           <w:p>
@@ -2170,7 +2505,7 @@
                 <w:sz w:val="24"/>
                 <w:szCs w:val="24"/>
               </w:rPr>
-              <w:t>(Один академический час соответствует 45 минутам астрономического часа)</w:t>
+              <w:t xml:space="preserve"> (Один академический час соответствует 45 минутам астрономического часа)</w:t>
             </w:r>
           </w:p>
         </w:tc>
@@ -5344,7 +5679,7 @@
     <w:tbl>
       <w:tblPr>
         <w:tblStyle w:val="ab"/>
-        <w:tblW w:w="0" w:type="auto"/>
+        <w:tblW w:w="9347" w:type="dxa"/>
         <w:tblLayout w:type="fixed"/>
         <w:tblLook w:val="04A0" w:firstRow="1" w:lastRow="0" w:firstColumn="1" w:lastColumn="0" w:noHBand="0" w:noVBand="1"/>
       </w:tblPr>
@@ -5354,10 +5689,10 @@
         <w:gridCol w:w="708"/>
         <w:gridCol w:w="709"/>
         <w:gridCol w:w="709"/>
+        <w:gridCol w:w="712"/>
         <w:gridCol w:w="710"/>
-        <w:gridCol w:w="710"/>
-        <w:gridCol w:w="710"/>
-        <w:gridCol w:w="710"/>
+        <w:gridCol w:w="756"/>
+        <w:gridCol w:w="664"/>
         <w:gridCol w:w="710"/>
         <w:gridCol w:w="1174"/>
       </w:tblGrid>
@@ -5438,8 +5773,8 @@
         </w:tc>
         <w:tc>
           <w:tcPr>
-            <w:tcW w:w="5676" w:type="dxa"/>
-            <w:gridSpan w:val="8"/>
+            <w:tcW w:w="4304" w:type="dxa"/>
+            <w:gridSpan w:val="6"/>
             <w:vAlign w:val="center"/>
           </w:tcPr>
           <w:p>
@@ -5465,6 +5800,33 @@
         </w:tc>
         <w:tc>
           <w:tcPr>
+            <w:tcW w:w="1374" w:type="dxa"/>
+            <w:gridSpan w:val="2"/>
+            <w:vMerge w:val="restart"/>
+            <w:vAlign w:val="center"/>
+          </w:tcPr>
+          <w:p>
+            <w:pPr>
+              <w:jc w:val="center"/>
+              <w:rPr>
+                <w:rFonts w:ascii="Times New Roman" w:hAnsi="Times New Roman" w:cs="Times New Roman"/>
+                <w:b/>
+                <w:sz w:val="20"/>
+                <w:szCs w:val="20"/>
+              </w:rPr>
+            </w:pPr>
+            <w:r>
+              <w:rPr>
+                <w:rFonts w:ascii="Times New Roman" w:hAnsi="Times New Roman" w:cs="Times New Roman"/>
+                <w:sz w:val="20"/>
+                <w:szCs w:val="20"/>
+              </w:rPr>
+              <w:t>СРС</w:t>
+            </w:r>
+          </w:p>
+        </w:tc>
+        <w:tc>
+          <w:tcPr>
             <w:tcW w:w="1174" w:type="dxa"/>
             <w:vMerge w:val="restart"/>
             <w:vAlign w:val="center"/>
@@ -5553,7 +5915,7 @@
         </w:tc>
         <w:tc>
           <w:tcPr>
-            <w:tcW w:w="1419" w:type="dxa"/>
+            <w:tcW w:w="1421" w:type="dxa"/>
             <w:gridSpan w:val="2"/>
             <w:vAlign w:val="center"/>
           </w:tcPr>
@@ -5578,7 +5940,7 @@
         </w:tc>
         <w:tc>
           <w:tcPr>
-            <w:tcW w:w="1420" w:type="dxa"/>
+            <w:tcW w:w="1466" w:type="dxa"/>
             <w:gridSpan w:val="2"/>
             <w:vAlign w:val="center"/>
           </w:tcPr>
@@ -5603,8 +5965,9 @@
         </w:tc>
         <w:tc>
           <w:tcPr>
-            <w:tcW w:w="1420" w:type="dxa"/>
+            <w:tcW w:w="1374" w:type="dxa"/>
             <w:gridSpan w:val="2"/>
+            <w:vMerge/>
             <w:vAlign w:val="center"/>
           </w:tcPr>
           <w:p>
@@ -5616,14 +5979,6 @@
                 <w:szCs w:val="20"/>
               </w:rPr>
             </w:pPr>
-            <w:r>
-              <w:rPr>
-                <w:rFonts w:ascii="Times New Roman" w:hAnsi="Times New Roman" w:cs="Times New Roman"/>
-                <w:sz w:val="20"/>
-                <w:szCs w:val="20"/>
-              </w:rPr>
-              <w:t>СРС</w:t>
-            </w:r>
           </w:p>
         </w:tc>
         <w:tc>
@@ -5753,6 +6108,30 @@
         </w:tc>
         <w:tc>
           <w:tcPr>
+            <w:tcW w:w="712" w:type="dxa"/>
+            <w:vAlign w:val="center"/>
+          </w:tcPr>
+          <w:p>
+            <w:pPr>
+              <w:jc w:val="center"/>
+              <w:rPr>
+                <w:rFonts w:ascii="Times New Roman" w:hAnsi="Times New Roman" w:cs="Times New Roman"/>
+                <w:sz w:val="20"/>
+                <w:szCs w:val="20"/>
+              </w:rPr>
+            </w:pPr>
+            <w:r>
+              <w:rPr>
+                <w:rFonts w:ascii="Times New Roman" w:hAnsi="Times New Roman" w:cs="Times New Roman"/>
+                <w:sz w:val="20"/>
+                <w:szCs w:val="20"/>
+              </w:rPr>
+              <w:t>Кол. Час.</w:t>
+            </w:r>
+          </w:p>
+        </w:tc>
+        <w:tc>
+          <w:tcPr>
             <w:tcW w:w="710" w:type="dxa"/>
             <w:vAlign w:val="center"/>
           </w:tcPr>
@@ -5771,13 +6150,13 @@
                 <w:sz w:val="20"/>
                 <w:szCs w:val="20"/>
               </w:rPr>
-              <w:t>Кол. Час.</w:t>
-            </w:r>
-          </w:p>
-        </w:tc>
-        <w:tc>
-          <w:tcPr>
-            <w:tcW w:w="710" w:type="dxa"/>
+              <w:t>№</w:t>
+            </w:r>
+          </w:p>
+        </w:tc>
+        <w:tc>
+          <w:tcPr>
+            <w:tcW w:w="756" w:type="dxa"/>
             <w:vAlign w:val="center"/>
           </w:tcPr>
           <w:p>
@@ -5795,37 +6174,13 @@
                 <w:sz w:val="20"/>
                 <w:szCs w:val="20"/>
               </w:rPr>
-              <w:t>№</w:t>
-            </w:r>
-          </w:p>
-        </w:tc>
-        <w:tc>
-          <w:tcPr>
-            <w:tcW w:w="710" w:type="dxa"/>
-            <w:vAlign w:val="center"/>
-          </w:tcPr>
-          <w:p>
-            <w:pPr>
-              <w:jc w:val="center"/>
-              <w:rPr>
-                <w:rFonts w:ascii="Times New Roman" w:hAnsi="Times New Roman" w:cs="Times New Roman"/>
-                <w:sz w:val="20"/>
-                <w:szCs w:val="20"/>
-              </w:rPr>
-            </w:pPr>
-            <w:r>
-              <w:rPr>
-                <w:rFonts w:ascii="Times New Roman" w:hAnsi="Times New Roman" w:cs="Times New Roman"/>
-                <w:sz w:val="20"/>
-                <w:szCs w:val="20"/>
-              </w:rPr>
               <w:t>Кол. Час.</w:t>
             </w:r>
           </w:p>
         </w:tc>
         <w:tc>
           <w:tcPr>
-            <w:tcW w:w="710" w:type="dxa"/>
+            <w:tcW w:w="664" w:type="dxa"/>
             <w:vAlign w:val="center"/>
           </w:tcPr>
           <w:p>
@@ -6013,6 +6368,30 @@
         </w:tc>
         <w:tc>
           <w:tcPr>
+            <w:tcW w:w="712" w:type="dxa"/>
+            <w:vAlign w:val="center"/>
+          </w:tcPr>
+          <w:p>
+            <w:pPr>
+              <w:jc w:val="center"/>
+              <w:rPr>
+                <w:rFonts w:ascii="Times New Roman" w:hAnsi="Times New Roman" w:cs="Times New Roman"/>
+                <w:sz w:val="20"/>
+                <w:szCs w:val="20"/>
+              </w:rPr>
+            </w:pPr>
+            <w:r>
+              <w:rPr>
+                <w:rFonts w:ascii="Times New Roman" w:hAnsi="Times New Roman" w:cs="Times New Roman"/>
+                <w:sz w:val="20"/>
+                <w:szCs w:val="20"/>
+              </w:rPr>
+              <w:t>6</w:t>
+            </w:r>
+          </w:p>
+        </w:tc>
+        <w:tc>
+          <w:tcPr>
             <w:tcW w:w="710" w:type="dxa"/>
             <w:vAlign w:val="center"/>
           </w:tcPr>
@@ -6031,7 +6410,55 @@
                 <w:sz w:val="20"/>
                 <w:szCs w:val="20"/>
               </w:rPr>
-              <w:t>6</w:t>
+              <w:t>7</w:t>
+            </w:r>
+          </w:p>
+        </w:tc>
+        <w:tc>
+          <w:tcPr>
+            <w:tcW w:w="756" w:type="dxa"/>
+            <w:vAlign w:val="center"/>
+          </w:tcPr>
+          <w:p>
+            <w:pPr>
+              <w:jc w:val="center"/>
+              <w:rPr>
+                <w:rFonts w:ascii="Times New Roman" w:hAnsi="Times New Roman" w:cs="Times New Roman"/>
+                <w:sz w:val="20"/>
+                <w:szCs w:val="20"/>
+              </w:rPr>
+            </w:pPr>
+            <w:r>
+              <w:rPr>
+                <w:rFonts w:ascii="Times New Roman" w:hAnsi="Times New Roman" w:cs="Times New Roman"/>
+                <w:sz w:val="20"/>
+                <w:szCs w:val="20"/>
+              </w:rPr>
+              <w:t>8</w:t>
+            </w:r>
+          </w:p>
+        </w:tc>
+        <w:tc>
+          <w:tcPr>
+            <w:tcW w:w="664" w:type="dxa"/>
+            <w:vAlign w:val="center"/>
+          </w:tcPr>
+          <w:p>
+            <w:pPr>
+              <w:jc w:val="center"/>
+              <w:rPr>
+                <w:rFonts w:ascii="Times New Roman" w:hAnsi="Times New Roman" w:cs="Times New Roman"/>
+                <w:sz w:val="20"/>
+                <w:szCs w:val="20"/>
+              </w:rPr>
+            </w:pPr>
+            <w:r>
+              <w:rPr>
+                <w:rFonts w:ascii="Times New Roman" w:hAnsi="Times New Roman" w:cs="Times New Roman"/>
+                <w:sz w:val="20"/>
+                <w:szCs w:val="20"/>
+              </w:rPr>
+              <w:t>9</w:t>
             </w:r>
           </w:p>
         </w:tc>
@@ -6055,7 +6482,259 @@
                 <w:sz w:val="20"/>
                 <w:szCs w:val="20"/>
               </w:rPr>
-              <w:t>7</w:t>
+              <w:t>10</w:t>
+            </w:r>
+          </w:p>
+        </w:tc>
+        <w:tc>
+          <w:tcPr>
+            <w:tcW w:w="1174" w:type="dxa"/>
+            <w:vAlign w:val="center"/>
+          </w:tcPr>
+          <w:p>
+            <w:pPr>
+              <w:jc w:val="center"/>
+              <w:rPr>
+                <w:rFonts w:ascii="Times New Roman" w:hAnsi="Times New Roman" w:cs="Times New Roman"/>
+                <w:sz w:val="20"/>
+                <w:szCs w:val="20"/>
+              </w:rPr>
+            </w:pPr>
+            <w:r>
+              <w:rPr>
+                <w:rFonts w:ascii="Times New Roman" w:hAnsi="Times New Roman" w:cs="Times New Roman"/>
+                <w:sz w:val="20"/>
+                <w:szCs w:val="20"/>
+              </w:rPr>
+              <w:t>11</w:t>
+            </w:r>
+          </w:p>
+        </w:tc>
+      </w:tr>
+      <w:tr>
+        <w:tc>
+          <w:tcPr>
+            <w:tcW w:w="704" w:type="dxa"/>
+            <w:vAlign w:val="center"/>
+          </w:tcPr>
+          <w:p>
+            <w:pPr>
+              <w:jc w:val="center"/>
+              <w:rPr>
+                <w:rFonts w:ascii="Times New Roman" w:hAnsi="Times New Roman" w:cs="Times New Roman"/>
+                <w:sz w:val="20"/>
+                <w:szCs w:val="20"/>
+                <w:lang w:val="en-US"/>
+              </w:rPr>
+            </w:pPr>
+          </w:p>
+        </w:tc>
+        <w:tc>
+          <w:tcPr>
+            <w:tcW w:w="8643" w:type="dxa"/>
+            <w:gridSpan w:val="10"/>
+            <w:vAlign w:val="center"/>
+          </w:tcPr>
+          <w:p>
+            <w:pPr>
+              <w:jc w:val="center"/>
+              <w:rPr>
+                <w:rFonts w:ascii="Times New Roman" w:hAnsi="Times New Roman" w:cs="Times New Roman"/>
+                <w:sz w:val="20"/>
+                <w:szCs w:val="20"/>
+                <w:lang w:val="en-US"/>
+              </w:rPr>
+            </w:pPr>
+            <w:r>
+              <w:rPr>
+                <w:rFonts w:ascii="Times New Roman" w:hAnsi="Times New Roman" w:cs="Times New Roman"/>
+                <w:sz w:val="20"/>
+                <w:szCs w:val="20"/>
+                <w:lang w:val="en-US"/>
+              </w:rPr>
+              <w:t xml:space="preserve">{%tr for </w:t>
+            </w:r>
+            <w:r>
+              <w:rPr>
+                <w:rFonts w:ascii="Times New Roman" w:hAnsi="Times New Roman" w:cs="Times New Roman"/>
+                <w:sz w:val="20"/>
+                <w:szCs w:val="20"/>
+                <w:lang w:val="en-US"/>
+              </w:rPr>
+              <w:t>i in items %}</w:t>
+            </w:r>
+          </w:p>
+        </w:tc>
+      </w:tr>
+      <w:tr>
+        <w:tc>
+          <w:tcPr>
+            <w:tcW w:w="704" w:type="dxa"/>
+            <w:vAlign w:val="center"/>
+          </w:tcPr>
+          <w:p>
+            <w:pPr>
+              <w:jc w:val="center"/>
+              <w:rPr>
+                <w:rFonts w:ascii="Times New Roman" w:hAnsi="Times New Roman" w:cs="Times New Roman"/>
+                <w:sz w:val="20"/>
+                <w:szCs w:val="20"/>
+              </w:rPr>
+            </w:pPr>
+            <w:r>
+              <w:rPr>
+                <w:rFonts w:ascii="Times New Roman" w:hAnsi="Times New Roman" w:cs="Times New Roman"/>
+                <w:sz w:val="20"/>
+                <w:szCs w:val="20"/>
+                <w:lang w:val="en-US"/>
+              </w:rPr>
+              <w:t>{{ i</w:t>
+            </w:r>
+            <w:r>
+              <w:rPr>
+                <w:rFonts w:ascii="Times New Roman" w:hAnsi="Times New Roman" w:cs="Times New Roman"/>
+                <w:sz w:val="20"/>
+                <w:szCs w:val="20"/>
+                <w:lang w:val="en-US"/>
+              </w:rPr>
+              <w:t>.num</w:t>
+            </w:r>
+            <w:r>
+              <w:rPr>
+                <w:rFonts w:ascii="Times New Roman" w:hAnsi="Times New Roman" w:cs="Times New Roman"/>
+                <w:sz w:val="20"/>
+                <w:szCs w:val="20"/>
+                <w:lang w:val="en-US"/>
+              </w:rPr>
+              <w:t>}}</w:t>
+            </w:r>
+          </w:p>
+        </w:tc>
+        <w:tc>
+          <w:tcPr>
+            <w:tcW w:w="1791" w:type="dxa"/>
+          </w:tcPr>
+          <w:p>
+            <w:pPr>
+              <w:rPr>
+                <w:rFonts w:ascii="Times New Roman" w:hAnsi="Times New Roman" w:cs="Times New Roman"/>
+                <w:sz w:val="20"/>
+                <w:szCs w:val="20"/>
+                <w:lang w:val="en-US"/>
+              </w:rPr>
+            </w:pPr>
+            <w:r>
+              <w:rPr>
+                <w:rFonts w:ascii="Times New Roman" w:hAnsi="Times New Roman" w:cs="Times New Roman"/>
+                <w:sz w:val="20"/>
+                <w:szCs w:val="20"/>
+                <w:lang w:val="en-US"/>
+              </w:rPr>
+              <w:t>{{ i.name }}</w:t>
+            </w:r>
+          </w:p>
+        </w:tc>
+        <w:tc>
+          <w:tcPr>
+            <w:tcW w:w="708" w:type="dxa"/>
+            <w:vAlign w:val="center"/>
+          </w:tcPr>
+          <w:p>
+            <w:pPr>
+              <w:jc w:val="center"/>
+              <w:rPr>
+                <w:rFonts w:ascii="Times New Roman" w:hAnsi="Times New Roman" w:cs="Times New Roman"/>
+                <w:sz w:val="20"/>
+                <w:szCs w:val="20"/>
+                <w:lang w:val="en-US"/>
+              </w:rPr>
+            </w:pPr>
+            <w:r>
+              <w:rPr>
+                <w:rFonts w:ascii="Times New Roman" w:hAnsi="Times New Roman" w:cs="Times New Roman"/>
+                <w:sz w:val="20"/>
+                <w:szCs w:val="20"/>
+                <w:lang w:val="en-US"/>
+              </w:rPr>
+              <w:t>{{ i.lekc }}</w:t>
+            </w:r>
+          </w:p>
+        </w:tc>
+        <w:tc>
+          <w:tcPr>
+            <w:tcW w:w="709" w:type="dxa"/>
+            <w:vAlign w:val="center"/>
+          </w:tcPr>
+          <w:p>
+            <w:pPr>
+              <w:jc w:val="center"/>
+              <w:rPr>
+                <w:rFonts w:ascii="Times New Roman" w:hAnsi="Times New Roman" w:cs="Times New Roman"/>
+                <w:sz w:val="20"/>
+                <w:szCs w:val="20"/>
+                <w:lang w:val="en-US"/>
+              </w:rPr>
+            </w:pPr>
+            <w:r>
+              <w:rPr>
+                <w:rFonts w:ascii="Times New Roman" w:hAnsi="Times New Roman" w:cs="Times New Roman"/>
+                <w:sz w:val="20"/>
+                <w:szCs w:val="20"/>
+                <w:lang w:val="en-US"/>
+              </w:rPr>
+              <w:t>{{ i.lekc_hours}}</w:t>
+            </w:r>
+          </w:p>
+        </w:tc>
+        <w:tc>
+          <w:tcPr>
+            <w:tcW w:w="709" w:type="dxa"/>
+            <w:vAlign w:val="center"/>
+          </w:tcPr>
+          <w:p>
+            <w:pPr>
+              <w:jc w:val="center"/>
+              <w:rPr>
+                <w:rFonts w:ascii="Times New Roman" w:hAnsi="Times New Roman" w:cs="Times New Roman"/>
+                <w:sz w:val="20"/>
+                <w:szCs w:val="20"/>
+                <w:lang w:val="en-US"/>
+              </w:rPr>
+            </w:pPr>
+            <w:r>
+              <w:rPr>
+                <w:rFonts w:ascii="Times New Roman" w:hAnsi="Times New Roman" w:cs="Times New Roman"/>
+                <w:sz w:val="20"/>
+                <w:szCs w:val="20"/>
+                <w:lang w:val="en-US"/>
+              </w:rPr>
+              <w:t>{{ i.lab }}</w:t>
+            </w:r>
+          </w:p>
+        </w:tc>
+        <w:tc>
+          <w:tcPr>
+            <w:tcW w:w="712" w:type="dxa"/>
+            <w:vAlign w:val="center"/>
+          </w:tcPr>
+          <w:p>
+            <w:pPr>
+              <w:jc w:val="center"/>
+              <w:rPr>
+                <w:rFonts w:ascii="Times New Roman" w:hAnsi="Times New Roman" w:cs="Times New Roman"/>
+                <w:sz w:val="20"/>
+                <w:szCs w:val="20"/>
+                <w:lang w:val="en-US"/>
+              </w:rPr>
+            </w:pPr>
+            <w:r>
+              <w:rPr>
+                <w:rFonts w:ascii="Times New Roman" w:hAnsi="Times New Roman" w:cs="Times New Roman"/>
+                <w:sz w:val="20"/>
+                <w:szCs w:val="20"/>
+                <w:lang w:val="en-US"/>
+              </w:rPr>
+              <w:t>{{ i.lab_hours }}</w:t>
             </w:r>
           </w:p>
         </w:tc>
@@ -6071,6 +6750,7 @@
                 <w:rFonts w:ascii="Times New Roman" w:hAnsi="Times New Roman" w:cs="Times New Roman"/>
                 <w:sz w:val="20"/>
                 <w:szCs w:val="20"/>
+                <w:lang w:val="en-US"/>
               </w:rPr>
             </w:pPr>
             <w:r>
@@ -6078,8 +6758,61 @@
                 <w:rFonts w:ascii="Times New Roman" w:hAnsi="Times New Roman" w:cs="Times New Roman"/>
                 <w:sz w:val="20"/>
                 <w:szCs w:val="20"/>
-              </w:rPr>
-              <w:t>8</w:t>
+                <w:lang w:val="en-US"/>
+              </w:rPr>
+              <w:t>{{ i.pr }}</w:t>
+            </w:r>
+          </w:p>
+        </w:tc>
+        <w:tc>
+          <w:tcPr>
+            <w:tcW w:w="756" w:type="dxa"/>
+            <w:vAlign w:val="center"/>
+          </w:tcPr>
+          <w:p>
+            <w:pPr>
+              <w:jc w:val="center"/>
+              <w:rPr>
+                <w:rFonts w:ascii="Times New Roman" w:hAnsi="Times New Roman" w:cs="Times New Roman"/>
+                <w:sz w:val="20"/>
+                <w:szCs w:val="20"/>
+                <w:lang w:val="en-US"/>
+              </w:rPr>
+            </w:pPr>
+            <w:r>
+              <w:rPr>
+                <w:rFonts w:ascii="Times New Roman" w:hAnsi="Times New Roman" w:cs="Times New Roman"/>
+                <w:sz w:val="20"/>
+                <w:szCs w:val="20"/>
+                <w:lang w:val="en-US"/>
+              </w:rPr>
+              <w:t>{{ i.pr_hours }}</w:t>
+            </w:r>
+          </w:p>
+        </w:tc>
+        <w:tc>
+          <w:tcPr>
+            <w:tcW w:w="664" w:type="dxa"/>
+            <w:vAlign w:val="center"/>
+          </w:tcPr>
+          <w:p>
+            <w:pPr>
+              <w:jc w:val="center"/>
+              <w:rPr>
+                <w:rFonts w:ascii="Times New Roman" w:hAnsi="Times New Roman" w:cs="Times New Roman"/>
+                <w:sz w:val="20"/>
+                <w:szCs w:val="20"/>
+                <w:lang w:val="en-US"/>
+              </w:rPr>
+            </w:pPr>
+            <w:r>
+              <w:rPr>
+                <w:rFonts w:ascii="Times New Roman" w:hAnsi="Times New Roman" w:cs="Times New Roman"/>
+                <w:sz w:val="20"/>
+                <w:szCs w:val="20"/>
+                <w:lang w:val="en-US"/>
+              </w:rPr>
+              <w:t>{{ i.srs }}</w:t>
             </w:r>
           </w:p>
         </w:tc>
@@ -6095,6 +6828,7 @@
                 <w:rFonts w:ascii="Times New Roman" w:hAnsi="Times New Roman" w:cs="Times New Roman"/>
                 <w:sz w:val="20"/>
                 <w:szCs w:val="20"/>
+                <w:lang w:val="en-US"/>
               </w:rPr>
             </w:pPr>
             <w:r>
@@ -6102,14 +6836,15 @@
                 <w:rFonts w:ascii="Times New Roman" w:hAnsi="Times New Roman" w:cs="Times New Roman"/>
                 <w:sz w:val="20"/>
                 <w:szCs w:val="20"/>
-              </w:rPr>
-              <w:t>9</w:t>
-            </w:r>
-          </w:p>
-        </w:tc>
-        <w:tc>
-          <w:tcPr>
-            <w:tcW w:w="710" w:type="dxa"/>
+                <w:lang w:val="en-US"/>
+              </w:rPr>
+              <w:t>{{ i.srs_hours }}</w:t>
+            </w:r>
+          </w:p>
+        </w:tc>
+        <w:tc>
+          <w:tcPr>
+            <w:tcW w:w="1174" w:type="dxa"/>
             <w:vAlign w:val="center"/>
           </w:tcPr>
           <w:p>
@@ -6119,6 +6854,7 @@
                 <w:rFonts w:ascii="Times New Roman" w:hAnsi="Times New Roman" w:cs="Times New Roman"/>
                 <w:sz w:val="20"/>
                 <w:szCs w:val="20"/>
+                <w:lang w:val="en-US"/>
               </w:rPr>
             </w:pPr>
             <w:r>
@@ -6126,32 +6862,27 @@
                 <w:rFonts w:ascii="Times New Roman" w:hAnsi="Times New Roman" w:cs="Times New Roman"/>
                 <w:sz w:val="20"/>
                 <w:szCs w:val="20"/>
-              </w:rPr>
-              <w:t>10</w:t>
-            </w:r>
-          </w:p>
-        </w:tc>
-        <w:tc>
-          <w:tcPr>
-            <w:tcW w:w="1174" w:type="dxa"/>
-            <w:vAlign w:val="center"/>
-          </w:tcPr>
-          <w:p>
-            <w:pPr>
-              <w:jc w:val="center"/>
+                <w:lang w:val="en-US"/>
+              </w:rPr>
+              <w:t>{{ i.</w:t>
+            </w:r>
+            <w:r>
               <w:rPr>
                 <w:rFonts w:ascii="Times New Roman" w:hAnsi="Times New Roman" w:cs="Times New Roman"/>
                 <w:sz w:val="20"/>
                 <w:szCs w:val="20"/>
-              </w:rPr>
-            </w:pPr>
+                <w:lang w:val="en-US"/>
+              </w:rPr>
+              <w:t>tic</w:t>
+            </w:r>
             <w:r>
               <w:rPr>
                 <w:rFonts w:ascii="Times New Roman" w:hAnsi="Times New Roman" w:cs="Times New Roman"/>
                 <w:sz w:val="20"/>
                 <w:szCs w:val="20"/>
-              </w:rPr>
-              <w:t>11</w:t>
+                <w:lang w:val="en-US"/>
+              </w:rPr>
+              <w:t xml:space="preserve"> }}</w:t>
             </w:r>
           </w:p>
         </w:tc>
@@ -6176,383 +6907,7 @@
         </w:tc>
         <w:tc>
           <w:tcPr>
-            <w:tcW w:w="8641" w:type="dxa"/>
-            <w:gridSpan w:val="10"/>
-            <w:vAlign w:val="center"/>
-          </w:tcPr>
-          <w:p>
-            <w:pPr>
-              <w:jc w:val="center"/>
-              <w:rPr>
-                <w:rFonts w:ascii="Times New Roman" w:hAnsi="Times New Roman" w:cs="Times New Roman"/>
-                <w:sz w:val="20"/>
-                <w:szCs w:val="20"/>
-                <w:lang w:val="en-US"/>
-              </w:rPr>
-            </w:pPr>
-            <w:r>
-              <w:rPr>
-                <w:rFonts w:ascii="Times New Roman" w:hAnsi="Times New Roman" w:cs="Times New Roman"/>
-                <w:sz w:val="20"/>
-                <w:szCs w:val="20"/>
-                <w:lang w:val="en-US"/>
-              </w:rPr>
-              <w:t xml:space="preserve">{%tr for </w:t>
-            </w:r>
-            <w:r>
-              <w:rPr>
-                <w:rFonts w:ascii="Times New Roman" w:hAnsi="Times New Roman" w:cs="Times New Roman"/>
-                <w:sz w:val="20"/>
-                <w:szCs w:val="20"/>
-                <w:lang w:val="en-US"/>
-              </w:rPr>
-              <w:t>i in items %}</w:t>
-            </w:r>
-          </w:p>
-        </w:tc>
-      </w:tr>
-      <w:tr>
-        <w:tc>
-          <w:tcPr>
-            <w:tcW w:w="704" w:type="dxa"/>
-            <w:vAlign w:val="center"/>
-          </w:tcPr>
-          <w:p>
-            <w:pPr>
-              <w:jc w:val="center"/>
-              <w:rPr>
-                <w:rFonts w:ascii="Times New Roman" w:hAnsi="Times New Roman" w:cs="Times New Roman"/>
-                <w:sz w:val="20"/>
-                <w:szCs w:val="20"/>
-              </w:rPr>
-            </w:pPr>
-            <w:r>
-              <w:rPr>
-                <w:rFonts w:ascii="Times New Roman" w:hAnsi="Times New Roman" w:cs="Times New Roman"/>
-                <w:sz w:val="20"/>
-                <w:szCs w:val="20"/>
-                <w:lang w:val="en-US"/>
-              </w:rPr>
-              <w:t>{{ i</w:t>
-            </w:r>
-            <w:r>
-              <w:rPr>
-                <w:rFonts w:ascii="Times New Roman" w:hAnsi="Times New Roman" w:cs="Times New Roman"/>
-                <w:sz w:val="20"/>
-                <w:szCs w:val="20"/>
-                <w:lang w:val="en-US"/>
-              </w:rPr>
-              <w:t>.num</w:t>
-            </w:r>
-            <w:r>
-              <w:rPr>
-                <w:rFonts w:ascii="Times New Roman" w:hAnsi="Times New Roman" w:cs="Times New Roman"/>
-                <w:sz w:val="20"/>
-                <w:szCs w:val="20"/>
-                <w:lang w:val="en-US"/>
-              </w:rPr>
-              <w:t>}}</w:t>
-            </w:r>
-          </w:p>
-        </w:tc>
-        <w:tc>
-          <w:tcPr>
-            <w:tcW w:w="1791" w:type="dxa"/>
-          </w:tcPr>
-          <w:p>
-            <w:pPr>
-              <w:rPr>
-                <w:rFonts w:ascii="Times New Roman" w:hAnsi="Times New Roman" w:cs="Times New Roman"/>
-                <w:sz w:val="20"/>
-                <w:szCs w:val="20"/>
-                <w:lang w:val="en-US"/>
-              </w:rPr>
-            </w:pPr>
-            <w:r>
-              <w:rPr>
-                <w:rFonts w:ascii="Times New Roman" w:hAnsi="Times New Roman" w:cs="Times New Roman"/>
-                <w:sz w:val="20"/>
-                <w:szCs w:val="20"/>
-                <w:lang w:val="en-US"/>
-              </w:rPr>
-              <w:t>{{ i.name }}</w:t>
-            </w:r>
-          </w:p>
-        </w:tc>
-        <w:tc>
-          <w:tcPr>
-            <w:tcW w:w="708" w:type="dxa"/>
-            <w:vAlign w:val="center"/>
-          </w:tcPr>
-          <w:p>
-            <w:pPr>
-              <w:jc w:val="center"/>
-              <w:rPr>
-                <w:rFonts w:ascii="Times New Roman" w:hAnsi="Times New Roman" w:cs="Times New Roman"/>
-                <w:sz w:val="20"/>
-                <w:szCs w:val="20"/>
-                <w:lang w:val="en-US"/>
-              </w:rPr>
-            </w:pPr>
-            <w:r>
-              <w:rPr>
-                <w:rFonts w:ascii="Times New Roman" w:hAnsi="Times New Roman" w:cs="Times New Roman"/>
-                <w:sz w:val="20"/>
-                <w:szCs w:val="20"/>
-                <w:lang w:val="en-US"/>
-              </w:rPr>
-              <w:t>{{ i.lekc }}</w:t>
-            </w:r>
-          </w:p>
-        </w:tc>
-        <w:tc>
-          <w:tcPr>
-            <w:tcW w:w="709" w:type="dxa"/>
-            <w:vAlign w:val="center"/>
-          </w:tcPr>
-          <w:p>
-            <w:pPr>
-              <w:jc w:val="center"/>
-              <w:rPr>
-                <w:rFonts w:ascii="Times New Roman" w:hAnsi="Times New Roman" w:cs="Times New Roman"/>
-                <w:sz w:val="20"/>
-                <w:szCs w:val="20"/>
-                <w:lang w:val="en-US"/>
-              </w:rPr>
-            </w:pPr>
-            <w:r>
-              <w:rPr>
-                <w:rFonts w:ascii="Times New Roman" w:hAnsi="Times New Roman" w:cs="Times New Roman"/>
-                <w:sz w:val="20"/>
-                <w:szCs w:val="20"/>
-                <w:lang w:val="en-US"/>
-              </w:rPr>
-              <w:t>{{ i.lekc_hours}}</w:t>
-            </w:r>
-          </w:p>
-        </w:tc>
-        <w:tc>
-          <w:tcPr>
-            <w:tcW w:w="709" w:type="dxa"/>
-            <w:vAlign w:val="center"/>
-          </w:tcPr>
-          <w:p>
-            <w:pPr>
-              <w:jc w:val="center"/>
-              <w:rPr>
-                <w:rFonts w:ascii="Times New Roman" w:hAnsi="Times New Roman" w:cs="Times New Roman"/>
-                <w:sz w:val="20"/>
-                <w:szCs w:val="20"/>
-                <w:lang w:val="en-US"/>
-              </w:rPr>
-            </w:pPr>
-            <w:r>
-              <w:rPr>
-                <w:rFonts w:ascii="Times New Roman" w:hAnsi="Times New Roman" w:cs="Times New Roman"/>
-                <w:sz w:val="20"/>
-                <w:szCs w:val="20"/>
-                <w:lang w:val="en-US"/>
-              </w:rPr>
-              <w:t>{{ i.lab }}</w:t>
-            </w:r>
-          </w:p>
-        </w:tc>
-        <w:tc>
-          <w:tcPr>
-            <w:tcW w:w="710" w:type="dxa"/>
-            <w:vAlign w:val="center"/>
-          </w:tcPr>
-          <w:p>
-            <w:pPr>
-              <w:jc w:val="center"/>
-              <w:rPr>
-                <w:rFonts w:ascii="Times New Roman" w:hAnsi="Times New Roman" w:cs="Times New Roman"/>
-                <w:sz w:val="20"/>
-                <w:szCs w:val="20"/>
-                <w:lang w:val="en-US"/>
-              </w:rPr>
-            </w:pPr>
-            <w:r>
-              <w:rPr>
-                <w:rFonts w:ascii="Times New Roman" w:hAnsi="Times New Roman" w:cs="Times New Roman"/>
-                <w:sz w:val="20"/>
-                <w:szCs w:val="20"/>
-                <w:lang w:val="en-US"/>
-              </w:rPr>
-              <w:t>{{ i.lab_hours }}</w:t>
-            </w:r>
-          </w:p>
-        </w:tc>
-        <w:tc>
-          <w:tcPr>
-            <w:tcW w:w="710" w:type="dxa"/>
-            <w:vAlign w:val="center"/>
-          </w:tcPr>
-          <w:p>
-            <w:pPr>
-              <w:jc w:val="center"/>
-              <w:rPr>
-                <w:rFonts w:ascii="Times New Roman" w:hAnsi="Times New Roman" w:cs="Times New Roman"/>
-                <w:sz w:val="20"/>
-                <w:szCs w:val="20"/>
-                <w:lang w:val="en-US"/>
-              </w:rPr>
-            </w:pPr>
-            <w:r>
-              <w:rPr>
-                <w:rFonts w:ascii="Times New Roman" w:hAnsi="Times New Roman" w:cs="Times New Roman"/>
-                <w:sz w:val="20"/>
-                <w:szCs w:val="20"/>
-                <w:lang w:val="en-US"/>
-              </w:rPr>
-              <w:t>{{ i.pr }}</w:t>
-            </w:r>
-          </w:p>
-        </w:tc>
-        <w:tc>
-          <w:tcPr>
-            <w:tcW w:w="710" w:type="dxa"/>
-            <w:vAlign w:val="center"/>
-          </w:tcPr>
-          <w:p>
-            <w:pPr>
-              <w:jc w:val="center"/>
-              <w:rPr>
-                <w:rFonts w:ascii="Times New Roman" w:hAnsi="Times New Roman" w:cs="Times New Roman"/>
-                <w:sz w:val="20"/>
-                <w:szCs w:val="20"/>
-                <w:lang w:val="en-US"/>
-              </w:rPr>
-            </w:pPr>
-            <w:r>
-              <w:rPr>
-                <w:rFonts w:ascii="Times New Roman" w:hAnsi="Times New Roman" w:cs="Times New Roman"/>
-                <w:sz w:val="20"/>
-                <w:szCs w:val="20"/>
-                <w:lang w:val="en-US"/>
-              </w:rPr>
-              <w:t>{{ i.pr_hours }}</w:t>
-            </w:r>
-          </w:p>
-        </w:tc>
-        <w:tc>
-          <w:tcPr>
-            <w:tcW w:w="710" w:type="dxa"/>
-            <w:vAlign w:val="center"/>
-          </w:tcPr>
-          <w:p>
-            <w:pPr>
-              <w:jc w:val="center"/>
-              <w:rPr>
-                <w:rFonts w:ascii="Times New Roman" w:hAnsi="Times New Roman" w:cs="Times New Roman"/>
-                <w:sz w:val="20"/>
-                <w:szCs w:val="20"/>
-                <w:lang w:val="en-US"/>
-              </w:rPr>
-            </w:pPr>
-            <w:r>
-              <w:rPr>
-                <w:rFonts w:ascii="Times New Roman" w:hAnsi="Times New Roman" w:cs="Times New Roman"/>
-                <w:sz w:val="20"/>
-                <w:szCs w:val="20"/>
-                <w:lang w:val="en-US"/>
-              </w:rPr>
-              <w:t>{{ i.srs }}</w:t>
-            </w:r>
-          </w:p>
-        </w:tc>
-        <w:tc>
-          <w:tcPr>
-            <w:tcW w:w="710" w:type="dxa"/>
-            <w:vAlign w:val="center"/>
-          </w:tcPr>
-          <w:p>
-            <w:pPr>
-              <w:jc w:val="center"/>
-              <w:rPr>
-                <w:rFonts w:ascii="Times New Roman" w:hAnsi="Times New Roman" w:cs="Times New Roman"/>
-                <w:sz w:val="20"/>
-                <w:szCs w:val="20"/>
-                <w:lang w:val="en-US"/>
-              </w:rPr>
-            </w:pPr>
-            <w:r>
-              <w:rPr>
-                <w:rFonts w:ascii="Times New Roman" w:hAnsi="Times New Roman" w:cs="Times New Roman"/>
-                <w:sz w:val="20"/>
-                <w:szCs w:val="20"/>
-                <w:lang w:val="en-US"/>
-              </w:rPr>
-              <w:t>{{ i.srs_hours }}</w:t>
-            </w:r>
-          </w:p>
-        </w:tc>
-        <w:tc>
-          <w:tcPr>
-            <w:tcW w:w="1174" w:type="dxa"/>
-            <w:vAlign w:val="center"/>
-          </w:tcPr>
-          <w:p>
-            <w:pPr>
-              <w:jc w:val="center"/>
-              <w:rPr>
-                <w:rFonts w:ascii="Times New Roman" w:hAnsi="Times New Roman" w:cs="Times New Roman"/>
-                <w:sz w:val="20"/>
-                <w:szCs w:val="20"/>
-                <w:lang w:val="en-US"/>
-              </w:rPr>
-            </w:pPr>
-            <w:r>
-              <w:rPr>
-                <w:rFonts w:ascii="Times New Roman" w:hAnsi="Times New Roman" w:cs="Times New Roman"/>
-                <w:sz w:val="20"/>
-                <w:szCs w:val="20"/>
-                <w:lang w:val="en-US"/>
-              </w:rPr>
-              <w:t>{{ i.</w:t>
-            </w:r>
-            <w:r>
-              <w:rPr>
-                <w:rFonts w:ascii="Times New Roman" w:hAnsi="Times New Roman" w:cs="Times New Roman"/>
-                <w:sz w:val="20"/>
-                <w:szCs w:val="20"/>
-                <w:lang w:val="en-US"/>
-              </w:rPr>
-              <w:t>tic</w:t>
-            </w:r>
-            <w:r>
-              <w:rPr>
-                <w:rFonts w:ascii="Times New Roman" w:hAnsi="Times New Roman" w:cs="Times New Roman"/>
-                <w:sz w:val="20"/>
-                <w:szCs w:val="20"/>
-                <w:lang w:val="en-US"/>
-              </w:rPr>
-              <w:t xml:space="preserve"> }}</w:t>
-            </w:r>
-          </w:p>
-        </w:tc>
-      </w:tr>
-      <w:tr>
-        <w:tc>
-          <w:tcPr>
-            <w:tcW w:w="704" w:type="dxa"/>
-            <w:vAlign w:val="center"/>
-          </w:tcPr>
-          <w:p>
-            <w:pPr>
-              <w:jc w:val="center"/>
-              <w:rPr>
-                <w:rFonts w:ascii="Times New Roman" w:hAnsi="Times New Roman" w:cs="Times New Roman"/>
-                <w:sz w:val="20"/>
-                <w:szCs w:val="20"/>
-                <w:lang w:val="en-US"/>
-              </w:rPr>
-            </w:pPr>
-          </w:p>
-        </w:tc>
-        <w:tc>
-          <w:tcPr>
-            <w:tcW w:w="8641" w:type="dxa"/>
+            <w:tcW w:w="8643" w:type="dxa"/>
             <w:gridSpan w:val="10"/>
             <w:vAlign w:val="center"/>
           </w:tcPr>
@@ -6866,7 +7221,6 @@
           <w:bCs/>
           <w:sz w:val="24"/>
           <w:szCs w:val="24"/>
-          <w:u w:val="single"/>
           <w:lang w:val="en-US"/>
         </w:rPr>
       </w:pPr>
@@ -8731,7 +9085,7 @@
                 <w:sz w:val="24"/>
                 <w:szCs w:val="24"/>
               </w:rPr>
-              <w:t>Темы практических (семинарских занятий)</w:t>
+              <w:t>Темы практических (семинарских) занятий</w:t>
             </w:r>
           </w:p>
         </w:tc>
@@ -9329,25 +9683,7 @@
           <w:sz w:val="24"/>
           <w:szCs w:val="24"/>
         </w:rPr>
-        <w:t>Самостоятельных</w:t>
-      </w:r>
-      <w:r>
-        <w:rPr>
-          <w:rFonts w:ascii="Times New Roman" w:hAnsi="Times New Roman" w:cs="Times New Roman"/>
-          <w:bCs/>
-          <w:sz w:val="24"/>
-          <w:szCs w:val="24"/>
-        </w:rPr>
-        <w:t xml:space="preserve"> </w:t>
-      </w:r>
-      <w:r>
-        <w:rPr>
-          <w:rFonts w:ascii="Times New Roman" w:hAnsi="Times New Roman" w:cs="Times New Roman"/>
-          <w:bCs/>
-          <w:sz w:val="24"/>
-          <w:szCs w:val="24"/>
-        </w:rPr>
-        <w:t>работ</w:t>
+        <w:t>Самостоятельных работ</w:t>
       </w:r>
       <w:r>
         <w:rPr>
@@ -10168,15 +10504,15 @@
           <w:sz w:val="24"/>
           <w:szCs w:val="24"/>
         </w:rPr>
-        <w:t>занятий по дисциплине используются</w:t>
-      </w:r>
-      <w:r>
-        <w:rPr>
-          <w:rFonts w:ascii="Times New Roman" w:hAnsi="Times New Roman" w:cs="Times New Roman"/>
-          <w:sz w:val="24"/>
-          <w:szCs w:val="24"/>
-        </w:rPr>
-        <w:t xml:space="preserve"> следующие интерактивные методы обучения: {{ interactive_methods }}</w:t>
+        <w:t>занятий по дисциплине</w:t>
+      </w:r>
+      <w:r>
+        <w:rPr>
+          <w:rFonts w:ascii="Times New Roman" w:hAnsi="Times New Roman" w:cs="Times New Roman"/>
+          <w:sz w:val="24"/>
+          <w:szCs w:val="24"/>
+        </w:rPr>
+        <w:t xml:space="preserve"> используются следующие интерактивные методы обучения: {{ interactive_methods }}</w:t>
       </w:r>
     </w:p>
     <w:p>
@@ -10610,6 +10946,7 @@
           <w:bCs/>
           <w:sz w:val="24"/>
           <w:szCs w:val="24"/>
+          <w:lang w:val="en-US"/>
         </w:rPr>
       </w:pPr>
       <w:r>
@@ -10619,6 +10956,7 @@
           <w:bCs/>
           <w:sz w:val="24"/>
           <w:szCs w:val="24"/>
+          <w:lang w:val="en-US"/>
         </w:rPr>
         <w:t>{%</w:t>
       </w:r>
@@ -10629,6 +10967,7 @@
           <w:bCs/>
           <w:sz w:val="24"/>
           <w:szCs w:val="24"/>
+          <w:lang w:val="en-US"/>
         </w:rPr>
         <w:t>-</w:t>
       </w:r>
@@ -10639,6 +10978,7 @@
           <w:bCs/>
           <w:sz w:val="24"/>
           <w:szCs w:val="24"/>
+          <w:lang w:val="en-US"/>
         </w:rPr>
         <w:t xml:space="preserve"> </w:t>
       </w:r>
@@ -10660,6 +11000,7 @@
           <w:bCs/>
           <w:sz w:val="24"/>
           <w:szCs w:val="24"/>
+          <w:lang w:val="en-US"/>
         </w:rPr>
         <w:t xml:space="preserve"> </w:t>
       </w:r>
@@ -10681,6 +11022,7 @@
           <w:bCs/>
           <w:sz w:val="24"/>
           <w:szCs w:val="24"/>
+          <w:lang w:val="en-US"/>
         </w:rPr>
         <w:t xml:space="preserve"> </w:t>
       </w:r>
@@ -10702,6 +11044,7 @@
           <w:bCs/>
           <w:sz w:val="24"/>
           <w:szCs w:val="24"/>
+          <w:lang w:val="en-US"/>
         </w:rPr>
         <w:t xml:space="preserve"> </w:t>
       </w:r>
@@ -10723,6 +11066,7 @@
           <w:bCs/>
           <w:sz w:val="24"/>
           <w:szCs w:val="24"/>
+          <w:lang w:val="en-US"/>
         </w:rPr>
         <w:t xml:space="preserve"> </w:t>
       </w:r>
@@ -10733,6 +11077,7 @@
           <w:bCs/>
           <w:sz w:val="24"/>
           <w:szCs w:val="24"/>
+          <w:lang w:val="en-US"/>
         </w:rPr>
         <w:t>%}</w:t>
       </w:r>
@@ -10747,6 +11092,7 @@
           <w:bCs/>
           <w:sz w:val="24"/>
           <w:szCs w:val="24"/>
+          <w:lang w:val="en-US"/>
         </w:rPr>
       </w:pPr>
       <w:r>
@@ -10756,11 +11102,15 @@
           <w:bCs/>
           <w:sz w:val="24"/>
           <w:szCs w:val="24"/>
+          <w:lang w:val="en-US"/>
         </w:rPr>
         <w:lastRenderedPageBreak/>
         <w:t>6.1.{{</w:t>
       </w:r>
       <w:r>
+        <w:rPr>
+          <w:lang w:val="en-US"/>
+        </w:rPr>
         <w:t xml:space="preserve"> </w:t>
       </w:r>
       <w:r>
@@ -10770,6 +11120,9 @@
         <w:t>i</w:t>
       </w:r>
       <w:r>
+        <w:rPr>
+          <w:lang w:val="en-US"/>
+        </w:rPr>
         <w:t>.</w:t>
       </w:r>
       <w:r>
@@ -10790,6 +11143,7 @@
           <w:bCs/>
           <w:sz w:val="24"/>
           <w:szCs w:val="24"/>
+          <w:lang w:val="en-US"/>
         </w:rPr>
         <w:t>}} {{</w:t>
       </w:r>
@@ -10811,6 +11165,7 @@
           <w:bCs/>
           <w:sz w:val="24"/>
           <w:szCs w:val="24"/>
+          <w:lang w:val="en-US"/>
         </w:rPr>
         <w:t>.</w:t>
       </w:r>
@@ -10832,6 +11187,7 @@
           <w:bCs/>
           <w:sz w:val="24"/>
           <w:szCs w:val="24"/>
+          <w:lang w:val="en-US"/>
         </w:rPr>
         <w:t>}}</w:t>
       </w:r>
@@ -11966,7 +12322,7 @@
           <w:szCs w:val="24"/>
           <w:u w:val="single"/>
         </w:rPr>
-        <w:t>билета</w:t>
+        <w:t>задания</w:t>
       </w:r>
       <w:r>
         <w:rPr>
@@ -14167,7 +14523,7 @@
             <w:noProof/>
             <w:sz w:val="24"/>
           </w:rPr>
-          <w:t>2</w:t>
+          <w:t>7</w:t>
         </w:r>
         <w:r>
           <w:rPr>
@@ -14269,8 +14625,9 @@
         <w:rFonts w:ascii="Times New Roman" w:hAnsi="Times New Roman" w:cs="Times New Roman"/>
         <w:color w:val="000000" w:themeColor="text1"/>
         <w:sz w:val="24"/>
+        <w:lang w:val="en-US"/>
       </w:rPr>
-      <w:t>____</w:t>
+      <w:t>{{ protocol_year }}</w:t>
     </w:r>
     <w:r>
       <w:rPr>
@@ -14707,7 +15064,7 @@
   <w:style w:type="paragraph" w:default="1" w:styleId="a">
     <w:name w:val="Normal"/>
     <w:qFormat/>
-    <w:rsid w:val="002E3601"/>
+    <w:rsid w:val="00826B62"/>
   </w:style>
   <w:style w:type="character" w:default="1" w:styleId="a0">
     <w:name w:val="Default Paragraph Font"/>
@@ -15149,7 +15506,7 @@
 </file>
 
 <file path=customXml/itemProps1.xml><?xml version="1.0" encoding="utf-8"?>
-<ds:datastoreItem xmlns:ds="http://schemas.openxmlformats.org/officeDocument/2006/customXml" ds:itemID="{1F3B7D93-4E62-4626-B2DF-400BAB4443B1}">
+<ds:datastoreItem xmlns:ds="http://schemas.openxmlformats.org/officeDocument/2006/customXml" ds:itemID="{FCA8A249-9003-4602-9188-7365EA692E76}">
   <ds:schemaRefs>
     <ds:schemaRef ds:uri="http://schemas.openxmlformats.org/officeDocument/2006/bibliography"/>
   </ds:schemaRefs>

</xml_diff>

<commit_message>
add critical, warning errors type
</commit_message>
<xml_diff>
--- a/templates/docxRPD/rpd.docx
+++ b/templates/docxRPD/rpd.docx
@@ -83,6 +83,7 @@
         </w:rPr>
         <w:t xml:space="preserve">Структурное подразделение </w:t>
       </w:r>
+      <w:proofErr w:type="gramStart"/>
       <w:r>
         <w:rPr>
           <w:rFonts w:ascii="Times New Roman" w:hAnsi="Times New Roman" w:cs="Times New Roman"/>
@@ -100,6 +101,7 @@
         </w:rPr>
         <w:t>kaf</w:t>
       </w:r>
+      <w:proofErr w:type="gramEnd"/>
       <w:r>
         <w:rPr>
           <w:rFonts w:ascii="Times New Roman" w:hAnsi="Times New Roman" w:cs="Times New Roman"/>
@@ -108,6 +110,7 @@
         </w:rPr>
         <w:t>_</w:t>
       </w:r>
+      <w:proofErr w:type="gramStart"/>
       <w:r>
         <w:rPr>
           <w:rFonts w:ascii="Times New Roman" w:hAnsi="Times New Roman" w:cs="Times New Roman"/>
@@ -123,7 +126,16 @@
           <w:sz w:val="24"/>
           <w:szCs w:val="24"/>
         </w:rPr>
-        <w:t xml:space="preserve"> }} </w:t>
+        <w:t xml:space="preserve"> }</w:t>
+      </w:r>
+      <w:proofErr w:type="gramEnd"/>
+      <w:r>
+        <w:rPr>
+          <w:rFonts w:ascii="Times New Roman" w:hAnsi="Times New Roman" w:cs="Times New Roman"/>
+          <w:sz w:val="24"/>
+          <w:szCs w:val="24"/>
+        </w:rPr>
+        <w:t xml:space="preserve">} </w:t>
       </w:r>
     </w:p>
     <w:p>
@@ -167,6 +179,7 @@
         </w:rPr>
         <w:t xml:space="preserve">на </w:t>
       </w:r>
+      <w:proofErr w:type="gramStart"/>
       <w:r>
         <w:rPr>
           <w:rFonts w:ascii="Times New Roman" w:hAnsi="Times New Roman" w:cs="Times New Roman"/>
@@ -184,6 +197,7 @@
         </w:rPr>
         <w:t>meeting</w:t>
       </w:r>
+      <w:proofErr w:type="gramEnd"/>
       <w:r>
         <w:rPr>
           <w:rFonts w:ascii="Times New Roman" w:hAnsi="Times New Roman" w:cs="Times New Roman"/>
@@ -217,7 +231,16 @@
           <w:sz w:val="24"/>
           <w:szCs w:val="24"/>
         </w:rPr>
-        <w:t xml:space="preserve"> №</w:t>
+        <w:t xml:space="preserve"> </w:t>
+      </w:r>
+      <w:proofErr w:type="gramStart"/>
+      <w:r>
+        <w:rPr>
+          <w:rFonts w:ascii="Times New Roman" w:hAnsi="Times New Roman" w:cs="Times New Roman"/>
+          <w:sz w:val="24"/>
+          <w:szCs w:val="24"/>
+        </w:rPr>
+        <w:t>№</w:t>
       </w:r>
       <w:r>
         <w:rPr>
@@ -238,6 +261,7 @@
         </w:rPr>
         <w:t>protocol</w:t>
       </w:r>
+      <w:proofErr w:type="gramEnd"/>
       <w:r>
         <w:rPr>
           <w:rFonts w:ascii="Times New Roman" w:hAnsi="Times New Roman" w:cs="Times New Roman"/>
@@ -247,6 +271,7 @@
         </w:rPr>
         <w:t>_</w:t>
       </w:r>
+      <w:proofErr w:type="gramStart"/>
       <w:r>
         <w:rPr>
           <w:rFonts w:ascii="Times New Roman" w:hAnsi="Times New Roman" w:cs="Times New Roman"/>
@@ -263,7 +288,17 @@
           <w:szCs w:val="24"/>
           <w:u w:val="single"/>
         </w:rPr>
-        <w:t xml:space="preserve"> }}</w:t>
+        <w:t xml:space="preserve"> }</w:t>
+      </w:r>
+      <w:proofErr w:type="gramEnd"/>
+      <w:r>
+        <w:rPr>
+          <w:rFonts w:ascii="Times New Roman" w:hAnsi="Times New Roman" w:cs="Times New Roman"/>
+          <w:sz w:val="24"/>
+          <w:szCs w:val="24"/>
+          <w:u w:val="single"/>
+        </w:rPr>
+        <w:t>}</w:t>
       </w:r>
       <w:r>
         <w:rPr>
@@ -289,6 +324,7 @@
         </w:rPr>
         <w:t xml:space="preserve"> </w:t>
       </w:r>
+      <w:proofErr w:type="gramStart"/>
       <w:r>
         <w:rPr>
           <w:rFonts w:ascii="Times New Roman" w:hAnsi="Times New Roman" w:cs="Times New Roman"/>
@@ -308,6 +344,7 @@
         </w:rPr>
         <w:t>protocol</w:t>
       </w:r>
+      <w:proofErr w:type="gramEnd"/>
       <w:r>
         <w:rPr>
           <w:rFonts w:ascii="Times New Roman" w:hAnsi="Times New Roman" w:cs="Times New Roman"/>
@@ -317,6 +354,7 @@
         </w:rPr>
         <w:t>_</w:t>
       </w:r>
+      <w:proofErr w:type="gramStart"/>
       <w:r>
         <w:rPr>
           <w:rFonts w:ascii="Times New Roman" w:hAnsi="Times New Roman" w:cs="Times New Roman"/>
@@ -334,7 +372,17 @@
           <w:szCs w:val="24"/>
           <w:u w:val="single"/>
         </w:rPr>
-        <w:t xml:space="preserve"> }}</w:t>
+        <w:t xml:space="preserve"> }</w:t>
+      </w:r>
+      <w:proofErr w:type="gramEnd"/>
+      <w:r>
+        <w:rPr>
+          <w:rFonts w:ascii="Times New Roman" w:hAnsi="Times New Roman" w:cs="Times New Roman"/>
+          <w:sz w:val="24"/>
+          <w:szCs w:val="24"/>
+          <w:u w:val="single"/>
+        </w:rPr>
+        <w:t>}</w:t>
       </w:r>
       <w:r>
         <w:rPr>
@@ -516,14 +564,105 @@
                 <w:lang w:val="en-US"/>
               </w:rPr>
             </w:pPr>
-            <w:r>
-              <w:rPr>
-                <w:rFonts w:ascii="Times New Roman" w:hAnsi="Times New Roman" w:cs="Times New Roman"/>
-                <w:sz w:val="24"/>
-                <w:szCs w:val="24"/>
-                <w:lang w:val="en-US"/>
-              </w:rPr>
-              <w:t>{{ kind_direct }}: {{ direction_code }} {{ direction }}</w:t>
+            <w:proofErr w:type="gramStart"/>
+            <w:r>
+              <w:rPr>
+                <w:rFonts w:ascii="Times New Roman" w:hAnsi="Times New Roman" w:cs="Times New Roman"/>
+                <w:sz w:val="24"/>
+                <w:szCs w:val="24"/>
+                <w:lang w:val="en-US"/>
+              </w:rPr>
+              <w:t>{{ kind</w:t>
+            </w:r>
+            <w:proofErr w:type="gramEnd"/>
+            <w:r>
+              <w:rPr>
+                <w:rFonts w:ascii="Times New Roman" w:hAnsi="Times New Roman" w:cs="Times New Roman"/>
+                <w:sz w:val="24"/>
+                <w:szCs w:val="24"/>
+                <w:lang w:val="en-US"/>
+              </w:rPr>
+              <w:t>_</w:t>
+            </w:r>
+            <w:proofErr w:type="gramStart"/>
+            <w:r>
+              <w:rPr>
+                <w:rFonts w:ascii="Times New Roman" w:hAnsi="Times New Roman" w:cs="Times New Roman"/>
+                <w:sz w:val="24"/>
+                <w:szCs w:val="24"/>
+                <w:lang w:val="en-US"/>
+              </w:rPr>
+              <w:t>direct }</w:t>
+            </w:r>
+            <w:proofErr w:type="gramEnd"/>
+            <w:r>
+              <w:rPr>
+                <w:rFonts w:ascii="Times New Roman" w:hAnsi="Times New Roman" w:cs="Times New Roman"/>
+                <w:sz w:val="24"/>
+                <w:szCs w:val="24"/>
+                <w:lang w:val="en-US"/>
+              </w:rPr>
+              <w:t xml:space="preserve">}: </w:t>
+            </w:r>
+            <w:proofErr w:type="gramStart"/>
+            <w:r>
+              <w:rPr>
+                <w:rFonts w:ascii="Times New Roman" w:hAnsi="Times New Roman" w:cs="Times New Roman"/>
+                <w:sz w:val="24"/>
+                <w:szCs w:val="24"/>
+                <w:lang w:val="en-US"/>
+              </w:rPr>
+              <w:t>{{ direction</w:t>
+            </w:r>
+            <w:proofErr w:type="gramEnd"/>
+            <w:r>
+              <w:rPr>
+                <w:rFonts w:ascii="Times New Roman" w:hAnsi="Times New Roman" w:cs="Times New Roman"/>
+                <w:sz w:val="24"/>
+                <w:szCs w:val="24"/>
+                <w:lang w:val="en-US"/>
+              </w:rPr>
+              <w:t>_</w:t>
+            </w:r>
+            <w:proofErr w:type="gramStart"/>
+            <w:r>
+              <w:rPr>
+                <w:rFonts w:ascii="Times New Roman" w:hAnsi="Times New Roman" w:cs="Times New Roman"/>
+                <w:sz w:val="24"/>
+                <w:szCs w:val="24"/>
+                <w:lang w:val="en-US"/>
+              </w:rPr>
+              <w:t>code }</w:t>
+            </w:r>
+            <w:proofErr w:type="gramEnd"/>
+            <w:r>
+              <w:rPr>
+                <w:rFonts w:ascii="Times New Roman" w:hAnsi="Times New Roman" w:cs="Times New Roman"/>
+                <w:sz w:val="24"/>
+                <w:szCs w:val="24"/>
+                <w:lang w:val="en-US"/>
+              </w:rPr>
+              <w:t xml:space="preserve">} </w:t>
+            </w:r>
+            <w:proofErr w:type="gramStart"/>
+            <w:r>
+              <w:rPr>
+                <w:rFonts w:ascii="Times New Roman" w:hAnsi="Times New Roman" w:cs="Times New Roman"/>
+                <w:sz w:val="24"/>
+                <w:szCs w:val="24"/>
+                <w:lang w:val="en-US"/>
+              </w:rPr>
+              <w:t>{{ direction</w:t>
+            </w:r>
+            <w:proofErr w:type="gramEnd"/>
+            <w:r>
+              <w:rPr>
+                <w:rFonts w:ascii="Times New Roman" w:hAnsi="Times New Roman" w:cs="Times New Roman"/>
+                <w:sz w:val="24"/>
+                <w:szCs w:val="24"/>
+                <w:lang w:val="en-US"/>
+              </w:rPr>
+              <w:t xml:space="preserve"> }}</w:t>
             </w:r>
           </w:p>
         </w:tc>
@@ -577,14 +716,45 @@
                 <w:lang w:val="en-US"/>
               </w:rPr>
             </w:pPr>
-            <w:r>
-              <w:rPr>
-                <w:rFonts w:ascii="Times New Roman" w:hAnsi="Times New Roman" w:cs="Times New Roman"/>
-                <w:sz w:val="24"/>
-                <w:szCs w:val="24"/>
-                <w:lang w:val="en-US"/>
-              </w:rPr>
-              <w:t xml:space="preserve">{{ spec_name }} </w:t>
+            <w:proofErr w:type="gramStart"/>
+            <w:r>
+              <w:rPr>
+                <w:rFonts w:ascii="Times New Roman" w:hAnsi="Times New Roman" w:cs="Times New Roman"/>
+                <w:sz w:val="24"/>
+                <w:szCs w:val="24"/>
+                <w:lang w:val="en-US"/>
+              </w:rPr>
+              <w:t>{{ spec</w:t>
+            </w:r>
+            <w:proofErr w:type="gramEnd"/>
+            <w:r>
+              <w:rPr>
+                <w:rFonts w:ascii="Times New Roman" w:hAnsi="Times New Roman" w:cs="Times New Roman"/>
+                <w:sz w:val="24"/>
+                <w:szCs w:val="24"/>
+                <w:lang w:val="en-US"/>
+              </w:rPr>
+              <w:t>_</w:t>
+            </w:r>
+            <w:proofErr w:type="gramStart"/>
+            <w:r>
+              <w:rPr>
+                <w:rFonts w:ascii="Times New Roman" w:hAnsi="Times New Roman" w:cs="Times New Roman"/>
+                <w:sz w:val="24"/>
+                <w:szCs w:val="24"/>
+                <w:lang w:val="en-US"/>
+              </w:rPr>
+              <w:t>name }</w:t>
+            </w:r>
+            <w:proofErr w:type="gramEnd"/>
+            <w:r>
+              <w:rPr>
+                <w:rFonts w:ascii="Times New Roman" w:hAnsi="Times New Roman" w:cs="Times New Roman"/>
+                <w:sz w:val="24"/>
+                <w:szCs w:val="24"/>
+                <w:lang w:val="en-US"/>
+              </w:rPr>
+              <w:t xml:space="preserve">} </w:t>
             </w:r>
           </w:p>
         </w:tc>
@@ -646,14 +816,25 @@
               </w:rPr>
               <w:t xml:space="preserve">Квалификация: </w:t>
             </w:r>
-            <w:r>
-              <w:rPr>
-                <w:rFonts w:ascii="Times New Roman" w:hAnsi="Times New Roman" w:cs="Times New Roman"/>
-                <w:sz w:val="24"/>
-                <w:szCs w:val="24"/>
-                <w:lang w:val="en-US"/>
-              </w:rPr>
-              <w:t>{{ kvalif }}</w:t>
+            <w:proofErr w:type="gramStart"/>
+            <w:r>
+              <w:rPr>
+                <w:rFonts w:ascii="Times New Roman" w:hAnsi="Times New Roman" w:cs="Times New Roman"/>
+                <w:sz w:val="24"/>
+                <w:szCs w:val="24"/>
+                <w:lang w:val="en-US"/>
+              </w:rPr>
+              <w:t>{{ kvalif</w:t>
+            </w:r>
+            <w:proofErr w:type="gramEnd"/>
+            <w:r>
+              <w:rPr>
+                <w:rFonts w:ascii="Times New Roman" w:hAnsi="Times New Roman" w:cs="Times New Roman"/>
+                <w:sz w:val="24"/>
+                <w:szCs w:val="24"/>
+                <w:lang w:val="en-US"/>
+              </w:rPr>
+              <w:t xml:space="preserve"> }}</w:t>
             </w:r>
           </w:p>
         </w:tc>
@@ -714,6 +895,7 @@
               </w:rPr>
               <w:t xml:space="preserve">Форма обучения: </w:t>
             </w:r>
+            <w:proofErr w:type="gramStart"/>
             <w:r>
               <w:rPr>
                 <w:rFonts w:ascii="Times New Roman" w:hAnsi="Times New Roman" w:cs="Times New Roman"/>
@@ -732,6 +914,7 @@
               </w:rPr>
               <w:t>fob</w:t>
             </w:r>
+            <w:proofErr w:type="gramEnd"/>
             <w:r>
               <w:rPr>
                 <w:rFonts w:ascii="Times New Roman" w:hAnsi="Times New Roman" w:cs="Times New Roman"/>
@@ -875,17 +1058,27 @@
                 <w:sz w:val="20"/>
                 <w:szCs w:val="24"/>
               </w:rPr>
-              <w:t xml:space="preserve">Составитель программы: {{ </w:t>
-            </w:r>
+              <w:t xml:space="preserve">Составитель программы: </w:t>
+            </w:r>
+            <w:proofErr w:type="gramStart"/>
             <w:r>
               <w:rPr>
                 <w:rFonts w:ascii="Times New Roman" w:hAnsi="Times New Roman" w:cs="Times New Roman"/>
                 <w:sz w:val="20"/>
                 <w:szCs w:val="24"/>
+              </w:rPr>
+              <w:t xml:space="preserve">{{ </w:t>
+            </w:r>
+            <w:r>
+              <w:rPr>
+                <w:rFonts w:ascii="Times New Roman" w:hAnsi="Times New Roman" w:cs="Times New Roman"/>
+                <w:sz w:val="20"/>
+                <w:szCs w:val="24"/>
                 <w:lang w:val="en-US"/>
               </w:rPr>
               <w:t>person</w:t>
             </w:r>
+            <w:proofErr w:type="gramEnd"/>
             <w:r>
               <w:rPr>
                 <w:rFonts w:ascii="Times New Roman" w:hAnsi="Times New Roman" w:cs="Times New Roman"/>
@@ -894,6 +1087,7 @@
               </w:rPr>
               <w:t>_</w:t>
             </w:r>
+            <w:proofErr w:type="gramStart"/>
             <w:r>
               <w:rPr>
                 <w:rFonts w:ascii="Times New Roman" w:hAnsi="Times New Roman" w:cs="Times New Roman"/>
@@ -909,25 +1103,35 @@
                 <w:sz w:val="20"/>
                 <w:szCs w:val="24"/>
               </w:rPr>
-              <w:t xml:space="preserve"> }}</w:t>
-            </w:r>
-          </w:p>
-          <w:p>
-            <w:pPr>
+              <w:t xml:space="preserve"> }</w:t>
+            </w:r>
+            <w:proofErr w:type="gramEnd"/>
+            <w:r>
               <w:rPr>
                 <w:rFonts w:ascii="Times New Roman" w:hAnsi="Times New Roman" w:cs="Times New Roman"/>
                 <w:sz w:val="20"/>
                 <w:szCs w:val="24"/>
               </w:rPr>
-            </w:pPr>
-            <w:r>
+              <w:t>}</w:t>
+            </w:r>
+          </w:p>
+          <w:p>
+            <w:pPr>
               <w:rPr>
                 <w:rFonts w:ascii="Times New Roman" w:hAnsi="Times New Roman" w:cs="Times New Roman"/>
                 <w:sz w:val="20"/>
                 <w:szCs w:val="24"/>
               </w:rPr>
+            </w:pPr>
+            <w:r>
+              <w:rPr>
+                <w:rFonts w:ascii="Times New Roman" w:hAnsi="Times New Roman" w:cs="Times New Roman"/>
+                <w:sz w:val="20"/>
+                <w:szCs w:val="24"/>
+              </w:rPr>
               <w:t xml:space="preserve">Дата подписания: </w:t>
             </w:r>
+            <w:proofErr w:type="gramStart"/>
             <w:r>
               <w:rPr>
                 <w:rFonts w:ascii="Times New Roman" w:hAnsi="Times New Roman" w:cs="Times New Roman"/>
@@ -945,6 +1149,7 @@
               </w:rPr>
               <w:t>review</w:t>
             </w:r>
+            <w:proofErr w:type="gramEnd"/>
             <w:r>
               <w:rPr>
                 <w:rFonts w:ascii="Times New Roman" w:hAnsi="Times New Roman" w:cs="Times New Roman"/>
@@ -1021,6 +1226,7 @@
                 <w:lang w:val="en-US"/>
               </w:rPr>
             </w:pPr>
+            <w:proofErr w:type="gramStart"/>
             <w:r>
               <w:rPr>
                 <w:rFonts w:ascii="Times New Roman" w:hAnsi="Times New Roman" w:cs="Times New Roman"/>
@@ -1039,6 +1245,7 @@
               </w:rPr>
               <w:t>user</w:t>
             </w:r>
+            <w:proofErr w:type="gramEnd"/>
             <w:r>
               <w:rPr>
                 <w:rFonts w:ascii="Times New Roman" w:hAnsi="Times New Roman" w:cs="Times New Roman"/>
@@ -1048,6 +1255,7 @@
               </w:rPr>
               <w:t>_</w:t>
             </w:r>
+            <w:proofErr w:type="gramStart"/>
             <w:r>
               <w:rPr>
                 <w:rFonts w:ascii="Times New Roman" w:hAnsi="Times New Roman" w:cs="Times New Roman"/>
@@ -1064,8 +1272,9 @@
                 <w:szCs w:val="24"/>
                 <w:lang w:val="en-US"/>
               </w:rPr>
-              <w:t xml:space="preserve"> }}: </w:t>
-            </w:r>
+              <w:t xml:space="preserve"> }</w:t>
+            </w:r>
+            <w:proofErr w:type="gramEnd"/>
             <w:r>
               <w:rPr>
                 <w:rFonts w:ascii="Times New Roman" w:hAnsi="Times New Roman" w:cs="Times New Roman"/>
@@ -1073,6 +1282,16 @@
                 <w:szCs w:val="24"/>
                 <w:lang w:val="en-US"/>
               </w:rPr>
+              <w:t xml:space="preserve">}: </w:t>
+            </w:r>
+            <w:proofErr w:type="gramStart"/>
+            <w:r>
+              <w:rPr>
+                <w:rFonts w:ascii="Times New Roman" w:hAnsi="Times New Roman" w:cs="Times New Roman"/>
+                <w:sz w:val="20"/>
+                <w:szCs w:val="24"/>
+                <w:lang w:val="en-US"/>
+              </w:rPr>
               <w:t xml:space="preserve">{{ </w:t>
             </w:r>
             <w:r>
@@ -1084,6 +1303,7 @@
               </w:rPr>
               <w:t>user</w:t>
             </w:r>
+            <w:proofErr w:type="gramEnd"/>
             <w:r>
               <w:rPr>
                 <w:rFonts w:ascii="Times New Roman" w:hAnsi="Times New Roman" w:cs="Times New Roman"/>
@@ -1093,6 +1313,7 @@
               </w:rPr>
               <w:t>_</w:t>
             </w:r>
+            <w:proofErr w:type="gramStart"/>
             <w:r>
               <w:rPr>
                 <w:rFonts w:ascii="Times New Roman" w:hAnsi="Times New Roman" w:cs="Times New Roman"/>
@@ -1109,23 +1330,33 @@
                 <w:szCs w:val="24"/>
                 <w:lang w:val="en-US"/>
               </w:rPr>
-              <w:t xml:space="preserve"> }}</w:t>
-            </w:r>
-          </w:p>
-          <w:p>
-            <w:pPr>
+              <w:t xml:space="preserve"> }</w:t>
+            </w:r>
+            <w:proofErr w:type="gramEnd"/>
+            <w:r>
               <w:rPr>
                 <w:rFonts w:ascii="Times New Roman" w:hAnsi="Times New Roman" w:cs="Times New Roman"/>
                 <w:sz w:val="20"/>
                 <w:szCs w:val="24"/>
                 <w:lang w:val="en-US"/>
               </w:rPr>
-            </w:pPr>
-            <w:r>
+              <w:t>}</w:t>
+            </w:r>
+          </w:p>
+          <w:p>
+            <w:pPr>
               <w:rPr>
                 <w:rFonts w:ascii="Times New Roman" w:hAnsi="Times New Roman" w:cs="Times New Roman"/>
                 <w:sz w:val="20"/>
                 <w:szCs w:val="24"/>
+                <w:lang w:val="en-US"/>
+              </w:rPr>
+            </w:pPr>
+            <w:r>
+              <w:rPr>
+                <w:rFonts w:ascii="Times New Roman" w:hAnsi="Times New Roman" w:cs="Times New Roman"/>
+                <w:sz w:val="20"/>
+                <w:szCs w:val="24"/>
               </w:rPr>
               <w:t>Дата</w:t>
             </w:r>
@@ -1162,8 +1393,9 @@
                 <w:szCs w:val="24"/>
                 <w:lang w:val="en-US"/>
               </w:rPr>
-              <w:t xml:space="preserve"> {{ </w:t>
-            </w:r>
+              <w:t xml:space="preserve"> </w:t>
+            </w:r>
+            <w:proofErr w:type="gramStart"/>
             <w:r>
               <w:rPr>
                 <w:rFonts w:ascii="Times New Roman" w:hAnsi="Times New Roman" w:cs="Times New Roman"/>
@@ -1171,7 +1403,26 @@
                 <w:szCs w:val="24"/>
                 <w:lang w:val="en-US"/>
               </w:rPr>
-              <w:t>accept_date</w:t>
+              <w:t xml:space="preserve">{{ </w:t>
+            </w:r>
+            <w:r>
+              <w:rPr>
+                <w:rFonts w:ascii="Times New Roman" w:hAnsi="Times New Roman" w:cs="Times New Roman"/>
+                <w:sz w:val="20"/>
+                <w:szCs w:val="24"/>
+                <w:lang w:val="en-US"/>
+              </w:rPr>
+              <w:t>accept</w:t>
+            </w:r>
+            <w:proofErr w:type="gramEnd"/>
+            <w:r>
+              <w:rPr>
+                <w:rFonts w:ascii="Times New Roman" w:hAnsi="Times New Roman" w:cs="Times New Roman"/>
+                <w:sz w:val="20"/>
+                <w:szCs w:val="24"/>
+                <w:lang w:val="en-US"/>
+              </w:rPr>
+              <w:t>_date</w:t>
             </w:r>
             <w:r>
               <w:rPr>
@@ -1503,6 +1754,7 @@
               </w:rPr>
               <w:t>{{</w:t>
             </w:r>
+            <w:proofErr w:type="gramStart"/>
             <w:r>
               <w:rPr>
                 <w:rFonts w:ascii="Times New Roman" w:hAnsi="Times New Roman" w:cs="Times New Roman"/>
@@ -1519,8 +1771,19 @@
                 <w:szCs w:val="24"/>
                 <w:lang w:val="en-US"/>
               </w:rPr>
-              <w:t>index}} {{</w:t>
-            </w:r>
+              <w:t>index</w:t>
+            </w:r>
+            <w:proofErr w:type="gramEnd"/>
+            <w:r>
+              <w:rPr>
+                <w:rFonts w:ascii="Times New Roman" w:hAnsi="Times New Roman" w:cs="Times New Roman"/>
+                <w:sz w:val="24"/>
+                <w:szCs w:val="24"/>
+                <w:lang w:val="en-US"/>
+              </w:rPr>
+              <w:t>}} {{</w:t>
+            </w:r>
+            <w:proofErr w:type="gramStart"/>
             <w:r>
               <w:rPr>
                 <w:rFonts w:ascii="Times New Roman" w:hAnsi="Times New Roman" w:cs="Times New Roman"/>
@@ -1539,6 +1802,7 @@
               </w:rPr>
               <w:t>content</w:t>
             </w:r>
+            <w:proofErr w:type="gramEnd"/>
             <w:r>
               <w:rPr>
                 <w:rFonts w:ascii="Times New Roman" w:hAnsi="Times New Roman" w:cs="Times New Roman"/>
@@ -1570,6 +1834,7 @@
                 <w:lang w:val="en-US"/>
               </w:rPr>
             </w:pPr>
+            <w:proofErr w:type="gramStart"/>
             <w:r>
               <w:rPr>
                 <w:rFonts w:ascii="Times New Roman" w:hAnsi="Times New Roman" w:cs="Times New Roman"/>
@@ -1586,7 +1851,17 @@
                 <w:szCs w:val="24"/>
                 <w:lang w:val="en-US"/>
               </w:rPr>
-              <w:t>item.</w:t>
+              <w:t>item</w:t>
+            </w:r>
+            <w:proofErr w:type="gramEnd"/>
+            <w:r>
+              <w:rPr>
+                <w:rFonts w:ascii="Times New Roman" w:hAnsi="Times New Roman" w:cs="Times New Roman"/>
+                <w:sz w:val="24"/>
+                <w:szCs w:val="24"/>
+                <w:lang w:val="en-US"/>
+              </w:rPr>
+              <w:t>.</w:t>
             </w:r>
             <w:r>
               <w:rPr>
@@ -1864,7 +2139,31 @@
                 <w:szCs w:val="24"/>
                 <w:lang w:val="en-US"/>
               </w:rPr>
-              <w:t>{{item.index}}</w:t>
+              <w:t>{{</w:t>
+            </w:r>
+            <w:proofErr w:type="gramStart"/>
+            <w:r>
+              <w:rPr>
+                <w:rFonts w:ascii="Times New Roman" w:hAnsi="Times New Roman" w:cs="Times New Roman"/>
+                <w:bCs/>
+                <w:color w:val="000000" w:themeColor="text1"/>
+                <w:sz w:val="24"/>
+                <w:szCs w:val="24"/>
+                <w:lang w:val="en-US"/>
+              </w:rPr>
+              <w:t>item.index</w:t>
+            </w:r>
+            <w:proofErr w:type="gramEnd"/>
+            <w:r>
+              <w:rPr>
+                <w:rFonts w:ascii="Times New Roman" w:hAnsi="Times New Roman" w:cs="Times New Roman"/>
+                <w:bCs/>
+                <w:color w:val="000000" w:themeColor="text1"/>
+                <w:sz w:val="24"/>
+                <w:szCs w:val="24"/>
+                <w:lang w:val="en-US"/>
+              </w:rPr>
+              <w:t>}}</w:t>
             </w:r>
           </w:p>
         </w:tc>
@@ -1901,7 +2200,31 @@
                 <w:szCs w:val="24"/>
                 <w:lang w:val="en-US"/>
               </w:rPr>
-              <w:t>{{item.content}}</w:t>
+              <w:t>{{</w:t>
+            </w:r>
+            <w:proofErr w:type="gramStart"/>
+            <w:r>
+              <w:rPr>
+                <w:rFonts w:ascii="Times New Roman" w:hAnsi="Times New Roman" w:cs="Times New Roman"/>
+                <w:bCs/>
+                <w:color w:val="000000" w:themeColor="text1"/>
+                <w:sz w:val="24"/>
+                <w:szCs w:val="24"/>
+                <w:lang w:val="en-US"/>
+              </w:rPr>
+              <w:t>item.content</w:t>
+            </w:r>
+            <w:proofErr w:type="gramEnd"/>
+            <w:r>
+              <w:rPr>
+                <w:rFonts w:ascii="Times New Roman" w:hAnsi="Times New Roman" w:cs="Times New Roman"/>
+                <w:bCs/>
+                <w:color w:val="000000" w:themeColor="text1"/>
+                <w:sz w:val="24"/>
+                <w:szCs w:val="24"/>
+                <w:lang w:val="en-US"/>
+              </w:rPr>
+              <w:t>}}</w:t>
             </w:r>
           </w:p>
         </w:tc>
@@ -1947,7 +2270,31 @@
                 <w:szCs w:val="24"/>
                 <w:lang w:val="en-US"/>
               </w:rPr>
-              <w:t xml:space="preserve"> {{item.know}}</w:t>
+              <w:t xml:space="preserve"> {{</w:t>
+            </w:r>
+            <w:proofErr w:type="gramStart"/>
+            <w:r>
+              <w:rPr>
+                <w:rFonts w:ascii="Times New Roman" w:hAnsi="Times New Roman" w:cs="Times New Roman"/>
+                <w:bCs/>
+                <w:color w:val="000000" w:themeColor="text1"/>
+                <w:sz w:val="24"/>
+                <w:szCs w:val="24"/>
+                <w:lang w:val="en-US"/>
+              </w:rPr>
+              <w:t>item.know</w:t>
+            </w:r>
+            <w:proofErr w:type="gramEnd"/>
+            <w:r>
+              <w:rPr>
+                <w:rFonts w:ascii="Times New Roman" w:hAnsi="Times New Roman" w:cs="Times New Roman"/>
+                <w:bCs/>
+                <w:color w:val="000000" w:themeColor="text1"/>
+                <w:sz w:val="24"/>
+                <w:szCs w:val="24"/>
+                <w:lang w:val="en-US"/>
+              </w:rPr>
+              <w:t>}}</w:t>
             </w:r>
           </w:p>
           <w:p>
@@ -1993,7 +2340,31 @@
                 <w:szCs w:val="24"/>
                 <w:lang w:val="en-US"/>
               </w:rPr>
-              <w:t>{{item.able}}</w:t>
+              <w:t>{{</w:t>
+            </w:r>
+            <w:proofErr w:type="gramStart"/>
+            <w:r>
+              <w:rPr>
+                <w:rFonts w:ascii="Times New Roman" w:hAnsi="Times New Roman" w:cs="Times New Roman"/>
+                <w:bCs/>
+                <w:color w:val="000000" w:themeColor="text1"/>
+                <w:sz w:val="24"/>
+                <w:szCs w:val="24"/>
+                <w:lang w:val="en-US"/>
+              </w:rPr>
+              <w:t>item.able</w:t>
+            </w:r>
+            <w:proofErr w:type="gramEnd"/>
+            <w:r>
+              <w:rPr>
+                <w:rFonts w:ascii="Times New Roman" w:hAnsi="Times New Roman" w:cs="Times New Roman"/>
+                <w:bCs/>
+                <w:color w:val="000000" w:themeColor="text1"/>
+                <w:sz w:val="24"/>
+                <w:szCs w:val="24"/>
+                <w:lang w:val="en-US"/>
+              </w:rPr>
+              <w:t>}}</w:t>
             </w:r>
           </w:p>
           <w:p>
@@ -2168,6 +2539,7 @@
         </w:rPr>
         <w:t xml:space="preserve">: </w:t>
       </w:r>
+      <w:proofErr w:type="gramStart"/>
       <w:r>
         <w:rPr>
           <w:rFonts w:ascii="Times New Roman" w:hAnsi="Times New Roman" w:cs="Times New Roman"/>
@@ -2185,7 +2557,16 @@
           <w:sz w:val="24"/>
           <w:szCs w:val="24"/>
         </w:rPr>
-        <w:t>subsequent }}</w:t>
+        <w:t>subsequent</w:t>
+      </w:r>
+      <w:proofErr w:type="gramEnd"/>
+      <w:r>
+        <w:rPr>
+          <w:rFonts w:ascii="Times New Roman" w:hAnsi="Times New Roman" w:cs="Times New Roman"/>
+          <w:sz w:val="24"/>
+          <w:szCs w:val="24"/>
+        </w:rPr>
+        <w:t xml:space="preserve"> }}</w:t>
       </w:r>
     </w:p>
     <w:p>
@@ -2223,13 +2604,23 @@
         </w:rPr>
         <w:t xml:space="preserve">: </w:t>
       </w:r>
-      <w:r>
-        <w:rPr>
-          <w:rFonts w:ascii="Times New Roman" w:hAnsi="Times New Roman" w:cs="Times New Roman"/>
-          <w:sz w:val="24"/>
-          <w:szCs w:val="24"/>
-        </w:rPr>
-        <w:t>{{ precedence }}</w:t>
+      <w:proofErr w:type="gramStart"/>
+      <w:r>
+        <w:rPr>
+          <w:rFonts w:ascii="Times New Roman" w:hAnsi="Times New Roman" w:cs="Times New Roman"/>
+          <w:sz w:val="24"/>
+          <w:szCs w:val="24"/>
+        </w:rPr>
+        <w:t>{{ precedence</w:t>
+      </w:r>
+      <w:proofErr w:type="gramEnd"/>
+      <w:r>
+        <w:rPr>
+          <w:rFonts w:ascii="Times New Roman" w:hAnsi="Times New Roman" w:cs="Times New Roman"/>
+          <w:sz w:val="24"/>
+          <w:szCs w:val="24"/>
+        </w:rPr>
+        <w:t xml:space="preserve"> }}</w:t>
       </w:r>
     </w:p>
     <w:p>
@@ -2310,6 +2701,7 @@
         </w:rPr>
         <w:t xml:space="preserve"> </w:t>
       </w:r>
+      <w:proofErr w:type="gramStart"/>
       <w:r>
         <w:rPr>
           <w:rFonts w:ascii="Times New Roman" w:hAnsi="Times New Roman" w:cs="Times New Roman"/>
@@ -2335,6 +2727,7 @@
         </w:rPr>
         <w:t>sum</w:t>
       </w:r>
+      <w:proofErr w:type="gramEnd"/>
       <w:r>
         <w:rPr>
           <w:rFonts w:ascii="Times New Roman" w:hAnsi="Times New Roman" w:cs="Times New Roman"/>
@@ -2484,6 +2877,7 @@
               </w:rPr>
               <w:t xml:space="preserve"> </w:t>
             </w:r>
+            <w:proofErr w:type="gramStart"/>
             <w:r>
               <w:rPr>
                 <w:rFonts w:ascii="Times New Roman" w:hAnsi="Times New Roman" w:cs="Times New Roman"/>
@@ -2500,7 +2894,18 @@
                 <w:sz w:val="24"/>
                 <w:szCs w:val="24"/>
               </w:rPr>
-              <w:t>Трудоемкость в академических часах</w:t>
+              <w:t>Трудоемкость</w:t>
+            </w:r>
+            <w:proofErr w:type="gramEnd"/>
+            <w:r>
+              <w:rPr>
+                <w:rFonts w:ascii="Times New Roman" w:hAnsi="Times New Roman" w:cs="Times New Roman"/>
+                <w:b/>
+                <w:bCs/>
+                <w:sz w:val="24"/>
+                <w:szCs w:val="24"/>
+              </w:rPr>
+              <w:t xml:space="preserve"> в академических часах</w:t>
             </w:r>
           </w:p>
           <w:p>
@@ -3337,6 +3742,7 @@
                 <w:lang w:val="en-US"/>
               </w:rPr>
             </w:pPr>
+            <w:proofErr w:type="gramStart"/>
             <w:r>
               <w:rPr>
                 <w:rFonts w:ascii="Times New Roman" w:hAnsi="Times New Roman" w:cs="Times New Roman"/>
@@ -3374,7 +3780,17 @@
                 <w:szCs w:val="24"/>
                 <w:lang w:val="en-US"/>
               </w:rPr>
-              <w:t>aud_</w:t>
+              <w:t>aud</w:t>
+            </w:r>
+            <w:proofErr w:type="gramEnd"/>
+            <w:r>
+              <w:rPr>
+                <w:rFonts w:ascii="Times New Roman" w:hAnsi="Times New Roman" w:cs="Times New Roman"/>
+                <w:sz w:val="24"/>
+                <w:szCs w:val="24"/>
+                <w:lang w:val="en-US"/>
+              </w:rPr>
+              <w:t>_</w:t>
             </w:r>
             <w:r>
               <w:rPr>
@@ -3522,6 +3938,7 @@
                 <w:szCs w:val="24"/>
               </w:rPr>
             </w:pPr>
+            <w:proofErr w:type="gramStart"/>
             <w:r>
               <w:rPr>
                 <w:rFonts w:ascii="Times New Roman" w:hAnsi="Times New Roman" w:cs="Times New Roman"/>
@@ -3539,6 +3956,7 @@
               </w:rPr>
               <w:t>sha</w:t>
             </w:r>
+            <w:proofErr w:type="gramEnd"/>
             <w:r>
               <w:rPr>
                 <w:rFonts w:ascii="Times New Roman" w:hAnsi="Times New Roman" w:cs="Times New Roman"/>
@@ -3738,6 +4156,7 @@
               </w:rPr>
               <w:t>{{</w:t>
             </w:r>
+            <w:proofErr w:type="gramStart"/>
             <w:r>
               <w:rPr>
                 <w:rFonts w:ascii="Times New Roman" w:hAnsi="Times New Roman" w:cs="Times New Roman"/>
@@ -3764,6 +4183,7 @@
               </w:rPr>
               <w:t>lekc</w:t>
             </w:r>
+            <w:proofErr w:type="gramEnd"/>
             <w:r>
               <w:rPr>
                 <w:rFonts w:ascii="Times New Roman" w:hAnsi="Times New Roman" w:cs="Times New Roman"/>
@@ -3922,6 +4342,7 @@
                 <w:szCs w:val="24"/>
               </w:rPr>
             </w:pPr>
+            <w:proofErr w:type="gramStart"/>
             <w:r>
               <w:rPr>
                 <w:rFonts w:ascii="Times New Roman" w:hAnsi="Times New Roman" w:cs="Times New Roman"/>
@@ -3956,6 +4377,7 @@
               </w:rPr>
               <w:t>lab</w:t>
             </w:r>
+            <w:proofErr w:type="gramEnd"/>
             <w:r>
               <w:rPr>
                 <w:rFonts w:ascii="Times New Roman" w:hAnsi="Times New Roman" w:cs="Times New Roman"/>
@@ -4245,6 +4667,7 @@
                 <w:lang w:val="en-US"/>
               </w:rPr>
             </w:pPr>
+            <w:proofErr w:type="gramStart"/>
             <w:r>
               <w:rPr>
                 <w:rFonts w:ascii="Times New Roman" w:hAnsi="Times New Roman" w:cs="Times New Roman"/>
@@ -4270,7 +4693,17 @@
                 <w:szCs w:val="24"/>
                 <w:lang w:val="en-US"/>
               </w:rPr>
-              <w:t>.pr_hours_all }}</w:t>
+              <w:t>.pr</w:t>
+            </w:r>
+            <w:proofErr w:type="gramEnd"/>
+            <w:r>
+              <w:rPr>
+                <w:rFonts w:ascii="Times New Roman" w:hAnsi="Times New Roman" w:cs="Times New Roman"/>
+                <w:sz w:val="24"/>
+                <w:szCs w:val="24"/>
+                <w:lang w:val="en-US"/>
+              </w:rPr>
+              <w:t>_hours_all }}</w:t>
             </w:r>
           </w:p>
         </w:tc>
@@ -4411,14 +4844,25 @@
                 <w:lang w:val="en-US"/>
               </w:rPr>
             </w:pPr>
-            <w:r>
-              <w:rPr>
-                <w:rFonts w:ascii="Times New Roman" w:hAnsi="Times New Roman" w:cs="Times New Roman"/>
-                <w:sz w:val="24"/>
-                <w:szCs w:val="24"/>
-                <w:lang w:val="en-US"/>
-              </w:rPr>
-              <w:t>{{ sha.</w:t>
+            <w:proofErr w:type="gramStart"/>
+            <w:r>
+              <w:rPr>
+                <w:rFonts w:ascii="Times New Roman" w:hAnsi="Times New Roman" w:cs="Times New Roman"/>
+                <w:sz w:val="24"/>
+                <w:szCs w:val="24"/>
+                <w:lang w:val="en-US"/>
+              </w:rPr>
+              <w:t>{{ sha</w:t>
+            </w:r>
+            <w:proofErr w:type="gramEnd"/>
+            <w:r>
+              <w:rPr>
+                <w:rFonts w:ascii="Times New Roman" w:hAnsi="Times New Roman" w:cs="Times New Roman"/>
+                <w:sz w:val="24"/>
+                <w:szCs w:val="24"/>
+                <w:lang w:val="en-US"/>
+              </w:rPr>
+              <w:t>.</w:t>
             </w:r>
             <w:r>
               <w:t xml:space="preserve"> </w:t>
@@ -4491,7 +4935,17 @@
                 <w:szCs w:val="24"/>
                 <w:lang w:val="en-US"/>
               </w:rPr>
-              <w:t>{{item.</w:t>
+              <w:t>{{</w:t>
+            </w:r>
+            <w:proofErr w:type="gramStart"/>
+            <w:r>
+              <w:rPr>
+                <w:rFonts w:ascii="Times New Roman" w:hAnsi="Times New Roman" w:cs="Times New Roman"/>
+                <w:sz w:val="24"/>
+                <w:szCs w:val="24"/>
+                <w:lang w:val="en-US"/>
+              </w:rPr>
+              <w:t>item.</w:t>
             </w:r>
             <w:r>
               <w:t>c</w:t>
@@ -4505,6 +4959,7 @@
               </w:rPr>
               <w:t>ontact</w:t>
             </w:r>
+            <w:proofErr w:type="gramEnd"/>
             <w:r>
               <w:rPr>
                 <w:rFonts w:ascii="Times New Roman" w:hAnsi="Times New Roman" w:cs="Times New Roman"/>
@@ -4793,6 +5248,7 @@
               </w:rPr>
               <w:t>{{</w:t>
             </w:r>
+            <w:proofErr w:type="gramStart"/>
             <w:r>
               <w:rPr>
                 <w:rFonts w:ascii="Times New Roman" w:hAnsi="Times New Roman" w:cs="Times New Roman"/>
@@ -4819,6 +5275,7 @@
               </w:rPr>
               <w:t>eios</w:t>
             </w:r>
+            <w:proofErr w:type="gramEnd"/>
             <w:r>
               <w:rPr>
                 <w:rFonts w:ascii="Times New Roman" w:hAnsi="Times New Roman" w:cs="Times New Roman"/>
@@ -4938,6 +5395,7 @@
                 <w:lang w:val="en-US"/>
               </w:rPr>
             </w:pPr>
+            <w:proofErr w:type="gramStart"/>
             <w:r>
               <w:rPr>
                 <w:rFonts w:ascii="Times New Roman" w:hAnsi="Times New Roman" w:cs="Times New Roman"/>
@@ -4963,7 +5421,17 @@
                 <w:szCs w:val="24"/>
                 <w:lang w:val="en-US"/>
               </w:rPr>
-              <w:t>.srs_hours_all }}</w:t>
+              <w:t>.srs</w:t>
+            </w:r>
+            <w:proofErr w:type="gramEnd"/>
+            <w:r>
+              <w:rPr>
+                <w:rFonts w:ascii="Times New Roman" w:hAnsi="Times New Roman" w:cs="Times New Roman"/>
+                <w:sz w:val="24"/>
+                <w:szCs w:val="24"/>
+                <w:lang w:val="en-US"/>
+              </w:rPr>
+              <w:t>_hours_all }}</w:t>
             </w:r>
           </w:p>
         </w:tc>
@@ -5104,14 +5572,25 @@
                 <w:lang w:val="en-US"/>
               </w:rPr>
             </w:pPr>
-            <w:r>
-              <w:rPr>
-                <w:rFonts w:ascii="Times New Roman" w:hAnsi="Times New Roman" w:cs="Times New Roman"/>
-                <w:sz w:val="24"/>
-                <w:szCs w:val="24"/>
-                <w:lang w:val="en-US"/>
-              </w:rPr>
-              <w:t>{{ sha.ekz_hours_all}}</w:t>
+            <w:proofErr w:type="gramStart"/>
+            <w:r>
+              <w:rPr>
+                <w:rFonts w:ascii="Times New Roman" w:hAnsi="Times New Roman" w:cs="Times New Roman"/>
+                <w:sz w:val="24"/>
+                <w:szCs w:val="24"/>
+                <w:lang w:val="en-US"/>
+              </w:rPr>
+              <w:t>{{ sha.ekz</w:t>
+            </w:r>
+            <w:proofErr w:type="gramEnd"/>
+            <w:r>
+              <w:rPr>
+                <w:rFonts w:ascii="Times New Roman" w:hAnsi="Times New Roman" w:cs="Times New Roman"/>
+                <w:sz w:val="24"/>
+                <w:szCs w:val="24"/>
+                <w:lang w:val="en-US"/>
+              </w:rPr>
+              <w:t>_hours_all}}</w:t>
             </w:r>
           </w:p>
         </w:tc>
@@ -5234,6 +5713,7 @@
                 <w:lang w:val="en-US"/>
               </w:rPr>
             </w:pPr>
+            <w:proofErr w:type="gramStart"/>
             <w:r>
               <w:rPr>
                 <w:rFonts w:ascii="Times New Roman" w:hAnsi="Times New Roman" w:cs="Times New Roman"/>
@@ -5259,7 +5739,17 @@
                 <w:szCs w:val="24"/>
                 <w:lang w:val="en-US"/>
               </w:rPr>
-              <w:t>.tic_all }}</w:t>
+              <w:t>.tic</w:t>
+            </w:r>
+            <w:proofErr w:type="gramEnd"/>
+            <w:r>
+              <w:rPr>
+                <w:rFonts w:ascii="Times New Roman" w:hAnsi="Times New Roman" w:cs="Times New Roman"/>
+                <w:sz w:val="24"/>
+                <w:szCs w:val="24"/>
+                <w:lang w:val="en-US"/>
+              </w:rPr>
+              <w:t>_all }}</w:t>
             </w:r>
           </w:p>
         </w:tc>
@@ -5551,6 +6041,7 @@
         </w:rPr>
         <w:t xml:space="preserve"> </w:t>
       </w:r>
+      <w:proofErr w:type="gramStart"/>
       <w:r>
         <w:rPr>
           <w:rFonts w:ascii="Times New Roman" w:hAnsi="Times New Roman" w:cs="Times New Roman"/>
@@ -5582,7 +6073,19 @@
           <w:szCs w:val="24"/>
           <w:lang w:val="en-US"/>
         </w:rPr>
-        <w:t>items()</w:t>
+        <w:t>items</w:t>
+      </w:r>
+      <w:proofErr w:type="gramEnd"/>
+      <w:r>
+        <w:rPr>
+          <w:rFonts w:ascii="Times New Roman" w:hAnsi="Times New Roman" w:cs="Times New Roman"/>
+          <w:b/>
+          <w:bCs/>
+          <w:sz w:val="24"/>
+          <w:szCs w:val="24"/>
+          <w:lang w:val="en-US"/>
+        </w:rPr>
+        <w:t>()</w:t>
       </w:r>
       <w:r>
         <w:rPr>
@@ -5652,6 +6155,7 @@
         </w:rPr>
         <w:t xml:space="preserve"> № </w:t>
       </w:r>
+      <w:proofErr w:type="gramStart"/>
       <w:r>
         <w:rPr>
           <w:rFonts w:ascii="Times New Roman" w:hAnsi="Times New Roman" w:cs="Times New Roman"/>
@@ -5676,6 +6180,7 @@
         </w:rPr>
         <w:t xml:space="preserve"> key</w:t>
       </w:r>
+      <w:proofErr w:type="gramEnd"/>
       <w:r>
         <w:rPr>
           <w:rFonts w:ascii="Times New Roman" w:hAnsi="Times New Roman" w:cs="Times New Roman"/>
@@ -6594,6 +7099,7 @@
                 <w:szCs w:val="20"/>
               </w:rPr>
             </w:pPr>
+            <w:proofErr w:type="gramStart"/>
             <w:r>
               <w:rPr>
                 <w:rFonts w:ascii="Times New Roman" w:hAnsi="Times New Roman" w:cs="Times New Roman"/>
@@ -6612,6 +7118,7 @@
               </w:rPr>
               <w:t>.num</w:t>
             </w:r>
+            <w:proofErr w:type="gramEnd"/>
             <w:r>
               <w:rPr>
                 <w:rFonts w:ascii="Times New Roman" w:hAnsi="Times New Roman" w:cs="Times New Roman"/>
@@ -6636,6 +7143,7 @@
                 <w:lang w:val="en-US"/>
               </w:rPr>
             </w:pPr>
+            <w:proofErr w:type="gramStart"/>
             <w:r>
               <w:rPr>
                 <w:rFonts w:ascii="Times New Roman" w:hAnsi="Times New Roman" w:cs="Times New Roman"/>
@@ -6643,7 +7151,17 @@
                 <w:szCs w:val="20"/>
                 <w:lang w:val="en-US"/>
               </w:rPr>
-              <w:t>{{ i.name }}</w:t>
+              <w:t>{{ i</w:t>
+            </w:r>
+            <w:proofErr w:type="gramEnd"/>
+            <w:r>
+              <w:rPr>
+                <w:rFonts w:ascii="Times New Roman" w:hAnsi="Times New Roman" w:cs="Times New Roman"/>
+                <w:sz w:val="20"/>
+                <w:szCs w:val="20"/>
+                <w:lang w:val="en-US"/>
+              </w:rPr>
+              <w:t>.name }}</w:t>
             </w:r>
           </w:p>
         </w:tc>
@@ -6662,6 +7180,7 @@
                 <w:lang w:val="en-US"/>
               </w:rPr>
             </w:pPr>
+            <w:proofErr w:type="gramStart"/>
             <w:r>
               <w:rPr>
                 <w:rFonts w:ascii="Times New Roman" w:hAnsi="Times New Roman" w:cs="Times New Roman"/>
@@ -6669,7 +7188,17 @@
                 <w:szCs w:val="20"/>
                 <w:lang w:val="en-US"/>
               </w:rPr>
-              <w:t>{{ i.lekc }}</w:t>
+              <w:t>{{ i</w:t>
+            </w:r>
+            <w:proofErr w:type="gramEnd"/>
+            <w:r>
+              <w:rPr>
+                <w:rFonts w:ascii="Times New Roman" w:hAnsi="Times New Roman" w:cs="Times New Roman"/>
+                <w:sz w:val="20"/>
+                <w:szCs w:val="20"/>
+                <w:lang w:val="en-US"/>
+              </w:rPr>
+              <w:t>.lekc }}</w:t>
             </w:r>
           </w:p>
         </w:tc>
@@ -6688,6 +7217,7 @@
                 <w:lang w:val="en-US"/>
               </w:rPr>
             </w:pPr>
+            <w:proofErr w:type="gramStart"/>
             <w:r>
               <w:rPr>
                 <w:rFonts w:ascii="Times New Roman" w:hAnsi="Times New Roman" w:cs="Times New Roman"/>
@@ -6695,7 +7225,17 @@
                 <w:szCs w:val="20"/>
                 <w:lang w:val="en-US"/>
               </w:rPr>
-              <w:t>{{ i.lekc_hours}}</w:t>
+              <w:t>{{ i</w:t>
+            </w:r>
+            <w:proofErr w:type="gramEnd"/>
+            <w:r>
+              <w:rPr>
+                <w:rFonts w:ascii="Times New Roman" w:hAnsi="Times New Roman" w:cs="Times New Roman"/>
+                <w:sz w:val="20"/>
+                <w:szCs w:val="20"/>
+                <w:lang w:val="en-US"/>
+              </w:rPr>
+              <w:t>.lekc_hours}}</w:t>
             </w:r>
           </w:p>
         </w:tc>
@@ -6714,6 +7254,7 @@
                 <w:lang w:val="en-US"/>
               </w:rPr>
             </w:pPr>
+            <w:proofErr w:type="gramStart"/>
             <w:r>
               <w:rPr>
                 <w:rFonts w:ascii="Times New Roman" w:hAnsi="Times New Roman" w:cs="Times New Roman"/>
@@ -6721,7 +7262,17 @@
                 <w:szCs w:val="20"/>
                 <w:lang w:val="en-US"/>
               </w:rPr>
-              <w:t>{{ i.lab }}</w:t>
+              <w:t>{{ i.lab</w:t>
+            </w:r>
+            <w:proofErr w:type="gramEnd"/>
+            <w:r>
+              <w:rPr>
+                <w:rFonts w:ascii="Times New Roman" w:hAnsi="Times New Roman" w:cs="Times New Roman"/>
+                <w:sz w:val="20"/>
+                <w:szCs w:val="20"/>
+                <w:lang w:val="en-US"/>
+              </w:rPr>
+              <w:t xml:space="preserve"> }}</w:t>
             </w:r>
           </w:p>
         </w:tc>
@@ -6740,6 +7291,7 @@
                 <w:lang w:val="en-US"/>
               </w:rPr>
             </w:pPr>
+            <w:proofErr w:type="gramStart"/>
             <w:r>
               <w:rPr>
                 <w:rFonts w:ascii="Times New Roman" w:hAnsi="Times New Roman" w:cs="Times New Roman"/>
@@ -6747,7 +7299,17 @@
                 <w:szCs w:val="20"/>
                 <w:lang w:val="en-US"/>
               </w:rPr>
-              <w:t>{{ i.lab_hours }}</w:t>
+              <w:t>{{ i.lab</w:t>
+            </w:r>
+            <w:proofErr w:type="gramEnd"/>
+            <w:r>
+              <w:rPr>
+                <w:rFonts w:ascii="Times New Roman" w:hAnsi="Times New Roman" w:cs="Times New Roman"/>
+                <w:sz w:val="20"/>
+                <w:szCs w:val="20"/>
+                <w:lang w:val="en-US"/>
+              </w:rPr>
+              <w:t>_hours }}</w:t>
             </w:r>
           </w:p>
         </w:tc>
@@ -6766,6 +7328,7 @@
                 <w:lang w:val="en-US"/>
               </w:rPr>
             </w:pPr>
+            <w:proofErr w:type="gramStart"/>
             <w:r>
               <w:rPr>
                 <w:rFonts w:ascii="Times New Roman" w:hAnsi="Times New Roman" w:cs="Times New Roman"/>
@@ -6773,7 +7336,17 @@
                 <w:szCs w:val="20"/>
                 <w:lang w:val="en-US"/>
               </w:rPr>
-              <w:t>{{ i.pr }}</w:t>
+              <w:t>{{ i</w:t>
+            </w:r>
+            <w:proofErr w:type="gramEnd"/>
+            <w:r>
+              <w:rPr>
+                <w:rFonts w:ascii="Times New Roman" w:hAnsi="Times New Roman" w:cs="Times New Roman"/>
+                <w:sz w:val="20"/>
+                <w:szCs w:val="20"/>
+                <w:lang w:val="en-US"/>
+              </w:rPr>
+              <w:t>.pr }}</w:t>
             </w:r>
           </w:p>
         </w:tc>
@@ -6792,6 +7365,7 @@
                 <w:lang w:val="en-US"/>
               </w:rPr>
             </w:pPr>
+            <w:proofErr w:type="gramStart"/>
             <w:r>
               <w:rPr>
                 <w:rFonts w:ascii="Times New Roman" w:hAnsi="Times New Roman" w:cs="Times New Roman"/>
@@ -6799,7 +7373,17 @@
                 <w:szCs w:val="20"/>
                 <w:lang w:val="en-US"/>
               </w:rPr>
-              <w:t>{{ i.pr_hours }}</w:t>
+              <w:t>{{ i</w:t>
+            </w:r>
+            <w:proofErr w:type="gramEnd"/>
+            <w:r>
+              <w:rPr>
+                <w:rFonts w:ascii="Times New Roman" w:hAnsi="Times New Roman" w:cs="Times New Roman"/>
+                <w:sz w:val="20"/>
+                <w:szCs w:val="20"/>
+                <w:lang w:val="en-US"/>
+              </w:rPr>
+              <w:t>.pr_hours }}</w:t>
             </w:r>
           </w:p>
         </w:tc>
@@ -6818,6 +7402,7 @@
                 <w:lang w:val="en-US"/>
               </w:rPr>
             </w:pPr>
+            <w:proofErr w:type="gramStart"/>
             <w:r>
               <w:rPr>
                 <w:rFonts w:ascii="Times New Roman" w:hAnsi="Times New Roman" w:cs="Times New Roman"/>
@@ -6825,7 +7410,17 @@
                 <w:szCs w:val="20"/>
                 <w:lang w:val="en-US"/>
               </w:rPr>
-              <w:t>{{ i.srs }}</w:t>
+              <w:t>{{ i.srs</w:t>
+            </w:r>
+            <w:proofErr w:type="gramEnd"/>
+            <w:r>
+              <w:rPr>
+                <w:rFonts w:ascii="Times New Roman" w:hAnsi="Times New Roman" w:cs="Times New Roman"/>
+                <w:sz w:val="20"/>
+                <w:szCs w:val="20"/>
+                <w:lang w:val="en-US"/>
+              </w:rPr>
+              <w:t xml:space="preserve"> }}</w:t>
             </w:r>
           </w:p>
         </w:tc>
@@ -6844,6 +7439,7 @@
                 <w:lang w:val="en-US"/>
               </w:rPr>
             </w:pPr>
+            <w:proofErr w:type="gramStart"/>
             <w:r>
               <w:rPr>
                 <w:rFonts w:ascii="Times New Roman" w:hAnsi="Times New Roman" w:cs="Times New Roman"/>
@@ -6851,7 +7447,17 @@
                 <w:szCs w:val="20"/>
                 <w:lang w:val="en-US"/>
               </w:rPr>
-              <w:t>{{ i.srs_hours }}</w:t>
+              <w:t>{{ i.srs</w:t>
+            </w:r>
+            <w:proofErr w:type="gramEnd"/>
+            <w:r>
+              <w:rPr>
+                <w:rFonts w:ascii="Times New Roman" w:hAnsi="Times New Roman" w:cs="Times New Roman"/>
+                <w:sz w:val="20"/>
+                <w:szCs w:val="20"/>
+                <w:lang w:val="en-US"/>
+              </w:rPr>
+              <w:t>_hours }}</w:t>
             </w:r>
           </w:p>
         </w:tc>
@@ -6870,6 +7476,7 @@
                 <w:lang w:val="en-US"/>
               </w:rPr>
             </w:pPr>
+            <w:proofErr w:type="gramStart"/>
             <w:r>
               <w:rPr>
                 <w:rFonts w:ascii="Times New Roman" w:hAnsi="Times New Roman" w:cs="Times New Roman"/>
@@ -6888,6 +7495,7 @@
               </w:rPr>
               <w:t>tic</w:t>
             </w:r>
+            <w:proofErr w:type="gramEnd"/>
             <w:r>
               <w:rPr>
                 <w:rFonts w:ascii="Times New Roman" w:hAnsi="Times New Roman" w:cs="Times New Roman"/>
@@ -7199,7 +7807,31 @@
           <w:szCs w:val="24"/>
           <w:lang w:val="en-US"/>
         </w:rPr>
-        <w:t xml:space="preserve"> in dg.items() </w:t>
+        <w:t xml:space="preserve"> in </w:t>
+      </w:r>
+      <w:proofErr w:type="gramStart"/>
+      <w:r>
+        <w:rPr>
+          <w:rFonts w:ascii="Times New Roman" w:hAnsi="Times New Roman" w:cs="Times New Roman"/>
+          <w:b/>
+          <w:bCs/>
+          <w:sz w:val="24"/>
+          <w:szCs w:val="24"/>
+          <w:lang w:val="en-US"/>
+        </w:rPr>
+        <w:t>dg.items</w:t>
+      </w:r>
+      <w:proofErr w:type="gramEnd"/>
+      <w:r>
+        <w:rPr>
+          <w:rFonts w:ascii="Times New Roman" w:hAnsi="Times New Roman" w:cs="Times New Roman"/>
+          <w:b/>
+          <w:bCs/>
+          <w:sz w:val="24"/>
+          <w:szCs w:val="24"/>
+          <w:lang w:val="en-US"/>
+        </w:rPr>
+        <w:t xml:space="preserve">() </w:t>
       </w:r>
       <w:r>
         <w:rPr>
@@ -7258,6 +7890,7 @@
         </w:rPr>
         <w:t xml:space="preserve"> № </w:t>
       </w:r>
+      <w:proofErr w:type="gramStart"/>
       <w:r>
         <w:rPr>
           <w:rFonts w:ascii="Times New Roman" w:hAnsi="Times New Roman" w:cs="Times New Roman"/>
@@ -7268,7 +7901,20 @@
           <w:u w:val="single"/>
           <w:lang w:val="en-US"/>
         </w:rPr>
-        <w:t>{{ key }}</w:t>
+        <w:t>{{ key</w:t>
+      </w:r>
+      <w:proofErr w:type="gramEnd"/>
+      <w:r>
+        <w:rPr>
+          <w:rFonts w:ascii="Times New Roman" w:hAnsi="Times New Roman" w:cs="Times New Roman"/>
+          <w:b/>
+          <w:bCs/>
+          <w:sz w:val="24"/>
+          <w:szCs w:val="24"/>
+          <w:u w:val="single"/>
+          <w:lang w:val="en-US"/>
+        </w:rPr>
+        <w:t xml:space="preserve"> }}</w:t>
       </w:r>
     </w:p>
     <w:tbl>
@@ -7401,6 +8047,7 @@
                 <w:lang w:val="en-US"/>
               </w:rPr>
             </w:pPr>
+            <w:proofErr w:type="gramStart"/>
             <w:r>
               <w:rPr>
                 <w:rFonts w:ascii="Times New Roman" w:hAnsi="Times New Roman" w:cs="Times New Roman"/>
@@ -7426,7 +8073,17 @@
                 <w:szCs w:val="24"/>
                 <w:lang w:val="en-US"/>
               </w:rPr>
-              <w:t>.num }}</w:t>
+              <w:t>.num</w:t>
+            </w:r>
+            <w:proofErr w:type="gramEnd"/>
+            <w:r>
+              <w:rPr>
+                <w:rFonts w:ascii="Times New Roman" w:hAnsi="Times New Roman" w:cs="Times New Roman"/>
+                <w:sz w:val="24"/>
+                <w:szCs w:val="24"/>
+                <w:lang w:val="en-US"/>
+              </w:rPr>
+              <w:t xml:space="preserve"> }}</w:t>
             </w:r>
           </w:p>
         </w:tc>
@@ -7443,6 +8100,7 @@
                 <w:lang w:val="en-US"/>
               </w:rPr>
             </w:pPr>
+            <w:proofErr w:type="gramStart"/>
             <w:r>
               <w:rPr>
                 <w:rFonts w:ascii="Times New Roman" w:hAnsi="Times New Roman" w:cs="Times New Roman"/>
@@ -7461,6 +8119,7 @@
               </w:rPr>
               <w:t xml:space="preserve"> i</w:t>
             </w:r>
+            <w:proofErr w:type="gramEnd"/>
             <w:r>
               <w:rPr>
                 <w:rFonts w:ascii="Times New Roman" w:hAnsi="Times New Roman" w:cs="Times New Roman"/>
@@ -7485,6 +8144,7 @@
                 <w:lang w:val="en-US"/>
               </w:rPr>
             </w:pPr>
+            <w:proofErr w:type="gramStart"/>
             <w:r>
               <w:rPr>
                 <w:rFonts w:ascii="Times New Roman" w:hAnsi="Times New Roman" w:cs="Times New Roman"/>
@@ -7503,6 +8163,7 @@
               </w:rPr>
               <w:t>i</w:t>
             </w:r>
+            <w:proofErr w:type="gramEnd"/>
             <w:r>
               <w:rPr>
                 <w:rFonts w:ascii="Times New Roman" w:hAnsi="Times New Roman" w:cs="Times New Roman"/>
@@ -7958,6 +8619,7 @@
         </w:rPr>
         <w:t xml:space="preserve"> </w:t>
       </w:r>
+      <w:proofErr w:type="gramStart"/>
       <w:r>
         <w:rPr>
           <w:rFonts w:ascii="Times New Roman" w:hAnsi="Times New Roman" w:cs="Times New Roman"/>
@@ -7991,6 +8653,7 @@
         </w:rPr>
         <w:t>items</w:t>
       </w:r>
+      <w:proofErr w:type="gramEnd"/>
       <w:r>
         <w:rPr>
           <w:rFonts w:ascii="Times New Roman" w:hAnsi="Times New Roman" w:cs="Times New Roman"/>
@@ -8057,6 +8720,7 @@
         </w:rPr>
         <w:t xml:space="preserve"> № </w:t>
       </w:r>
+      <w:proofErr w:type="gramStart"/>
       <w:r>
         <w:rPr>
           <w:rFonts w:ascii="Times New Roman" w:hAnsi="Times New Roman" w:cs="Times New Roman"/>
@@ -8067,7 +8731,20 @@
           <w:u w:val="single"/>
           <w:lang w:val="en-US"/>
         </w:rPr>
-        <w:t>{{ key }}</w:t>
+        <w:t>{{ key</w:t>
+      </w:r>
+      <w:proofErr w:type="gramEnd"/>
+      <w:r>
+        <w:rPr>
+          <w:rFonts w:ascii="Times New Roman" w:hAnsi="Times New Roman" w:cs="Times New Roman"/>
+          <w:b/>
+          <w:bCs/>
+          <w:sz w:val="24"/>
+          <w:szCs w:val="24"/>
+          <w:u w:val="single"/>
+          <w:lang w:val="en-US"/>
+        </w:rPr>
+        <w:t xml:space="preserve"> }}</w:t>
       </w:r>
     </w:p>
     <w:tbl>
@@ -8303,6 +8980,7 @@
                 <w:szCs w:val="24"/>
               </w:rPr>
             </w:pPr>
+            <w:proofErr w:type="gramStart"/>
             <w:r>
               <w:rPr>
                 <w:rFonts w:ascii="Times New Roman" w:hAnsi="Times New Roman" w:cs="Times New Roman"/>
@@ -8320,6 +8998,7 @@
               </w:rPr>
               <w:t>i</w:t>
             </w:r>
+            <w:proofErr w:type="gramEnd"/>
             <w:r>
               <w:rPr>
                 <w:rFonts w:ascii="Times New Roman" w:hAnsi="Times New Roman" w:cs="Times New Roman"/>
@@ -8359,6 +9038,7 @@
                 <w:szCs w:val="24"/>
               </w:rPr>
             </w:pPr>
+            <w:proofErr w:type="gramStart"/>
             <w:r>
               <w:rPr>
                 <w:rFonts w:ascii="Times New Roman" w:hAnsi="Times New Roman" w:cs="Times New Roman"/>
@@ -8376,6 +9056,7 @@
               </w:rPr>
               <w:t>i</w:t>
             </w:r>
+            <w:proofErr w:type="gramEnd"/>
             <w:r>
               <w:rPr>
                 <w:rFonts w:ascii="Times New Roman" w:hAnsi="Times New Roman" w:cs="Times New Roman"/>
@@ -8417,6 +9098,7 @@
                 <w:szCs w:val="24"/>
               </w:rPr>
             </w:pPr>
+            <w:proofErr w:type="gramStart"/>
             <w:r>
               <w:rPr>
                 <w:rFonts w:ascii="Times New Roman" w:hAnsi="Times New Roman" w:cs="Times New Roman"/>
@@ -8434,6 +9116,7 @@
               </w:rPr>
               <w:t>i</w:t>
             </w:r>
+            <w:proofErr w:type="gramEnd"/>
             <w:r>
               <w:rPr>
                 <w:rFonts w:ascii="Times New Roman" w:hAnsi="Times New Roman" w:cs="Times New Roman"/>
@@ -8924,6 +9607,7 @@
         </w:rPr>
         <w:t xml:space="preserve"> </w:t>
       </w:r>
+      <w:proofErr w:type="gramStart"/>
       <w:r>
         <w:rPr>
           <w:rFonts w:ascii="Times New Roman" w:hAnsi="Times New Roman" w:cs="Times New Roman"/>
@@ -8957,6 +9641,7 @@
         </w:rPr>
         <w:t>items</w:t>
       </w:r>
+      <w:proofErr w:type="gramEnd"/>
       <w:r>
         <w:rPr>
           <w:rFonts w:ascii="Times New Roman" w:hAnsi="Times New Roman" w:cs="Times New Roman"/>
@@ -9025,6 +9710,7 @@
         </w:rPr>
         <w:t xml:space="preserve"> № </w:t>
       </w:r>
+      <w:proofErr w:type="gramStart"/>
       <w:r>
         <w:rPr>
           <w:rFonts w:ascii="Times New Roman" w:hAnsi="Times New Roman" w:cs="Times New Roman"/>
@@ -9035,7 +9721,20 @@
           <w:u w:val="single"/>
           <w:lang w:val="en-US"/>
         </w:rPr>
-        <w:t>{{ key }}</w:t>
+        <w:t>{{ key</w:t>
+      </w:r>
+      <w:proofErr w:type="gramEnd"/>
+      <w:r>
+        <w:rPr>
+          <w:rFonts w:ascii="Times New Roman" w:hAnsi="Times New Roman" w:cs="Times New Roman"/>
+          <w:b/>
+          <w:bCs/>
+          <w:sz w:val="24"/>
+          <w:szCs w:val="24"/>
+          <w:u w:val="single"/>
+          <w:lang w:val="en-US"/>
+        </w:rPr>
+        <w:t xml:space="preserve"> }}</w:t>
       </w:r>
     </w:p>
     <w:tbl>
@@ -9262,6 +9961,7 @@
                 <w:szCs w:val="24"/>
               </w:rPr>
             </w:pPr>
+            <w:proofErr w:type="gramStart"/>
             <w:r>
               <w:rPr>
                 <w:rFonts w:ascii="Times New Roman" w:hAnsi="Times New Roman" w:cs="Times New Roman"/>
@@ -9279,6 +9979,7 @@
               </w:rPr>
               <w:t>i</w:t>
             </w:r>
+            <w:proofErr w:type="gramEnd"/>
             <w:r>
               <w:rPr>
                 <w:rFonts w:ascii="Times New Roman" w:hAnsi="Times New Roman" w:cs="Times New Roman"/>
@@ -9318,6 +10019,7 @@
                 <w:szCs w:val="24"/>
               </w:rPr>
             </w:pPr>
+            <w:proofErr w:type="gramStart"/>
             <w:r>
               <w:rPr>
                 <w:rFonts w:ascii="Times New Roman" w:hAnsi="Times New Roman" w:cs="Times New Roman"/>
@@ -9335,6 +10037,7 @@
               </w:rPr>
               <w:t>i</w:t>
             </w:r>
+            <w:proofErr w:type="gramEnd"/>
             <w:r>
               <w:rPr>
                 <w:rFonts w:ascii="Times New Roman" w:hAnsi="Times New Roman" w:cs="Times New Roman"/>
@@ -9376,6 +10079,7 @@
                 <w:szCs w:val="24"/>
               </w:rPr>
             </w:pPr>
+            <w:proofErr w:type="gramStart"/>
             <w:r>
               <w:rPr>
                 <w:rFonts w:ascii="Times New Roman" w:hAnsi="Times New Roman" w:cs="Times New Roman"/>
@@ -9393,6 +10097,7 @@
               </w:rPr>
               <w:t>i</w:t>
             </w:r>
+            <w:proofErr w:type="gramEnd"/>
             <w:r>
               <w:rPr>
                 <w:rFonts w:ascii="Times New Roman" w:hAnsi="Times New Roman" w:cs="Times New Roman"/>
@@ -9887,6 +10592,7 @@
         </w:rPr>
         <w:t xml:space="preserve"> </w:t>
       </w:r>
+      <w:proofErr w:type="gramStart"/>
       <w:r>
         <w:rPr>
           <w:rFonts w:ascii="Times New Roman" w:hAnsi="Times New Roman" w:cs="Times New Roman"/>
@@ -9920,6 +10626,7 @@
         </w:rPr>
         <w:t>items</w:t>
       </w:r>
+      <w:proofErr w:type="gramEnd"/>
       <w:r>
         <w:rPr>
           <w:rFonts w:ascii="Times New Roman" w:hAnsi="Times New Roman" w:cs="Times New Roman"/>
@@ -9986,6 +10693,7 @@
         </w:rPr>
         <w:t xml:space="preserve"> № </w:t>
       </w:r>
+      <w:proofErr w:type="gramStart"/>
       <w:r>
         <w:rPr>
           <w:rFonts w:ascii="Times New Roman" w:hAnsi="Times New Roman" w:cs="Times New Roman"/>
@@ -9996,7 +10704,20 @@
           <w:u w:val="single"/>
           <w:lang w:val="en-US"/>
         </w:rPr>
-        <w:t>{{ key }}</w:t>
+        <w:t>{{ key</w:t>
+      </w:r>
+      <w:proofErr w:type="gramEnd"/>
+      <w:r>
+        <w:rPr>
+          <w:rFonts w:ascii="Times New Roman" w:hAnsi="Times New Roman" w:cs="Times New Roman"/>
+          <w:b/>
+          <w:bCs/>
+          <w:sz w:val="24"/>
+          <w:szCs w:val="24"/>
+          <w:u w:val="single"/>
+          <w:lang w:val="en-US"/>
+        </w:rPr>
+        <w:t xml:space="preserve"> }}</w:t>
       </w:r>
     </w:p>
     <w:tbl>
@@ -10223,6 +10944,7 @@
                 <w:szCs w:val="24"/>
               </w:rPr>
             </w:pPr>
+            <w:proofErr w:type="gramStart"/>
             <w:r>
               <w:rPr>
                 <w:rFonts w:ascii="Times New Roman" w:hAnsi="Times New Roman" w:cs="Times New Roman"/>
@@ -10240,6 +10962,7 @@
               </w:rPr>
               <w:t>i</w:t>
             </w:r>
+            <w:proofErr w:type="gramEnd"/>
             <w:r>
               <w:rPr>
                 <w:rFonts w:ascii="Times New Roman" w:hAnsi="Times New Roman" w:cs="Times New Roman"/>
@@ -10279,6 +11002,7 @@
                 <w:szCs w:val="24"/>
               </w:rPr>
             </w:pPr>
+            <w:proofErr w:type="gramStart"/>
             <w:r>
               <w:rPr>
                 <w:rFonts w:ascii="Times New Roman" w:hAnsi="Times New Roman" w:cs="Times New Roman"/>
@@ -10296,6 +11020,7 @@
               </w:rPr>
               <w:t>i</w:t>
             </w:r>
+            <w:proofErr w:type="gramEnd"/>
             <w:r>
               <w:rPr>
                 <w:rFonts w:ascii="Times New Roman" w:hAnsi="Times New Roman" w:cs="Times New Roman"/>
@@ -10337,6 +11062,7 @@
                 <w:szCs w:val="24"/>
               </w:rPr>
             </w:pPr>
+            <w:proofErr w:type="gramStart"/>
             <w:r>
               <w:rPr>
                 <w:rFonts w:ascii="Times New Roman" w:hAnsi="Times New Roman" w:cs="Times New Roman"/>
@@ -10354,6 +11080,7 @@
               </w:rPr>
               <w:t>i</w:t>
             </w:r>
+            <w:proofErr w:type="gramEnd"/>
             <w:r>
               <w:rPr>
                 <w:rFonts w:ascii="Times New Roman" w:hAnsi="Times New Roman" w:cs="Times New Roman"/>
@@ -10525,7 +11252,43 @@
           <w:sz w:val="24"/>
           <w:szCs w:val="24"/>
         </w:rPr>
-        <w:t xml:space="preserve"> используются следующие интерактивные методы обучения: {{ interactive_methods }}</w:t>
+        <w:t xml:space="preserve"> используются следующие интерактивные методы обучения: </w:t>
+      </w:r>
+      <w:proofErr w:type="gramStart"/>
+      <w:r>
+        <w:rPr>
+          <w:rFonts w:ascii="Times New Roman" w:hAnsi="Times New Roman" w:cs="Times New Roman"/>
+          <w:sz w:val="24"/>
+          <w:szCs w:val="24"/>
+        </w:rPr>
+        <w:t>{{ interactive</w:t>
+      </w:r>
+      <w:proofErr w:type="gramEnd"/>
+      <w:r>
+        <w:rPr>
+          <w:rFonts w:ascii="Times New Roman" w:hAnsi="Times New Roman" w:cs="Times New Roman"/>
+          <w:sz w:val="24"/>
+          <w:szCs w:val="24"/>
+        </w:rPr>
+        <w:t>_</w:t>
+      </w:r>
+      <w:proofErr w:type="gramStart"/>
+      <w:r>
+        <w:rPr>
+          <w:rFonts w:ascii="Times New Roman" w:hAnsi="Times New Roman" w:cs="Times New Roman"/>
+          <w:sz w:val="24"/>
+          <w:szCs w:val="24"/>
+        </w:rPr>
+        <w:t>methods }</w:t>
+      </w:r>
+      <w:proofErr w:type="gramEnd"/>
+      <w:r>
+        <w:rPr>
+          <w:rFonts w:ascii="Times New Roman" w:hAnsi="Times New Roman" w:cs="Times New Roman"/>
+          <w:sz w:val="24"/>
+          <w:szCs w:val="24"/>
+        </w:rPr>
+        <w:t>}</w:t>
       </w:r>
     </w:p>
     <w:p>
@@ -10683,7 +11446,19 @@
           <w:szCs w:val="24"/>
           <w:lang w:val="en-US"/>
         </w:rPr>
-        <w:t>5.1.</w:t>
+        <w:t>5.</w:t>
+      </w:r>
+      <w:proofErr w:type="gramStart"/>
+      <w:r>
+        <w:rPr>
+          <w:rFonts w:ascii="Times New Roman" w:hAnsi="Times New Roman" w:cs="Times New Roman"/>
+          <w:b/>
+          <w:bCs/>
+          <w:sz w:val="24"/>
+          <w:szCs w:val="24"/>
+          <w:lang w:val="en-US"/>
+        </w:rPr>
+        <w:t>1.</w:t>
       </w:r>
       <w:r>
         <w:rPr>
@@ -10706,6 +11481,47 @@
         <w:rPr>
           <w:lang w:val="en-US"/>
         </w:rPr>
+        <w:t>i</w:t>
+      </w:r>
+      <w:proofErr w:type="gramEnd"/>
+      <w:r>
+        <w:rPr>
+          <w:lang w:val="en-US"/>
+        </w:rPr>
+        <w:t>.</w:t>
+      </w:r>
+      <w:r>
+        <w:rPr>
+          <w:rFonts w:ascii="Times New Roman" w:hAnsi="Times New Roman" w:cs="Times New Roman"/>
+          <w:b/>
+          <w:bCs/>
+          <w:sz w:val="24"/>
+          <w:szCs w:val="24"/>
+          <w:lang w:val="en-US"/>
+        </w:rPr>
+        <w:t>number</w:t>
+      </w:r>
+      <w:r>
+        <w:rPr>
+          <w:rFonts w:ascii="Times New Roman" w:hAnsi="Times New Roman" w:cs="Times New Roman"/>
+          <w:b/>
+          <w:bCs/>
+          <w:sz w:val="24"/>
+          <w:szCs w:val="24"/>
+          <w:lang w:val="en-US"/>
+        </w:rPr>
+        <w:t>}} {{</w:t>
+      </w:r>
+      <w:proofErr w:type="gramStart"/>
+      <w:r>
+        <w:rPr>
+          <w:rFonts w:ascii="Times New Roman" w:hAnsi="Times New Roman" w:cs="Times New Roman"/>
+          <w:b/>
+          <w:bCs/>
+          <w:sz w:val="24"/>
+          <w:szCs w:val="24"/>
+          <w:lang w:val="en-US"/>
+        </w:rPr>
         <w:t>i.</w:t>
       </w:r>
       <w:r>
@@ -10717,41 +11533,9 @@
           <w:szCs w:val="24"/>
           <w:lang w:val="en-US"/>
         </w:rPr>
-        <w:t>number</w:t>
-      </w:r>
-      <w:r>
-        <w:rPr>
-          <w:rFonts w:ascii="Times New Roman" w:hAnsi="Times New Roman" w:cs="Times New Roman"/>
-          <w:b/>
-          <w:bCs/>
-          <w:sz w:val="24"/>
-          <w:szCs w:val="24"/>
-          <w:lang w:val="en-US"/>
-        </w:rPr>
-        <w:t>}} {{</w:t>
-      </w:r>
-      <w:r>
-        <w:rPr>
-          <w:rFonts w:ascii="Times New Roman" w:hAnsi="Times New Roman" w:cs="Times New Roman"/>
-          <w:b/>
-          <w:bCs/>
-          <w:sz w:val="24"/>
-          <w:szCs w:val="24"/>
-          <w:lang w:val="en-US"/>
-        </w:rPr>
-        <w:t>i.</w:t>
-      </w:r>
-      <w:r>
-        <w:rPr>
-          <w:rFonts w:ascii="Times New Roman" w:hAnsi="Times New Roman" w:cs="Times New Roman"/>
-          <w:b/>
-          <w:bCs/>
-          <w:sz w:val="24"/>
-          <w:szCs w:val="24"/>
-          <w:lang w:val="en-US"/>
-        </w:rPr>
         <w:t>title</w:t>
       </w:r>
+      <w:proofErr w:type="gramEnd"/>
       <w:r>
         <w:rPr>
           <w:rFonts w:ascii="Times New Roman" w:hAnsi="Times New Roman" w:cs="Times New Roman"/>
@@ -10783,6 +11567,7 @@
         </w:rPr>
         <w:t>{{</w:t>
       </w:r>
+      <w:proofErr w:type="gramStart"/>
       <w:r>
         <w:rPr>
           <w:rFonts w:ascii="Times New Roman" w:hAnsi="Times New Roman" w:cs="Times New Roman"/>
@@ -10810,6 +11595,7 @@
         </w:rPr>
         <w:t>content</w:t>
       </w:r>
+      <w:proofErr w:type="gramEnd"/>
       <w:r>
         <w:rPr>
           <w:rFonts w:ascii="Times New Roman" w:hAnsi="Times New Roman" w:cs="Times New Roman"/>
@@ -11087,7 +11873,18 @@
           <w:szCs w:val="24"/>
         </w:rPr>
         <w:lastRenderedPageBreak/>
-        <w:t>6.1.{{</w:t>
+        <w:t>6.</w:t>
+      </w:r>
+      <w:proofErr w:type="gramStart"/>
+      <w:r>
+        <w:rPr>
+          <w:rFonts w:ascii="Times New Roman" w:hAnsi="Times New Roman" w:cs="Times New Roman"/>
+          <w:b/>
+          <w:bCs/>
+          <w:sz w:val="24"/>
+          <w:szCs w:val="24"/>
+        </w:rPr>
+        <w:t>1.{{</w:t>
       </w:r>
       <w:r>
         <w:t xml:space="preserve"> </w:t>
@@ -11098,6 +11895,7 @@
         </w:rPr>
         <w:t>i</w:t>
       </w:r>
+      <w:proofErr w:type="gramEnd"/>
       <w:r>
         <w:t>.</w:t>
       </w:r>
@@ -11122,6 +11920,7 @@
         </w:rPr>
         <w:t>}} {{</w:t>
       </w:r>
+      <w:proofErr w:type="gramStart"/>
       <w:r>
         <w:rPr>
           <w:rFonts w:ascii="Times New Roman" w:hAnsi="Times New Roman" w:cs="Times New Roman"/>
@@ -11154,6 +11953,7 @@
         </w:rPr>
         <w:t>title</w:t>
       </w:r>
+      <w:proofErr w:type="gramEnd"/>
       <w:r>
         <w:rPr>
           <w:rFonts w:ascii="Times New Roman" w:hAnsi="Times New Roman" w:cs="Times New Roman"/>
@@ -11207,6 +12007,7 @@
         </w:rPr>
         <w:t>{{</w:t>
       </w:r>
+      <w:proofErr w:type="gramStart"/>
       <w:r>
         <w:rPr>
           <w:rFonts w:ascii="Times New Roman" w:hAnsi="Times New Roman" w:cs="Times New Roman"/>
@@ -11233,6 +12034,7 @@
         </w:rPr>
         <w:t>about</w:t>
       </w:r>
+      <w:proofErr w:type="gramEnd"/>
       <w:r>
         <w:rPr>
           <w:rFonts w:ascii="Times New Roman" w:hAnsi="Times New Roman" w:cs="Times New Roman"/>
@@ -11283,6 +12085,7 @@
         </w:rPr>
         <w:t>{{</w:t>
       </w:r>
+      <w:proofErr w:type="gramStart"/>
       <w:r>
         <w:rPr>
           <w:rFonts w:ascii="Times New Roman" w:hAnsi="Times New Roman" w:cs="Times New Roman"/>
@@ -11309,6 +12112,7 @@
         </w:rPr>
         <w:t>criteria</w:t>
       </w:r>
+      <w:proofErr w:type="gramEnd"/>
       <w:r>
         <w:rPr>
           <w:rFonts w:ascii="Times New Roman" w:hAnsi="Times New Roman" w:cs="Times New Roman"/>
@@ -11632,6 +12436,7 @@
                 <w:lang w:val="en-US"/>
               </w:rPr>
             </w:pPr>
+            <w:proofErr w:type="gramStart"/>
             <w:r>
               <w:rPr>
                 <w:rFonts w:ascii="Times New Roman" w:hAnsi="Times New Roman" w:cs="Times New Roman"/>
@@ -11640,7 +12445,18 @@
                 <w:szCs w:val="24"/>
                 <w:lang w:val="en-US"/>
               </w:rPr>
-              <w:t>{{ i.index }}</w:t>
+              <w:t>{{ i</w:t>
+            </w:r>
+            <w:proofErr w:type="gramEnd"/>
+            <w:r>
+              <w:rPr>
+                <w:rFonts w:ascii="Times New Roman" w:hAnsi="Times New Roman" w:cs="Times New Roman"/>
+                <w:bCs/>
+                <w:sz w:val="24"/>
+                <w:szCs w:val="24"/>
+                <w:lang w:val="en-US"/>
+              </w:rPr>
+              <w:t>.index }}</w:t>
             </w:r>
           </w:p>
         </w:tc>
@@ -11667,7 +12483,29 @@
                 <w:szCs w:val="24"/>
                 <w:lang w:val="en-US"/>
               </w:rPr>
-              <w:t>{{i.criteria}}</w:t>
+              <w:t>{{</w:t>
+            </w:r>
+            <w:proofErr w:type="gramStart"/>
+            <w:r>
+              <w:rPr>
+                <w:rFonts w:ascii="Times New Roman" w:hAnsi="Times New Roman" w:cs="Times New Roman"/>
+                <w:bCs/>
+                <w:sz w:val="24"/>
+                <w:szCs w:val="24"/>
+                <w:lang w:val="en-US"/>
+              </w:rPr>
+              <w:t>i.criteria</w:t>
+            </w:r>
+            <w:proofErr w:type="gramEnd"/>
+            <w:r>
+              <w:rPr>
+                <w:rFonts w:ascii="Times New Roman" w:hAnsi="Times New Roman" w:cs="Times New Roman"/>
+                <w:bCs/>
+                <w:sz w:val="24"/>
+                <w:szCs w:val="24"/>
+                <w:lang w:val="en-US"/>
+              </w:rPr>
+              <w:t>}}</w:t>
             </w:r>
           </w:p>
         </w:tc>
@@ -11694,7 +12532,29 @@
                 <w:szCs w:val="24"/>
                 <w:lang w:val="en-US"/>
               </w:rPr>
-              <w:t>{{i.methods}}</w:t>
+              <w:t>{{</w:t>
+            </w:r>
+            <w:proofErr w:type="gramStart"/>
+            <w:r>
+              <w:rPr>
+                <w:rFonts w:ascii="Times New Roman" w:hAnsi="Times New Roman" w:cs="Times New Roman"/>
+                <w:bCs/>
+                <w:sz w:val="24"/>
+                <w:szCs w:val="24"/>
+                <w:lang w:val="en-US"/>
+              </w:rPr>
+              <w:t>i.methods</w:t>
+            </w:r>
+            <w:proofErr w:type="gramEnd"/>
+            <w:r>
+              <w:rPr>
+                <w:rFonts w:ascii="Times New Roman" w:hAnsi="Times New Roman" w:cs="Times New Roman"/>
+                <w:bCs/>
+                <w:sz w:val="24"/>
+                <w:szCs w:val="24"/>
+                <w:lang w:val="en-US"/>
+              </w:rPr>
+              <w:t>}}</w:t>
             </w:r>
           </w:p>
         </w:tc>
@@ -11917,8 +12777,33 @@
           <w:szCs w:val="24"/>
           <w:lang w:val="en-US"/>
         </w:rPr>
-        <w:t>6.2.2.{{</w:t>
-      </w:r>
+        <w:t>6.2.</w:t>
+      </w:r>
+      <w:proofErr w:type="gramStart"/>
+      <w:r>
+        <w:rPr>
+          <w:rFonts w:ascii="Times New Roman" w:hAnsi="Times New Roman" w:cs="Times New Roman"/>
+          <w:b/>
+          <w:bCs/>
+          <w:sz w:val="24"/>
+          <w:szCs w:val="24"/>
+          <w:lang w:val="en-US"/>
+        </w:rPr>
+        <w:t>2.{</w:t>
+      </w:r>
+      <w:proofErr w:type="gramEnd"/>
+      <w:r>
+        <w:rPr>
+          <w:rFonts w:ascii="Times New Roman" w:hAnsi="Times New Roman" w:cs="Times New Roman"/>
+          <w:b/>
+          <w:bCs/>
+          <w:sz w:val="24"/>
+          <w:szCs w:val="24"/>
+          <w:lang w:val="en-US"/>
+        </w:rPr>
+        <w:t>{</w:t>
+      </w:r>
+      <w:proofErr w:type="gramStart"/>
       <w:r>
         <w:rPr>
           <w:rFonts w:ascii="Times New Roman" w:hAnsi="Times New Roman" w:cs="Times New Roman"/>
@@ -11952,6 +12837,7 @@
         </w:rPr>
         <w:t>number</w:t>
       </w:r>
+      <w:proofErr w:type="gramEnd"/>
       <w:r>
         <w:rPr>
           <w:rFonts w:ascii="Times New Roman" w:hAnsi="Times New Roman" w:cs="Times New Roman"/>
@@ -11972,7 +12858,31 @@
           <w:szCs w:val="24"/>
           <w:lang w:val="en-US"/>
         </w:rPr>
-        <w:t>{{i.title}}</w:t>
+        <w:t>{{</w:t>
+      </w:r>
+      <w:proofErr w:type="gramStart"/>
+      <w:r>
+        <w:rPr>
+          <w:rFonts w:ascii="Times New Roman" w:hAnsi="Times New Roman" w:cs="Times New Roman"/>
+          <w:b/>
+          <w:bCs/>
+          <w:sz w:val="24"/>
+          <w:szCs w:val="24"/>
+          <w:lang w:val="en-US"/>
+        </w:rPr>
+        <w:t>i.title</w:t>
+      </w:r>
+      <w:proofErr w:type="gramEnd"/>
+      <w:r>
+        <w:rPr>
+          <w:rFonts w:ascii="Times New Roman" w:hAnsi="Times New Roman" w:cs="Times New Roman"/>
+          <w:b/>
+          <w:bCs/>
+          <w:sz w:val="24"/>
+          <w:szCs w:val="24"/>
+          <w:lang w:val="en-US"/>
+        </w:rPr>
+        <w:t>}}</w:t>
       </w:r>
     </w:p>
     <w:p>
@@ -11995,8 +12905,33 @@
           <w:szCs w:val="24"/>
           <w:lang w:val="en-US"/>
         </w:rPr>
-        <w:t>6.2.2.{{</w:t>
-      </w:r>
+        <w:t>6.2.</w:t>
+      </w:r>
+      <w:proofErr w:type="gramStart"/>
+      <w:r>
+        <w:rPr>
+          <w:rFonts w:ascii="Times New Roman" w:hAnsi="Times New Roman" w:cs="Times New Roman"/>
+          <w:b/>
+          <w:bCs/>
+          <w:sz w:val="24"/>
+          <w:szCs w:val="24"/>
+          <w:lang w:val="en-US"/>
+        </w:rPr>
+        <w:t>2.{</w:t>
+      </w:r>
+      <w:proofErr w:type="gramEnd"/>
+      <w:r>
+        <w:rPr>
+          <w:rFonts w:ascii="Times New Roman" w:hAnsi="Times New Roman" w:cs="Times New Roman"/>
+          <w:b/>
+          <w:bCs/>
+          <w:sz w:val="24"/>
+          <w:szCs w:val="24"/>
+          <w:lang w:val="en-US"/>
+        </w:rPr>
+        <w:t>{</w:t>
+      </w:r>
+      <w:proofErr w:type="gramStart"/>
       <w:r>
         <w:rPr>
           <w:rFonts w:ascii="Times New Roman" w:hAnsi="Times New Roman" w:cs="Times New Roman"/>
@@ -12030,6 +12965,7 @@
         </w:rPr>
         <w:t>number</w:t>
       </w:r>
+      <w:proofErr w:type="gramEnd"/>
       <w:r>
         <w:rPr>
           <w:rFonts w:ascii="Times New Roman" w:hAnsi="Times New Roman" w:cs="Times New Roman"/>
@@ -12106,6 +13042,7 @@
           <w:lang w:val="en-US"/>
         </w:rPr>
       </w:pPr>
+      <w:proofErr w:type="gramStart"/>
       <w:r>
         <w:rPr>
           <w:rFonts w:ascii="Times New Roman" w:hAnsi="Times New Roman" w:cs="Times New Roman"/>
@@ -12131,7 +13068,27 @@
           <w:szCs w:val="24"/>
           <w:lang w:val="en-US"/>
         </w:rPr>
-        <w:t>i.about</w:t>
+        <w:t>i</w:t>
+      </w:r>
+      <w:proofErr w:type="gramEnd"/>
+      <w:r>
+        <w:rPr>
+          <w:rFonts w:ascii="Times New Roman" w:hAnsi="Times New Roman" w:cs="Times New Roman"/>
+          <w:sz w:val="24"/>
+          <w:szCs w:val="24"/>
+          <w:lang w:val="en-US"/>
+        </w:rPr>
+        <w:t>.</w:t>
+      </w:r>
+      <w:proofErr w:type="gramStart"/>
+      <w:r>
+        <w:rPr>
+          <w:rFonts w:ascii="Times New Roman" w:hAnsi="Times New Roman" w:cs="Times New Roman"/>
+          <w:sz w:val="24"/>
+          <w:szCs w:val="24"/>
+          <w:lang w:val="en-US"/>
+        </w:rPr>
+        <w:t>about</w:t>
       </w:r>
       <w:r>
         <w:rPr>
@@ -12149,7 +13106,17 @@
           <w:szCs w:val="24"/>
           <w:lang w:val="en-US"/>
         </w:rPr>
-        <w:t>}}</w:t>
+        <w:t>}</w:t>
+      </w:r>
+      <w:proofErr w:type="gramEnd"/>
+      <w:r>
+        <w:rPr>
+          <w:rFonts w:ascii="Times New Roman" w:hAnsi="Times New Roman" w:cs="Times New Roman"/>
+          <w:sz w:val="24"/>
+          <w:szCs w:val="24"/>
+          <w:lang w:val="en-US"/>
+        </w:rPr>
+        <w:t>}</w:t>
       </w:r>
     </w:p>
     <w:p>
@@ -12226,6 +13193,7 @@
         </w:rPr>
         <w:t>.</w:t>
       </w:r>
+      <w:proofErr w:type="gramStart"/>
       <w:r>
         <w:rPr>
           <w:rFonts w:ascii="Times New Roman" w:hAnsi="Times New Roman" w:cs="Times New Roman"/>
@@ -12242,7 +13210,17 @@
           <w:szCs w:val="24"/>
           <w:lang w:val="en-US"/>
         </w:rPr>
-        <w:t xml:space="preserve"> != ‘’ %}</w:t>
+        <w:t xml:space="preserve"> !</w:t>
+      </w:r>
+      <w:proofErr w:type="gramEnd"/>
+      <w:r>
+        <w:rPr>
+          <w:rFonts w:ascii="Times New Roman" w:hAnsi="Times New Roman" w:cs="Times New Roman"/>
+          <w:sz w:val="24"/>
+          <w:szCs w:val="24"/>
+          <w:lang w:val="en-US"/>
+        </w:rPr>
+        <w:t>= ‘’ %}</w:t>
       </w:r>
     </w:p>
     <w:p>
@@ -12306,6 +13284,7 @@
           <w:lang w:val="en-US"/>
         </w:rPr>
       </w:pPr>
+      <w:proofErr w:type="gramStart"/>
       <w:r>
         <w:rPr>
           <w:rFonts w:ascii="Times New Roman" w:hAnsi="Times New Roman" w:cs="Times New Roman"/>
@@ -12324,6 +13303,7 @@
         </w:rPr>
         <w:t>i</w:t>
       </w:r>
+      <w:proofErr w:type="gramEnd"/>
       <w:r>
         <w:rPr>
           <w:rFonts w:ascii="Times New Roman" w:hAnsi="Times New Roman" w:cs="Times New Roman"/>
@@ -12333,6 +13313,7 @@
         </w:rPr>
         <w:t>.</w:t>
       </w:r>
+      <w:proofErr w:type="gramStart"/>
       <w:r>
         <w:rPr>
           <w:rFonts w:ascii="Times New Roman" w:hAnsi="Times New Roman" w:cs="Times New Roman"/>
@@ -12349,7 +13330,17 @@
           <w:szCs w:val="24"/>
           <w:lang w:val="en-US"/>
         </w:rPr>
-        <w:t xml:space="preserve"> }}</w:t>
+        <w:t xml:space="preserve"> }</w:t>
+      </w:r>
+      <w:proofErr w:type="gramEnd"/>
+      <w:r>
+        <w:rPr>
+          <w:rFonts w:ascii="Times New Roman" w:hAnsi="Times New Roman" w:cs="Times New Roman"/>
+          <w:sz w:val="24"/>
+          <w:szCs w:val="24"/>
+          <w:lang w:val="en-US"/>
+        </w:rPr>
+        <w:t>}</w:t>
       </w:r>
       <w:r>
         <w:rPr>
@@ -12437,6 +13428,7 @@
           <w:bCs/>
           <w:sz w:val="24"/>
           <w:szCs w:val="24"/>
+          <w:lang w:val="en-US"/>
         </w:rPr>
       </w:pPr>
       <w:r>
@@ -12446,9 +13438,35 @@
           <w:bCs/>
           <w:sz w:val="24"/>
           <w:szCs w:val="24"/>
-        </w:rPr>
-        <w:t>6.2.2.{{</w:t>
-      </w:r>
+          <w:lang w:val="en-US"/>
+        </w:rPr>
+        <w:t>6.2.</w:t>
+      </w:r>
+      <w:proofErr w:type="gramStart"/>
+      <w:r>
+        <w:rPr>
+          <w:rFonts w:ascii="Times New Roman" w:hAnsi="Times New Roman" w:cs="Times New Roman"/>
+          <w:b/>
+          <w:bCs/>
+          <w:sz w:val="24"/>
+          <w:szCs w:val="24"/>
+          <w:lang w:val="en-US"/>
+        </w:rPr>
+        <w:t>2.{</w:t>
+      </w:r>
+      <w:proofErr w:type="gramEnd"/>
+      <w:r>
+        <w:rPr>
+          <w:rFonts w:ascii="Times New Roman" w:hAnsi="Times New Roman" w:cs="Times New Roman"/>
+          <w:b/>
+          <w:bCs/>
+          <w:sz w:val="24"/>
+          <w:szCs w:val="24"/>
+          <w:lang w:val="en-US"/>
+        </w:rPr>
+        <w:t>{</w:t>
+      </w:r>
+      <w:proofErr w:type="gramStart"/>
       <w:r>
         <w:rPr>
           <w:rFonts w:ascii="Times New Roman" w:hAnsi="Times New Roman" w:cs="Times New Roman"/>
@@ -12467,6 +13485,7 @@
           <w:bCs/>
           <w:sz w:val="24"/>
           <w:szCs w:val="24"/>
+          <w:lang w:val="en-US"/>
         </w:rPr>
         <w:t>.</w:t>
       </w:r>
@@ -12481,13 +13500,15 @@
         </w:rPr>
         <w:t>number</w:t>
       </w:r>
-      <w:r>
-        <w:rPr>
-          <w:rFonts w:ascii="Times New Roman" w:hAnsi="Times New Roman" w:cs="Times New Roman"/>
-          <w:b/>
-          <w:bCs/>
-          <w:sz w:val="24"/>
-          <w:szCs w:val="24"/>
+      <w:proofErr w:type="gramEnd"/>
+      <w:r>
+        <w:rPr>
+          <w:rFonts w:ascii="Times New Roman" w:hAnsi="Times New Roman" w:cs="Times New Roman"/>
+          <w:b/>
+          <w:bCs/>
+          <w:sz w:val="24"/>
+          <w:szCs w:val="24"/>
+          <w:lang w:val="en-US"/>
         </w:rPr>
         <w:t xml:space="preserve">}}.2 </w:t>
       </w:r>
@@ -12508,6 +13529,7 @@
           <w:bCs/>
           <w:sz w:val="24"/>
           <w:szCs w:val="24"/>
+          <w:lang w:val="en-US"/>
         </w:rPr>
         <w:t xml:space="preserve"> </w:t>
       </w:r>
@@ -12532,6 +13554,7 @@
           <w:bCs/>
           <w:sz w:val="24"/>
           <w:szCs w:val="24"/>
+          <w:lang w:val="en-US"/>
         </w:rPr>
       </w:pPr>
       <w:r>
@@ -12540,6 +13563,7 @@
           <w:bCs/>
           <w:sz w:val="24"/>
           <w:szCs w:val="24"/>
+          <w:lang w:val="en-US"/>
         </w:rPr>
         <w:t>{%</w:t>
       </w:r>
@@ -12549,6 +13573,7 @@
           <w:bCs/>
           <w:sz w:val="24"/>
           <w:szCs w:val="24"/>
+          <w:lang w:val="en-US"/>
         </w:rPr>
         <w:t>-</w:t>
       </w:r>
@@ -12558,6 +13583,7 @@
           <w:bCs/>
           <w:sz w:val="24"/>
           <w:szCs w:val="24"/>
+          <w:lang w:val="en-US"/>
         </w:rPr>
         <w:t xml:space="preserve"> </w:t>
       </w:r>
@@ -12577,9 +13603,11 @@
           <w:bCs/>
           <w:sz w:val="24"/>
           <w:szCs w:val="24"/>
+          <w:lang w:val="en-US"/>
         </w:rPr>
         <w:t xml:space="preserve"> </w:t>
       </w:r>
+      <w:proofErr w:type="gramStart"/>
       <w:r>
         <w:rPr>
           <w:rFonts w:ascii="Times New Roman" w:hAnsi="Times New Roman" w:cs="Times New Roman"/>
@@ -12596,6 +13624,7 @@
           <w:bCs/>
           <w:sz w:val="24"/>
           <w:szCs w:val="24"/>
+          <w:lang w:val="en-US"/>
         </w:rPr>
         <w:t>.</w:t>
       </w:r>
@@ -12609,12 +13638,14 @@
         </w:rPr>
         <w:t>type</w:t>
       </w:r>
-      <w:r>
-        <w:rPr>
-          <w:rFonts w:ascii="Times New Roman" w:hAnsi="Times New Roman" w:cs="Times New Roman"/>
-          <w:bCs/>
-          <w:sz w:val="24"/>
-          <w:szCs w:val="24"/>
+      <w:proofErr w:type="gramEnd"/>
+      <w:r>
+        <w:rPr>
+          <w:rFonts w:ascii="Times New Roman" w:hAnsi="Times New Roman" w:cs="Times New Roman"/>
+          <w:bCs/>
+          <w:sz w:val="24"/>
+          <w:szCs w:val="24"/>
+          <w:lang w:val="en-US"/>
         </w:rPr>
         <w:t xml:space="preserve"> == ‘</w:t>
       </w:r>
@@ -12634,6 +13665,7 @@
           <w:bCs/>
           <w:sz w:val="24"/>
           <w:szCs w:val="24"/>
+          <w:lang w:val="en-US"/>
         </w:rPr>
         <w:t>’ %}</w:t>
       </w:r>
@@ -12742,7 +13774,27 @@
                 <w:sz w:val="24"/>
                 <w:lang w:val="en-US"/>
               </w:rPr>
-              <w:t>{{i.passed}}</w:t>
+              <w:t>{{</w:t>
+            </w:r>
+            <w:proofErr w:type="gramStart"/>
+            <w:r>
+              <w:rPr>
+                <w:rFonts w:ascii="Times New Roman" w:hAnsi="Times New Roman" w:cs="Times New Roman"/>
+                <w:bCs/>
+                <w:sz w:val="24"/>
+                <w:lang w:val="en-US"/>
+              </w:rPr>
+              <w:t>i.passed</w:t>
+            </w:r>
+            <w:proofErr w:type="gramEnd"/>
+            <w:r>
+              <w:rPr>
+                <w:rFonts w:ascii="Times New Roman" w:hAnsi="Times New Roman" w:cs="Times New Roman"/>
+                <w:bCs/>
+                <w:sz w:val="24"/>
+                <w:lang w:val="en-US"/>
+              </w:rPr>
+              <w:t>}}</w:t>
             </w:r>
           </w:p>
         </w:tc>
@@ -12768,7 +13820,27 @@
                 <w:sz w:val="24"/>
                 <w:lang w:val="en-US"/>
               </w:rPr>
-              <w:t>{{i.unpassed}}</w:t>
+              <w:t>{{</w:t>
+            </w:r>
+            <w:proofErr w:type="gramStart"/>
+            <w:r>
+              <w:rPr>
+                <w:rFonts w:ascii="Times New Roman" w:hAnsi="Times New Roman" w:cs="Times New Roman"/>
+                <w:bCs/>
+                <w:sz w:val="24"/>
+                <w:lang w:val="en-US"/>
+              </w:rPr>
+              <w:t>i.unpassed</w:t>
+            </w:r>
+            <w:proofErr w:type="gramEnd"/>
+            <w:r>
+              <w:rPr>
+                <w:rFonts w:ascii="Times New Roman" w:hAnsi="Times New Roman" w:cs="Times New Roman"/>
+                <w:bCs/>
+                <w:sz w:val="24"/>
+                <w:lang w:val="en-US"/>
+              </w:rPr>
+              <w:t>}}</w:t>
             </w:r>
           </w:p>
         </w:tc>
@@ -12936,7 +14008,27 @@
                 <w:sz w:val="24"/>
                 <w:lang w:val="en-US"/>
               </w:rPr>
-              <w:t>{{i.great}}</w:t>
+              <w:t>{{</w:t>
+            </w:r>
+            <w:proofErr w:type="gramStart"/>
+            <w:r>
+              <w:rPr>
+                <w:rFonts w:ascii="Times New Roman" w:hAnsi="Times New Roman" w:cs="Times New Roman"/>
+                <w:bCs/>
+                <w:sz w:val="24"/>
+                <w:lang w:val="en-US"/>
+              </w:rPr>
+              <w:t>i.great</w:t>
+            </w:r>
+            <w:proofErr w:type="gramEnd"/>
+            <w:r>
+              <w:rPr>
+                <w:rFonts w:ascii="Times New Roman" w:hAnsi="Times New Roman" w:cs="Times New Roman"/>
+                <w:bCs/>
+                <w:sz w:val="24"/>
+                <w:lang w:val="en-US"/>
+              </w:rPr>
+              <w:t>}}</w:t>
             </w:r>
           </w:p>
         </w:tc>
@@ -12962,7 +14054,27 @@
                 <w:sz w:val="24"/>
                 <w:lang w:val="en-US"/>
               </w:rPr>
-              <w:t>{{i.good}}</w:t>
+              <w:t>{{</w:t>
+            </w:r>
+            <w:proofErr w:type="gramStart"/>
+            <w:r>
+              <w:rPr>
+                <w:rFonts w:ascii="Times New Roman" w:hAnsi="Times New Roman" w:cs="Times New Roman"/>
+                <w:bCs/>
+                <w:sz w:val="24"/>
+                <w:lang w:val="en-US"/>
+              </w:rPr>
+              <w:t>i.good</w:t>
+            </w:r>
+            <w:proofErr w:type="gramEnd"/>
+            <w:r>
+              <w:rPr>
+                <w:rFonts w:ascii="Times New Roman" w:hAnsi="Times New Roman" w:cs="Times New Roman"/>
+                <w:bCs/>
+                <w:sz w:val="24"/>
+                <w:lang w:val="en-US"/>
+              </w:rPr>
+              <w:t>}}</w:t>
             </w:r>
           </w:p>
         </w:tc>
@@ -12988,8 +14100,9 @@
                 <w:sz w:val="24"/>
                 <w:lang w:val="en-US"/>
               </w:rPr>
-              <w:t>{{i.</w:t>
-            </w:r>
+              <w:t>{{</w:t>
+            </w:r>
+            <w:proofErr w:type="gramStart"/>
             <w:r>
               <w:rPr>
                 <w:rFonts w:ascii="Times New Roman" w:hAnsi="Times New Roman" w:cs="Times New Roman"/>
@@ -12997,8 +14110,18 @@
                 <w:sz w:val="24"/>
                 <w:lang w:val="en-US"/>
               </w:rPr>
+              <w:t>i.</w:t>
+            </w:r>
+            <w:r>
+              <w:rPr>
+                <w:rFonts w:ascii="Times New Roman" w:hAnsi="Times New Roman" w:cs="Times New Roman"/>
+                <w:bCs/>
+                <w:sz w:val="24"/>
+                <w:lang w:val="en-US"/>
+              </w:rPr>
               <w:t>satisfactorily</w:t>
             </w:r>
+            <w:proofErr w:type="gramEnd"/>
             <w:r>
               <w:rPr>
                 <w:rFonts w:ascii="Times New Roman" w:hAnsi="Times New Roman" w:cs="Times New Roman"/>
@@ -13032,8 +14155,9 @@
                 <w:sz w:val="24"/>
                 <w:lang w:val="en-US"/>
               </w:rPr>
-              <w:t>{{i.</w:t>
-            </w:r>
+              <w:t>{{</w:t>
+            </w:r>
+            <w:proofErr w:type="gramStart"/>
             <w:r>
               <w:rPr>
                 <w:rFonts w:ascii="Times New Roman" w:hAnsi="Times New Roman" w:cs="Times New Roman"/>
@@ -13041,8 +14165,18 @@
                 <w:sz w:val="24"/>
                 <w:lang w:val="en-US"/>
               </w:rPr>
+              <w:t>i.</w:t>
+            </w:r>
+            <w:r>
+              <w:rPr>
+                <w:rFonts w:ascii="Times New Roman" w:hAnsi="Times New Roman" w:cs="Times New Roman"/>
+                <w:bCs/>
+                <w:sz w:val="24"/>
+                <w:lang w:val="en-US"/>
+              </w:rPr>
               <w:t>unsatisfactory</w:t>
             </w:r>
+            <w:proofErr w:type="gramEnd"/>
             <w:r>
               <w:rPr>
                 <w:rFonts w:ascii="Times New Roman" w:hAnsi="Times New Roman" w:cs="Times New Roman"/>
@@ -13126,6 +14260,7 @@
           <w:bCs/>
           <w:sz w:val="24"/>
           <w:szCs w:val="24"/>
+          <w:lang w:val="en-US"/>
         </w:rPr>
         <w:t>-</w:t>
       </w:r>
@@ -13147,6 +14282,7 @@
           <w:bCs/>
           <w:sz w:val="24"/>
           <w:szCs w:val="24"/>
+          <w:lang w:val="en-US"/>
         </w:rPr>
         <w:t>-</w:t>
       </w:r>
@@ -13312,7 +14448,27 @@
           <w:szCs w:val="24"/>
           <w:lang w:val="en-US"/>
         </w:rPr>
-        <w:t>{{i.number}}</w:t>
+        <w:t>{{</w:t>
+      </w:r>
+      <w:proofErr w:type="gramStart"/>
+      <w:r>
+        <w:rPr>
+          <w:rFonts w:ascii="Times New Roman" w:hAnsi="Times New Roman" w:cs="Times New Roman"/>
+          <w:sz w:val="24"/>
+          <w:szCs w:val="24"/>
+          <w:lang w:val="en-US"/>
+        </w:rPr>
+        <w:t>i.number</w:t>
+      </w:r>
+      <w:proofErr w:type="gramEnd"/>
+      <w:r>
+        <w:rPr>
+          <w:rFonts w:ascii="Times New Roman" w:hAnsi="Times New Roman" w:cs="Times New Roman"/>
+          <w:sz w:val="24"/>
+          <w:szCs w:val="24"/>
+          <w:lang w:val="en-US"/>
+        </w:rPr>
+        <w:t>}}</w:t>
       </w:r>
       <w:r>
         <w:rPr>
@@ -13632,7 +14788,27 @@
           <w:szCs w:val="24"/>
           <w:lang w:val="en-US"/>
         </w:rPr>
-        <w:t>{{i.number}}</w:t>
+        <w:t>{{</w:t>
+      </w:r>
+      <w:proofErr w:type="gramStart"/>
+      <w:r>
+        <w:rPr>
+          <w:rFonts w:ascii="Times New Roman" w:hAnsi="Times New Roman" w:cs="Times New Roman"/>
+          <w:sz w:val="24"/>
+          <w:szCs w:val="24"/>
+          <w:lang w:val="en-US"/>
+        </w:rPr>
+        <w:t>i.number</w:t>
+      </w:r>
+      <w:proofErr w:type="gramEnd"/>
+      <w:r>
+        <w:rPr>
+          <w:rFonts w:ascii="Times New Roman" w:hAnsi="Times New Roman" w:cs="Times New Roman"/>
+          <w:sz w:val="24"/>
+          <w:szCs w:val="24"/>
+          <w:lang w:val="en-US"/>
+        </w:rPr>
+        <w:t>}}</w:t>
       </w:r>
       <w:r>
         <w:rPr>
@@ -13780,20 +14956,55 @@
     </w:p>
     <w:p>
       <w:pPr>
-        <w:spacing w:before="200" w:after="200" w:line="240" w:lineRule="auto"/>
-        <w:rPr>
-          <w:rFonts w:ascii="Times New Roman" w:hAnsi="Times New Roman" w:cs="Times New Roman"/>
-          <w:sz w:val="24"/>
-          <w:szCs w:val="24"/>
+        <w:spacing w:before="240" w:after="0" w:line="240" w:lineRule="auto"/>
+        <w:jc w:val="both"/>
+        <w:rPr>
+          <w:rFonts w:ascii="Times New Roman" w:hAnsi="Times New Roman" w:cs="Times New Roman"/>
+          <w:bCs/>
+          <w:sz w:val="24"/>
+          <w:szCs w:val="24"/>
+          <w:lang w:val="en-US"/>
         </w:rPr>
       </w:pPr>
       <w:r>
         <w:rPr>
           <w:rFonts w:ascii="Times New Roman" w:hAnsi="Times New Roman" w:cs="Times New Roman"/>
-          <w:sz w:val="24"/>
-          <w:szCs w:val="24"/>
-        </w:rPr>
-        <w:t xml:space="preserve">{{ </w:t>
+          <w:bCs/>
+          <w:sz w:val="24"/>
+          <w:szCs w:val="24"/>
+          <w:lang w:val="en-US"/>
+        </w:rPr>
+        <w:t xml:space="preserve">{% </w:t>
+      </w:r>
+      <w:r>
+        <w:rPr>
+          <w:rFonts w:ascii="Times New Roman" w:hAnsi="Times New Roman" w:cs="Times New Roman"/>
+          <w:bCs/>
+          <w:sz w:val="24"/>
+          <w:szCs w:val="24"/>
+          <w:lang w:val="en-US"/>
+        </w:rPr>
+        <w:t>if</w:t>
+      </w:r>
+      <w:r>
+        <w:rPr>
+          <w:rFonts w:ascii="Times New Roman" w:hAnsi="Times New Roman" w:cs="Times New Roman"/>
+          <w:bCs/>
+          <w:sz w:val="24"/>
+          <w:szCs w:val="24"/>
+          <w:lang w:val="en-US"/>
+        </w:rPr>
+        <w:t xml:space="preserve"> </w:t>
+      </w:r>
+      <w:r>
+        <w:rPr>
+          <w:rFonts w:ascii="Times New Roman" w:hAnsi="Times New Roman" w:cs="Times New Roman"/>
+          <w:bCs/>
+          <w:sz w:val="24"/>
+          <w:szCs w:val="24"/>
+          <w:lang w:val="en-US"/>
+        </w:rPr>
+        <w:t xml:space="preserve">not </w:t>
       </w:r>
       <w:r>
         <w:rPr>
@@ -13827,7 +15038,17 @@
           <w:sz w:val="24"/>
           <w:szCs w:val="24"/>
         </w:rPr>
-        <w:t xml:space="preserve"> }}</w:t>
+        <w:t xml:space="preserve"> </w:t>
+      </w:r>
+      <w:r>
+        <w:rPr>
+          <w:rFonts w:ascii="Times New Roman" w:hAnsi="Times New Roman" w:cs="Times New Roman"/>
+          <w:bCs/>
+          <w:sz w:val="24"/>
+          <w:szCs w:val="24"/>
+          <w:lang w:val="en-US"/>
+        </w:rPr>
+        <w:t>%}</w:t>
       </w:r>
     </w:p>
     <w:p>
@@ -13836,83 +15057,39 @@
         <w:jc w:val="both"/>
         <w:rPr>
           <w:rFonts w:ascii="Times New Roman" w:hAnsi="Times New Roman" w:cs="Times New Roman"/>
-          <w:b/>
-          <w:bCs/>
-          <w:sz w:val="24"/>
-          <w:szCs w:val="24"/>
+          <w:bCs/>
+          <w:sz w:val="24"/>
+          <w:szCs w:val="24"/>
+          <w:lang w:val="en-US"/>
         </w:rPr>
       </w:pPr>
       <w:r>
         <w:rPr>
           <w:rFonts w:ascii="Times New Roman" w:hAnsi="Times New Roman" w:cs="Times New Roman"/>
-          <w:b/>
-          <w:bCs/>
-          <w:sz w:val="24"/>
-          <w:szCs w:val="24"/>
-        </w:rPr>
-        <w:t xml:space="preserve">10 </w:t>
-      </w:r>
-      <w:r>
-        <w:rPr>
-          <w:rFonts w:ascii="Times New Roman" w:hAnsi="Times New Roman" w:cs="Times New Roman"/>
-          <w:b/>
-          <w:bCs/>
-          <w:sz w:val="24"/>
-          <w:szCs w:val="24"/>
-        </w:rPr>
-        <w:t>Профессиональные базы данных</w:t>
-      </w:r>
-    </w:p>
-    <w:p>
-      <w:pPr>
-        <w:spacing w:before="200" w:after="200" w:line="240" w:lineRule="auto"/>
-        <w:rPr>
-          <w:rFonts w:ascii="Times New Roman" w:hAnsi="Times New Roman" w:cs="Times New Roman"/>
-          <w:sz w:val="24"/>
-          <w:szCs w:val="24"/>
-        </w:rPr>
-      </w:pPr>
-      <w:r>
-        <w:rPr>
-          <w:rFonts w:ascii="Times New Roman" w:hAnsi="Times New Roman" w:cs="Times New Roman"/>
-          <w:sz w:val="24"/>
-          <w:szCs w:val="24"/>
-        </w:rPr>
-        <w:t xml:space="preserve">{{ </w:t>
-      </w:r>
-      <w:r>
-        <w:rPr>
-          <w:rFonts w:ascii="Times New Roman" w:hAnsi="Times New Roman" w:cs="Times New Roman"/>
-          <w:sz w:val="24"/>
-          <w:szCs w:val="24"/>
-          <w:lang w:val="en-US"/>
-        </w:rPr>
-        <w:t>resources</w:t>
-      </w:r>
-      <w:r>
-        <w:rPr>
-          <w:rFonts w:ascii="Times New Roman" w:hAnsi="Times New Roman" w:cs="Times New Roman"/>
-          <w:sz w:val="24"/>
-          <w:szCs w:val="24"/>
-        </w:rPr>
-        <w:t>.</w:t>
-      </w:r>
-      <w:r>
-        <w:rPr>
-          <w:rFonts w:ascii="Times New Roman" w:hAnsi="Times New Roman" w:cs="Times New Roman"/>
-          <w:sz w:val="24"/>
-          <w:szCs w:val="24"/>
-          <w:lang w:val="en-US"/>
-        </w:rPr>
-        <w:t>bd</w:t>
-      </w:r>
-      <w:r>
-        <w:rPr>
-          <w:rFonts w:ascii="Times New Roman" w:hAnsi="Times New Roman" w:cs="Times New Roman"/>
-          <w:sz w:val="24"/>
-          <w:szCs w:val="24"/>
-        </w:rPr>
-        <w:t xml:space="preserve"> }}</w:t>
+          <w:bCs/>
+          <w:sz w:val="24"/>
+          <w:szCs w:val="24"/>
+        </w:rPr>
+        <w:t>Не</w:t>
+      </w:r>
+      <w:r>
+        <w:rPr>
+          <w:rFonts w:ascii="Times New Roman" w:hAnsi="Times New Roman" w:cs="Times New Roman"/>
+          <w:bCs/>
+          <w:sz w:val="24"/>
+          <w:szCs w:val="24"/>
+          <w:lang w:val="en-US"/>
+        </w:rPr>
+        <w:t xml:space="preserve"> </w:t>
+      </w:r>
+      <w:r>
+        <w:rPr>
+          <w:rFonts w:ascii="Times New Roman" w:hAnsi="Times New Roman" w:cs="Times New Roman"/>
+          <w:bCs/>
+          <w:sz w:val="24"/>
+          <w:szCs w:val="24"/>
+        </w:rPr>
+        <w:t>используются</w:t>
       </w:r>
     </w:p>
     <w:p>
@@ -13921,31 +15098,95 @@
         <w:jc w:val="both"/>
         <w:rPr>
           <w:rFonts w:ascii="Times New Roman" w:hAnsi="Times New Roman" w:cs="Times New Roman"/>
-          <w:b/>
-          <w:bCs/>
-          <w:sz w:val="24"/>
-          <w:szCs w:val="24"/>
+          <w:bCs/>
+          <w:sz w:val="24"/>
+          <w:szCs w:val="24"/>
+          <w:lang w:val="en-US"/>
         </w:rPr>
       </w:pPr>
       <w:r>
         <w:rPr>
           <w:rFonts w:ascii="Times New Roman" w:hAnsi="Times New Roman" w:cs="Times New Roman"/>
-          <w:b/>
-          <w:bCs/>
-          <w:sz w:val="24"/>
-          <w:szCs w:val="24"/>
-        </w:rPr>
-        <w:t xml:space="preserve">11 </w:t>
-      </w:r>
-      <w:r>
-        <w:rPr>
-          <w:rFonts w:ascii="Times New Roman" w:hAnsi="Times New Roman" w:cs="Times New Roman"/>
-          <w:b/>
-          <w:bCs/>
-          <w:sz w:val="24"/>
-          <w:szCs w:val="24"/>
-        </w:rPr>
-        <w:t>Перечень информационных технологий, лицензионных и свободно распространяемых специализированных программных средств, информационных справочных систем</w:t>
+          <w:bCs/>
+          <w:sz w:val="24"/>
+          <w:szCs w:val="24"/>
+          <w:lang w:val="en-US"/>
+        </w:rPr>
+        <w:t xml:space="preserve">{% </w:t>
+      </w:r>
+      <w:r>
+        <w:rPr>
+          <w:rFonts w:ascii="Times New Roman" w:hAnsi="Times New Roman" w:cs="Times New Roman"/>
+          <w:bCs/>
+          <w:sz w:val="24"/>
+          <w:szCs w:val="24"/>
+          <w:lang w:val="en-US"/>
+        </w:rPr>
+        <w:t>endif</w:t>
+      </w:r>
+      <w:r>
+        <w:rPr>
+          <w:rFonts w:ascii="Times New Roman" w:hAnsi="Times New Roman" w:cs="Times New Roman"/>
+          <w:bCs/>
+          <w:sz w:val="24"/>
+          <w:szCs w:val="24"/>
+          <w:lang w:val="en-US"/>
+        </w:rPr>
+        <w:t xml:space="preserve"> %}</w:t>
+      </w:r>
+    </w:p>
+    <w:p>
+      <w:pPr>
+        <w:spacing w:before="200" w:after="200" w:line="240" w:lineRule="auto"/>
+        <w:rPr>
+          <w:rFonts w:ascii="Times New Roman" w:hAnsi="Times New Roman" w:cs="Times New Roman"/>
+          <w:sz w:val="24"/>
+          <w:szCs w:val="24"/>
+        </w:rPr>
+      </w:pPr>
+      <w:proofErr w:type="gramStart"/>
+      <w:r>
+        <w:rPr>
+          <w:rFonts w:ascii="Times New Roman" w:hAnsi="Times New Roman" w:cs="Times New Roman"/>
+          <w:sz w:val="24"/>
+          <w:szCs w:val="24"/>
+        </w:rPr>
+        <w:t xml:space="preserve">{{ </w:t>
+      </w:r>
+      <w:r>
+        <w:rPr>
+          <w:rFonts w:ascii="Times New Roman" w:hAnsi="Times New Roman" w:cs="Times New Roman"/>
+          <w:sz w:val="24"/>
+          <w:szCs w:val="24"/>
+          <w:lang w:val="en-US"/>
+        </w:rPr>
+        <w:t>resources</w:t>
+      </w:r>
+      <w:r>
+        <w:rPr>
+          <w:rFonts w:ascii="Times New Roman" w:hAnsi="Times New Roman" w:cs="Times New Roman"/>
+          <w:sz w:val="24"/>
+          <w:szCs w:val="24"/>
+        </w:rPr>
+        <w:t>.</w:t>
+      </w:r>
+      <w:r>
+        <w:rPr>
+          <w:rFonts w:ascii="Times New Roman" w:hAnsi="Times New Roman" w:cs="Times New Roman"/>
+          <w:sz w:val="24"/>
+          <w:szCs w:val="24"/>
+          <w:lang w:val="en-US"/>
+        </w:rPr>
+        <w:t>web</w:t>
+      </w:r>
+      <w:proofErr w:type="gramEnd"/>
+      <w:r>
+        <w:rPr>
+          <w:rFonts w:ascii="Times New Roman" w:hAnsi="Times New Roman" w:cs="Times New Roman"/>
+          <w:sz w:val="24"/>
+          <w:szCs w:val="24"/>
+        </w:rPr>
+        <w:t xml:space="preserve"> }}</w:t>
       </w:r>
     </w:p>
     <w:p>
@@ -13954,71 +15195,31 @@
         <w:jc w:val="both"/>
         <w:rPr>
           <w:rFonts w:ascii="Times New Roman" w:hAnsi="Times New Roman" w:cs="Times New Roman"/>
-          <w:bCs/>
-          <w:sz w:val="24"/>
-          <w:szCs w:val="24"/>
-          <w:lang w:val="en-US"/>
+          <w:b/>
+          <w:bCs/>
+          <w:sz w:val="24"/>
+          <w:szCs w:val="24"/>
         </w:rPr>
       </w:pPr>
       <w:r>
         <w:rPr>
           <w:rFonts w:ascii="Times New Roman" w:hAnsi="Times New Roman" w:cs="Times New Roman"/>
-          <w:bCs/>
-          <w:sz w:val="24"/>
-          <w:szCs w:val="24"/>
-          <w:lang w:val="en-US"/>
-        </w:rPr>
-        <w:t>{%</w:t>
-      </w:r>
-      <w:r>
-        <w:rPr>
-          <w:rFonts w:ascii="Times New Roman" w:hAnsi="Times New Roman" w:cs="Times New Roman"/>
-          <w:bCs/>
-          <w:sz w:val="24"/>
-          <w:szCs w:val="24"/>
-          <w:lang w:val="en-US"/>
-        </w:rPr>
-        <w:t>-</w:t>
-      </w:r>
-      <w:r>
-        <w:rPr>
-          <w:rFonts w:ascii="Times New Roman" w:hAnsi="Times New Roman" w:cs="Times New Roman"/>
-          <w:bCs/>
-          <w:sz w:val="24"/>
-          <w:szCs w:val="24"/>
-          <w:lang w:val="en-US"/>
-        </w:rPr>
-        <w:t xml:space="preserve"> </w:t>
-      </w:r>
-      <w:r>
-        <w:rPr>
-          <w:rFonts w:ascii="Times New Roman" w:hAnsi="Times New Roman" w:cs="Times New Roman"/>
-          <w:bCs/>
-          <w:sz w:val="24"/>
-          <w:szCs w:val="24"/>
-          <w:lang w:val="en-US"/>
-        </w:rPr>
-        <w:t xml:space="preserve">for i in </w:t>
-      </w:r>
-      <w:r>
-        <w:rPr>
-          <w:rFonts w:ascii="Times New Roman" w:hAnsi="Times New Roman" w:cs="Times New Roman"/>
-          <w:bCs/>
-          <w:sz w:val="24"/>
-          <w:szCs w:val="24"/>
-          <w:lang w:val="en-US"/>
-        </w:rPr>
-        <w:t>software</w:t>
-      </w:r>
-      <w:r>
-        <w:rPr>
-          <w:rFonts w:ascii="Times New Roman" w:hAnsi="Times New Roman" w:cs="Times New Roman"/>
-          <w:bCs/>
-          <w:sz w:val="24"/>
-          <w:szCs w:val="24"/>
-          <w:lang w:val="en-US"/>
-        </w:rPr>
-        <w:t xml:space="preserve"> %}</w:t>
+          <w:b/>
+          <w:bCs/>
+          <w:sz w:val="24"/>
+          <w:szCs w:val="24"/>
+        </w:rPr>
+        <w:t xml:space="preserve">10 </w:t>
+      </w:r>
+      <w:r>
+        <w:rPr>
+          <w:rFonts w:ascii="Times New Roman" w:hAnsi="Times New Roman" w:cs="Times New Roman"/>
+          <w:b/>
+          <w:bCs/>
+          <w:sz w:val="24"/>
+          <w:szCs w:val="24"/>
+        </w:rPr>
+        <w:t>Профессиональные базы данных</w:t>
       </w:r>
     </w:p>
     <w:p>
@@ -14041,57 +15242,73 @@
           <w:szCs w:val="24"/>
           <w:lang w:val="en-US"/>
         </w:rPr>
-        <w:t xml:space="preserve">{{i.number}}. </w:t>
-      </w:r>
-      <w:r>
-        <w:rPr>
-          <w:rFonts w:ascii="Times New Roman" w:hAnsi="Times New Roman" w:cs="Times New Roman"/>
-          <w:bCs/>
-          <w:sz w:val="24"/>
-          <w:szCs w:val="24"/>
-          <w:lang w:val="en-US"/>
-        </w:rPr>
-        <w:t>{{</w:t>
-      </w:r>
-      <w:r>
-        <w:rPr>
-          <w:rFonts w:ascii="Times New Roman" w:hAnsi="Times New Roman" w:cs="Times New Roman"/>
-          <w:bCs/>
-          <w:sz w:val="24"/>
-          <w:szCs w:val="24"/>
-          <w:lang w:val="en-US"/>
-        </w:rPr>
-        <w:t>i</w:t>
-      </w:r>
-      <w:r>
-        <w:rPr>
-          <w:rFonts w:ascii="Times New Roman" w:hAnsi="Times New Roman" w:cs="Times New Roman"/>
-          <w:bCs/>
-          <w:sz w:val="24"/>
-          <w:szCs w:val="24"/>
-          <w:lang w:val="en-US"/>
+        <w:t xml:space="preserve">{% </w:t>
+      </w:r>
+      <w:r>
+        <w:rPr>
+          <w:rFonts w:ascii="Times New Roman" w:hAnsi="Times New Roman" w:cs="Times New Roman"/>
+          <w:bCs/>
+          <w:sz w:val="24"/>
+          <w:szCs w:val="24"/>
+          <w:lang w:val="en-US"/>
+        </w:rPr>
+        <w:t>if</w:t>
+      </w:r>
+      <w:r>
+        <w:rPr>
+          <w:rFonts w:ascii="Times New Roman" w:hAnsi="Times New Roman" w:cs="Times New Roman"/>
+          <w:bCs/>
+          <w:sz w:val="24"/>
+          <w:szCs w:val="24"/>
+          <w:lang w:val="en-US"/>
+        </w:rPr>
+        <w:t xml:space="preserve"> </w:t>
+      </w:r>
+      <w:r>
+        <w:rPr>
+          <w:rFonts w:ascii="Times New Roman" w:hAnsi="Times New Roman" w:cs="Times New Roman"/>
+          <w:bCs/>
+          <w:sz w:val="24"/>
+          <w:szCs w:val="24"/>
+          <w:lang w:val="en-US"/>
+        </w:rPr>
+        <w:t xml:space="preserve">not </w:t>
+      </w:r>
+      <w:r>
+        <w:rPr>
+          <w:rFonts w:ascii="Times New Roman" w:hAnsi="Times New Roman" w:cs="Times New Roman"/>
+          <w:sz w:val="24"/>
+          <w:szCs w:val="24"/>
+          <w:lang w:val="en-US"/>
+        </w:rPr>
+        <w:t>resources</w:t>
+      </w:r>
+      <w:r>
+        <w:rPr>
+          <w:rFonts w:ascii="Times New Roman" w:hAnsi="Times New Roman" w:cs="Times New Roman"/>
+          <w:sz w:val="24"/>
+          <w:szCs w:val="24"/>
         </w:rPr>
         <w:t>.</w:t>
       </w:r>
       <w:r>
         <w:rPr>
           <w:rFonts w:ascii="Times New Roman" w:hAnsi="Times New Roman" w:cs="Times New Roman"/>
-          <w:bCs/>
-          <w:sz w:val="24"/>
-          <w:szCs w:val="24"/>
-          <w:lang w:val="en-US"/>
-        </w:rPr>
-        <w:t>content</w:t>
-      </w:r>
-      <w:r>
-        <w:rPr>
-          <w:rFonts w:ascii="Times New Roman" w:hAnsi="Times New Roman" w:cs="Times New Roman"/>
-          <w:bCs/>
-          <w:sz w:val="24"/>
-          <w:szCs w:val="24"/>
-          <w:lang w:val="en-US"/>
-        </w:rPr>
-        <w:t>}}</w:t>
+          <w:sz w:val="24"/>
+          <w:szCs w:val="24"/>
+          <w:lang w:val="en-US"/>
+        </w:rPr>
+        <w:t xml:space="preserve">bd </w:t>
+      </w:r>
+      <w:r>
+        <w:rPr>
+          <w:rFonts w:ascii="Times New Roman" w:hAnsi="Times New Roman" w:cs="Times New Roman"/>
+          <w:bCs/>
+          <w:sz w:val="24"/>
+          <w:szCs w:val="24"/>
+          <w:lang w:val="en-US"/>
+        </w:rPr>
+        <w:t>%}</w:t>
       </w:r>
     </w:p>
     <w:p>
@@ -14112,19 +15329,8 @@
           <w:bCs/>
           <w:sz w:val="24"/>
           <w:szCs w:val="24"/>
-          <w:lang w:val="en-US"/>
-        </w:rPr>
-        <w:t>{%</w:t>
-      </w:r>
-      <w:r>
-        <w:rPr>
-          <w:rFonts w:ascii="Times New Roman" w:hAnsi="Times New Roman" w:cs="Times New Roman"/>
-          <w:bCs/>
-          <w:sz w:val="24"/>
-          <w:szCs w:val="24"/>
-          <w:lang w:val="en-US"/>
-        </w:rPr>
-        <w:t>-</w:t>
+        </w:rPr>
+        <w:t>Не</w:t>
       </w:r>
       <w:r>
         <w:rPr>
@@ -14142,24 +15348,14 @@
           <w:bCs/>
           <w:sz w:val="24"/>
           <w:szCs w:val="24"/>
-          <w:lang w:val="en-US"/>
-        </w:rPr>
-        <w:t>endfor</w:t>
-      </w:r>
-      <w:r>
-        <w:rPr>
-          <w:rFonts w:ascii="Times New Roman" w:hAnsi="Times New Roman" w:cs="Times New Roman"/>
-          <w:bCs/>
-          <w:sz w:val="24"/>
-          <w:szCs w:val="24"/>
-          <w:lang w:val="en-US"/>
-        </w:rPr>
-        <w:t xml:space="preserve"> %}</w:t>
+        </w:rPr>
+        <w:t>используются</w:t>
       </w:r>
     </w:p>
     <w:p>
       <w:pPr>
         <w:spacing w:before="240" w:after="0" w:line="240" w:lineRule="auto"/>
+        <w:jc w:val="both"/>
         <w:rPr>
           <w:rFonts w:ascii="Times New Roman" w:hAnsi="Times New Roman" w:cs="Times New Roman"/>
           <w:bCs/>
@@ -14170,29 +15366,95 @@
       <w:r>
         <w:rPr>
           <w:rFonts w:ascii="Times New Roman" w:hAnsi="Times New Roman" w:cs="Times New Roman"/>
-          <w:b/>
-          <w:bCs/>
-          <w:sz w:val="24"/>
-          <w:szCs w:val="24"/>
-        </w:rPr>
-        <w:t xml:space="preserve">12 </w:t>
-      </w:r>
-      <w:r>
-        <w:rPr>
-          <w:rFonts w:ascii="Times New Roman" w:hAnsi="Times New Roman" w:cs="Times New Roman"/>
-          <w:b/>
-          <w:bCs/>
-          <w:sz w:val="24"/>
-          <w:szCs w:val="24"/>
-        </w:rPr>
-        <w:t>Материально-техническое обеспечение дисциплины</w:t>
+          <w:bCs/>
+          <w:sz w:val="24"/>
+          <w:szCs w:val="24"/>
+          <w:lang w:val="en-US"/>
+        </w:rPr>
+        <w:t xml:space="preserve">{% </w:t>
+      </w:r>
+      <w:r>
+        <w:rPr>
+          <w:rFonts w:ascii="Times New Roman" w:hAnsi="Times New Roman" w:cs="Times New Roman"/>
+          <w:bCs/>
+          <w:sz w:val="24"/>
+          <w:szCs w:val="24"/>
+          <w:lang w:val="en-US"/>
+        </w:rPr>
+        <w:t>endif</w:t>
+      </w:r>
+      <w:r>
+        <w:rPr>
+          <w:rFonts w:ascii="Times New Roman" w:hAnsi="Times New Roman" w:cs="Times New Roman"/>
+          <w:bCs/>
+          <w:sz w:val="24"/>
+          <w:szCs w:val="24"/>
+          <w:lang w:val="en-US"/>
+        </w:rPr>
+        <w:t xml:space="preserve"> %}</w:t>
+      </w:r>
+    </w:p>
+    <w:p>
+      <w:pPr>
+        <w:spacing w:before="200" w:after="200" w:line="240" w:lineRule="auto"/>
+        <w:rPr>
+          <w:rFonts w:ascii="Times New Roman" w:hAnsi="Times New Roman" w:cs="Times New Roman"/>
+          <w:sz w:val="24"/>
+          <w:szCs w:val="24"/>
+        </w:rPr>
+      </w:pPr>
+      <w:proofErr w:type="gramStart"/>
+      <w:r>
+        <w:rPr>
+          <w:rFonts w:ascii="Times New Roman" w:hAnsi="Times New Roman" w:cs="Times New Roman"/>
+          <w:sz w:val="24"/>
+          <w:szCs w:val="24"/>
+        </w:rPr>
+        <w:t xml:space="preserve">{{ </w:t>
+      </w:r>
+      <w:r>
+        <w:rPr>
+          <w:rFonts w:ascii="Times New Roman" w:hAnsi="Times New Roman" w:cs="Times New Roman"/>
+          <w:sz w:val="24"/>
+          <w:szCs w:val="24"/>
+          <w:lang w:val="en-US"/>
+        </w:rPr>
+        <w:t>resources</w:t>
+      </w:r>
+      <w:r>
+        <w:rPr>
+          <w:rFonts w:ascii="Times New Roman" w:hAnsi="Times New Roman" w:cs="Times New Roman"/>
+          <w:sz w:val="24"/>
+          <w:szCs w:val="24"/>
+        </w:rPr>
+        <w:t>.</w:t>
+      </w:r>
+      <w:r>
+        <w:rPr>
+          <w:rFonts w:ascii="Times New Roman" w:hAnsi="Times New Roman" w:cs="Times New Roman"/>
+          <w:sz w:val="24"/>
+          <w:szCs w:val="24"/>
+          <w:lang w:val="en-US"/>
+        </w:rPr>
+        <w:t>bd</w:t>
+      </w:r>
+      <w:proofErr w:type="gramEnd"/>
+      <w:r>
+        <w:rPr>
+          <w:rFonts w:ascii="Times New Roman" w:hAnsi="Times New Roman" w:cs="Times New Roman"/>
+          <w:sz w:val="24"/>
+          <w:szCs w:val="24"/>
+        </w:rPr>
+        <w:t xml:space="preserve"> }}</w:t>
       </w:r>
     </w:p>
     <w:p>
       <w:pPr>
         <w:spacing w:before="240" w:after="0" w:line="240" w:lineRule="auto"/>
-        <w:rPr>
-          <w:rFonts w:ascii="Times New Roman" w:hAnsi="Times New Roman" w:cs="Times New Roman"/>
+        <w:jc w:val="both"/>
+        <w:rPr>
+          <w:rFonts w:ascii="Times New Roman" w:hAnsi="Times New Roman" w:cs="Times New Roman"/>
+          <w:b/>
           <w:bCs/>
           <w:sz w:val="24"/>
           <w:szCs w:val="24"/>
@@ -14201,110 +15463,28 @@
       <w:r>
         <w:rPr>
           <w:rFonts w:ascii="Times New Roman" w:hAnsi="Times New Roman" w:cs="Times New Roman"/>
-          <w:bCs/>
-          <w:sz w:val="24"/>
-          <w:szCs w:val="24"/>
-        </w:rPr>
-        <w:t>{%</w:t>
-      </w:r>
-      <w:r>
-        <w:rPr>
-          <w:rFonts w:ascii="Times New Roman" w:hAnsi="Times New Roman" w:cs="Times New Roman"/>
-          <w:bCs/>
-          <w:sz w:val="24"/>
-          <w:szCs w:val="24"/>
-        </w:rPr>
-        <w:t>-</w:t>
-      </w:r>
-      <w:r>
-        <w:rPr>
-          <w:rFonts w:ascii="Times New Roman" w:hAnsi="Times New Roman" w:cs="Times New Roman"/>
-          <w:bCs/>
-          <w:sz w:val="24"/>
-          <w:szCs w:val="24"/>
-        </w:rPr>
-        <w:t xml:space="preserve"> </w:t>
-      </w:r>
-      <w:r>
-        <w:rPr>
-          <w:rFonts w:ascii="Times New Roman" w:hAnsi="Times New Roman" w:cs="Times New Roman"/>
-          <w:bCs/>
-          <w:sz w:val="24"/>
-          <w:szCs w:val="24"/>
-          <w:lang w:val="en-US"/>
-        </w:rPr>
-        <w:t>for</w:t>
-      </w:r>
-      <w:r>
-        <w:rPr>
-          <w:rFonts w:ascii="Times New Roman" w:hAnsi="Times New Roman" w:cs="Times New Roman"/>
-          <w:bCs/>
-          <w:sz w:val="24"/>
-          <w:szCs w:val="24"/>
-        </w:rPr>
-        <w:t xml:space="preserve"> </w:t>
-      </w:r>
-      <w:r>
-        <w:rPr>
-          <w:rFonts w:ascii="Times New Roman" w:hAnsi="Times New Roman" w:cs="Times New Roman"/>
-          <w:bCs/>
-          <w:sz w:val="24"/>
-          <w:szCs w:val="24"/>
-          <w:lang w:val="en-US"/>
-        </w:rPr>
-        <w:t>i</w:t>
-      </w:r>
-      <w:r>
-        <w:rPr>
-          <w:rFonts w:ascii="Times New Roman" w:hAnsi="Times New Roman" w:cs="Times New Roman"/>
-          <w:bCs/>
-          <w:sz w:val="24"/>
-          <w:szCs w:val="24"/>
-        </w:rPr>
-        <w:t xml:space="preserve"> </w:t>
-      </w:r>
-      <w:r>
-        <w:rPr>
-          <w:rFonts w:ascii="Times New Roman" w:hAnsi="Times New Roman" w:cs="Times New Roman"/>
-          <w:bCs/>
-          <w:sz w:val="24"/>
-          <w:szCs w:val="24"/>
-          <w:lang w:val="en-US"/>
-        </w:rPr>
-        <w:t>in</w:t>
-      </w:r>
-      <w:r>
-        <w:rPr>
-          <w:rFonts w:ascii="Times New Roman" w:hAnsi="Times New Roman" w:cs="Times New Roman"/>
-          <w:bCs/>
-          <w:sz w:val="24"/>
-          <w:szCs w:val="24"/>
-        </w:rPr>
-        <w:t xml:space="preserve"> </w:t>
-      </w:r>
-      <w:r>
-        <w:rPr>
-          <w:rFonts w:ascii="Times New Roman" w:hAnsi="Times New Roman" w:cs="Times New Roman"/>
-          <w:bCs/>
-          <w:sz w:val="24"/>
-          <w:szCs w:val="24"/>
-          <w:lang w:val="en-US"/>
-        </w:rPr>
-        <w:t>logistics</w:t>
-      </w:r>
-      <w:r>
-        <w:rPr>
-          <w:rFonts w:ascii="Times New Roman" w:hAnsi="Times New Roman" w:cs="Times New Roman"/>
-          <w:bCs/>
-          <w:sz w:val="24"/>
-          <w:szCs w:val="24"/>
-        </w:rPr>
-        <w:t xml:space="preserve"> %}</w:t>
+          <w:b/>
+          <w:bCs/>
+          <w:sz w:val="24"/>
+          <w:szCs w:val="24"/>
+        </w:rPr>
+        <w:t xml:space="preserve">11 </w:t>
+      </w:r>
+      <w:r>
+        <w:rPr>
+          <w:rFonts w:ascii="Times New Roman" w:hAnsi="Times New Roman" w:cs="Times New Roman"/>
+          <w:b/>
+          <w:bCs/>
+          <w:sz w:val="24"/>
+          <w:szCs w:val="24"/>
+        </w:rPr>
+        <w:t>Перечень информационных технологий, лицензионных и свободно распространяемых специализированных программных средств, информационных справочных систем</w:t>
       </w:r>
     </w:p>
     <w:p>
       <w:pPr>
         <w:spacing w:before="240" w:after="0" w:line="240" w:lineRule="auto"/>
+        <w:jc w:val="both"/>
         <w:rPr>
           <w:rFonts w:ascii="Times New Roman" w:hAnsi="Times New Roman" w:cs="Times New Roman"/>
           <w:bCs/>
@@ -14319,88 +15499,61 @@
           <w:sz w:val="24"/>
           <w:szCs w:val="24"/>
         </w:rPr>
-        <w:t>{{</w:t>
-      </w:r>
-      <w:r>
-        <w:rPr>
-          <w:rFonts w:ascii="Times New Roman" w:hAnsi="Times New Roman" w:cs="Times New Roman"/>
-          <w:bCs/>
-          <w:sz w:val="24"/>
-          <w:szCs w:val="24"/>
-          <w:lang w:val="en-US"/>
-        </w:rPr>
-        <w:t>i</w:t>
-      </w:r>
-      <w:r>
-        <w:rPr>
-          <w:rFonts w:ascii="Times New Roman" w:hAnsi="Times New Roman" w:cs="Times New Roman"/>
-          <w:bCs/>
-          <w:sz w:val="24"/>
-          <w:szCs w:val="24"/>
-        </w:rPr>
-        <w:t>.</w:t>
-      </w:r>
-      <w:r>
-        <w:rPr>
-          <w:rFonts w:ascii="Times New Roman" w:hAnsi="Times New Roman" w:cs="Times New Roman"/>
-          <w:bCs/>
-          <w:sz w:val="24"/>
-          <w:szCs w:val="24"/>
-          <w:lang w:val="en-US"/>
-        </w:rPr>
-        <w:t>number</w:t>
-      </w:r>
-      <w:r>
-        <w:rPr>
-          <w:rFonts w:ascii="Times New Roman" w:hAnsi="Times New Roman" w:cs="Times New Roman"/>
-          <w:bCs/>
-          <w:sz w:val="24"/>
-          <w:szCs w:val="24"/>
-        </w:rPr>
-        <w:t>}}. {{</w:t>
-      </w:r>
-      <w:r>
-        <w:rPr>
-          <w:rFonts w:ascii="Times New Roman" w:hAnsi="Times New Roman" w:cs="Times New Roman"/>
-          <w:bCs/>
-          <w:sz w:val="24"/>
-          <w:szCs w:val="24"/>
-          <w:lang w:val="en-US"/>
-        </w:rPr>
-        <w:t>i</w:t>
-      </w:r>
-      <w:r>
-        <w:rPr>
-          <w:rFonts w:ascii="Times New Roman" w:hAnsi="Times New Roman" w:cs="Times New Roman"/>
-          <w:bCs/>
-          <w:sz w:val="24"/>
-          <w:szCs w:val="24"/>
-        </w:rPr>
-        <w:t>.</w:t>
-      </w:r>
-      <w:r>
-        <w:rPr>
-          <w:rFonts w:ascii="Times New Roman" w:hAnsi="Times New Roman" w:cs="Times New Roman"/>
-          <w:bCs/>
-          <w:sz w:val="24"/>
-          <w:szCs w:val="24"/>
-          <w:lang w:val="en-US"/>
-        </w:rPr>
-        <w:t>name</w:t>
-      </w:r>
-      <w:r>
-        <w:rPr>
-          <w:rFonts w:ascii="Times New Roman" w:hAnsi="Times New Roman" w:cs="Times New Roman"/>
-          <w:bCs/>
-          <w:sz w:val="24"/>
-          <w:szCs w:val="24"/>
-        </w:rPr>
-        <w:t>}}</w:t>
+        <w:t xml:space="preserve">{% </w:t>
+      </w:r>
+      <w:r>
+        <w:rPr>
+          <w:rFonts w:ascii="Times New Roman" w:hAnsi="Times New Roman" w:cs="Times New Roman"/>
+          <w:bCs/>
+          <w:sz w:val="24"/>
+          <w:szCs w:val="24"/>
+          <w:lang w:val="en-US"/>
+        </w:rPr>
+        <w:t>if</w:t>
+      </w:r>
+      <w:r>
+        <w:rPr>
+          <w:rFonts w:ascii="Times New Roman" w:hAnsi="Times New Roman" w:cs="Times New Roman"/>
+          <w:bCs/>
+          <w:sz w:val="24"/>
+          <w:szCs w:val="24"/>
+        </w:rPr>
+        <w:t xml:space="preserve"> </w:t>
+      </w:r>
+      <w:r>
+        <w:rPr>
+          <w:rFonts w:ascii="Times New Roman" w:hAnsi="Times New Roman" w:cs="Times New Roman"/>
+          <w:bCs/>
+          <w:sz w:val="24"/>
+          <w:szCs w:val="24"/>
+          <w:lang w:val="en-US"/>
+        </w:rPr>
+        <w:t xml:space="preserve">not </w:t>
+      </w:r>
+      <w:r>
+        <w:rPr>
+          <w:rFonts w:ascii="Times New Roman" w:hAnsi="Times New Roman" w:cs="Times New Roman"/>
+          <w:bCs/>
+          <w:sz w:val="24"/>
+          <w:szCs w:val="24"/>
+          <w:lang w:val="en-US"/>
+        </w:rPr>
+        <w:t>software</w:t>
+      </w:r>
+      <w:r>
+        <w:rPr>
+          <w:rFonts w:ascii="Times New Roman" w:hAnsi="Times New Roman" w:cs="Times New Roman"/>
+          <w:bCs/>
+          <w:sz w:val="24"/>
+          <w:szCs w:val="24"/>
+        </w:rPr>
+        <w:t xml:space="preserve"> %}</w:t>
       </w:r>
     </w:p>
     <w:p>
       <w:pPr>
         <w:spacing w:before="240" w:after="0" w:line="240" w:lineRule="auto"/>
+        <w:jc w:val="both"/>
         <w:rPr>
           <w:rFonts w:ascii="Times New Roman" w:hAnsi="Times New Roman" w:cs="Times New Roman"/>
           <w:bCs/>
@@ -14415,6 +15568,69 @@
           <w:sz w:val="24"/>
           <w:szCs w:val="24"/>
         </w:rPr>
+        <w:t>Не используются</w:t>
+      </w:r>
+    </w:p>
+    <w:p>
+      <w:pPr>
+        <w:spacing w:before="240" w:after="0" w:line="240" w:lineRule="auto"/>
+        <w:jc w:val="both"/>
+        <w:rPr>
+          <w:rFonts w:ascii="Times New Roman" w:hAnsi="Times New Roman" w:cs="Times New Roman"/>
+          <w:bCs/>
+          <w:sz w:val="24"/>
+          <w:szCs w:val="24"/>
+        </w:rPr>
+      </w:pPr>
+      <w:r>
+        <w:rPr>
+          <w:rFonts w:ascii="Times New Roman" w:hAnsi="Times New Roman" w:cs="Times New Roman"/>
+          <w:bCs/>
+          <w:sz w:val="24"/>
+          <w:szCs w:val="24"/>
+        </w:rPr>
+        <w:t xml:space="preserve">{% </w:t>
+      </w:r>
+      <w:r>
+        <w:rPr>
+          <w:rFonts w:ascii="Times New Roman" w:hAnsi="Times New Roman" w:cs="Times New Roman"/>
+          <w:bCs/>
+          <w:sz w:val="24"/>
+          <w:szCs w:val="24"/>
+          <w:lang w:val="en-US"/>
+        </w:rPr>
+        <w:t>endif</w:t>
+      </w:r>
+      <w:r>
+        <w:rPr>
+          <w:rFonts w:ascii="Times New Roman" w:hAnsi="Times New Roman" w:cs="Times New Roman"/>
+          <w:bCs/>
+          <w:sz w:val="24"/>
+          <w:szCs w:val="24"/>
+        </w:rPr>
+        <w:t xml:space="preserve"> %}</w:t>
+      </w:r>
+    </w:p>
+    <w:p>
+      <w:pPr>
+        <w:spacing w:before="240" w:after="0" w:line="240" w:lineRule="auto"/>
+        <w:jc w:val="both"/>
+        <w:rPr>
+          <w:rFonts w:ascii="Times New Roman" w:hAnsi="Times New Roman" w:cs="Times New Roman"/>
+          <w:bCs/>
+          <w:sz w:val="24"/>
+          <w:szCs w:val="24"/>
+          <w:lang w:val="en-US"/>
+        </w:rPr>
+      </w:pPr>
+      <w:r>
+        <w:rPr>
+          <w:rFonts w:ascii="Times New Roman" w:hAnsi="Times New Roman" w:cs="Times New Roman"/>
+          <w:bCs/>
+          <w:sz w:val="24"/>
+          <w:szCs w:val="24"/>
+          <w:lang w:val="en-US"/>
+        </w:rPr>
         <w:t>{%</w:t>
       </w:r>
       <w:r>
@@ -14423,6 +15639,7 @@
           <w:bCs/>
           <w:sz w:val="24"/>
           <w:szCs w:val="24"/>
+          <w:lang w:val="en-US"/>
         </w:rPr>
         <w:t>-</w:t>
       </w:r>
@@ -14432,6 +15649,7 @@
           <w:bCs/>
           <w:sz w:val="24"/>
           <w:szCs w:val="24"/>
+          <w:lang w:val="en-US"/>
         </w:rPr>
         <w:t xml:space="preserve"> </w:t>
       </w:r>
@@ -14443,6 +15661,176 @@
           <w:szCs w:val="24"/>
           <w:lang w:val="en-US"/>
         </w:rPr>
+        <w:t xml:space="preserve">for i in </w:t>
+      </w:r>
+      <w:r>
+        <w:rPr>
+          <w:rFonts w:ascii="Times New Roman" w:hAnsi="Times New Roman" w:cs="Times New Roman"/>
+          <w:bCs/>
+          <w:sz w:val="24"/>
+          <w:szCs w:val="24"/>
+          <w:lang w:val="en-US"/>
+        </w:rPr>
+        <w:t>software</w:t>
+      </w:r>
+      <w:r>
+        <w:rPr>
+          <w:rFonts w:ascii="Times New Roman" w:hAnsi="Times New Roman" w:cs="Times New Roman"/>
+          <w:bCs/>
+          <w:sz w:val="24"/>
+          <w:szCs w:val="24"/>
+          <w:lang w:val="en-US"/>
+        </w:rPr>
+        <w:t xml:space="preserve"> %}</w:t>
+      </w:r>
+    </w:p>
+    <w:p>
+      <w:pPr>
+        <w:spacing w:before="240" w:after="0" w:line="240" w:lineRule="auto"/>
+        <w:jc w:val="both"/>
+        <w:rPr>
+          <w:rFonts w:ascii="Times New Roman" w:hAnsi="Times New Roman" w:cs="Times New Roman"/>
+          <w:bCs/>
+          <w:sz w:val="24"/>
+          <w:szCs w:val="24"/>
+          <w:lang w:val="en-US"/>
+        </w:rPr>
+      </w:pPr>
+      <w:r>
+        <w:rPr>
+          <w:rFonts w:ascii="Times New Roman" w:hAnsi="Times New Roman" w:cs="Times New Roman"/>
+          <w:bCs/>
+          <w:sz w:val="24"/>
+          <w:szCs w:val="24"/>
+          <w:lang w:val="en-US"/>
+        </w:rPr>
+        <w:t>{{</w:t>
+      </w:r>
+      <w:proofErr w:type="gramStart"/>
+      <w:r>
+        <w:rPr>
+          <w:rFonts w:ascii="Times New Roman" w:hAnsi="Times New Roman" w:cs="Times New Roman"/>
+          <w:bCs/>
+          <w:sz w:val="24"/>
+          <w:szCs w:val="24"/>
+          <w:lang w:val="en-US"/>
+        </w:rPr>
+        <w:t>i.number</w:t>
+      </w:r>
+      <w:proofErr w:type="gramEnd"/>
+      <w:r>
+        <w:rPr>
+          <w:rFonts w:ascii="Times New Roman" w:hAnsi="Times New Roman" w:cs="Times New Roman"/>
+          <w:bCs/>
+          <w:sz w:val="24"/>
+          <w:szCs w:val="24"/>
+          <w:lang w:val="en-US"/>
+        </w:rPr>
+        <w:t xml:space="preserve">}}. </w:t>
+      </w:r>
+      <w:r>
+        <w:rPr>
+          <w:rFonts w:ascii="Times New Roman" w:hAnsi="Times New Roman" w:cs="Times New Roman"/>
+          <w:bCs/>
+          <w:sz w:val="24"/>
+          <w:szCs w:val="24"/>
+          <w:lang w:val="en-US"/>
+        </w:rPr>
+        <w:t>{{</w:t>
+      </w:r>
+      <w:proofErr w:type="gramStart"/>
+      <w:r>
+        <w:rPr>
+          <w:rFonts w:ascii="Times New Roman" w:hAnsi="Times New Roman" w:cs="Times New Roman"/>
+          <w:bCs/>
+          <w:sz w:val="24"/>
+          <w:szCs w:val="24"/>
+          <w:lang w:val="en-US"/>
+        </w:rPr>
+        <w:t>i</w:t>
+      </w:r>
+      <w:r>
+        <w:rPr>
+          <w:rFonts w:ascii="Times New Roman" w:hAnsi="Times New Roman" w:cs="Times New Roman"/>
+          <w:bCs/>
+          <w:sz w:val="24"/>
+          <w:szCs w:val="24"/>
+          <w:lang w:val="en-US"/>
+        </w:rPr>
+        <w:t>.</w:t>
+      </w:r>
+      <w:r>
+        <w:rPr>
+          <w:rFonts w:ascii="Times New Roman" w:hAnsi="Times New Roman" w:cs="Times New Roman"/>
+          <w:bCs/>
+          <w:sz w:val="24"/>
+          <w:szCs w:val="24"/>
+          <w:lang w:val="en-US"/>
+        </w:rPr>
+        <w:t>content</w:t>
+      </w:r>
+      <w:proofErr w:type="gramEnd"/>
+      <w:r>
+        <w:rPr>
+          <w:rFonts w:ascii="Times New Roman" w:hAnsi="Times New Roman" w:cs="Times New Roman"/>
+          <w:bCs/>
+          <w:sz w:val="24"/>
+          <w:szCs w:val="24"/>
+          <w:lang w:val="en-US"/>
+        </w:rPr>
+        <w:t>}}</w:t>
+      </w:r>
+    </w:p>
+    <w:p>
+      <w:pPr>
+        <w:spacing w:before="240" w:after="0" w:line="240" w:lineRule="auto"/>
+        <w:jc w:val="both"/>
+        <w:rPr>
+          <w:rFonts w:ascii="Times New Roman" w:hAnsi="Times New Roman" w:cs="Times New Roman"/>
+          <w:bCs/>
+          <w:sz w:val="24"/>
+          <w:szCs w:val="24"/>
+          <w:lang w:val="en-US"/>
+        </w:rPr>
+      </w:pPr>
+      <w:r>
+        <w:rPr>
+          <w:rFonts w:ascii="Times New Roman" w:hAnsi="Times New Roman" w:cs="Times New Roman"/>
+          <w:bCs/>
+          <w:sz w:val="24"/>
+          <w:szCs w:val="24"/>
+          <w:lang w:val="en-US"/>
+        </w:rPr>
+        <w:t>{%</w:t>
+      </w:r>
+      <w:r>
+        <w:rPr>
+          <w:rFonts w:ascii="Times New Roman" w:hAnsi="Times New Roman" w:cs="Times New Roman"/>
+          <w:bCs/>
+          <w:sz w:val="24"/>
+          <w:szCs w:val="24"/>
+          <w:lang w:val="en-US"/>
+        </w:rPr>
+        <w:t>-</w:t>
+      </w:r>
+      <w:r>
+        <w:rPr>
+          <w:rFonts w:ascii="Times New Roman" w:hAnsi="Times New Roman" w:cs="Times New Roman"/>
+          <w:bCs/>
+          <w:sz w:val="24"/>
+          <w:szCs w:val="24"/>
+          <w:lang w:val="en-US"/>
+        </w:rPr>
+        <w:t xml:space="preserve"> </w:t>
+      </w:r>
+      <w:r>
+        <w:rPr>
+          <w:rFonts w:ascii="Times New Roman" w:hAnsi="Times New Roman" w:cs="Times New Roman"/>
+          <w:bCs/>
+          <w:sz w:val="24"/>
+          <w:szCs w:val="24"/>
+          <w:lang w:val="en-US"/>
+        </w:rPr>
         <w:t>endfor</w:t>
       </w:r>
       <w:r>
@@ -14451,6 +15839,499 @@
           <w:bCs/>
           <w:sz w:val="24"/>
           <w:szCs w:val="24"/>
+          <w:lang w:val="en-US"/>
+        </w:rPr>
+        <w:t xml:space="preserve"> %}</w:t>
+      </w:r>
+    </w:p>
+    <w:p>
+      <w:pPr>
+        <w:spacing w:before="240" w:after="0" w:line="240" w:lineRule="auto"/>
+        <w:rPr>
+          <w:rFonts w:ascii="Times New Roman" w:hAnsi="Times New Roman" w:cs="Times New Roman"/>
+          <w:bCs/>
+          <w:sz w:val="24"/>
+          <w:szCs w:val="24"/>
+        </w:rPr>
+      </w:pPr>
+      <w:r>
+        <w:rPr>
+          <w:rFonts w:ascii="Times New Roman" w:hAnsi="Times New Roman" w:cs="Times New Roman"/>
+          <w:b/>
+          <w:bCs/>
+          <w:sz w:val="24"/>
+          <w:szCs w:val="24"/>
+        </w:rPr>
+        <w:t xml:space="preserve">12 </w:t>
+      </w:r>
+      <w:r>
+        <w:rPr>
+          <w:rFonts w:ascii="Times New Roman" w:hAnsi="Times New Roman" w:cs="Times New Roman"/>
+          <w:b/>
+          <w:bCs/>
+          <w:sz w:val="24"/>
+          <w:szCs w:val="24"/>
+        </w:rPr>
+        <w:t>Материально-техническое обеспечение дисциплины</w:t>
+      </w:r>
+    </w:p>
+    <w:p>
+      <w:pPr>
+        <w:spacing w:before="240" w:after="0" w:line="240" w:lineRule="auto"/>
+        <w:jc w:val="both"/>
+        <w:rPr>
+          <w:rFonts w:ascii="Times New Roman" w:hAnsi="Times New Roman" w:cs="Times New Roman"/>
+          <w:bCs/>
+          <w:sz w:val="24"/>
+          <w:szCs w:val="24"/>
+        </w:rPr>
+      </w:pPr>
+      <w:r>
+        <w:rPr>
+          <w:rFonts w:ascii="Times New Roman" w:hAnsi="Times New Roman" w:cs="Times New Roman"/>
+          <w:bCs/>
+          <w:sz w:val="24"/>
+          <w:szCs w:val="24"/>
+        </w:rPr>
+        <w:t xml:space="preserve">{% </w:t>
+      </w:r>
+      <w:r>
+        <w:rPr>
+          <w:rFonts w:ascii="Times New Roman" w:hAnsi="Times New Roman" w:cs="Times New Roman"/>
+          <w:bCs/>
+          <w:sz w:val="24"/>
+          <w:szCs w:val="24"/>
+          <w:lang w:val="en-US"/>
+        </w:rPr>
+        <w:t>if</w:t>
+      </w:r>
+      <w:r>
+        <w:rPr>
+          <w:rFonts w:ascii="Times New Roman" w:hAnsi="Times New Roman" w:cs="Times New Roman"/>
+          <w:bCs/>
+          <w:sz w:val="24"/>
+          <w:szCs w:val="24"/>
+        </w:rPr>
+        <w:t xml:space="preserve"> </w:t>
+      </w:r>
+      <w:r>
+        <w:rPr>
+          <w:rFonts w:ascii="Times New Roman" w:hAnsi="Times New Roman" w:cs="Times New Roman"/>
+          <w:bCs/>
+          <w:sz w:val="24"/>
+          <w:szCs w:val="24"/>
+          <w:lang w:val="en-US"/>
+        </w:rPr>
+        <w:t>not</w:t>
+      </w:r>
+      <w:r>
+        <w:rPr>
+          <w:rFonts w:ascii="Times New Roman" w:hAnsi="Times New Roman" w:cs="Times New Roman"/>
+          <w:bCs/>
+          <w:sz w:val="24"/>
+          <w:szCs w:val="24"/>
+        </w:rPr>
+        <w:t xml:space="preserve"> </w:t>
+      </w:r>
+      <w:r>
+        <w:rPr>
+          <w:rFonts w:ascii="Times New Roman" w:hAnsi="Times New Roman" w:cs="Times New Roman"/>
+          <w:bCs/>
+          <w:sz w:val="24"/>
+          <w:szCs w:val="24"/>
+          <w:lang w:val="en-US"/>
+        </w:rPr>
+        <w:t>logistics</w:t>
+      </w:r>
+      <w:r>
+        <w:rPr>
+          <w:rFonts w:ascii="Times New Roman" w:hAnsi="Times New Roman" w:cs="Times New Roman"/>
+          <w:bCs/>
+          <w:sz w:val="24"/>
+          <w:szCs w:val="24"/>
+        </w:rPr>
+        <w:t>%}</w:t>
+      </w:r>
+    </w:p>
+    <w:p>
+      <w:pPr>
+        <w:spacing w:before="240" w:after="0" w:line="240" w:lineRule="auto"/>
+        <w:jc w:val="both"/>
+        <w:rPr>
+          <w:rFonts w:ascii="Times New Roman" w:hAnsi="Times New Roman" w:cs="Times New Roman"/>
+          <w:bCs/>
+          <w:sz w:val="24"/>
+          <w:szCs w:val="24"/>
+          <w:lang w:val="en-US"/>
+        </w:rPr>
+      </w:pPr>
+      <w:r>
+        <w:rPr>
+          <w:rFonts w:ascii="Times New Roman" w:hAnsi="Times New Roman" w:cs="Times New Roman"/>
+          <w:bCs/>
+          <w:sz w:val="24"/>
+          <w:szCs w:val="24"/>
+        </w:rPr>
+        <w:lastRenderedPageBreak/>
+        <w:t>Не</w:t>
+      </w:r>
+      <w:r>
+        <w:rPr>
+          <w:rFonts w:ascii="Times New Roman" w:hAnsi="Times New Roman" w:cs="Times New Roman"/>
+          <w:bCs/>
+          <w:sz w:val="24"/>
+          <w:szCs w:val="24"/>
+          <w:lang w:val="en-US"/>
+        </w:rPr>
+        <w:t xml:space="preserve"> </w:t>
+      </w:r>
+      <w:r>
+        <w:rPr>
+          <w:rFonts w:ascii="Times New Roman" w:hAnsi="Times New Roman" w:cs="Times New Roman"/>
+          <w:bCs/>
+          <w:sz w:val="24"/>
+          <w:szCs w:val="24"/>
+        </w:rPr>
+        <w:t>используются</w:t>
+      </w:r>
+    </w:p>
+    <w:p>
+      <w:pPr>
+        <w:spacing w:before="240" w:after="0" w:line="240" w:lineRule="auto"/>
+        <w:jc w:val="both"/>
+        <w:rPr>
+          <w:rFonts w:ascii="Times New Roman" w:hAnsi="Times New Roman" w:cs="Times New Roman"/>
+          <w:bCs/>
+          <w:sz w:val="24"/>
+          <w:szCs w:val="24"/>
+          <w:lang w:val="en-US"/>
+        </w:rPr>
+      </w:pPr>
+      <w:r>
+        <w:rPr>
+          <w:rFonts w:ascii="Times New Roman" w:hAnsi="Times New Roman" w:cs="Times New Roman"/>
+          <w:bCs/>
+          <w:sz w:val="24"/>
+          <w:szCs w:val="24"/>
+          <w:lang w:val="en-US"/>
+        </w:rPr>
+        <w:t xml:space="preserve">{% </w:t>
+      </w:r>
+      <w:r>
+        <w:rPr>
+          <w:rFonts w:ascii="Times New Roman" w:hAnsi="Times New Roman" w:cs="Times New Roman"/>
+          <w:bCs/>
+          <w:sz w:val="24"/>
+          <w:szCs w:val="24"/>
+          <w:lang w:val="en-US"/>
+        </w:rPr>
+        <w:t>endif</w:t>
+      </w:r>
+      <w:r>
+        <w:rPr>
+          <w:rFonts w:ascii="Times New Roman" w:hAnsi="Times New Roman" w:cs="Times New Roman"/>
+          <w:bCs/>
+          <w:sz w:val="24"/>
+          <w:szCs w:val="24"/>
+          <w:lang w:val="en-US"/>
+        </w:rPr>
+        <w:t xml:space="preserve"> %}</w:t>
+      </w:r>
+    </w:p>
+    <w:p>
+      <w:pPr>
+        <w:spacing w:before="240" w:after="0" w:line="240" w:lineRule="auto"/>
+        <w:rPr>
+          <w:rFonts w:ascii="Times New Roman" w:hAnsi="Times New Roman" w:cs="Times New Roman"/>
+          <w:bCs/>
+          <w:sz w:val="24"/>
+          <w:szCs w:val="24"/>
+          <w:lang w:val="en-US"/>
+        </w:rPr>
+      </w:pPr>
+      <w:r>
+        <w:rPr>
+          <w:rFonts w:ascii="Times New Roman" w:hAnsi="Times New Roman" w:cs="Times New Roman"/>
+          <w:bCs/>
+          <w:sz w:val="24"/>
+          <w:szCs w:val="24"/>
+          <w:lang w:val="en-US"/>
+        </w:rPr>
+        <w:t>{%</w:t>
+      </w:r>
+      <w:r>
+        <w:rPr>
+          <w:rFonts w:ascii="Times New Roman" w:hAnsi="Times New Roman" w:cs="Times New Roman"/>
+          <w:bCs/>
+          <w:sz w:val="24"/>
+          <w:szCs w:val="24"/>
+          <w:lang w:val="en-US"/>
+        </w:rPr>
+        <w:t>-</w:t>
+      </w:r>
+      <w:r>
+        <w:rPr>
+          <w:rFonts w:ascii="Times New Roman" w:hAnsi="Times New Roman" w:cs="Times New Roman"/>
+          <w:bCs/>
+          <w:sz w:val="24"/>
+          <w:szCs w:val="24"/>
+          <w:lang w:val="en-US"/>
+        </w:rPr>
+        <w:t xml:space="preserve"> </w:t>
+      </w:r>
+      <w:r>
+        <w:rPr>
+          <w:rFonts w:ascii="Times New Roman" w:hAnsi="Times New Roman" w:cs="Times New Roman"/>
+          <w:bCs/>
+          <w:sz w:val="24"/>
+          <w:szCs w:val="24"/>
+          <w:lang w:val="en-US"/>
+        </w:rPr>
+        <w:t>for</w:t>
+      </w:r>
+      <w:r>
+        <w:rPr>
+          <w:rFonts w:ascii="Times New Roman" w:hAnsi="Times New Roman" w:cs="Times New Roman"/>
+          <w:bCs/>
+          <w:sz w:val="24"/>
+          <w:szCs w:val="24"/>
+          <w:lang w:val="en-US"/>
+        </w:rPr>
+        <w:t xml:space="preserve"> </w:t>
+      </w:r>
+      <w:r>
+        <w:rPr>
+          <w:rFonts w:ascii="Times New Roman" w:hAnsi="Times New Roman" w:cs="Times New Roman"/>
+          <w:bCs/>
+          <w:sz w:val="24"/>
+          <w:szCs w:val="24"/>
+          <w:lang w:val="en-US"/>
+        </w:rPr>
+        <w:t>i</w:t>
+      </w:r>
+      <w:r>
+        <w:rPr>
+          <w:rFonts w:ascii="Times New Roman" w:hAnsi="Times New Roman" w:cs="Times New Roman"/>
+          <w:bCs/>
+          <w:sz w:val="24"/>
+          <w:szCs w:val="24"/>
+          <w:lang w:val="en-US"/>
+        </w:rPr>
+        <w:t xml:space="preserve"> </w:t>
+      </w:r>
+      <w:r>
+        <w:rPr>
+          <w:rFonts w:ascii="Times New Roman" w:hAnsi="Times New Roman" w:cs="Times New Roman"/>
+          <w:bCs/>
+          <w:sz w:val="24"/>
+          <w:szCs w:val="24"/>
+          <w:lang w:val="en-US"/>
+        </w:rPr>
+        <w:t>in</w:t>
+      </w:r>
+      <w:r>
+        <w:rPr>
+          <w:rFonts w:ascii="Times New Roman" w:hAnsi="Times New Roman" w:cs="Times New Roman"/>
+          <w:bCs/>
+          <w:sz w:val="24"/>
+          <w:szCs w:val="24"/>
+          <w:lang w:val="en-US"/>
+        </w:rPr>
+        <w:t xml:space="preserve"> </w:t>
+      </w:r>
+      <w:r>
+        <w:rPr>
+          <w:rFonts w:ascii="Times New Roman" w:hAnsi="Times New Roman" w:cs="Times New Roman"/>
+          <w:bCs/>
+          <w:sz w:val="24"/>
+          <w:szCs w:val="24"/>
+          <w:lang w:val="en-US"/>
+        </w:rPr>
+        <w:t>logistics</w:t>
+      </w:r>
+      <w:r>
+        <w:rPr>
+          <w:rFonts w:ascii="Times New Roman" w:hAnsi="Times New Roman" w:cs="Times New Roman"/>
+          <w:bCs/>
+          <w:sz w:val="24"/>
+          <w:szCs w:val="24"/>
+          <w:lang w:val="en-US"/>
+        </w:rPr>
+        <w:t xml:space="preserve"> %}</w:t>
+      </w:r>
+    </w:p>
+    <w:p>
+      <w:pPr>
+        <w:spacing w:before="240" w:after="0" w:line="240" w:lineRule="auto"/>
+        <w:rPr>
+          <w:rFonts w:ascii="Times New Roman" w:hAnsi="Times New Roman" w:cs="Times New Roman"/>
+          <w:bCs/>
+          <w:sz w:val="24"/>
+          <w:szCs w:val="24"/>
+          <w:lang w:val="en-US"/>
+        </w:rPr>
+      </w:pPr>
+      <w:r>
+        <w:rPr>
+          <w:rFonts w:ascii="Times New Roman" w:hAnsi="Times New Roman" w:cs="Times New Roman"/>
+          <w:bCs/>
+          <w:sz w:val="24"/>
+          <w:szCs w:val="24"/>
+          <w:lang w:val="en-US"/>
+        </w:rPr>
+        <w:t>{{</w:t>
+      </w:r>
+      <w:proofErr w:type="gramStart"/>
+      <w:r>
+        <w:rPr>
+          <w:rFonts w:ascii="Times New Roman" w:hAnsi="Times New Roman" w:cs="Times New Roman"/>
+          <w:bCs/>
+          <w:sz w:val="24"/>
+          <w:szCs w:val="24"/>
+          <w:lang w:val="en-US"/>
+        </w:rPr>
+        <w:t>i</w:t>
+      </w:r>
+      <w:r>
+        <w:rPr>
+          <w:rFonts w:ascii="Times New Roman" w:hAnsi="Times New Roman" w:cs="Times New Roman"/>
+          <w:bCs/>
+          <w:sz w:val="24"/>
+          <w:szCs w:val="24"/>
+          <w:lang w:val="en-US"/>
+        </w:rPr>
+        <w:t>.</w:t>
+      </w:r>
+      <w:r>
+        <w:rPr>
+          <w:rFonts w:ascii="Times New Roman" w:hAnsi="Times New Roman" w:cs="Times New Roman"/>
+          <w:bCs/>
+          <w:sz w:val="24"/>
+          <w:szCs w:val="24"/>
+          <w:lang w:val="en-US"/>
+        </w:rPr>
+        <w:t>number</w:t>
+      </w:r>
+      <w:proofErr w:type="gramEnd"/>
+      <w:r>
+        <w:rPr>
+          <w:rFonts w:ascii="Times New Roman" w:hAnsi="Times New Roman" w:cs="Times New Roman"/>
+          <w:bCs/>
+          <w:sz w:val="24"/>
+          <w:szCs w:val="24"/>
+          <w:lang w:val="en-US"/>
+        </w:rPr>
+        <w:t xml:space="preserve">}}. </w:t>
+      </w:r>
+      <w:r>
+        <w:rPr>
+          <w:rFonts w:ascii="Times New Roman" w:hAnsi="Times New Roman" w:cs="Times New Roman"/>
+          <w:bCs/>
+          <w:sz w:val="24"/>
+          <w:szCs w:val="24"/>
+          <w:lang w:val="en-US"/>
+        </w:rPr>
+        <w:t>{{</w:t>
+      </w:r>
+      <w:r>
+        <w:rPr>
+          <w:rFonts w:ascii="Times New Roman" w:hAnsi="Times New Roman" w:cs="Times New Roman"/>
+          <w:bCs/>
+          <w:sz w:val="24"/>
+          <w:szCs w:val="24"/>
+          <w:lang w:val="en-US"/>
+        </w:rPr>
+        <w:t>i</w:t>
+      </w:r>
+      <w:r>
+        <w:rPr>
+          <w:rFonts w:ascii="Times New Roman" w:hAnsi="Times New Roman" w:cs="Times New Roman"/>
+          <w:bCs/>
+          <w:sz w:val="24"/>
+          <w:szCs w:val="24"/>
+          <w:lang w:val="en-US"/>
+        </w:rPr>
+        <w:t>.</w:t>
+      </w:r>
+      <w:r>
+        <w:rPr>
+          <w:rFonts w:ascii="Times New Roman" w:hAnsi="Times New Roman" w:cs="Times New Roman"/>
+          <w:bCs/>
+          <w:sz w:val="24"/>
+          <w:szCs w:val="24"/>
+          <w:lang w:val="en-US"/>
+        </w:rPr>
+        <w:t>name</w:t>
+      </w:r>
+      <w:r>
+        <w:rPr>
+          <w:rFonts w:ascii="Times New Roman" w:hAnsi="Times New Roman" w:cs="Times New Roman"/>
+          <w:bCs/>
+          <w:sz w:val="24"/>
+          <w:szCs w:val="24"/>
+          <w:lang w:val="en-US"/>
+        </w:rPr>
+        <w:t>}}</w:t>
+      </w:r>
+    </w:p>
+    <w:p>
+      <w:pPr>
+        <w:spacing w:before="240" w:after="0" w:line="240" w:lineRule="auto"/>
+        <w:rPr>
+          <w:rFonts w:ascii="Times New Roman" w:hAnsi="Times New Roman" w:cs="Times New Roman"/>
+          <w:bCs/>
+          <w:sz w:val="24"/>
+          <w:szCs w:val="24"/>
+          <w:lang w:val="en-US"/>
+        </w:rPr>
+      </w:pPr>
+      <w:r>
+        <w:rPr>
+          <w:rFonts w:ascii="Times New Roman" w:hAnsi="Times New Roman" w:cs="Times New Roman"/>
+          <w:bCs/>
+          <w:sz w:val="24"/>
+          <w:szCs w:val="24"/>
+          <w:lang w:val="en-US"/>
+        </w:rPr>
+        <w:t>{%</w:t>
+      </w:r>
+      <w:r>
+        <w:rPr>
+          <w:rFonts w:ascii="Times New Roman" w:hAnsi="Times New Roman" w:cs="Times New Roman"/>
+          <w:bCs/>
+          <w:sz w:val="24"/>
+          <w:szCs w:val="24"/>
+          <w:lang w:val="en-US"/>
+        </w:rPr>
+        <w:t>-</w:t>
+      </w:r>
+      <w:r>
+        <w:rPr>
+          <w:rFonts w:ascii="Times New Roman" w:hAnsi="Times New Roman" w:cs="Times New Roman"/>
+          <w:bCs/>
+          <w:sz w:val="24"/>
+          <w:szCs w:val="24"/>
+          <w:lang w:val="en-US"/>
+        </w:rPr>
+        <w:t xml:space="preserve"> </w:t>
+      </w:r>
+      <w:r>
+        <w:rPr>
+          <w:rFonts w:ascii="Times New Roman" w:hAnsi="Times New Roman" w:cs="Times New Roman"/>
+          <w:bCs/>
+          <w:sz w:val="24"/>
+          <w:szCs w:val="24"/>
+          <w:lang w:val="en-US"/>
+        </w:rPr>
+        <w:t>endfor</w:t>
+      </w:r>
+      <w:r>
+        <w:rPr>
+          <w:rFonts w:ascii="Times New Roman" w:hAnsi="Times New Roman" w:cs="Times New Roman"/>
+          <w:bCs/>
+          <w:sz w:val="24"/>
+          <w:szCs w:val="24"/>
+          <w:lang w:val="en-US"/>
         </w:rPr>
         <w:t xml:space="preserve"> %}</w:t>
       </w:r>
@@ -14577,7 +16458,16 @@
         <w:color w:val="000000" w:themeColor="text1"/>
         <w:sz w:val="24"/>
       </w:rPr>
-      <w:t xml:space="preserve">Год набора – {{ </w:t>
+      <w:t xml:space="preserve">Год набора – </w:t>
+    </w:r>
+    <w:proofErr w:type="gramStart"/>
+    <w:r>
+      <w:rPr>
+        <w:rFonts w:ascii="Times New Roman" w:hAnsi="Times New Roman" w:cs="Times New Roman"/>
+        <w:color w:val="000000" w:themeColor="text1"/>
+        <w:sz w:val="24"/>
+      </w:rPr>
+      <w:t xml:space="preserve">{{ </w:t>
     </w:r>
     <w:r>
       <w:rPr>
@@ -14588,6 +16478,7 @@
       </w:rPr>
       <w:t>year</w:t>
     </w:r>
+    <w:proofErr w:type="gramEnd"/>
     <w:r>
       <w:rPr>
         <w:rFonts w:ascii="Times New Roman" w:hAnsi="Times New Roman" w:cs="Times New Roman"/>
@@ -14596,6 +16487,7 @@
       </w:rPr>
       <w:t>_</w:t>
     </w:r>
+    <w:proofErr w:type="gramStart"/>
     <w:r>
       <w:rPr>
         <w:rFonts w:ascii="Times New Roman" w:hAnsi="Times New Roman" w:cs="Times New Roman"/>
@@ -14611,7 +16503,16 @@
         <w:color w:val="000000" w:themeColor="text1"/>
         <w:sz w:val="24"/>
       </w:rPr>
-      <w:t xml:space="preserve"> }}</w:t>
+      <w:t xml:space="preserve"> }</w:t>
+    </w:r>
+    <w:proofErr w:type="gramEnd"/>
+    <w:r>
+      <w:rPr>
+        <w:rFonts w:ascii="Times New Roman" w:hAnsi="Times New Roman" w:cs="Times New Roman"/>
+        <w:color w:val="000000" w:themeColor="text1"/>
+        <w:sz w:val="24"/>
+      </w:rPr>
+      <w:t>}</w:t>
     </w:r>
   </w:p>
   <w:p>
@@ -14633,6 +16534,7 @@
       </w:rPr>
       <w:t xml:space="preserve">Иркутск, </w:t>
     </w:r>
+    <w:proofErr w:type="gramStart"/>
     <w:r>
       <w:rPr>
         <w:rFonts w:ascii="Times New Roman" w:hAnsi="Times New Roman" w:cs="Times New Roman"/>
@@ -14640,7 +16542,37 @@
         <w:sz w:val="24"/>
         <w:lang w:val="en-US"/>
       </w:rPr>
-      <w:t>{{ protocol_year }}</w:t>
+      <w:t>{{ protocol</w:t>
+    </w:r>
+    <w:proofErr w:type="gramEnd"/>
+    <w:r>
+      <w:rPr>
+        <w:rFonts w:ascii="Times New Roman" w:hAnsi="Times New Roman" w:cs="Times New Roman"/>
+        <w:color w:val="000000" w:themeColor="text1"/>
+        <w:sz w:val="24"/>
+        <w:lang w:val="en-US"/>
+      </w:rPr>
+      <w:t>_</w:t>
+    </w:r>
+    <w:proofErr w:type="gramStart"/>
+    <w:r>
+      <w:rPr>
+        <w:rFonts w:ascii="Times New Roman" w:hAnsi="Times New Roman" w:cs="Times New Roman"/>
+        <w:color w:val="000000" w:themeColor="text1"/>
+        <w:sz w:val="24"/>
+        <w:lang w:val="en-US"/>
+      </w:rPr>
+      <w:t>year }</w:t>
+    </w:r>
+    <w:proofErr w:type="gramEnd"/>
+    <w:r>
+      <w:rPr>
+        <w:rFonts w:ascii="Times New Roman" w:hAnsi="Times New Roman" w:cs="Times New Roman"/>
+        <w:color w:val="000000" w:themeColor="text1"/>
+        <w:sz w:val="24"/>
+        <w:lang w:val="en-US"/>
+      </w:rPr>
+      <w:t>}</w:t>
     </w:r>
     <w:r>
       <w:rPr>
@@ -15077,7 +17009,7 @@
   <w:style w:type="paragraph" w:default="1" w:styleId="a">
     <w:name w:val="Normal"/>
     <w:qFormat/>
-    <w:rsid w:val="00826B62"/>
+    <w:rsid w:val="00D955DC"/>
   </w:style>
   <w:style w:type="character" w:default="1" w:styleId="a0">
     <w:name w:val="Default Paragraph Font"/>

</xml_diff>

<commit_message>
Add confirm user and date and update rpd
</commit_message>
<xml_diff>
--- a/templates/docxRPD/rpd.docx
+++ b/templates/docxRPD/rpd.docx
@@ -1,6 +1,6 @@
 
 <file path=word/document.xml><?xml version="1.0" encoding="utf-8"?>
-<w:document xmlns:wpc="http://schemas.microsoft.com/office/word/2010/wordprocessingCanvas" xmlns:mc="http://schemas.openxmlformats.org/markup-compatibility/2006" xmlns:o="urn:schemas-microsoft-com:office:office" xmlns:r="http://schemas.openxmlformats.org/officeDocument/2006/relationships" xmlns:m="http://schemas.openxmlformats.org/officeDocument/2006/math" xmlns:v="urn:schemas-microsoft-com:vml" xmlns:wp14="http://schemas.microsoft.com/office/word/2010/wordprocessingDrawing" xmlns:wp="http://schemas.openxmlformats.org/drawingml/2006/wordprocessingDrawing" xmlns:w10="urn:schemas-microsoft-com:office:word" xmlns:w="http://schemas.openxmlformats.org/wordprocessingml/2006/main" xmlns:w14="http://schemas.microsoft.com/office/word/2010/wordml" xmlns:w15="http://schemas.microsoft.com/office/word/2012/wordml" xmlns:wpg="http://schemas.microsoft.com/office/word/2010/wordprocessingGroup" xmlns:wpi="http://schemas.microsoft.com/office/word/2010/wordprocessingInk" xmlns:wne="http://schemas.microsoft.com/office/word/2006/wordml" xmlns:wps="http://schemas.microsoft.com/office/word/2010/wordprocessingShape" mc:Ignorable="w14 w15 wp14">
+<w:document xmlns:wpc="http://schemas.microsoft.com/office/word/2010/wordprocessingCanvas" xmlns:cx="http://schemas.microsoft.com/office/drawing/2014/chartex" xmlns:cx1="http://schemas.microsoft.com/office/drawing/2015/9/8/chartex" xmlns:mc="http://schemas.openxmlformats.org/markup-compatibility/2006" xmlns:o="urn:schemas-microsoft-com:office:office" xmlns:r="http://schemas.openxmlformats.org/officeDocument/2006/relationships" xmlns:m="http://schemas.openxmlformats.org/officeDocument/2006/math" xmlns:v="urn:schemas-microsoft-com:vml" xmlns:wp14="http://schemas.microsoft.com/office/word/2010/wordprocessingDrawing" xmlns:wp="http://schemas.openxmlformats.org/drawingml/2006/wordprocessingDrawing" xmlns:w10="urn:schemas-microsoft-com:office:word" xmlns:w="http://schemas.openxmlformats.org/wordprocessingml/2006/main" xmlns:w14="http://schemas.microsoft.com/office/word/2010/wordml" xmlns:w15="http://schemas.microsoft.com/office/word/2012/wordml" xmlns:w16se="http://schemas.microsoft.com/office/word/2015/wordml/symex" xmlns:wpg="http://schemas.microsoft.com/office/word/2010/wordprocessingGroup" xmlns:wpi="http://schemas.microsoft.com/office/word/2010/wordprocessingInk" xmlns:wne="http://schemas.microsoft.com/office/word/2006/wordml" xmlns:wps="http://schemas.microsoft.com/office/word/2010/wordprocessingShape" mc:Ignorable="w14 w15 w16se wp14">
   <w:body>
     <w:p>
       <w:pPr>
@@ -154,10 +154,18 @@
           <w:sz w:val="24"/>
           <w:szCs w:val="24"/>
         </w:rPr>
-        <w:t>{%-</w:t>
-      </w:r>
-      <w:bookmarkStart w:id="0" w:name="_GoBack"/>
-      <w:bookmarkEnd w:id="0"/>
+        <w:t xml:space="preserve">{%- </w:t>
+      </w:r>
+      <w:proofErr w:type="spellStart"/>
+      <w:r>
+        <w:rPr>
+          <w:rFonts w:ascii="Times New Roman" w:hAnsi="Times New Roman" w:cs="Times New Roman"/>
+          <w:sz w:val="24"/>
+          <w:szCs w:val="24"/>
+        </w:rPr>
+        <w:t>if</w:t>
+      </w:r>
+      <w:proofErr w:type="spellEnd"/>
       <w:r>
         <w:rPr>
           <w:rFonts w:ascii="Times New Roman" w:hAnsi="Times New Roman" w:cs="Times New Roman"/>
@@ -173,7 +181,7 @@
           <w:sz w:val="24"/>
           <w:szCs w:val="24"/>
         </w:rPr>
-        <w:t>if</w:t>
+        <w:t>status</w:t>
       </w:r>
       <w:proofErr w:type="spellEnd"/>
       <w:r>
@@ -184,30 +192,11 @@
         </w:rPr>
         <w:t xml:space="preserve"> </w:t>
       </w:r>
-      <w:proofErr w:type="spellStart"/>
-      <w:r>
-        <w:rPr>
-          <w:rFonts w:ascii="Times New Roman" w:hAnsi="Times New Roman" w:cs="Times New Roman"/>
-          <w:sz w:val="24"/>
-          <w:szCs w:val="24"/>
-        </w:rPr>
-        <w:t>status</w:t>
-      </w:r>
-      <w:proofErr w:type="spellEnd"/>
-      <w:r>
-        <w:rPr>
-          <w:rFonts w:ascii="Times New Roman" w:hAnsi="Times New Roman" w:cs="Times New Roman"/>
-          <w:sz w:val="24"/>
-          <w:szCs w:val="24"/>
-        </w:rPr>
-        <w:t xml:space="preserve"> </w:t>
-      </w:r>
-      <w:r>
-        <w:rPr>
-          <w:rFonts w:ascii="Times New Roman" w:hAnsi="Times New Roman" w:cs="Times New Roman"/>
-          <w:sz w:val="24"/>
-          <w:szCs w:val="24"/>
-          <w:lang w:val="en-US"/>
+      <w:r>
+        <w:rPr>
+          <w:rFonts w:ascii="Times New Roman" w:hAnsi="Times New Roman" w:cs="Times New Roman"/>
+          <w:sz w:val="24"/>
+          <w:szCs w:val="24"/>
         </w:rPr>
         <w:t>=</w:t>
       </w:r>
@@ -464,7 +453,6 @@
           <w:rFonts w:ascii="Times New Roman" w:hAnsi="Times New Roman" w:cs="Times New Roman"/>
           <w:sz w:val="24"/>
           <w:szCs w:val="24"/>
-          <w:lang w:val="en-US"/>
         </w:rPr>
       </w:pPr>
       <w:r>
@@ -472,7 +460,6 @@
           <w:rFonts w:ascii="Times New Roman" w:hAnsi="Times New Roman" w:cs="Times New Roman"/>
           <w:sz w:val="24"/>
           <w:szCs w:val="24"/>
-          <w:lang w:val="en-US"/>
         </w:rPr>
         <w:t>{%</w:t>
       </w:r>
@@ -489,9 +476,25 @@
           <w:rFonts w:ascii="Times New Roman" w:hAnsi="Times New Roman" w:cs="Times New Roman"/>
           <w:sz w:val="24"/>
           <w:szCs w:val="24"/>
-          <w:lang w:val="en-US"/>
-        </w:rPr>
-        <w:t xml:space="preserve"> else %}</w:t>
+        </w:rPr>
+        <w:t xml:space="preserve"> </w:t>
+      </w:r>
+      <w:r>
+        <w:rPr>
+          <w:rFonts w:ascii="Times New Roman" w:hAnsi="Times New Roman" w:cs="Times New Roman"/>
+          <w:sz w:val="24"/>
+          <w:szCs w:val="24"/>
+          <w:lang w:val="en-US"/>
+        </w:rPr>
+        <w:t>else</w:t>
+      </w:r>
+      <w:r>
+        <w:rPr>
+          <w:rFonts w:ascii="Times New Roman" w:hAnsi="Times New Roman" w:cs="Times New Roman"/>
+          <w:sz w:val="24"/>
+          <w:szCs w:val="24"/>
+        </w:rPr>
+        <w:t xml:space="preserve"> %}</w:t>
       </w:r>
     </w:p>
     <w:p>
@@ -910,7 +913,6 @@
               </w:rPr>
               <w:t xml:space="preserve">Квалификация: </w:t>
             </w:r>
-            <w:proofErr w:type="gramStart"/>
             <w:r>
               <w:rPr>
                 <w:rFonts w:ascii="Times New Roman" w:hAnsi="Times New Roman" w:cs="Times New Roman"/>
@@ -931,7 +933,6 @@
               <w:t>kvalif</w:t>
             </w:r>
             <w:proofErr w:type="spellEnd"/>
-            <w:proofErr w:type="gramEnd"/>
             <w:r>
               <w:rPr>
                 <w:rFonts w:ascii="Times New Roman" w:hAnsi="Times New Roman" w:cs="Times New Roman"/>
@@ -1000,7 +1001,6 @@
               </w:rPr>
               <w:t xml:space="preserve">Форма обучения: </w:t>
             </w:r>
-            <w:proofErr w:type="gramStart"/>
             <w:r>
               <w:rPr>
                 <w:rFonts w:ascii="Times New Roman" w:hAnsi="Times New Roman" w:cs="Times New Roman"/>
@@ -1019,7 +1019,6 @@
               </w:rPr>
               <w:t>fob</w:t>
             </w:r>
-            <w:proofErr w:type="gramEnd"/>
             <w:r>
               <w:rPr>
                 <w:rFonts w:ascii="Times New Roman" w:hAnsi="Times New Roman" w:cs="Times New Roman"/>
@@ -1111,6 +1110,66 @@
           <w:lang w:val="en-US"/>
         </w:rPr>
         <w:t>{% if status == 3 %}</w:t>
+      </w:r>
+    </w:p>
+    <w:p>
+      <w:pPr>
+        <w:jc w:val="center"/>
+        <w:rPr>
+          <w:rFonts w:ascii="Times New Roman" w:hAnsi="Times New Roman" w:cs="Times New Roman"/>
+          <w:sz w:val="24"/>
+          <w:szCs w:val="24"/>
+          <w:lang w:val="en-US"/>
+        </w:rPr>
+      </w:pPr>
+      <w:r>
+        <w:rPr>
+          <w:rFonts w:ascii="Times New Roman" w:hAnsi="Times New Roman" w:cs="Times New Roman"/>
+          <w:sz w:val="24"/>
+          <w:szCs w:val="24"/>
+          <w:lang w:val="en-US"/>
+        </w:rPr>
+        <w:t xml:space="preserve">{% if </w:t>
+      </w:r>
+      <w:proofErr w:type="spellStart"/>
+      <w:r>
+        <w:rPr>
+          <w:rFonts w:ascii="Times New Roman" w:hAnsi="Times New Roman" w:cs="Times New Roman"/>
+          <w:sz w:val="24"/>
+          <w:szCs w:val="24"/>
+          <w:lang w:val="en-US"/>
+        </w:rPr>
+        <w:t>user_accepted_is_</w:t>
+      </w:r>
+      <w:proofErr w:type="gramStart"/>
+      <w:r>
+        <w:rPr>
+          <w:rFonts w:ascii="Times New Roman" w:hAnsi="Times New Roman" w:cs="Times New Roman"/>
+          <w:sz w:val="24"/>
+          <w:szCs w:val="24"/>
+          <w:lang w:val="en-US"/>
+        </w:rPr>
+        <w:t>confirmed</w:t>
+      </w:r>
+      <w:proofErr w:type="spellEnd"/>
+      <w:r>
+        <w:rPr>
+          <w:rFonts w:ascii="Times New Roman" w:hAnsi="Times New Roman" w:cs="Times New Roman"/>
+          <w:sz w:val="24"/>
+          <w:szCs w:val="24"/>
+          <w:lang w:val="en-US"/>
+        </w:rPr>
+        <w:t xml:space="preserve">  %</w:t>
+      </w:r>
+      <w:proofErr w:type="gramEnd"/>
+      <w:r>
+        <w:rPr>
+          <w:rFonts w:ascii="Times New Roman" w:hAnsi="Times New Roman" w:cs="Times New Roman"/>
+          <w:sz w:val="24"/>
+          <w:szCs w:val="24"/>
+          <w:lang w:val="en-US"/>
+        </w:rPr>
+        <w:t>}</w:t>
       </w:r>
     </w:p>
     <w:tbl>
@@ -1226,7 +1285,6 @@
               </w:rPr>
               <w:t xml:space="preserve">Дата подписания: </w:t>
             </w:r>
-            <w:proofErr w:type="gramStart"/>
             <w:r>
               <w:rPr>
                 <w:rFonts w:ascii="Times New Roman" w:hAnsi="Times New Roman" w:cs="Times New Roman"/>
@@ -1244,7 +1302,6 @@
               </w:rPr>
               <w:t>review</w:t>
             </w:r>
-            <w:proofErr w:type="gramEnd"/>
             <w:r>
               <w:rPr>
                 <w:rFonts w:ascii="Times New Roman" w:hAnsi="Times New Roman" w:cs="Times New Roman"/>
@@ -1342,6 +1399,22 @@
                 <w:sz w:val="20"/>
                 <w:szCs w:val="24"/>
               </w:rPr>
+              <w:t xml:space="preserve"> </w:t>
+            </w:r>
+            <w:r>
+              <w:rPr>
+                <w:rFonts w:ascii="Times New Roman" w:hAnsi="Times New Roman" w:cs="Times New Roman"/>
+                <w:sz w:val="20"/>
+                <w:szCs w:val="24"/>
+              </w:rPr>
+              <w:t>и согласовал</w:t>
+            </w:r>
+            <w:r>
+              <w:rPr>
+                <w:rFonts w:ascii="Times New Roman" w:hAnsi="Times New Roman" w:cs="Times New Roman"/>
+                <w:sz w:val="20"/>
+                <w:szCs w:val="24"/>
+              </w:rPr>
               <w:t>:</w:t>
             </w:r>
             <w:r>
@@ -1352,6 +1425,7 @@
               </w:rPr>
               <w:t xml:space="preserve"> </w:t>
             </w:r>
+            <w:proofErr w:type="gramStart"/>
             <w:r>
               <w:rPr>
                 <w:rFonts w:ascii="Times New Roman" w:hAnsi="Times New Roman" w:cs="Times New Roman"/>
@@ -1369,6 +1443,7 @@
               </w:rPr>
               <w:t>user</w:t>
             </w:r>
+            <w:proofErr w:type="gramEnd"/>
             <w:r>
               <w:rPr>
                 <w:rFonts w:ascii="Times New Roman" w:hAnsi="Times New Roman" w:cs="Times New Roman"/>
@@ -1445,29 +1520,19 @@
                 <w:szCs w:val="24"/>
                 <w:lang w:val="en-US"/>
               </w:rPr>
-              <w:t xml:space="preserve"> </w:t>
-            </w:r>
-            <w:proofErr w:type="gramStart"/>
-            <w:r>
-              <w:rPr>
-                <w:rFonts w:ascii="Times New Roman" w:hAnsi="Times New Roman" w:cs="Times New Roman"/>
-                <w:sz w:val="20"/>
-                <w:szCs w:val="24"/>
-                <w:lang w:val="en-US"/>
-              </w:rPr>
-              <w:t xml:space="preserve">{{ </w:t>
-            </w:r>
-            <w:proofErr w:type="spellStart"/>
-            <w:r>
-              <w:rPr>
-                <w:rFonts w:ascii="Times New Roman" w:hAnsi="Times New Roman" w:cs="Times New Roman"/>
-                <w:sz w:val="20"/>
-                <w:szCs w:val="24"/>
-                <w:lang w:val="en-US"/>
-              </w:rPr>
-              <w:t>accept</w:t>
-            </w:r>
-            <w:proofErr w:type="gramEnd"/>
+              <w:t xml:space="preserve"> {{ </w:t>
+            </w:r>
+            <w:r>
+              <w:rPr>
+                <w:rFonts w:ascii="Times New Roman" w:hAnsi="Times New Roman" w:cs="Times New Roman"/>
+                <w:sz w:val="20"/>
+                <w:szCs w:val="24"/>
+                <w:lang w:val="en-US"/>
+              </w:rPr>
+              <w:t>confirm</w:t>
+            </w:r>
+            <w:bookmarkStart w:id="0" w:name="_GoBack"/>
+            <w:bookmarkEnd w:id="0"/>
             <w:r>
               <w:rPr>
                 <w:rFonts w:ascii="Times New Roman" w:hAnsi="Times New Roman" w:cs="Times New Roman"/>
@@ -1477,7 +1542,6 @@
               </w:rPr>
               <w:t>_date</w:t>
             </w:r>
-            <w:proofErr w:type="spellEnd"/>
             <w:r>
               <w:rPr>
                 <w:rFonts w:ascii="Times New Roman" w:hAnsi="Times New Roman" w:cs="Times New Roman"/>
@@ -1500,6 +1564,1044 @@
         </w:tc>
       </w:tr>
     </w:tbl>
+    <w:p>
+      <w:pPr>
+        <w:jc w:val="center"/>
+        <w:rPr>
+          <w:rFonts w:ascii="Times New Roman" w:hAnsi="Times New Roman" w:cs="Times New Roman"/>
+          <w:sz w:val="24"/>
+          <w:szCs w:val="24"/>
+          <w:lang w:val="en-US"/>
+        </w:rPr>
+      </w:pPr>
+      <w:r>
+        <w:rPr>
+          <w:rFonts w:ascii="Times New Roman" w:hAnsi="Times New Roman" w:cs="Times New Roman"/>
+          <w:sz w:val="24"/>
+          <w:szCs w:val="24"/>
+          <w:lang w:val="en-US"/>
+        </w:rPr>
+        <w:t xml:space="preserve">{% </w:t>
+      </w:r>
+      <w:proofErr w:type="spellStart"/>
+      <w:r>
+        <w:rPr>
+          <w:rFonts w:ascii="Times New Roman" w:hAnsi="Times New Roman" w:cs="Times New Roman"/>
+          <w:sz w:val="24"/>
+          <w:szCs w:val="24"/>
+          <w:lang w:val="en-US"/>
+        </w:rPr>
+        <w:t>el</w:t>
+      </w:r>
+      <w:r>
+        <w:rPr>
+          <w:rFonts w:ascii="Times New Roman" w:hAnsi="Times New Roman" w:cs="Times New Roman"/>
+          <w:sz w:val="24"/>
+          <w:szCs w:val="24"/>
+          <w:lang w:val="en-US"/>
+        </w:rPr>
+        <w:t>if</w:t>
+      </w:r>
+      <w:proofErr w:type="spellEnd"/>
+      <w:r>
+        <w:rPr>
+          <w:rFonts w:ascii="Times New Roman" w:hAnsi="Times New Roman" w:cs="Times New Roman"/>
+          <w:sz w:val="24"/>
+          <w:szCs w:val="24"/>
+          <w:lang w:val="en-US"/>
+        </w:rPr>
+        <w:t xml:space="preserve"> </w:t>
+      </w:r>
+      <w:proofErr w:type="spellStart"/>
+      <w:r>
+        <w:rPr>
+          <w:rFonts w:ascii="Times New Roman" w:hAnsi="Times New Roman" w:cs="Times New Roman"/>
+          <w:sz w:val="24"/>
+          <w:szCs w:val="24"/>
+          <w:lang w:val="en-US"/>
+        </w:rPr>
+        <w:t>is_only_accepted</w:t>
+      </w:r>
+      <w:proofErr w:type="spellEnd"/>
+      <w:r>
+        <w:rPr>
+          <w:rFonts w:ascii="Times New Roman" w:hAnsi="Times New Roman" w:cs="Times New Roman"/>
+          <w:sz w:val="24"/>
+          <w:szCs w:val="24"/>
+          <w:lang w:val="en-US"/>
+        </w:rPr>
+        <w:t xml:space="preserve"> </w:t>
+      </w:r>
+      <w:r>
+        <w:rPr>
+          <w:rFonts w:ascii="Times New Roman" w:hAnsi="Times New Roman" w:cs="Times New Roman"/>
+          <w:sz w:val="24"/>
+          <w:szCs w:val="24"/>
+          <w:lang w:val="en-US"/>
+        </w:rPr>
+        <w:t>%}</w:t>
+      </w:r>
+    </w:p>
+    <w:tbl>
+      <w:tblPr>
+        <w:tblStyle w:val="ab"/>
+        <w:tblW w:w="0" w:type="auto"/>
+        <w:tblLook w:val="04A0" w:firstRow="1" w:lastRow="0" w:firstColumn="1" w:lastColumn="0" w:noHBand="0" w:noVBand="1"/>
+      </w:tblPr>
+      <w:tblGrid>
+        <w:gridCol w:w="4106"/>
+        <w:gridCol w:w="851"/>
+        <w:gridCol w:w="4388"/>
+      </w:tblGrid>
+      <w:tr>
+        <w:tc>
+          <w:tcPr>
+            <w:tcW w:w="4106" w:type="dxa"/>
+            <w:tcBorders>
+              <w:right w:val="single" w:sz="4" w:space="0" w:color="auto"/>
+            </w:tcBorders>
+          </w:tcPr>
+          <w:p>
+            <w:pPr>
+              <w:rPr>
+                <w:rFonts w:ascii="Times New Roman" w:hAnsi="Times New Roman" w:cs="Times New Roman"/>
+                <w:sz w:val="20"/>
+                <w:szCs w:val="24"/>
+              </w:rPr>
+            </w:pPr>
+            <w:r>
+              <w:rPr>
+                <w:rFonts w:ascii="Times New Roman" w:hAnsi="Times New Roman" w:cs="Times New Roman"/>
+                <w:sz w:val="20"/>
+                <w:szCs w:val="24"/>
+              </w:rPr>
+              <w:t>Документ подписан простой электронной подписью</w:t>
+            </w:r>
+          </w:p>
+          <w:p>
+            <w:pPr>
+              <w:rPr>
+                <w:rFonts w:ascii="Times New Roman" w:hAnsi="Times New Roman" w:cs="Times New Roman"/>
+                <w:sz w:val="20"/>
+                <w:szCs w:val="24"/>
+              </w:rPr>
+            </w:pPr>
+            <w:r>
+              <w:rPr>
+                <w:rFonts w:ascii="Times New Roman" w:hAnsi="Times New Roman" w:cs="Times New Roman"/>
+                <w:sz w:val="20"/>
+                <w:szCs w:val="24"/>
+              </w:rPr>
+              <w:t xml:space="preserve">Составитель программы: </w:t>
+            </w:r>
+            <w:proofErr w:type="gramStart"/>
+            <w:r>
+              <w:rPr>
+                <w:rFonts w:ascii="Times New Roman" w:hAnsi="Times New Roman" w:cs="Times New Roman"/>
+                <w:sz w:val="20"/>
+                <w:szCs w:val="24"/>
+              </w:rPr>
+              <w:t xml:space="preserve">{{ </w:t>
+            </w:r>
+            <w:r>
+              <w:rPr>
+                <w:rFonts w:ascii="Times New Roman" w:hAnsi="Times New Roman" w:cs="Times New Roman"/>
+                <w:sz w:val="20"/>
+                <w:szCs w:val="24"/>
+                <w:lang w:val="en-US"/>
+              </w:rPr>
+              <w:t>person</w:t>
+            </w:r>
+            <w:proofErr w:type="gramEnd"/>
+            <w:r>
+              <w:rPr>
+                <w:rFonts w:ascii="Times New Roman" w:hAnsi="Times New Roman" w:cs="Times New Roman"/>
+                <w:sz w:val="20"/>
+                <w:szCs w:val="24"/>
+              </w:rPr>
+              <w:t>_</w:t>
+            </w:r>
+            <w:r>
+              <w:rPr>
+                <w:rFonts w:ascii="Times New Roman" w:hAnsi="Times New Roman" w:cs="Times New Roman"/>
+                <w:sz w:val="20"/>
+                <w:szCs w:val="24"/>
+                <w:lang w:val="en-US"/>
+              </w:rPr>
+              <w:t>name</w:t>
+            </w:r>
+            <w:r>
+              <w:rPr>
+                <w:rFonts w:ascii="Times New Roman" w:hAnsi="Times New Roman" w:cs="Times New Roman"/>
+                <w:sz w:val="20"/>
+                <w:szCs w:val="24"/>
+              </w:rPr>
+              <w:t xml:space="preserve"> }}</w:t>
+            </w:r>
+          </w:p>
+          <w:p>
+            <w:pPr>
+              <w:rPr>
+                <w:rFonts w:ascii="Times New Roman" w:hAnsi="Times New Roman" w:cs="Times New Roman"/>
+                <w:sz w:val="20"/>
+                <w:szCs w:val="24"/>
+              </w:rPr>
+            </w:pPr>
+            <w:r>
+              <w:rPr>
+                <w:rFonts w:ascii="Times New Roman" w:hAnsi="Times New Roman" w:cs="Times New Roman"/>
+                <w:sz w:val="20"/>
+                <w:szCs w:val="24"/>
+              </w:rPr>
+              <w:t xml:space="preserve">Дата подписания: </w:t>
+            </w:r>
+            <w:r>
+              <w:rPr>
+                <w:rFonts w:ascii="Times New Roman" w:hAnsi="Times New Roman" w:cs="Times New Roman"/>
+                <w:sz w:val="20"/>
+                <w:szCs w:val="24"/>
+              </w:rPr>
+              <w:t xml:space="preserve">{{ </w:t>
+            </w:r>
+            <w:r>
+              <w:rPr>
+                <w:rFonts w:ascii="Times New Roman" w:hAnsi="Times New Roman" w:cs="Times New Roman"/>
+                <w:sz w:val="20"/>
+                <w:szCs w:val="24"/>
+                <w:lang w:val="en-US"/>
+              </w:rPr>
+              <w:t>review</w:t>
+            </w:r>
+            <w:r>
+              <w:rPr>
+                <w:rFonts w:ascii="Times New Roman" w:hAnsi="Times New Roman" w:cs="Times New Roman"/>
+                <w:sz w:val="20"/>
+                <w:szCs w:val="24"/>
+              </w:rPr>
+              <w:t>_</w:t>
+            </w:r>
+            <w:r>
+              <w:rPr>
+                <w:rFonts w:ascii="Times New Roman" w:hAnsi="Times New Roman" w:cs="Times New Roman"/>
+                <w:sz w:val="20"/>
+                <w:szCs w:val="24"/>
+                <w:lang w:val="en-US"/>
+              </w:rPr>
+              <w:t>date</w:t>
+            </w:r>
+            <w:r>
+              <w:rPr>
+                <w:rFonts w:ascii="Times New Roman" w:hAnsi="Times New Roman" w:cs="Times New Roman"/>
+                <w:sz w:val="20"/>
+                <w:szCs w:val="24"/>
+              </w:rPr>
+              <w:t xml:space="preserve"> }}</w:t>
+            </w:r>
+          </w:p>
+        </w:tc>
+        <w:tc>
+          <w:tcPr>
+            <w:tcW w:w="851" w:type="dxa"/>
+            <w:tcBorders>
+              <w:top w:val="nil"/>
+              <w:left w:val="single" w:sz="4" w:space="0" w:color="auto"/>
+              <w:bottom w:val="nil"/>
+            </w:tcBorders>
+          </w:tcPr>
+          <w:p>
+            <w:pPr>
+              <w:rPr>
+                <w:rFonts w:ascii="Times New Roman" w:hAnsi="Times New Roman" w:cs="Times New Roman"/>
+                <w:sz w:val="20"/>
+                <w:szCs w:val="24"/>
+              </w:rPr>
+            </w:pPr>
+          </w:p>
+        </w:tc>
+        <w:tc>
+          <w:tcPr>
+            <w:tcW w:w="4388" w:type="dxa"/>
+          </w:tcPr>
+          <w:p>
+            <w:pPr>
+              <w:rPr>
+                <w:rFonts w:ascii="Times New Roman" w:hAnsi="Times New Roman" w:cs="Times New Roman"/>
+                <w:sz w:val="20"/>
+                <w:szCs w:val="24"/>
+              </w:rPr>
+            </w:pPr>
+            <w:r>
+              <w:rPr>
+                <w:rFonts w:ascii="Times New Roman" w:hAnsi="Times New Roman" w:cs="Times New Roman"/>
+                <w:sz w:val="20"/>
+                <w:szCs w:val="24"/>
+              </w:rPr>
+              <w:t>Документ подписан простой электронной подписью</w:t>
+            </w:r>
+          </w:p>
+          <w:p>
+            <w:pPr>
+              <w:rPr>
+                <w:rFonts w:ascii="Times New Roman" w:hAnsi="Times New Roman" w:cs="Times New Roman"/>
+                <w:sz w:val="20"/>
+                <w:szCs w:val="24"/>
+              </w:rPr>
+            </w:pPr>
+            <w:r>
+              <w:rPr>
+                <w:rFonts w:ascii="Times New Roman" w:hAnsi="Times New Roman" w:cs="Times New Roman"/>
+                <w:sz w:val="20"/>
+                <w:szCs w:val="24"/>
+              </w:rPr>
+              <w:t>Утвердил:</w:t>
+            </w:r>
+            <w:r>
+              <w:rPr>
+                <w:rFonts w:ascii="Times New Roman" w:hAnsi="Times New Roman" w:cs="Times New Roman"/>
+                <w:sz w:val="20"/>
+                <w:szCs w:val="24"/>
+              </w:rPr>
+              <w:t xml:space="preserve"> </w:t>
+            </w:r>
+            <w:proofErr w:type="gramStart"/>
+            <w:r>
+              <w:rPr>
+                <w:rFonts w:ascii="Times New Roman" w:hAnsi="Times New Roman" w:cs="Times New Roman"/>
+                <w:sz w:val="20"/>
+                <w:szCs w:val="24"/>
+              </w:rPr>
+              <w:t xml:space="preserve">{{ </w:t>
+            </w:r>
+            <w:r>
+              <w:rPr>
+                <w:rFonts w:ascii="Times New Roman" w:hAnsi="Times New Roman" w:cs="Times New Roman"/>
+                <w:sz w:val="20"/>
+                <w:szCs w:val="24"/>
+                <w:lang w:val="en-US"/>
+              </w:rPr>
+              <w:t>user</w:t>
+            </w:r>
+            <w:proofErr w:type="gramEnd"/>
+            <w:r>
+              <w:rPr>
+                <w:rFonts w:ascii="Times New Roman" w:hAnsi="Times New Roman" w:cs="Times New Roman"/>
+                <w:sz w:val="20"/>
+                <w:szCs w:val="24"/>
+              </w:rPr>
+              <w:t>_</w:t>
+            </w:r>
+            <w:r>
+              <w:rPr>
+                <w:rFonts w:ascii="Times New Roman" w:hAnsi="Times New Roman" w:cs="Times New Roman"/>
+                <w:sz w:val="20"/>
+                <w:szCs w:val="24"/>
+                <w:lang w:val="en-US"/>
+              </w:rPr>
+              <w:t>accepted</w:t>
+            </w:r>
+            <w:r>
+              <w:rPr>
+                <w:rFonts w:ascii="Times New Roman" w:hAnsi="Times New Roman" w:cs="Times New Roman"/>
+                <w:sz w:val="20"/>
+                <w:szCs w:val="24"/>
+              </w:rPr>
+              <w:t xml:space="preserve"> }}</w:t>
+            </w:r>
+          </w:p>
+          <w:p>
+            <w:pPr>
+              <w:rPr>
+                <w:rFonts w:ascii="Times New Roman" w:hAnsi="Times New Roman" w:cs="Times New Roman"/>
+                <w:sz w:val="20"/>
+                <w:szCs w:val="24"/>
+                <w:lang w:val="en-US"/>
+              </w:rPr>
+            </w:pPr>
+            <w:r>
+              <w:rPr>
+                <w:rFonts w:ascii="Times New Roman" w:hAnsi="Times New Roman" w:cs="Times New Roman"/>
+                <w:sz w:val="20"/>
+                <w:szCs w:val="24"/>
+              </w:rPr>
+              <w:t>Дата</w:t>
+            </w:r>
+            <w:r>
+              <w:rPr>
+                <w:rFonts w:ascii="Times New Roman" w:hAnsi="Times New Roman" w:cs="Times New Roman"/>
+                <w:sz w:val="20"/>
+                <w:szCs w:val="24"/>
+                <w:lang w:val="en-US"/>
+              </w:rPr>
+              <w:t xml:space="preserve"> </w:t>
+            </w:r>
+            <w:r>
+              <w:rPr>
+                <w:rFonts w:ascii="Times New Roman" w:hAnsi="Times New Roman" w:cs="Times New Roman"/>
+                <w:sz w:val="20"/>
+                <w:szCs w:val="24"/>
+              </w:rPr>
+              <w:t>подписания</w:t>
+            </w:r>
+            <w:r>
+              <w:rPr>
+                <w:rFonts w:ascii="Times New Roman" w:hAnsi="Times New Roman" w:cs="Times New Roman"/>
+                <w:sz w:val="20"/>
+                <w:szCs w:val="24"/>
+                <w:lang w:val="en-US"/>
+              </w:rPr>
+              <w:t>:</w:t>
+            </w:r>
+            <w:r>
+              <w:rPr>
+                <w:rFonts w:ascii="Times New Roman" w:hAnsi="Times New Roman" w:cs="Times New Roman"/>
+                <w:sz w:val="20"/>
+                <w:szCs w:val="24"/>
+                <w:lang w:val="en-US"/>
+              </w:rPr>
+              <w:t xml:space="preserve"> {{ </w:t>
+            </w:r>
+            <w:proofErr w:type="spellStart"/>
+            <w:r>
+              <w:rPr>
+                <w:rFonts w:ascii="Times New Roman" w:hAnsi="Times New Roman" w:cs="Times New Roman"/>
+                <w:sz w:val="20"/>
+                <w:szCs w:val="24"/>
+                <w:lang w:val="en-US"/>
+              </w:rPr>
+              <w:t>accept_date</w:t>
+            </w:r>
+            <w:proofErr w:type="spellEnd"/>
+            <w:r>
+              <w:rPr>
+                <w:rFonts w:ascii="Times New Roman" w:hAnsi="Times New Roman" w:cs="Times New Roman"/>
+                <w:sz w:val="20"/>
+                <w:szCs w:val="24"/>
+                <w:lang w:val="en-US"/>
+              </w:rPr>
+              <w:t xml:space="preserve"> </w:t>
+            </w:r>
+            <w:r>
+              <w:rPr>
+                <w:rFonts w:ascii="Times New Roman" w:hAnsi="Times New Roman" w:cs="Times New Roman"/>
+                <w:sz w:val="20"/>
+                <w:szCs w:val="24"/>
+                <w:lang w:val="en-US"/>
+              </w:rPr>
+              <w:t>}}</w:t>
+            </w:r>
+          </w:p>
+        </w:tc>
+      </w:tr>
+    </w:tbl>
+    <w:p>
+      <w:pPr>
+        <w:jc w:val="center"/>
+        <w:rPr>
+          <w:rFonts w:ascii="Times New Roman" w:hAnsi="Times New Roman" w:cs="Times New Roman"/>
+          <w:sz w:val="24"/>
+          <w:szCs w:val="24"/>
+          <w:lang w:val="en-US"/>
+        </w:rPr>
+      </w:pPr>
+      <w:r>
+        <w:rPr>
+          <w:rFonts w:ascii="Times New Roman" w:hAnsi="Times New Roman" w:cs="Times New Roman"/>
+          <w:sz w:val="24"/>
+          <w:szCs w:val="24"/>
+          <w:lang w:val="en-US"/>
+        </w:rPr>
+        <w:lastRenderedPageBreak/>
+        <w:t>{% else %}</w:t>
+      </w:r>
+    </w:p>
+    <w:p>
+      <w:pPr>
+        <w:jc w:val="center"/>
+        <w:rPr>
+          <w:rFonts w:ascii="Times New Roman" w:hAnsi="Times New Roman" w:cs="Times New Roman"/>
+          <w:sz w:val="24"/>
+          <w:szCs w:val="24"/>
+          <w:lang w:val="en-US"/>
+        </w:rPr>
+      </w:pPr>
+    </w:p>
+    <w:tbl>
+      <w:tblPr>
+        <w:tblStyle w:val="ab"/>
+        <w:tblW w:w="0" w:type="auto"/>
+        <w:tblLook w:val="04A0" w:firstRow="1" w:lastRow="0" w:firstColumn="1" w:lastColumn="0" w:noHBand="0" w:noVBand="1"/>
+      </w:tblPr>
+      <w:tblGrid>
+        <w:gridCol w:w="2835"/>
+        <w:gridCol w:w="283"/>
+        <w:gridCol w:w="2835"/>
+        <w:gridCol w:w="283"/>
+        <w:gridCol w:w="2835"/>
+      </w:tblGrid>
+      <w:tr>
+        <w:tc>
+          <w:tcPr>
+            <w:tcW w:w="2835" w:type="dxa"/>
+            <w:tcBorders>
+              <w:right w:val="single" w:sz="4" w:space="0" w:color="auto"/>
+            </w:tcBorders>
+          </w:tcPr>
+          <w:p>
+            <w:pPr>
+              <w:rPr>
+                <w:rFonts w:ascii="Times New Roman" w:hAnsi="Times New Roman" w:cs="Times New Roman"/>
+                <w:sz w:val="20"/>
+                <w:szCs w:val="24"/>
+              </w:rPr>
+            </w:pPr>
+            <w:r>
+              <w:rPr>
+                <w:rFonts w:ascii="Times New Roman" w:hAnsi="Times New Roman" w:cs="Times New Roman"/>
+                <w:sz w:val="20"/>
+                <w:szCs w:val="24"/>
+              </w:rPr>
+              <w:t>Документ подписан простой электронной подписью</w:t>
+            </w:r>
+          </w:p>
+          <w:p>
+            <w:pPr>
+              <w:rPr>
+                <w:rFonts w:ascii="Times New Roman" w:hAnsi="Times New Roman" w:cs="Times New Roman"/>
+                <w:sz w:val="20"/>
+                <w:szCs w:val="24"/>
+              </w:rPr>
+            </w:pPr>
+            <w:r>
+              <w:rPr>
+                <w:rFonts w:ascii="Times New Roman" w:hAnsi="Times New Roman" w:cs="Times New Roman"/>
+                <w:sz w:val="20"/>
+                <w:szCs w:val="24"/>
+              </w:rPr>
+              <w:t xml:space="preserve">Составитель программы: </w:t>
+            </w:r>
+            <w:proofErr w:type="gramStart"/>
+            <w:r>
+              <w:rPr>
+                <w:rFonts w:ascii="Times New Roman" w:hAnsi="Times New Roman" w:cs="Times New Roman"/>
+                <w:sz w:val="20"/>
+                <w:szCs w:val="24"/>
+              </w:rPr>
+              <w:t xml:space="preserve">{{ </w:t>
+            </w:r>
+            <w:r>
+              <w:rPr>
+                <w:rFonts w:ascii="Times New Roman" w:hAnsi="Times New Roman" w:cs="Times New Roman"/>
+                <w:sz w:val="20"/>
+                <w:szCs w:val="24"/>
+                <w:lang w:val="en-US"/>
+              </w:rPr>
+              <w:t>person</w:t>
+            </w:r>
+            <w:proofErr w:type="gramEnd"/>
+            <w:r>
+              <w:rPr>
+                <w:rFonts w:ascii="Times New Roman" w:hAnsi="Times New Roman" w:cs="Times New Roman"/>
+                <w:sz w:val="20"/>
+                <w:szCs w:val="24"/>
+              </w:rPr>
+              <w:t>_</w:t>
+            </w:r>
+            <w:r>
+              <w:rPr>
+                <w:rFonts w:ascii="Times New Roman" w:hAnsi="Times New Roman" w:cs="Times New Roman"/>
+                <w:sz w:val="20"/>
+                <w:szCs w:val="24"/>
+                <w:lang w:val="en-US"/>
+              </w:rPr>
+              <w:t>name</w:t>
+            </w:r>
+            <w:r>
+              <w:rPr>
+                <w:rFonts w:ascii="Times New Roman" w:hAnsi="Times New Roman" w:cs="Times New Roman"/>
+                <w:sz w:val="20"/>
+                <w:szCs w:val="24"/>
+              </w:rPr>
+              <w:t xml:space="preserve"> }}</w:t>
+            </w:r>
+          </w:p>
+          <w:p>
+            <w:pPr>
+              <w:rPr>
+                <w:rFonts w:ascii="Times New Roman" w:hAnsi="Times New Roman" w:cs="Times New Roman"/>
+                <w:sz w:val="20"/>
+                <w:szCs w:val="24"/>
+              </w:rPr>
+            </w:pPr>
+            <w:r>
+              <w:rPr>
+                <w:rFonts w:ascii="Times New Roman" w:hAnsi="Times New Roman" w:cs="Times New Roman"/>
+                <w:sz w:val="20"/>
+                <w:szCs w:val="24"/>
+              </w:rPr>
+              <w:t xml:space="preserve">Дата подписания: </w:t>
+            </w:r>
+            <w:r>
+              <w:rPr>
+                <w:rFonts w:ascii="Times New Roman" w:hAnsi="Times New Roman" w:cs="Times New Roman"/>
+                <w:sz w:val="20"/>
+                <w:szCs w:val="24"/>
+              </w:rPr>
+              <w:t xml:space="preserve">{{ </w:t>
+            </w:r>
+            <w:r>
+              <w:rPr>
+                <w:rFonts w:ascii="Times New Roman" w:hAnsi="Times New Roman" w:cs="Times New Roman"/>
+                <w:sz w:val="20"/>
+                <w:szCs w:val="24"/>
+                <w:lang w:val="en-US"/>
+              </w:rPr>
+              <w:t>review</w:t>
+            </w:r>
+            <w:r>
+              <w:rPr>
+                <w:rFonts w:ascii="Times New Roman" w:hAnsi="Times New Roman" w:cs="Times New Roman"/>
+                <w:sz w:val="20"/>
+                <w:szCs w:val="24"/>
+              </w:rPr>
+              <w:t>_</w:t>
+            </w:r>
+            <w:r>
+              <w:rPr>
+                <w:rFonts w:ascii="Times New Roman" w:hAnsi="Times New Roman" w:cs="Times New Roman"/>
+                <w:sz w:val="20"/>
+                <w:szCs w:val="24"/>
+                <w:lang w:val="en-US"/>
+              </w:rPr>
+              <w:t>date</w:t>
+            </w:r>
+            <w:r>
+              <w:rPr>
+                <w:rFonts w:ascii="Times New Roman" w:hAnsi="Times New Roman" w:cs="Times New Roman"/>
+                <w:sz w:val="20"/>
+                <w:szCs w:val="24"/>
+              </w:rPr>
+              <w:t xml:space="preserve"> }}</w:t>
+            </w:r>
+          </w:p>
+        </w:tc>
+        <w:tc>
+          <w:tcPr>
+            <w:tcW w:w="283" w:type="dxa"/>
+            <w:tcBorders>
+              <w:top w:val="nil"/>
+              <w:left w:val="single" w:sz="4" w:space="0" w:color="auto"/>
+              <w:bottom w:val="nil"/>
+            </w:tcBorders>
+          </w:tcPr>
+          <w:p>
+            <w:pPr>
+              <w:rPr>
+                <w:rFonts w:ascii="Times New Roman" w:hAnsi="Times New Roman" w:cs="Times New Roman"/>
+                <w:sz w:val="20"/>
+                <w:szCs w:val="24"/>
+              </w:rPr>
+            </w:pPr>
+          </w:p>
+        </w:tc>
+        <w:tc>
+          <w:tcPr>
+            <w:tcW w:w="2835" w:type="dxa"/>
+          </w:tcPr>
+          <w:p>
+            <w:pPr>
+              <w:rPr>
+                <w:rFonts w:ascii="Times New Roman" w:hAnsi="Times New Roman" w:cs="Times New Roman"/>
+                <w:sz w:val="20"/>
+                <w:szCs w:val="24"/>
+              </w:rPr>
+            </w:pPr>
+            <w:r>
+              <w:rPr>
+                <w:rFonts w:ascii="Times New Roman" w:hAnsi="Times New Roman" w:cs="Times New Roman"/>
+                <w:sz w:val="20"/>
+                <w:szCs w:val="24"/>
+              </w:rPr>
+              <w:t>Документ подписан простой электронной подписью</w:t>
+            </w:r>
+          </w:p>
+          <w:p>
+            <w:pPr>
+              <w:rPr>
+                <w:rFonts w:ascii="Times New Roman" w:hAnsi="Times New Roman" w:cs="Times New Roman"/>
+                <w:sz w:val="20"/>
+                <w:szCs w:val="24"/>
+              </w:rPr>
+            </w:pPr>
+            <w:r>
+              <w:rPr>
+                <w:rFonts w:ascii="Times New Roman" w:hAnsi="Times New Roman" w:cs="Times New Roman"/>
+                <w:sz w:val="20"/>
+                <w:szCs w:val="24"/>
+              </w:rPr>
+              <w:t>Утвердил:</w:t>
+            </w:r>
+            <w:r>
+              <w:rPr>
+                <w:rFonts w:ascii="Times New Roman" w:hAnsi="Times New Roman" w:cs="Times New Roman"/>
+                <w:sz w:val="20"/>
+                <w:szCs w:val="24"/>
+              </w:rPr>
+              <w:t xml:space="preserve"> </w:t>
+            </w:r>
+            <w:proofErr w:type="gramStart"/>
+            <w:r>
+              <w:rPr>
+                <w:rFonts w:ascii="Times New Roman" w:hAnsi="Times New Roman" w:cs="Times New Roman"/>
+                <w:sz w:val="20"/>
+                <w:szCs w:val="24"/>
+              </w:rPr>
+              <w:t xml:space="preserve">{{ </w:t>
+            </w:r>
+            <w:r>
+              <w:rPr>
+                <w:rFonts w:ascii="Times New Roman" w:hAnsi="Times New Roman" w:cs="Times New Roman"/>
+                <w:sz w:val="20"/>
+                <w:szCs w:val="24"/>
+                <w:lang w:val="en-US"/>
+              </w:rPr>
+              <w:t>user</w:t>
+            </w:r>
+            <w:proofErr w:type="gramEnd"/>
+            <w:r>
+              <w:rPr>
+                <w:rFonts w:ascii="Times New Roman" w:hAnsi="Times New Roman" w:cs="Times New Roman"/>
+                <w:sz w:val="20"/>
+                <w:szCs w:val="24"/>
+              </w:rPr>
+              <w:t>_</w:t>
+            </w:r>
+            <w:r>
+              <w:rPr>
+                <w:rFonts w:ascii="Times New Roman" w:hAnsi="Times New Roman" w:cs="Times New Roman"/>
+                <w:sz w:val="20"/>
+                <w:szCs w:val="24"/>
+                <w:lang w:val="en-US"/>
+              </w:rPr>
+              <w:t>accepted</w:t>
+            </w:r>
+            <w:r>
+              <w:rPr>
+                <w:rFonts w:ascii="Times New Roman" w:hAnsi="Times New Roman" w:cs="Times New Roman"/>
+                <w:sz w:val="20"/>
+                <w:szCs w:val="24"/>
+              </w:rPr>
+              <w:t xml:space="preserve"> }}</w:t>
+            </w:r>
+          </w:p>
+          <w:p>
+            <w:pPr>
+              <w:rPr>
+                <w:rFonts w:ascii="Times New Roman" w:hAnsi="Times New Roman" w:cs="Times New Roman"/>
+                <w:sz w:val="20"/>
+                <w:szCs w:val="24"/>
+              </w:rPr>
+            </w:pPr>
+            <w:r>
+              <w:rPr>
+                <w:rFonts w:ascii="Times New Roman" w:hAnsi="Times New Roman" w:cs="Times New Roman"/>
+                <w:sz w:val="20"/>
+                <w:szCs w:val="24"/>
+              </w:rPr>
+              <w:t>Дата</w:t>
+            </w:r>
+            <w:r>
+              <w:rPr>
+                <w:rFonts w:ascii="Times New Roman" w:hAnsi="Times New Roman" w:cs="Times New Roman"/>
+                <w:sz w:val="20"/>
+                <w:szCs w:val="24"/>
+              </w:rPr>
+              <w:t xml:space="preserve"> </w:t>
+            </w:r>
+            <w:r>
+              <w:rPr>
+                <w:rFonts w:ascii="Times New Roman" w:hAnsi="Times New Roman" w:cs="Times New Roman"/>
+                <w:sz w:val="20"/>
+                <w:szCs w:val="24"/>
+              </w:rPr>
+              <w:t>подписания</w:t>
+            </w:r>
+            <w:r>
+              <w:rPr>
+                <w:rFonts w:ascii="Times New Roman" w:hAnsi="Times New Roman" w:cs="Times New Roman"/>
+                <w:sz w:val="20"/>
+                <w:szCs w:val="24"/>
+              </w:rPr>
+              <w:t xml:space="preserve">: {{ </w:t>
+            </w:r>
+            <w:r>
+              <w:rPr>
+                <w:rFonts w:ascii="Times New Roman" w:hAnsi="Times New Roman" w:cs="Times New Roman"/>
+                <w:sz w:val="20"/>
+                <w:szCs w:val="24"/>
+                <w:lang w:val="en-US"/>
+              </w:rPr>
+              <w:t>accept</w:t>
+            </w:r>
+            <w:r>
+              <w:rPr>
+                <w:rFonts w:ascii="Times New Roman" w:hAnsi="Times New Roman" w:cs="Times New Roman"/>
+                <w:sz w:val="20"/>
+                <w:szCs w:val="24"/>
+              </w:rPr>
+              <w:t>_</w:t>
+            </w:r>
+            <w:r>
+              <w:rPr>
+                <w:rFonts w:ascii="Times New Roman" w:hAnsi="Times New Roman" w:cs="Times New Roman"/>
+                <w:sz w:val="20"/>
+                <w:szCs w:val="24"/>
+                <w:lang w:val="en-US"/>
+              </w:rPr>
+              <w:t>date</w:t>
+            </w:r>
+            <w:r>
+              <w:rPr>
+                <w:rFonts w:ascii="Times New Roman" w:hAnsi="Times New Roman" w:cs="Times New Roman"/>
+                <w:sz w:val="20"/>
+                <w:szCs w:val="24"/>
+              </w:rPr>
+              <w:t xml:space="preserve"> }}</w:t>
+            </w:r>
+          </w:p>
+        </w:tc>
+        <w:tc>
+          <w:tcPr>
+            <w:tcW w:w="283" w:type="dxa"/>
+            <w:tcBorders>
+              <w:top w:val="nil"/>
+              <w:bottom w:val="nil"/>
+            </w:tcBorders>
+          </w:tcPr>
+          <w:p>
+            <w:pPr>
+              <w:rPr>
+                <w:rFonts w:ascii="Times New Roman" w:hAnsi="Times New Roman" w:cs="Times New Roman"/>
+                <w:sz w:val="20"/>
+                <w:szCs w:val="24"/>
+              </w:rPr>
+            </w:pPr>
+          </w:p>
+        </w:tc>
+        <w:tc>
+          <w:tcPr>
+            <w:tcW w:w="2835" w:type="dxa"/>
+          </w:tcPr>
+          <w:p>
+            <w:pPr>
+              <w:rPr>
+                <w:rFonts w:ascii="Times New Roman" w:hAnsi="Times New Roman" w:cs="Times New Roman"/>
+                <w:sz w:val="20"/>
+                <w:szCs w:val="24"/>
+              </w:rPr>
+            </w:pPr>
+            <w:r>
+              <w:rPr>
+                <w:rFonts w:ascii="Times New Roman" w:hAnsi="Times New Roman" w:cs="Times New Roman"/>
+                <w:sz w:val="20"/>
+                <w:szCs w:val="24"/>
+              </w:rPr>
+              <w:t>Документ подписан простой электронной подписью</w:t>
+            </w:r>
+          </w:p>
+          <w:p>
+            <w:pPr>
+              <w:rPr>
+                <w:rFonts w:ascii="Times New Roman" w:hAnsi="Times New Roman" w:cs="Times New Roman"/>
+                <w:sz w:val="20"/>
+                <w:szCs w:val="24"/>
+              </w:rPr>
+            </w:pPr>
+            <w:r>
+              <w:rPr>
+                <w:rFonts w:ascii="Times New Roman" w:hAnsi="Times New Roman" w:cs="Times New Roman"/>
+                <w:sz w:val="20"/>
+                <w:szCs w:val="24"/>
+              </w:rPr>
+              <w:t>Согласовал:</w:t>
+            </w:r>
+            <w:r>
+              <w:rPr>
+                <w:rFonts w:ascii="Times New Roman" w:hAnsi="Times New Roman" w:cs="Times New Roman"/>
+                <w:sz w:val="20"/>
+                <w:szCs w:val="24"/>
+              </w:rPr>
+              <w:t xml:space="preserve"> </w:t>
+            </w:r>
+            <w:proofErr w:type="gramStart"/>
+            <w:r>
+              <w:rPr>
+                <w:rFonts w:ascii="Times New Roman" w:hAnsi="Times New Roman" w:cs="Times New Roman"/>
+                <w:sz w:val="20"/>
+                <w:szCs w:val="24"/>
+              </w:rPr>
+              <w:t xml:space="preserve">{{ </w:t>
+            </w:r>
+            <w:r>
+              <w:rPr>
+                <w:rFonts w:ascii="Times New Roman" w:hAnsi="Times New Roman" w:cs="Times New Roman"/>
+                <w:sz w:val="20"/>
+                <w:szCs w:val="24"/>
+                <w:lang w:val="en-US"/>
+              </w:rPr>
+              <w:t>user</w:t>
+            </w:r>
+            <w:proofErr w:type="gramEnd"/>
+            <w:r>
+              <w:rPr>
+                <w:rFonts w:ascii="Times New Roman" w:hAnsi="Times New Roman" w:cs="Times New Roman"/>
+                <w:sz w:val="20"/>
+                <w:szCs w:val="24"/>
+              </w:rPr>
+              <w:t>_</w:t>
+            </w:r>
+            <w:r>
+              <w:rPr>
+                <w:rFonts w:ascii="Times New Roman" w:hAnsi="Times New Roman" w:cs="Times New Roman"/>
+                <w:sz w:val="20"/>
+                <w:szCs w:val="24"/>
+                <w:lang w:val="en-US"/>
+              </w:rPr>
+              <w:t>confirmed</w:t>
+            </w:r>
+            <w:r>
+              <w:rPr>
+                <w:rFonts w:ascii="Times New Roman" w:hAnsi="Times New Roman" w:cs="Times New Roman"/>
+                <w:sz w:val="20"/>
+                <w:szCs w:val="24"/>
+              </w:rPr>
+              <w:t xml:space="preserve"> }}</w:t>
+            </w:r>
+          </w:p>
+          <w:p>
+            <w:pPr>
+              <w:rPr>
+                <w:rFonts w:ascii="Times New Roman" w:hAnsi="Times New Roman" w:cs="Times New Roman"/>
+                <w:sz w:val="20"/>
+                <w:szCs w:val="24"/>
+              </w:rPr>
+            </w:pPr>
+            <w:r>
+              <w:rPr>
+                <w:rFonts w:ascii="Times New Roman" w:hAnsi="Times New Roman" w:cs="Times New Roman"/>
+                <w:sz w:val="20"/>
+                <w:szCs w:val="24"/>
+              </w:rPr>
+              <w:t>Дата</w:t>
+            </w:r>
+            <w:r>
+              <w:rPr>
+                <w:rFonts w:ascii="Times New Roman" w:hAnsi="Times New Roman" w:cs="Times New Roman"/>
+                <w:sz w:val="20"/>
+                <w:szCs w:val="24"/>
+              </w:rPr>
+              <w:t xml:space="preserve"> </w:t>
+            </w:r>
+            <w:r>
+              <w:rPr>
+                <w:rFonts w:ascii="Times New Roman" w:hAnsi="Times New Roman" w:cs="Times New Roman"/>
+                <w:sz w:val="20"/>
+                <w:szCs w:val="24"/>
+              </w:rPr>
+              <w:t>подписания</w:t>
+            </w:r>
+            <w:r>
+              <w:rPr>
+                <w:rFonts w:ascii="Times New Roman" w:hAnsi="Times New Roman" w:cs="Times New Roman"/>
+                <w:sz w:val="20"/>
+                <w:szCs w:val="24"/>
+              </w:rPr>
+              <w:t xml:space="preserve">: {{ </w:t>
+            </w:r>
+            <w:r>
+              <w:rPr>
+                <w:rFonts w:ascii="Times New Roman" w:hAnsi="Times New Roman" w:cs="Times New Roman"/>
+                <w:sz w:val="20"/>
+                <w:szCs w:val="24"/>
+                <w:lang w:val="en-US"/>
+              </w:rPr>
+              <w:t>confirm</w:t>
+            </w:r>
+            <w:r>
+              <w:rPr>
+                <w:rFonts w:ascii="Times New Roman" w:hAnsi="Times New Roman" w:cs="Times New Roman"/>
+                <w:sz w:val="20"/>
+                <w:szCs w:val="24"/>
+              </w:rPr>
+              <w:t>_</w:t>
+            </w:r>
+            <w:r>
+              <w:rPr>
+                <w:rFonts w:ascii="Times New Roman" w:hAnsi="Times New Roman" w:cs="Times New Roman"/>
+                <w:sz w:val="20"/>
+                <w:szCs w:val="24"/>
+                <w:lang w:val="en-US"/>
+              </w:rPr>
+              <w:t>date</w:t>
+            </w:r>
+            <w:r>
+              <w:rPr>
+                <w:rFonts w:ascii="Times New Roman" w:hAnsi="Times New Roman" w:cs="Times New Roman"/>
+                <w:sz w:val="20"/>
+                <w:szCs w:val="24"/>
+              </w:rPr>
+              <w:t xml:space="preserve"> }}</w:t>
+            </w:r>
+          </w:p>
+        </w:tc>
+      </w:tr>
+    </w:tbl>
+    <w:p>
+      <w:pPr>
+        <w:jc w:val="center"/>
+        <w:rPr>
+          <w:rFonts w:ascii="Times New Roman" w:hAnsi="Times New Roman" w:cs="Times New Roman"/>
+          <w:sz w:val="24"/>
+          <w:szCs w:val="24"/>
+        </w:rPr>
+      </w:pPr>
+    </w:p>
+    <w:p>
+      <w:pPr>
+        <w:jc w:val="center"/>
+        <w:rPr>
+          <w:rFonts w:ascii="Times New Roman" w:hAnsi="Times New Roman" w:cs="Times New Roman"/>
+          <w:sz w:val="24"/>
+          <w:szCs w:val="24"/>
+        </w:rPr>
+      </w:pPr>
+      <w:r>
+        <w:rPr>
+          <w:rFonts w:ascii="Times New Roman" w:hAnsi="Times New Roman" w:cs="Times New Roman"/>
+          <w:sz w:val="24"/>
+          <w:szCs w:val="24"/>
+        </w:rPr>
+        <w:t xml:space="preserve">{% </w:t>
+      </w:r>
+      <w:proofErr w:type="spellStart"/>
+      <w:r>
+        <w:rPr>
+          <w:rFonts w:ascii="Times New Roman" w:hAnsi="Times New Roman" w:cs="Times New Roman"/>
+          <w:sz w:val="24"/>
+          <w:szCs w:val="24"/>
+          <w:lang w:val="en-US"/>
+        </w:rPr>
+        <w:t>endif</w:t>
+      </w:r>
+      <w:proofErr w:type="spellEnd"/>
+      <w:r>
+        <w:rPr>
+          <w:rFonts w:ascii="Times New Roman" w:hAnsi="Times New Roman" w:cs="Times New Roman"/>
+          <w:sz w:val="24"/>
+          <w:szCs w:val="24"/>
+        </w:rPr>
+        <w:t xml:space="preserve"> %}</w:t>
+      </w:r>
+    </w:p>
     <w:p>
       <w:pPr>
         <w:jc w:val="center"/>
@@ -4416,7 +5518,6 @@
                 <w:szCs w:val="24"/>
               </w:rPr>
             </w:pPr>
-            <w:proofErr w:type="gramStart"/>
             <w:r>
               <w:rPr>
                 <w:rFonts w:ascii="Times New Roman" w:hAnsi="Times New Roman" w:cs="Times New Roman"/>
@@ -4455,7 +5556,6 @@
               <w:t>lekc</w:t>
             </w:r>
             <w:proofErr w:type="spellEnd"/>
-            <w:proofErr w:type="gramEnd"/>
             <w:r>
               <w:rPr>
                 <w:rFonts w:ascii="Times New Roman" w:hAnsi="Times New Roman" w:cs="Times New Roman"/>
@@ -4832,7 +5932,6 @@
                 <w:szCs w:val="24"/>
               </w:rPr>
             </w:pPr>
-            <w:proofErr w:type="gramStart"/>
             <w:r>
               <w:rPr>
                 <w:rFonts w:ascii="Times New Roman" w:hAnsi="Times New Roman" w:cs="Times New Roman"/>
@@ -4869,7 +5968,6 @@
               </w:rPr>
               <w:t>lab</w:t>
             </w:r>
-            <w:proofErr w:type="gramEnd"/>
             <w:r>
               <w:rPr>
                 <w:rFonts w:ascii="Times New Roman" w:hAnsi="Times New Roman" w:cs="Times New Roman"/>
@@ -10318,7 +11416,6 @@
                 <w:szCs w:val="24"/>
               </w:rPr>
             </w:pPr>
-            <w:proofErr w:type="gramStart"/>
             <w:r>
               <w:rPr>
                 <w:rFonts w:ascii="Times New Roman" w:hAnsi="Times New Roman" w:cs="Times New Roman"/>
@@ -10355,7 +11452,6 @@
               </w:rPr>
               <w:t>number</w:t>
             </w:r>
-            <w:proofErr w:type="gramEnd"/>
             <w:r>
               <w:rPr>
                 <w:rFonts w:ascii="Times New Roman" w:hAnsi="Times New Roman" w:cs="Times New Roman"/>
@@ -10378,7 +11474,6 @@
                 <w:szCs w:val="24"/>
               </w:rPr>
             </w:pPr>
-            <w:proofErr w:type="gramStart"/>
             <w:r>
               <w:rPr>
                 <w:rFonts w:ascii="Times New Roman" w:hAnsi="Times New Roman" w:cs="Times New Roman"/>
@@ -10415,7 +11510,6 @@
               </w:rPr>
               <w:t>content</w:t>
             </w:r>
-            <w:proofErr w:type="gramEnd"/>
             <w:r>
               <w:rPr>
                 <w:rFonts w:ascii="Times New Roman" w:hAnsi="Times New Roman" w:cs="Times New Roman"/>
@@ -10440,7 +11534,6 @@
                 <w:szCs w:val="24"/>
               </w:rPr>
             </w:pPr>
-            <w:proofErr w:type="gramStart"/>
             <w:r>
               <w:rPr>
                 <w:rFonts w:ascii="Times New Roman" w:hAnsi="Times New Roman" w:cs="Times New Roman"/>
@@ -10477,7 +11570,6 @@
               </w:rPr>
               <w:t>hours</w:t>
             </w:r>
-            <w:proofErr w:type="gramEnd"/>
             <w:r>
               <w:rPr>
                 <w:rFonts w:ascii="Times New Roman" w:hAnsi="Times New Roman" w:cs="Times New Roman"/>
@@ -11332,7 +12424,6 @@
                 <w:szCs w:val="24"/>
               </w:rPr>
             </w:pPr>
-            <w:proofErr w:type="gramStart"/>
             <w:r>
               <w:rPr>
                 <w:rFonts w:ascii="Times New Roman" w:hAnsi="Times New Roman" w:cs="Times New Roman"/>
@@ -11369,7 +12460,6 @@
               </w:rPr>
               <w:t>number</w:t>
             </w:r>
-            <w:proofErr w:type="gramEnd"/>
             <w:r>
               <w:rPr>
                 <w:rFonts w:ascii="Times New Roman" w:hAnsi="Times New Roman" w:cs="Times New Roman"/>
@@ -11392,7 +12482,6 @@
                 <w:szCs w:val="24"/>
               </w:rPr>
             </w:pPr>
-            <w:proofErr w:type="gramStart"/>
             <w:r>
               <w:rPr>
                 <w:rFonts w:ascii="Times New Roman" w:hAnsi="Times New Roman" w:cs="Times New Roman"/>
@@ -11429,7 +12518,6 @@
               </w:rPr>
               <w:t>content</w:t>
             </w:r>
-            <w:proofErr w:type="gramEnd"/>
             <w:r>
               <w:rPr>
                 <w:rFonts w:ascii="Times New Roman" w:hAnsi="Times New Roman" w:cs="Times New Roman"/>
@@ -11454,7 +12542,6 @@
                 <w:szCs w:val="24"/>
               </w:rPr>
             </w:pPr>
-            <w:proofErr w:type="gramStart"/>
             <w:r>
               <w:rPr>
                 <w:rFonts w:ascii="Times New Roman" w:hAnsi="Times New Roman" w:cs="Times New Roman"/>
@@ -11491,7 +12578,6 @@
               </w:rPr>
               <w:t>hours</w:t>
             </w:r>
-            <w:proofErr w:type="gramEnd"/>
             <w:r>
               <w:rPr>
                 <w:rFonts w:ascii="Times New Roman" w:hAnsi="Times New Roman" w:cs="Times New Roman"/>
@@ -12348,7 +13434,6 @@
                 <w:szCs w:val="24"/>
               </w:rPr>
             </w:pPr>
-            <w:proofErr w:type="gramStart"/>
             <w:r>
               <w:rPr>
                 <w:rFonts w:ascii="Times New Roman" w:hAnsi="Times New Roman" w:cs="Times New Roman"/>
@@ -12385,7 +13470,6 @@
               </w:rPr>
               <w:t>number</w:t>
             </w:r>
-            <w:proofErr w:type="gramEnd"/>
             <w:r>
               <w:rPr>
                 <w:rFonts w:ascii="Times New Roman" w:hAnsi="Times New Roman" w:cs="Times New Roman"/>
@@ -12408,7 +13492,6 @@
                 <w:szCs w:val="24"/>
               </w:rPr>
             </w:pPr>
-            <w:proofErr w:type="gramStart"/>
             <w:r>
               <w:rPr>
                 <w:rFonts w:ascii="Times New Roman" w:hAnsi="Times New Roman" w:cs="Times New Roman"/>
@@ -12445,7 +13528,6 @@
               </w:rPr>
               <w:t>content</w:t>
             </w:r>
-            <w:proofErr w:type="gramEnd"/>
             <w:r>
               <w:rPr>
                 <w:rFonts w:ascii="Times New Roman" w:hAnsi="Times New Roman" w:cs="Times New Roman"/>
@@ -12470,7 +13552,6 @@
                 <w:szCs w:val="24"/>
               </w:rPr>
             </w:pPr>
-            <w:proofErr w:type="gramStart"/>
             <w:r>
               <w:rPr>
                 <w:rFonts w:ascii="Times New Roman" w:hAnsi="Times New Roman" w:cs="Times New Roman"/>
@@ -12507,7 +13588,6 @@
               </w:rPr>
               <w:t>hours</w:t>
             </w:r>
-            <w:proofErr w:type="gramEnd"/>
             <w:r>
               <w:rPr>
                 <w:rFonts w:ascii="Times New Roman" w:hAnsi="Times New Roman" w:cs="Times New Roman"/>
@@ -17472,7 +18552,7 @@
 </file>
 
 <file path=word/endnotes.xml><?xml version="1.0" encoding="utf-8"?>
-<w:endnotes xmlns:wpc="http://schemas.microsoft.com/office/word/2010/wordprocessingCanvas" xmlns:mc="http://schemas.openxmlformats.org/markup-compatibility/2006" xmlns:o="urn:schemas-microsoft-com:office:office" xmlns:r="http://schemas.openxmlformats.org/officeDocument/2006/relationships" xmlns:m="http://schemas.openxmlformats.org/officeDocument/2006/math" xmlns:v="urn:schemas-microsoft-com:vml" xmlns:wp14="http://schemas.microsoft.com/office/word/2010/wordprocessingDrawing" xmlns:wp="http://schemas.openxmlformats.org/drawingml/2006/wordprocessingDrawing" xmlns:w10="urn:schemas-microsoft-com:office:word" xmlns:w="http://schemas.openxmlformats.org/wordprocessingml/2006/main" xmlns:w14="http://schemas.microsoft.com/office/word/2010/wordml" xmlns:w15="http://schemas.microsoft.com/office/word/2012/wordml" xmlns:wpg="http://schemas.microsoft.com/office/word/2010/wordprocessingGroup" xmlns:wpi="http://schemas.microsoft.com/office/word/2010/wordprocessingInk" xmlns:wne="http://schemas.microsoft.com/office/word/2006/wordml" xmlns:wps="http://schemas.microsoft.com/office/word/2010/wordprocessingShape" mc:Ignorable="w14 w15 wp14">
+<w:endnotes xmlns:wpc="http://schemas.microsoft.com/office/word/2010/wordprocessingCanvas" xmlns:cx="http://schemas.microsoft.com/office/drawing/2014/chartex" xmlns:cx1="http://schemas.microsoft.com/office/drawing/2015/9/8/chartex" xmlns:mc="http://schemas.openxmlformats.org/markup-compatibility/2006" xmlns:o="urn:schemas-microsoft-com:office:office" xmlns:r="http://schemas.openxmlformats.org/officeDocument/2006/relationships" xmlns:m="http://schemas.openxmlformats.org/officeDocument/2006/math" xmlns:v="urn:schemas-microsoft-com:vml" xmlns:wp14="http://schemas.microsoft.com/office/word/2010/wordprocessingDrawing" xmlns:wp="http://schemas.openxmlformats.org/drawingml/2006/wordprocessingDrawing" xmlns:w10="urn:schemas-microsoft-com:office:word" xmlns:w="http://schemas.openxmlformats.org/wordprocessingml/2006/main" xmlns:w14="http://schemas.microsoft.com/office/word/2010/wordml" xmlns:w15="http://schemas.microsoft.com/office/word/2012/wordml" xmlns:w16se="http://schemas.microsoft.com/office/word/2015/wordml/symex" xmlns:wpg="http://schemas.microsoft.com/office/word/2010/wordprocessingGroup" xmlns:wpi="http://schemas.microsoft.com/office/word/2010/wordprocessingInk" xmlns:wne="http://schemas.microsoft.com/office/word/2006/wordml" xmlns:wps="http://schemas.microsoft.com/office/word/2010/wordprocessingShape" mc:Ignorable="w14 w15 w16se wp14">
   <w:endnote w:type="separator" w:id="-1">
     <w:p>
       <w:pPr>
@@ -17497,7 +18577,7 @@
 </file>
 
 <file path=word/footer1.xml><?xml version="1.0" encoding="utf-8"?>
-<w:ftr xmlns:wpc="http://schemas.microsoft.com/office/word/2010/wordprocessingCanvas" xmlns:mc="http://schemas.openxmlformats.org/markup-compatibility/2006" xmlns:o="urn:schemas-microsoft-com:office:office" xmlns:r="http://schemas.openxmlformats.org/officeDocument/2006/relationships" xmlns:m="http://schemas.openxmlformats.org/officeDocument/2006/math" xmlns:v="urn:schemas-microsoft-com:vml" xmlns:wp14="http://schemas.microsoft.com/office/word/2010/wordprocessingDrawing" xmlns:wp="http://schemas.openxmlformats.org/drawingml/2006/wordprocessingDrawing" xmlns:w10="urn:schemas-microsoft-com:office:word" xmlns:w="http://schemas.openxmlformats.org/wordprocessingml/2006/main" xmlns:w14="http://schemas.microsoft.com/office/word/2010/wordml" xmlns:w15="http://schemas.microsoft.com/office/word/2012/wordml" xmlns:wpg="http://schemas.microsoft.com/office/word/2010/wordprocessingGroup" xmlns:wpi="http://schemas.microsoft.com/office/word/2010/wordprocessingInk" xmlns:wne="http://schemas.microsoft.com/office/word/2006/wordml" xmlns:wps="http://schemas.microsoft.com/office/word/2010/wordprocessingShape" mc:Ignorable="w14 w15 wp14">
+<w:ftr xmlns:wpc="http://schemas.microsoft.com/office/word/2010/wordprocessingCanvas" xmlns:cx="http://schemas.microsoft.com/office/drawing/2014/chartex" xmlns:cx1="http://schemas.microsoft.com/office/drawing/2015/9/8/chartex" xmlns:mc="http://schemas.openxmlformats.org/markup-compatibility/2006" xmlns:o="urn:schemas-microsoft-com:office:office" xmlns:r="http://schemas.openxmlformats.org/officeDocument/2006/relationships" xmlns:m="http://schemas.openxmlformats.org/officeDocument/2006/math" xmlns:v="urn:schemas-microsoft-com:vml" xmlns:wp14="http://schemas.microsoft.com/office/word/2010/wordprocessingDrawing" xmlns:wp="http://schemas.openxmlformats.org/drawingml/2006/wordprocessingDrawing" xmlns:w10="urn:schemas-microsoft-com:office:word" xmlns:w="http://schemas.openxmlformats.org/wordprocessingml/2006/main" xmlns:w14="http://schemas.microsoft.com/office/word/2010/wordml" xmlns:w15="http://schemas.microsoft.com/office/word/2012/wordml" xmlns:w16se="http://schemas.microsoft.com/office/word/2015/wordml/symex" xmlns:wpg="http://schemas.microsoft.com/office/word/2010/wordprocessingGroup" xmlns:wpi="http://schemas.microsoft.com/office/word/2010/wordprocessingInk" xmlns:wne="http://schemas.microsoft.com/office/word/2006/wordml" xmlns:wps="http://schemas.microsoft.com/office/word/2010/wordprocessingShape" mc:Ignorable="w14 w15 w16se wp14">
   <w:sdt>
     <w:sdtPr>
       <w:id w:val="1344050656"/>
@@ -17540,7 +18620,7 @@
             <w:noProof/>
             <w:sz w:val="24"/>
           </w:rPr>
-          <w:t>7</w:t>
+          <w:t>8</w:t>
         </w:r>
         <w:r>
           <w:rPr>
@@ -17565,7 +18645,7 @@
 </file>
 
 <file path=word/footer2.xml><?xml version="1.0" encoding="utf-8"?>
-<w:ftr xmlns:wpc="http://schemas.microsoft.com/office/word/2010/wordprocessingCanvas" xmlns:mc="http://schemas.openxmlformats.org/markup-compatibility/2006" xmlns:o="urn:schemas-microsoft-com:office:office" xmlns:r="http://schemas.openxmlformats.org/officeDocument/2006/relationships" xmlns:m="http://schemas.openxmlformats.org/officeDocument/2006/math" xmlns:v="urn:schemas-microsoft-com:vml" xmlns:wp14="http://schemas.microsoft.com/office/word/2010/wordprocessingDrawing" xmlns:wp="http://schemas.openxmlformats.org/drawingml/2006/wordprocessingDrawing" xmlns:w10="urn:schemas-microsoft-com:office:word" xmlns:w="http://schemas.openxmlformats.org/wordprocessingml/2006/main" xmlns:w14="http://schemas.microsoft.com/office/word/2010/wordml" xmlns:w15="http://schemas.microsoft.com/office/word/2012/wordml" xmlns:wpg="http://schemas.microsoft.com/office/word/2010/wordprocessingGroup" xmlns:wpi="http://schemas.microsoft.com/office/word/2010/wordprocessingInk" xmlns:wne="http://schemas.microsoft.com/office/word/2006/wordml" xmlns:wps="http://schemas.microsoft.com/office/word/2010/wordprocessingShape" mc:Ignorable="w14 w15 wp14">
+<w:ftr xmlns:wpc="http://schemas.microsoft.com/office/word/2010/wordprocessingCanvas" xmlns:cx="http://schemas.microsoft.com/office/drawing/2014/chartex" xmlns:cx1="http://schemas.microsoft.com/office/drawing/2015/9/8/chartex" xmlns:mc="http://schemas.openxmlformats.org/markup-compatibility/2006" xmlns:o="urn:schemas-microsoft-com:office:office" xmlns:r="http://schemas.openxmlformats.org/officeDocument/2006/relationships" xmlns:m="http://schemas.openxmlformats.org/officeDocument/2006/math" xmlns:v="urn:schemas-microsoft-com:vml" xmlns:wp14="http://schemas.microsoft.com/office/word/2010/wordprocessingDrawing" xmlns:wp="http://schemas.openxmlformats.org/drawingml/2006/wordprocessingDrawing" xmlns:w10="urn:schemas-microsoft-com:office:word" xmlns:w="http://schemas.openxmlformats.org/wordprocessingml/2006/main" xmlns:w14="http://schemas.microsoft.com/office/word/2010/wordml" xmlns:w15="http://schemas.microsoft.com/office/word/2012/wordml" xmlns:w16se="http://schemas.microsoft.com/office/word/2015/wordml/symex" xmlns:wpg="http://schemas.microsoft.com/office/word/2010/wordprocessingGroup" xmlns:wpi="http://schemas.microsoft.com/office/word/2010/wordprocessingInk" xmlns:wne="http://schemas.microsoft.com/office/word/2006/wordml" xmlns:wps="http://schemas.microsoft.com/office/word/2010/wordprocessingShape" mc:Ignorable="w14 w15 w16se wp14">
   <w:p>
     <w:pPr>
       <w:jc w:val="center"/>
@@ -17700,7 +18780,7 @@
 </file>
 
 <file path=word/footnotes.xml><?xml version="1.0" encoding="utf-8"?>
-<w:footnotes xmlns:wpc="http://schemas.microsoft.com/office/word/2010/wordprocessingCanvas" xmlns:mc="http://schemas.openxmlformats.org/markup-compatibility/2006" xmlns:o="urn:schemas-microsoft-com:office:office" xmlns:r="http://schemas.openxmlformats.org/officeDocument/2006/relationships" xmlns:m="http://schemas.openxmlformats.org/officeDocument/2006/math" xmlns:v="urn:schemas-microsoft-com:vml" xmlns:wp14="http://schemas.microsoft.com/office/word/2010/wordprocessingDrawing" xmlns:wp="http://schemas.openxmlformats.org/drawingml/2006/wordprocessingDrawing" xmlns:w10="urn:schemas-microsoft-com:office:word" xmlns:w="http://schemas.openxmlformats.org/wordprocessingml/2006/main" xmlns:w14="http://schemas.microsoft.com/office/word/2010/wordml" xmlns:w15="http://schemas.microsoft.com/office/word/2012/wordml" xmlns:wpg="http://schemas.microsoft.com/office/word/2010/wordprocessingGroup" xmlns:wpi="http://schemas.microsoft.com/office/word/2010/wordprocessingInk" xmlns:wne="http://schemas.microsoft.com/office/word/2006/wordml" xmlns:wps="http://schemas.microsoft.com/office/word/2010/wordprocessingShape" mc:Ignorable="w14 w15 wp14">
+<w:footnotes xmlns:wpc="http://schemas.microsoft.com/office/word/2010/wordprocessingCanvas" xmlns:cx="http://schemas.microsoft.com/office/drawing/2014/chartex" xmlns:cx1="http://schemas.microsoft.com/office/drawing/2015/9/8/chartex" xmlns:mc="http://schemas.openxmlformats.org/markup-compatibility/2006" xmlns:o="urn:schemas-microsoft-com:office:office" xmlns:r="http://schemas.openxmlformats.org/officeDocument/2006/relationships" xmlns:m="http://schemas.openxmlformats.org/officeDocument/2006/math" xmlns:v="urn:schemas-microsoft-com:vml" xmlns:wp14="http://schemas.microsoft.com/office/word/2010/wordprocessingDrawing" xmlns:wp="http://schemas.openxmlformats.org/drawingml/2006/wordprocessingDrawing" xmlns:w10="urn:schemas-microsoft-com:office:word" xmlns:w="http://schemas.openxmlformats.org/wordprocessingml/2006/main" xmlns:w14="http://schemas.microsoft.com/office/word/2010/wordml" xmlns:w15="http://schemas.microsoft.com/office/word/2012/wordml" xmlns:w16se="http://schemas.microsoft.com/office/word/2015/wordml/symex" xmlns:wpg="http://schemas.microsoft.com/office/word/2010/wordprocessingGroup" xmlns:wpi="http://schemas.microsoft.com/office/word/2010/wordprocessingInk" xmlns:wne="http://schemas.microsoft.com/office/word/2006/wordml" xmlns:wps="http://schemas.microsoft.com/office/word/2010/wordprocessingShape" mc:Ignorable="w14 w15 w16se wp14">
   <w:footnote w:type="separator" w:id="-1">
     <w:p>
       <w:pPr>
@@ -17725,7 +18805,7 @@
 </file>
 
 <file path=word/styles.xml><?xml version="1.0" encoding="utf-8"?>
-<w:styles xmlns:mc="http://schemas.openxmlformats.org/markup-compatibility/2006" xmlns:r="http://schemas.openxmlformats.org/officeDocument/2006/relationships" xmlns:w="http://schemas.openxmlformats.org/wordprocessingml/2006/main" xmlns:w14="http://schemas.microsoft.com/office/word/2010/wordml" xmlns:w15="http://schemas.microsoft.com/office/word/2012/wordml" mc:Ignorable="w14 w15">
+<w:styles xmlns:mc="http://schemas.openxmlformats.org/markup-compatibility/2006" xmlns:r="http://schemas.openxmlformats.org/officeDocument/2006/relationships" xmlns:w="http://schemas.openxmlformats.org/wordprocessingml/2006/main" xmlns:w14="http://schemas.microsoft.com/office/word/2010/wordml" xmlns:w15="http://schemas.microsoft.com/office/word/2012/wordml" xmlns:w16se="http://schemas.microsoft.com/office/word/2015/wordml/symex" mc:Ignorable="w14 w15 w16se">
   <w:docDefaults>
     <w:rPrDefault>
       <w:rPr>
@@ -18117,7 +19197,7 @@
   <w:style w:type="paragraph" w:default="1" w:styleId="a">
     <w:name w:val="Normal"/>
     <w:qFormat/>
-    <w:rsid w:val="00D955DC"/>
+    <w:rsid w:val="00335CE5"/>
   </w:style>
   <w:style w:type="character" w:default="1" w:styleId="a0">
     <w:name w:val="Default Paragraph Font"/>
@@ -18559,7 +19639,7 @@
 </file>
 
 <file path=customXml/itemProps1.xml><?xml version="1.0" encoding="utf-8"?>
-<ds:datastoreItem xmlns:ds="http://schemas.openxmlformats.org/officeDocument/2006/customXml" ds:itemID="{640FC1CA-8F91-413F-BBAE-873EF90B1712}">
+<ds:datastoreItem xmlns:ds="http://schemas.openxmlformats.org/officeDocument/2006/customXml" ds:itemID="{FEF876F1-7EA4-4BF7-9B41-06DB95C7765E}">
   <ds:schemaRefs>
     <ds:schemaRef ds:uri="http://schemas.openxmlformats.org/officeDocument/2006/bibliography"/>
   </ds:schemaRefs>

</xml_diff>